<commit_message>
menambahkan opsi pertanyaan dan jawaban di bagian tugas praktikum
</commit_message>
<xml_diff>
--- a/kuliah/DocumentGenerator_Laporan_Praktikum/src/templates/format-1.docx
+++ b/kuliah/DocumentGenerator_Laporan_Praktikum/src/templates/format-1.docx
@@ -30,6 +30,7 @@
           <w:lang w:val="en-US"/>
         </w:rPr>
       </w:pPr>
+      <w:proofErr w:type="gramStart"/>
       <w:r>
         <w:rPr>
           <w:b/>
@@ -47,9 +48,9 @@
           <w:szCs w:val="28"/>
           <w:lang w:val="en-US"/>
         </w:rPr>
-        <w:t>mata_kuliah</w:t>
-      </w:r>
-      <w:proofErr w:type="spellEnd"/>
+        <w:t>mata</w:t>
+      </w:r>
+      <w:proofErr w:type="gramEnd"/>
       <w:r>
         <w:rPr>
           <w:b/>
@@ -57,43 +58,29 @@
           <w:szCs w:val="28"/>
           <w:lang w:val="en-US"/>
         </w:rPr>
-        <w:t xml:space="preserve"> }}</w:t>
-      </w:r>
-    </w:p>
-    <w:p>
-      <w:pPr>
-        <w:jc w:val="center"/>
-        <w:rPr>
-          <w:b/>
-        </w:rPr>
-      </w:pPr>
-    </w:p>
-    <w:p>
-      <w:pPr>
-        <w:jc w:val="center"/>
-        <w:rPr>
-          <w:b/>
-        </w:rPr>
-      </w:pPr>
-    </w:p>
-    <w:p>
-      <w:pPr>
-        <w:jc w:val="center"/>
+        <w:t>_</w:t>
+      </w:r>
+      <w:proofErr w:type="gramStart"/>
+      <w:r>
         <w:rPr>
           <w:b/>
           <w:sz w:val="28"/>
           <w:szCs w:val="28"/>
           <w:lang w:val="en-US"/>
         </w:rPr>
-      </w:pPr>
+        <w:t>kuliah</w:t>
+      </w:r>
+      <w:proofErr w:type="spellEnd"/>
       <w:r>
         <w:rPr>
           <w:b/>
           <w:sz w:val="28"/>
           <w:szCs w:val="28"/>
-        </w:rPr>
-        <w:t>MODUL</w:t>
-      </w:r>
+          <w:lang w:val="en-US"/>
+        </w:rPr>
+        <w:t xml:space="preserve"> }</w:t>
+      </w:r>
+      <w:proofErr w:type="gramEnd"/>
       <w:r>
         <w:rPr>
           <w:b/>
@@ -101,28 +88,43 @@
           <w:szCs w:val="28"/>
           <w:lang w:val="en-US"/>
         </w:rPr>
-        <w:t xml:space="preserve"> </w:t>
-      </w:r>
-      <w:r>
+        <w:t>}</w:t>
+      </w:r>
+    </w:p>
+    <w:p>
+      <w:pPr>
+        <w:jc w:val="center"/>
+        <w:rPr>
+          <w:b/>
+        </w:rPr>
+      </w:pPr>
+    </w:p>
+    <w:p>
+      <w:pPr>
+        <w:jc w:val="center"/>
+        <w:rPr>
+          <w:b/>
+        </w:rPr>
+      </w:pPr>
+    </w:p>
+    <w:p>
+      <w:pPr>
+        <w:jc w:val="center"/>
         <w:rPr>
           <w:b/>
           <w:sz w:val="28"/>
           <w:szCs w:val="28"/>
           <w:lang w:val="en-US"/>
         </w:rPr>
-        <w:t xml:space="preserve">{{ </w:t>
-      </w:r>
-      <w:proofErr w:type="spellStart"/>
+      </w:pPr>
       <w:r>
         <w:rPr>
           <w:b/>
           <w:sz w:val="28"/>
           <w:szCs w:val="28"/>
-          <w:lang w:val="en-US"/>
-        </w:rPr>
-        <w:t>nomor_modul</w:t>
-      </w:r>
-      <w:proofErr w:type="spellEnd"/>
+        </w:rPr>
+        <w:t>MODUL</w:t>
+      </w:r>
       <w:r>
         <w:rPr>
           <w:b/>
@@ -130,19 +132,18 @@
           <w:szCs w:val="28"/>
           <w:lang w:val="en-US"/>
         </w:rPr>
-        <w:t xml:space="preserve"> }}</w:t>
-      </w:r>
-    </w:p>
-    <w:p>
-      <w:pPr>
-        <w:jc w:val="center"/>
+        <w:t xml:space="preserve"> </w:t>
+      </w:r>
+      <w:r>
         <w:rPr>
           <w:b/>
           <w:sz w:val="28"/>
           <w:szCs w:val="28"/>
           <w:lang w:val="en-US"/>
         </w:rPr>
-      </w:pPr>
+        <w:t xml:space="preserve">{{ </w:t>
+      </w:r>
+      <w:proofErr w:type="spellStart"/>
       <w:r>
         <w:rPr>
           <w:b/>
@@ -150,9 +151,9 @@
           <w:szCs w:val="28"/>
           <w:lang w:val="en-US"/>
         </w:rPr>
-        <w:t xml:space="preserve">{{ </w:t>
-      </w:r>
-      <w:proofErr w:type="spellStart"/>
+        <w:t>nomor_modul</w:t>
+      </w:r>
+      <w:proofErr w:type="spellEnd"/>
       <w:r>
         <w:rPr>
           <w:b/>
@@ -160,9 +161,41 @@
           <w:szCs w:val="28"/>
           <w:lang w:val="en-US"/>
         </w:rPr>
+        <w:t xml:space="preserve"> }}</w:t>
+      </w:r>
+    </w:p>
+    <w:p>
+      <w:pPr>
+        <w:jc w:val="center"/>
+        <w:rPr>
+          <w:b/>
+          <w:sz w:val="28"/>
+          <w:szCs w:val="28"/>
+          <w:lang w:val="en-US"/>
+        </w:rPr>
+      </w:pPr>
+      <w:proofErr w:type="gramStart"/>
+      <w:r>
+        <w:rPr>
+          <w:b/>
+          <w:sz w:val="28"/>
+          <w:szCs w:val="28"/>
+          <w:lang w:val="en-US"/>
+        </w:rPr>
+        <w:t xml:space="preserve">{{ </w:t>
+      </w:r>
+      <w:proofErr w:type="spellStart"/>
+      <w:r>
+        <w:rPr>
+          <w:b/>
+          <w:sz w:val="28"/>
+          <w:szCs w:val="28"/>
+          <w:lang w:val="en-US"/>
+        </w:rPr>
         <w:t>judul</w:t>
       </w:r>
       <w:proofErr w:type="spellEnd"/>
+      <w:proofErr w:type="gramEnd"/>
       <w:r>
         <w:rPr>
           <w:b/>
@@ -3221,29 +3254,57 @@
     </w:p>
     <w:p>
       <w:pPr>
-        <w:pStyle w:val="Code"/>
-        <w:ind w:firstLine="0"/>
+        <w:ind w:left="1021"/>
         <w:jc w:val="left"/>
       </w:pPr>
       <w:r>
-        <w:t xml:space="preserve">{{ </w:t>
-      </w:r>
-      <w:proofErr w:type="spellStart"/>
-      <w:r>
-        <w:t>item.isi_point_a</w:t>
-      </w:r>
-      <w:proofErr w:type="spellEnd"/>
-      <w:r>
-        <w:t xml:space="preserve"> }}</w:t>
+        <w:t>{% if item.list_kode %}</w:t>
+      </w:r>
+      <w:r>
+        <w:t>{% for k in item.list_kode %}</w:t>
+      </w:r>
+      <w:r>
+        <w:t xml:space="preserve"> </w:t>
+      </w:r>
+      <w:r>
+        <w:t>{{ k.judul }}</w:t>
       </w:r>
     </w:p>
     <w:p>
       <w:pPr>
-        <w:ind w:left="510"/>
-        <w:rPr>
-          <w:lang w:val="en-US"/>
-        </w:rPr>
-      </w:pPr>
+        <w:pStyle w:val="Code"/>
+      </w:pPr>
+      <w:r>
+        <w:t xml:space="preserve">{{ </w:t>
+      </w:r>
+      <w:proofErr w:type="spellStart"/>
+      <w:r>
+        <w:t>k.isi</w:t>
+      </w:r>
+      <w:proofErr w:type="spellEnd"/>
+      <w:r>
+        <w:t xml:space="preserve"> }}</w:t>
+      </w:r>
+    </w:p>
+    <w:p>
+      <w:pPr>
+        <w:ind w:left="1021"/>
+        <w:rPr>
+          <w:lang w:val="en-US"/>
+        </w:rPr>
+      </w:pPr>
+      <w:r>
+        <w:t>{% endfor %}</w:t>
+      </w:r>
+      <w:r>
+        <w:t xml:space="preserve">{% else %} </w:t>
+      </w:r>
+      <w:r>
+        <w:t>{{ item.isi_point_a }}</w:t>
+      </w:r>
+      <w:r>
+        <w:t xml:space="preserve"> {% endif %}</w:t>
+      </w:r>
     </w:p>
     <w:p>
       <w:pPr>
@@ -3304,11 +3365,19 @@
         <w:t xml:space="preserve"> in </w:t>
       </w:r>
       <w:proofErr w:type="spellStart"/>
-      <w:r>
-        <w:rPr>
-          <w:lang w:val="en-US"/>
-        </w:rPr>
-        <w:t>item.list_gambar</w:t>
+      <w:proofErr w:type="gramStart"/>
+      <w:r>
+        <w:rPr>
+          <w:lang w:val="en-US"/>
+        </w:rPr>
+        <w:t>item.list</w:t>
+      </w:r>
+      <w:proofErr w:type="gramEnd"/>
+      <w:r>
+        <w:rPr>
+          <w:lang w:val="en-US"/>
+        </w:rPr>
+        <w:t>_gambar</w:t>
       </w:r>
       <w:proofErr w:type="spellEnd"/>
       <w:r>
@@ -3323,6 +3392,7 @@
         </w:rPr>
         <w:t xml:space="preserve"> </w:t>
       </w:r>
+      <w:proofErr w:type="gramStart"/>
       <w:r>
         <w:rPr>
           <w:lang w:val="en-US"/>
@@ -3334,14 +3404,35 @@
         <w:rPr>
           <w:lang w:val="en-US"/>
         </w:rPr>
-        <w:t>gbr.objek_gambar</w:t>
+        <w:t>gbr</w:t>
+      </w:r>
+      <w:proofErr w:type="gramEnd"/>
+      <w:r>
+        <w:rPr>
+          <w:lang w:val="en-US"/>
+        </w:rPr>
+        <w:t>.objek_</w:t>
+      </w:r>
+      <w:proofErr w:type="gramStart"/>
+      <w:r>
+        <w:rPr>
+          <w:lang w:val="en-US"/>
+        </w:rPr>
+        <w:t>gambar</w:t>
       </w:r>
       <w:proofErr w:type="spellEnd"/>
       <w:r>
         <w:rPr>
           <w:lang w:val="en-US"/>
         </w:rPr>
-        <w:t xml:space="preserve"> }}</w:t>
+        <w:t xml:space="preserve"> }</w:t>
+      </w:r>
+      <w:proofErr w:type="gramEnd"/>
+      <w:r>
+        <w:rPr>
+          <w:lang w:val="en-US"/>
+        </w:rPr>
+        <w:t>}</w:t>
       </w:r>
     </w:p>
     <w:p>
@@ -3350,7 +3441,13 @@
       </w:pPr>
       <w:bookmarkStart w:id="2" w:name="_Toc221452899"/>
       <w:r>
-        <w:t>Gambar 1.{{ loop.index }} {{ gbr.caption }</w:t>
+        <w:t xml:space="preserve">Gambar 1.{{ </w:t>
+      </w:r>
+      <w:r>
+        <w:t>gbr.nomor_tampil</w:t>
+      </w:r>
+      <w:r>
+        <w:t>}} {{ gbr.caption }</w:t>
       </w:r>
       <w:r>
         <w:t>}</w:t>
@@ -3360,8 +3457,16 @@
     <w:p>
       <w:pPr>
         <w:ind w:left="1021"/>
-      </w:pPr>
-      <w:r>
+        <w:rPr>
+          <w:sz w:val="6"/>
+          <w:szCs w:val="6"/>
+        </w:rPr>
+      </w:pPr>
+      <w:r>
+        <w:rPr>
+          <w:sz w:val="6"/>
+          <w:szCs w:val="6"/>
+        </w:rPr>
         <w:t>{% endfor %}</w:t>
       </w:r>
     </w:p>
@@ -3435,6 +3540,13 @@
     </w:p>
     <w:p>
       <w:pPr>
+        <w:rPr>
+          <w:lang w:val="en-US"/>
+        </w:rPr>
+      </w:pPr>
+    </w:p>
+    <w:p>
+      <w:pPr>
         <w:pStyle w:val="Heading1"/>
         <w:spacing w:after="0"/>
         <w:ind w:left="1077" w:hanging="1077"/>
@@ -3664,35 +3776,91 @@
         <w:rPr>
           <w:lang w:val="en-US"/>
         </w:rPr>
-        <w:t xml:space="preserve">2.{{ </w:t>
+        <w:t>2.</w:t>
+      </w:r>
+      <w:proofErr w:type="gramStart"/>
+      <w:r>
+        <w:rPr>
+          <w:lang w:val="en-US"/>
+        </w:rPr>
+        <w:t xml:space="preserve">{{ </w:t>
       </w:r>
       <w:proofErr w:type="spellStart"/>
       <w:r>
         <w:rPr>
           <w:lang w:val="en-US"/>
         </w:rPr>
-        <w:t>loop.index</w:t>
+        <w:t>loop</w:t>
+      </w:r>
+      <w:proofErr w:type="gramEnd"/>
+      <w:r>
+        <w:rPr>
+          <w:lang w:val="en-US"/>
+        </w:rPr>
+        <w:t>.</w:t>
+      </w:r>
+      <w:proofErr w:type="gramStart"/>
+      <w:r>
+        <w:rPr>
+          <w:lang w:val="en-US"/>
+        </w:rPr>
+        <w:t>index</w:t>
       </w:r>
       <w:proofErr w:type="spellEnd"/>
       <w:r>
         <w:rPr>
           <w:lang w:val="en-US"/>
         </w:rPr>
-        <w:t xml:space="preserve"> }} {{ </w:t>
+        <w:t xml:space="preserve"> }</w:t>
+      </w:r>
+      <w:proofErr w:type="gramEnd"/>
+      <w:r>
+        <w:rPr>
+          <w:lang w:val="en-US"/>
+        </w:rPr>
+        <w:t xml:space="preserve">} </w:t>
+      </w:r>
+      <w:proofErr w:type="gramStart"/>
+      <w:r>
+        <w:rPr>
+          <w:lang w:val="en-US"/>
+        </w:rPr>
+        <w:t xml:space="preserve">{{ </w:t>
       </w:r>
       <w:proofErr w:type="spellStart"/>
       <w:r>
         <w:rPr>
           <w:lang w:val="en-US"/>
         </w:rPr>
-        <w:t>tugas.judul_sub_bab</w:t>
+        <w:t>tugas</w:t>
+      </w:r>
+      <w:proofErr w:type="gramEnd"/>
+      <w:r>
+        <w:rPr>
+          <w:lang w:val="en-US"/>
+        </w:rPr>
+        <w:t>.judul_sub_</w:t>
+      </w:r>
+      <w:proofErr w:type="gramStart"/>
+      <w:r>
+        <w:rPr>
+          <w:lang w:val="en-US"/>
+        </w:rPr>
+        <w:t>bab</w:t>
       </w:r>
       <w:proofErr w:type="spellEnd"/>
       <w:r>
         <w:rPr>
           <w:lang w:val="en-US"/>
         </w:rPr>
-        <w:t xml:space="preserve"> }} (Style: Heading 2)</w:t>
+        <w:t xml:space="preserve"> }</w:t>
+      </w:r>
+      <w:proofErr w:type="gramEnd"/>
+      <w:r>
+        <w:rPr>
+          <w:lang w:val="en-US"/>
+        </w:rPr>
+        <w:t>} (Style: Heading 2)</w:t>
       </w:r>
     </w:p>
     <w:p>
@@ -3712,21 +3880,49 @@
         <w:rPr>
           <w:lang w:val="en-US"/>
         </w:rPr>
-        <w:t xml:space="preserve">Soal: {{ </w:t>
+        <w:t xml:space="preserve">Soal: </w:t>
+      </w:r>
+      <w:proofErr w:type="gramStart"/>
+      <w:r>
+        <w:rPr>
+          <w:lang w:val="en-US"/>
+        </w:rPr>
+        <w:t xml:space="preserve">{{ </w:t>
       </w:r>
       <w:proofErr w:type="spellStart"/>
       <w:r>
         <w:rPr>
           <w:lang w:val="en-US"/>
         </w:rPr>
-        <w:t>tugas.isi_soal</w:t>
+        <w:t>tugas.isi</w:t>
+      </w:r>
+      <w:proofErr w:type="gramEnd"/>
+      <w:r>
+        <w:rPr>
+          <w:lang w:val="en-US"/>
+        </w:rPr>
+        <w:t>_</w:t>
+      </w:r>
+      <w:proofErr w:type="gramStart"/>
+      <w:r>
+        <w:rPr>
+          <w:lang w:val="en-US"/>
+        </w:rPr>
+        <w:t>soal</w:t>
       </w:r>
       <w:proofErr w:type="spellEnd"/>
       <w:r>
         <w:rPr>
           <w:lang w:val="en-US"/>
         </w:rPr>
-        <w:t xml:space="preserve"> }}</w:t>
+        <w:t xml:space="preserve"> }</w:t>
+      </w:r>
+      <w:proofErr w:type="gramEnd"/>
+      <w:r>
+        <w:rPr>
+          <w:lang w:val="en-US"/>
+        </w:rPr>
+        <w:t>}</w:t>
       </w:r>
     </w:p>
     <w:p>
@@ -3754,21 +3950,49 @@
         <w:rPr>
           <w:lang w:val="en-US"/>
         </w:rPr>
-        <w:t xml:space="preserve">: {{ </w:t>
+        <w:t xml:space="preserve">: </w:t>
+      </w:r>
+      <w:proofErr w:type="gramStart"/>
+      <w:r>
+        <w:rPr>
+          <w:lang w:val="en-US"/>
+        </w:rPr>
+        <w:t xml:space="preserve">{{ </w:t>
       </w:r>
       <w:proofErr w:type="spellStart"/>
       <w:r>
         <w:rPr>
           <w:lang w:val="en-US"/>
         </w:rPr>
-        <w:t>tugas.isi_jawaban</w:t>
+        <w:t>tugas.isi</w:t>
+      </w:r>
+      <w:proofErr w:type="gramEnd"/>
+      <w:r>
+        <w:rPr>
+          <w:lang w:val="en-US"/>
+        </w:rPr>
+        <w:t>_</w:t>
+      </w:r>
+      <w:proofErr w:type="gramStart"/>
+      <w:r>
+        <w:rPr>
+          <w:lang w:val="en-US"/>
+        </w:rPr>
+        <w:t>jawaban</w:t>
       </w:r>
       <w:proofErr w:type="spellEnd"/>
       <w:r>
         <w:rPr>
           <w:lang w:val="en-US"/>
         </w:rPr>
-        <w:t xml:space="preserve"> }}</w:t>
+        <w:t xml:space="preserve"> }</w:t>
+      </w:r>
+      <w:proofErr w:type="gramEnd"/>
+      <w:r>
+        <w:rPr>
+          <w:lang w:val="en-US"/>
+        </w:rPr>
+        <w:t>}</w:t>
       </w:r>
     </w:p>
     <w:p>
@@ -3819,60 +4043,152 @@
         <w:t xml:space="preserve"> in </w:t>
       </w:r>
       <w:proofErr w:type="spellStart"/>
-      <w:r>
-        <w:rPr>
-          <w:lang w:val="en-US"/>
-        </w:rPr>
-        <w:t>tugas.list_gambar</w:t>
+      <w:proofErr w:type="gramStart"/>
+      <w:r>
+        <w:rPr>
+          <w:lang w:val="en-US"/>
+        </w:rPr>
+        <w:t>tugas.list</w:t>
+      </w:r>
+      <w:proofErr w:type="gramEnd"/>
+      <w:r>
+        <w:rPr>
+          <w:lang w:val="en-US"/>
+        </w:rPr>
+        <w:t>_gambar</w:t>
       </w:r>
       <w:proofErr w:type="spellEnd"/>
       <w:r>
         <w:rPr>
           <w:lang w:val="en-US"/>
         </w:rPr>
-        <w:t xml:space="preserve"> %} {{ </w:t>
+        <w:t xml:space="preserve"> %} </w:t>
+      </w:r>
+      <w:proofErr w:type="gramStart"/>
+      <w:r>
+        <w:rPr>
+          <w:lang w:val="en-US"/>
+        </w:rPr>
+        <w:t xml:space="preserve">{{ </w:t>
       </w:r>
       <w:proofErr w:type="spellStart"/>
       <w:r>
         <w:rPr>
           <w:lang w:val="en-US"/>
         </w:rPr>
-        <w:t>gbr.objek_gambar</w:t>
+        <w:t>gbr</w:t>
+      </w:r>
+      <w:proofErr w:type="gramEnd"/>
+      <w:r>
+        <w:rPr>
+          <w:lang w:val="en-US"/>
+        </w:rPr>
+        <w:t>.objek_</w:t>
+      </w:r>
+      <w:proofErr w:type="gramStart"/>
+      <w:r>
+        <w:rPr>
+          <w:lang w:val="en-US"/>
+        </w:rPr>
+        <w:t>gambar</w:t>
       </w:r>
       <w:proofErr w:type="spellEnd"/>
       <w:r>
         <w:rPr>
           <w:lang w:val="en-US"/>
         </w:rPr>
-        <w:t xml:space="preserve"> }} Gambar 2.{{ </w:t>
+        <w:t xml:space="preserve"> }</w:t>
+      </w:r>
+      <w:proofErr w:type="gramEnd"/>
+      <w:r>
+        <w:rPr>
+          <w:lang w:val="en-US"/>
+        </w:rPr>
+        <w:t xml:space="preserve">} Gambar </w:t>
+      </w:r>
+      <w:proofErr w:type="gramStart"/>
+      <w:r>
+        <w:rPr>
+          <w:lang w:val="en-US"/>
+        </w:rPr>
+        <w:t xml:space="preserve">2.{{ </w:t>
       </w:r>
       <w:proofErr w:type="spellStart"/>
       <w:r>
         <w:rPr>
           <w:lang w:val="en-US"/>
         </w:rPr>
-        <w:t>gbr.nomor_tampil</w:t>
+        <w:t>gbr</w:t>
+      </w:r>
+      <w:proofErr w:type="gramEnd"/>
+      <w:r>
+        <w:rPr>
+          <w:lang w:val="en-US"/>
+        </w:rPr>
+        <w:t>.nomor_</w:t>
+      </w:r>
+      <w:proofErr w:type="gramStart"/>
+      <w:r>
+        <w:rPr>
+          <w:lang w:val="en-US"/>
+        </w:rPr>
+        <w:t>tampil</w:t>
       </w:r>
       <w:proofErr w:type="spellEnd"/>
       <w:r>
         <w:rPr>
           <w:lang w:val="en-US"/>
         </w:rPr>
-        <w:t xml:space="preserve"> }} {{ </w:t>
+        <w:t xml:space="preserve"> }</w:t>
+      </w:r>
+      <w:proofErr w:type="gramEnd"/>
+      <w:r>
+        <w:rPr>
+          <w:lang w:val="en-US"/>
+        </w:rPr>
+        <w:t xml:space="preserve">} </w:t>
+      </w:r>
+      <w:proofErr w:type="gramStart"/>
+      <w:r>
+        <w:rPr>
+          <w:lang w:val="en-US"/>
+        </w:rPr>
+        <w:t xml:space="preserve">{{ </w:t>
       </w:r>
       <w:proofErr w:type="spellStart"/>
       <w:r>
         <w:rPr>
           <w:lang w:val="en-US"/>
         </w:rPr>
-        <w:t>gbr.caption</w:t>
+        <w:t>gbr</w:t>
+      </w:r>
+      <w:proofErr w:type="gramEnd"/>
+      <w:r>
+        <w:rPr>
+          <w:lang w:val="en-US"/>
+        </w:rPr>
+        <w:t>.</w:t>
+      </w:r>
+      <w:proofErr w:type="gramStart"/>
+      <w:r>
+        <w:rPr>
+          <w:lang w:val="en-US"/>
+        </w:rPr>
+        <w:t>caption</w:t>
       </w:r>
       <w:proofErr w:type="spellEnd"/>
       <w:r>
         <w:rPr>
           <w:lang w:val="en-US"/>
         </w:rPr>
-        <w:t xml:space="preserve"> }} (Style: Caption) {% </w:t>
+        <w:t xml:space="preserve"> }</w:t>
+      </w:r>
+      <w:proofErr w:type="gramEnd"/>
+      <w:r>
+        <w:rPr>
+          <w:lang w:val="en-US"/>
+        </w:rPr>
+        <w:t xml:space="preserve">} (Style: Caption) {% </w:t>
       </w:r>
       <w:proofErr w:type="spellStart"/>
       <w:r>
@@ -3906,7 +4222,6 @@
         <w:rPr>
           <w:lang w:val="en-US"/>
         </w:rPr>
-        <w:lastRenderedPageBreak/>
         <w:t xml:space="preserve">{% </w:t>
       </w:r>
       <w:proofErr w:type="spellStart"/>
@@ -3959,6 +4274,7 @@
           <w:lang w:val="en-US"/>
         </w:rPr>
       </w:pPr>
+      <w:proofErr w:type="gramStart"/>
       <w:r>
         <w:rPr>
           <w:lang w:val="en-US"/>
@@ -3970,14 +4286,35 @@
         <w:rPr>
           <w:lang w:val="en-US"/>
         </w:rPr>
-        <w:t>isi_kesimpulan</w:t>
+        <w:t>isi</w:t>
+      </w:r>
+      <w:proofErr w:type="gramEnd"/>
+      <w:r>
+        <w:rPr>
+          <w:lang w:val="en-US"/>
+        </w:rPr>
+        <w:t>_</w:t>
+      </w:r>
+      <w:proofErr w:type="gramStart"/>
+      <w:r>
+        <w:rPr>
+          <w:lang w:val="en-US"/>
+        </w:rPr>
+        <w:t>kesimpulan</w:t>
       </w:r>
       <w:proofErr w:type="spellEnd"/>
       <w:r>
         <w:rPr>
           <w:lang w:val="en-US"/>
         </w:rPr>
-        <w:t xml:space="preserve"> }}</w:t>
+        <w:t xml:space="preserve"> }</w:t>
+      </w:r>
+      <w:proofErr w:type="gramEnd"/>
+      <w:r>
+        <w:rPr>
+          <w:lang w:val="en-US"/>
+        </w:rPr>
+        <w:t>}</w:t>
       </w:r>
     </w:p>
     <w:sectPr>
@@ -7902,7 +8239,6 @@
   <w:style w:type="character" w:default="1" w:styleId="DefaultParagraphFont">
     <w:name w:val="Default Paragraph Font"/>
     <w:uiPriority w:val="1"/>
-    <w:semiHidden/>
     <w:unhideWhenUsed/>
   </w:style>
   <w:style w:type="table" w:default="1" w:styleId="TableNormal">
@@ -8221,7 +8557,7 @@
     <w:basedOn w:val="Text"/>
     <w:link w:val="CodeChar"/>
     <w:qFormat/>
-    <w:rsid w:val="00B919B8"/>
+    <w:rsid w:val="00314972"/>
     <w:pPr>
       <w:pBdr>
         <w:top w:val="single" w:sz="4" w:space="1" w:color="auto"/>
@@ -8229,7 +8565,8 @@
         <w:bottom w:val="single" w:sz="4" w:space="1" w:color="auto"/>
         <w:right w:val="single" w:sz="4" w:space="4" w:color="auto"/>
       </w:pBdr>
-      <w:ind w:left="1106"/>
+      <w:ind w:left="1106" w:firstLine="0"/>
+      <w:jc w:val="left"/>
     </w:pPr>
     <w:rPr>
       <w:rFonts w:ascii="Courier New" w:hAnsi="Courier New"/>
@@ -8259,7 +8596,7 @@
     <w:name w:val="Code Char"/>
     <w:basedOn w:val="TextChar"/>
     <w:link w:val="Code"/>
-    <w:rsid w:val="00B919B8"/>
+    <w:rsid w:val="00314972"/>
     <w:rPr>
       <w:rFonts w:ascii="Courier New" w:eastAsia="Times New Roman" w:hAnsi="Courier New" w:cs="Times New Roman"/>
       <w:sz w:val="20"/>

</xml_diff>

<commit_message>
Implementasi fungsi pada UI
</commit_message>
<xml_diff>
--- a/kuliah/DocumentGenerator_Laporan_Praktikum/src/templates/format-1.docx
+++ b/kuliah/DocumentGenerator_Laporan_Praktikum/src/templates/format-1.docx
@@ -1,6 +1,6 @@
 
 <file path=word/document.xml><?xml version="1.0" encoding="utf-8"?>
-<w:document xmlns:wpc="http://schemas.microsoft.com/office/word/2010/wordprocessingCanvas" xmlns:cx="http://schemas.microsoft.com/office/drawing/2014/chartex" xmlns:cx1="http://schemas.microsoft.com/office/drawing/2015/9/8/chartex" xmlns:cx2="http://schemas.microsoft.com/office/drawing/2015/10/21/chartex" xmlns:cx3="http://schemas.microsoft.com/office/drawing/2016/5/9/chartex" xmlns:cx4="http://schemas.microsoft.com/office/drawing/2016/5/10/chartex" xmlns:cx5="http://schemas.microsoft.com/office/drawing/2016/5/11/chartex" xmlns:cx6="http://schemas.microsoft.com/office/drawing/2016/5/12/chartex" xmlns:cx7="http://schemas.microsoft.com/office/drawing/2016/5/13/chartex" xmlns:cx8="http://schemas.microsoft.com/office/drawing/2016/5/14/chartex" xmlns:mc="http://schemas.openxmlformats.org/markup-compatibility/2006" xmlns:aink="http://schemas.microsoft.com/office/drawing/2016/ink" xmlns:am3d="http://schemas.microsoft.com/office/drawing/2017/model3d" xmlns:o="urn:schemas-microsoft-com:office:office" xmlns:oel="http://schemas.microsoft.com/office/2019/extlst" xmlns:r="http://schemas.openxmlformats.org/officeDocument/2006/relationships" xmlns:m="http://schemas.openxmlformats.org/officeDocument/2006/math" xmlns:v="urn:schemas-microsoft-com:vml" xmlns:wp14="http://schemas.microsoft.com/office/word/2010/wordprocessingDrawing" xmlns:wp="http://schemas.openxmlformats.org/drawingml/2006/wordprocessingDrawing" xmlns:w10="urn:schemas-microsoft-com:office:word" xmlns:w="http://schemas.openxmlformats.org/wordprocessingml/2006/main" xmlns:w14="http://schemas.microsoft.com/office/word/2010/wordml" xmlns:w15="http://schemas.microsoft.com/office/word/2012/wordml" xmlns:w16cex="http://schemas.microsoft.com/office/word/2018/wordml/cex" xmlns:w16cid="http://schemas.microsoft.com/office/word/2016/wordml/cid" xmlns:w16="http://schemas.microsoft.com/office/word/2018/wordml" xmlns:w16du="http://schemas.microsoft.com/office/word/2023/wordml/word16du" xmlns:w16sdtdh="http://schemas.microsoft.com/office/word/2020/wordml/sdtdatahash" xmlns:w16sdtfl="http://schemas.microsoft.com/office/word/2024/wordml/sdtformatlock" xmlns:w16se="http://schemas.microsoft.com/office/word/2015/wordml/symex" xmlns:wpg="http://schemas.microsoft.com/office/word/2010/wordprocessingGroup" xmlns:wpi="http://schemas.microsoft.com/office/word/2010/wordprocessingInk" xmlns:wne="http://schemas.microsoft.com/office/word/2006/wordml" xmlns:wps="http://schemas.microsoft.com/office/word/2010/wordprocessingShape" mc:Ignorable="w14 w15 w16se w16cid w16 w16cex w16sdtdh w16sdtfl w16du wp14">
+<w:document xmlns:wpc="http://schemas.microsoft.com/office/word/2010/wordprocessingCanvas" xmlns:cx="http://schemas.microsoft.com/office/drawing/2014/chartex" xmlns:cx1="http://schemas.microsoft.com/office/drawing/2015/9/8/chartex" xmlns:cx2="http://schemas.microsoft.com/office/drawing/2015/10/21/chartex" xmlns:cx3="http://schemas.microsoft.com/office/drawing/2016/5/9/chartex" xmlns:cx4="http://schemas.microsoft.com/office/drawing/2016/5/10/chartex" xmlns:cx5="http://schemas.microsoft.com/office/drawing/2016/5/11/chartex" xmlns:cx6="http://schemas.microsoft.com/office/drawing/2016/5/12/chartex" xmlns:cx7="http://schemas.microsoft.com/office/drawing/2016/5/13/chartex" xmlns:cx8="http://schemas.microsoft.com/office/drawing/2016/5/14/chartex" xmlns:mc="http://schemas.openxmlformats.org/markup-compatibility/2006" xmlns:aink="http://schemas.microsoft.com/office/drawing/2016/ink" xmlns:am3d="http://schemas.microsoft.com/office/drawing/2017/model3d" xmlns:o="urn:schemas-microsoft-com:office:office" xmlns:r="http://schemas.openxmlformats.org/officeDocument/2006/relationships" xmlns:m="http://schemas.openxmlformats.org/officeDocument/2006/math" xmlns:v="urn:schemas-microsoft-com:vml" xmlns:wp14="http://schemas.microsoft.com/office/word/2010/wordprocessingDrawing" xmlns:wp="http://schemas.openxmlformats.org/drawingml/2006/wordprocessingDrawing" xmlns:w10="urn:schemas-microsoft-com:office:word" xmlns:w="http://schemas.openxmlformats.org/wordprocessingml/2006/main" xmlns:w14="http://schemas.microsoft.com/office/word/2010/wordml" xmlns:w15="http://schemas.microsoft.com/office/word/2012/wordml" xmlns:w16cex="http://schemas.microsoft.com/office/word/2018/wordml/cex" xmlns:w16cid="http://schemas.microsoft.com/office/word/2016/wordml/cid" xmlns:w16="http://schemas.microsoft.com/office/word/2018/wordml" xmlns:w16se="http://schemas.microsoft.com/office/word/2015/wordml/symex" xmlns:wpg="http://schemas.microsoft.com/office/word/2010/wordprocessingGroup" xmlns:wpi="http://schemas.microsoft.com/office/word/2010/wordprocessingInk" xmlns:wne="http://schemas.microsoft.com/office/word/2006/wordml" xmlns:wps="http://schemas.microsoft.com/office/word/2010/wordprocessingShape" mc:Ignorable="w14 w15 w16se w16cid w16 w16cex wp14">
   <w:body>
     <w:p>
       <w:pPr>
@@ -30,7 +30,6 @@
           <w:lang w:val="en-US"/>
         </w:rPr>
       </w:pPr>
-      <w:proofErr w:type="gramStart"/>
       <w:r>
         <w:rPr>
           <w:b/>
@@ -38,19 +37,43 @@
           <w:szCs w:val="28"/>
           <w:lang w:val="en-US"/>
         </w:rPr>
-        <w:t xml:space="preserve">{{ </w:t>
+        <w:t>{{ mata_kuliah }}</w:t>
       </w:r>
-      <w:proofErr w:type="spellStart"/>
-      <w:r>
+    </w:p>
+    <w:p>
+      <w:pPr>
+        <w:jc w:val="center"/>
+        <w:rPr>
+          <w:b/>
+        </w:rPr>
+      </w:pPr>
+    </w:p>
+    <w:p>
+      <w:pPr>
+        <w:jc w:val="center"/>
+        <w:rPr>
+          <w:b/>
+        </w:rPr>
+      </w:pPr>
+    </w:p>
+    <w:p>
+      <w:pPr>
+        <w:jc w:val="center"/>
         <w:rPr>
           <w:b/>
           <w:sz w:val="28"/>
           <w:szCs w:val="28"/>
           <w:lang w:val="en-US"/>
         </w:rPr>
-        <w:t>mata</w:t>
+      </w:pPr>
+      <w:r>
+        <w:rPr>
+          <w:b/>
+          <w:sz w:val="28"/>
+          <w:szCs w:val="28"/>
+        </w:rPr>
+        <w:t>MODUL</w:t>
       </w:r>
-      <w:proofErr w:type="gramEnd"/>
       <w:r>
         <w:rPr>
           <w:b/>
@@ -58,9 +81,8 @@
           <w:szCs w:val="28"/>
           <w:lang w:val="en-US"/>
         </w:rPr>
-        <w:t>_</w:t>
+        <w:t xml:space="preserve"> </w:t>
       </w:r>
-      <w:proofErr w:type="gramStart"/>
       <w:r>
         <w:rPr>
           <w:b/>
@@ -68,19 +90,19 @@
           <w:szCs w:val="28"/>
           <w:lang w:val="en-US"/>
         </w:rPr>
-        <w:t>kuliah</w:t>
+        <w:t>{{ nomor_modul }}</w:t>
       </w:r>
-      <w:proofErr w:type="spellEnd"/>
-      <w:r>
+    </w:p>
+    <w:p>
+      <w:pPr>
+        <w:jc w:val="center"/>
         <w:rPr>
           <w:b/>
           <w:sz w:val="28"/>
           <w:szCs w:val="28"/>
           <w:lang w:val="en-US"/>
         </w:rPr>
-        <w:t xml:space="preserve"> }</w:t>
-      </w:r>
-      <w:proofErr w:type="gramEnd"/>
+      </w:pPr>
       <w:r>
         <w:rPr>
           <w:b/>
@@ -88,122 +110,7 @@
           <w:szCs w:val="28"/>
           <w:lang w:val="en-US"/>
         </w:rPr>
-        <w:t>}</w:t>
-      </w:r>
-    </w:p>
-    <w:p>
-      <w:pPr>
-        <w:jc w:val="center"/>
-        <w:rPr>
-          <w:b/>
-        </w:rPr>
-      </w:pPr>
-    </w:p>
-    <w:p>
-      <w:pPr>
-        <w:jc w:val="center"/>
-        <w:rPr>
-          <w:b/>
-        </w:rPr>
-      </w:pPr>
-    </w:p>
-    <w:p>
-      <w:pPr>
-        <w:jc w:val="center"/>
-        <w:rPr>
-          <w:b/>
-          <w:sz w:val="28"/>
-          <w:szCs w:val="28"/>
-          <w:lang w:val="en-US"/>
-        </w:rPr>
-      </w:pPr>
-      <w:r>
-        <w:rPr>
-          <w:b/>
-          <w:sz w:val="28"/>
-          <w:szCs w:val="28"/>
-        </w:rPr>
-        <w:t>MODUL</w:t>
-      </w:r>
-      <w:r>
-        <w:rPr>
-          <w:b/>
-          <w:sz w:val="28"/>
-          <w:szCs w:val="28"/>
-          <w:lang w:val="en-US"/>
-        </w:rPr>
-        <w:t xml:space="preserve"> </w:t>
-      </w:r>
-      <w:r>
-        <w:rPr>
-          <w:b/>
-          <w:sz w:val="28"/>
-          <w:szCs w:val="28"/>
-          <w:lang w:val="en-US"/>
-        </w:rPr>
-        <w:t xml:space="preserve">{{ </w:t>
-      </w:r>
-      <w:proofErr w:type="spellStart"/>
-      <w:r>
-        <w:rPr>
-          <w:b/>
-          <w:sz w:val="28"/>
-          <w:szCs w:val="28"/>
-          <w:lang w:val="en-US"/>
-        </w:rPr>
-        <w:t>nomor_modul</w:t>
-      </w:r>
-      <w:proofErr w:type="spellEnd"/>
-      <w:r>
-        <w:rPr>
-          <w:b/>
-          <w:sz w:val="28"/>
-          <w:szCs w:val="28"/>
-          <w:lang w:val="en-US"/>
-        </w:rPr>
-        <w:t xml:space="preserve"> }}</w:t>
-      </w:r>
-    </w:p>
-    <w:p>
-      <w:pPr>
-        <w:jc w:val="center"/>
-        <w:rPr>
-          <w:b/>
-          <w:sz w:val="28"/>
-          <w:szCs w:val="28"/>
-          <w:lang w:val="en-US"/>
-        </w:rPr>
-      </w:pPr>
-      <w:proofErr w:type="gramStart"/>
-      <w:r>
-        <w:rPr>
-          <w:b/>
-          <w:sz w:val="28"/>
-          <w:szCs w:val="28"/>
-          <w:lang w:val="en-US"/>
-        </w:rPr>
-        <w:t xml:space="preserve">{{ </w:t>
-      </w:r>
-      <w:proofErr w:type="spellStart"/>
-      <w:r>
-        <w:rPr>
-          <w:b/>
-          <w:sz w:val="28"/>
-          <w:szCs w:val="28"/>
-          <w:lang w:val="en-US"/>
-        </w:rPr>
-        <w:t>judul</w:t>
-      </w:r>
-      <w:proofErr w:type="spellEnd"/>
-      <w:proofErr w:type="gramEnd"/>
-      <w:r>
-        <w:rPr>
-          <w:b/>
-          <w:sz w:val="28"/>
-          <w:szCs w:val="28"/>
-          <w:lang w:val="en-US"/>
-        </w:rPr>
-        <w:t xml:space="preserve"> }}</w:t>
+        <w:t>{{ judul }}</w:t>
       </w:r>
     </w:p>
     <w:p>
@@ -3057,7 +2964,6 @@
       </w:pPr>
       <w:bookmarkStart w:id="0" w:name="_Toc197688582"/>
       <w:r>
-        <w:lastRenderedPageBreak/>
         <w:t>DAFTAR GAMBAR</w:t>
       </w:r>
       <w:bookmarkEnd w:id="0"/>
@@ -3142,7 +3048,6 @@
       </w:pPr>
       <w:bookmarkStart w:id="1" w:name="_Toc197688583"/>
       <w:r>
-        <w:lastRenderedPageBreak/>
         <w:t>HASIL PRAKTIKUM</w:t>
       </w:r>
       <w:bookmarkEnd w:id="1"/>
@@ -3161,25 +3066,7 @@
           <w:szCs w:val="34"/>
           <w:lang w:val="en-US"/>
         </w:rPr>
-        <w:t xml:space="preserve">{% for item in </w:t>
-      </w:r>
-      <w:proofErr w:type="spellStart"/>
-      <w:r>
-        <w:rPr>
-          <w:sz w:val="34"/>
-          <w:szCs w:val="34"/>
-          <w:lang w:val="en-US"/>
-        </w:rPr>
-        <w:t>daftar_sub_bab</w:t>
-      </w:r>
-      <w:proofErr w:type="spellEnd"/>
-      <w:r>
-        <w:rPr>
-          <w:sz w:val="34"/>
-          <w:szCs w:val="34"/>
-          <w:lang w:val="en-US"/>
-        </w:rPr>
-        <w:t xml:space="preserve"> %}</w:t>
+        <w:t>{% for item in daftar_sub_bab %}</w:t>
       </w:r>
     </w:p>
     <w:p>
@@ -3191,23 +3078,7 @@
         </w:numPr>
       </w:pPr>
       <w:r>
-        <w:t xml:space="preserve">1.{{ </w:t>
-      </w:r>
-      <w:proofErr w:type="spellStart"/>
-      <w:r>
-        <w:t>loop.index</w:t>
-      </w:r>
-      <w:proofErr w:type="spellEnd"/>
-      <w:r>
-        <w:t xml:space="preserve"> }} {{ </w:t>
-      </w:r>
-      <w:proofErr w:type="spellStart"/>
-      <w:r>
-        <w:t>item.judul_sub_bab</w:t>
-      </w:r>
-      <w:proofErr w:type="spellEnd"/>
-      <w:r>
-        <w:t xml:space="preserve"> }}</w:t>
+        <w:t>1.{{ loop.index }} {{ item.judul_sub_bab }}</w:t>
       </w:r>
     </w:p>
     <w:p>
@@ -3238,15 +3109,7 @@
         <w:t xml:space="preserve"> </w:t>
       </w:r>
       <w:r>
-        <w:t xml:space="preserve">{{ </w:t>
-      </w:r>
-      <w:proofErr w:type="spellStart"/>
-      <w:r>
-        <w:t>item.label_point_a</w:t>
-      </w:r>
-      <w:proofErr w:type="spellEnd"/>
-      <w:r>
-        <w:t xml:space="preserve"> }}</w:t>
+        <w:t>{{ item.label_point_a }}</w:t>
       </w:r>
       <w:r>
         <w:t xml:space="preserve"> </w:t>
@@ -3275,23 +3138,12 @@
         <w:pStyle w:val="Code"/>
       </w:pPr>
       <w:r>
-        <w:t xml:space="preserve">{{ </w:t>
-      </w:r>
-      <w:proofErr w:type="spellStart"/>
-      <w:r>
-        <w:t>k.isi</w:t>
-      </w:r>
-      <w:proofErr w:type="spellEnd"/>
-      <w:r>
-        <w:t xml:space="preserve"> }}</w:t>
+        <w:t>{{ k.isi }}</w:t>
       </w:r>
     </w:p>
     <w:p>
       <w:pPr>
         <w:ind w:left="1021"/>
-        <w:rPr>
-          <w:lang w:val="en-US"/>
-        </w:rPr>
       </w:pPr>
       <w:r>
         <w:t>{% endfor %}</w:t>
@@ -3299,11 +3151,56 @@
       <w:r>
         <w:t xml:space="preserve">{% else %} </w:t>
       </w:r>
+    </w:p>
+    <w:tbl>
+      <w:tblPr>
+        <w:tblStyle w:val="TableGrid"/>
+        <w:tblW w:w="0" w:type="auto"/>
+        <w:tblInd w:w="1021" w:type="dxa"/>
+        <w:tblLook w:val="04A0" w:firstRow="1" w:lastRow="0" w:firstColumn="1" w:lastColumn="0" w:noHBand="0" w:noVBand="1"/>
+      </w:tblPr>
+      <w:tblGrid>
+        <w:gridCol w:w="1937"/>
+        <w:gridCol w:w="4962"/>
+      </w:tblGrid>
+      <w:tr>
+        <w:tc>
+          <w:tcPr>
+            <w:tcW w:w="1937" w:type="dxa"/>
+          </w:tcPr>
+          <w:p>
+            <w:r>
+              <w:t>{% for langkah in item.langkah_list %}</w:t>
+            </w:r>
+            <w:r>
+              <w:t>{{ loop.index }}</w:t>
+            </w:r>
+          </w:p>
+        </w:tc>
+        <w:tc>
+          <w:tcPr>
+            <w:tcW w:w="4962" w:type="dxa"/>
+          </w:tcPr>
+          <w:p>
+            <w:r>
+              <w:t>{{ langkah }}</w:t>
+            </w:r>
+            <w:r>
+              <w:t>{% endfor %}</w:t>
+            </w:r>
+          </w:p>
+        </w:tc>
+      </w:tr>
+    </w:tbl>
+    <w:p>
+      <w:pPr>
+        <w:ind w:left="1021"/>
+        <w:rPr>
+          <w:lang w:val="en-US"/>
+        </w:rPr>
+      </w:pPr>
       <w:r>
-        <w:t>{{ item.isi_point_a }}</w:t>
-      </w:r>
-      <w:r>
-        <w:t xml:space="preserve"> {% endif %}</w:t>
+        <w:t>{% endif %}</w:t>
       </w:r>
     </w:p>
     <w:p>
@@ -3348,43 +3245,7 @@
         <w:rPr>
           <w:lang w:val="en-US"/>
         </w:rPr>
-        <w:t xml:space="preserve">{% for </w:t>
-      </w:r>
-      <w:proofErr w:type="spellStart"/>
-      <w:r>
-        <w:rPr>
-          <w:lang w:val="en-US"/>
-        </w:rPr>
-        <w:t>gbr</w:t>
-      </w:r>
-      <w:proofErr w:type="spellEnd"/>
-      <w:r>
-        <w:rPr>
-          <w:lang w:val="en-US"/>
-        </w:rPr>
-        <w:t xml:space="preserve"> in </w:t>
-      </w:r>
-      <w:proofErr w:type="spellStart"/>
-      <w:proofErr w:type="gramStart"/>
-      <w:r>
-        <w:rPr>
-          <w:lang w:val="en-US"/>
-        </w:rPr>
-        <w:t>item.list</w:t>
-      </w:r>
-      <w:proofErr w:type="gramEnd"/>
-      <w:r>
-        <w:rPr>
-          <w:lang w:val="en-US"/>
-        </w:rPr>
-        <w:t>_gambar</w:t>
-      </w:r>
-      <w:proofErr w:type="spellEnd"/>
-      <w:r>
-        <w:rPr>
-          <w:lang w:val="en-US"/>
-        </w:rPr>
-        <w:t xml:space="preserve"> %}</w:t>
+        <w:t>{% for gbr in item.list_gambar %}</w:t>
       </w:r>
       <w:r>
         <w:rPr>
@@ -3392,47 +3253,11 @@
         </w:rPr>
         <w:t xml:space="preserve"> </w:t>
       </w:r>
-      <w:proofErr w:type="gramStart"/>
       <w:r>
         <w:rPr>
           <w:lang w:val="en-US"/>
         </w:rPr>
-        <w:t xml:space="preserve">{{ </w:t>
-      </w:r>
-      <w:proofErr w:type="spellStart"/>
-      <w:r>
-        <w:rPr>
-          <w:lang w:val="en-US"/>
-        </w:rPr>
-        <w:t>gbr</w:t>
-      </w:r>
-      <w:proofErr w:type="gramEnd"/>
-      <w:r>
-        <w:rPr>
-          <w:lang w:val="en-US"/>
-        </w:rPr>
-        <w:t>.objek_</w:t>
-      </w:r>
-      <w:proofErr w:type="gramStart"/>
-      <w:r>
-        <w:rPr>
-          <w:lang w:val="en-US"/>
-        </w:rPr>
-        <w:t>gambar</w:t>
-      </w:r>
-      <w:proofErr w:type="spellEnd"/>
-      <w:r>
-        <w:rPr>
-          <w:lang w:val="en-US"/>
-        </w:rPr>
-        <w:t xml:space="preserve"> }</w:t>
-      </w:r>
-      <w:proofErr w:type="gramEnd"/>
-      <w:r>
-        <w:rPr>
-          <w:lang w:val="en-US"/>
-        </w:rPr>
-        <w:t>}</w:t>
+        <w:t>{{ gbr.objek_gambar }}</w:t>
       </w:r>
     </w:p>
     <w:p>
@@ -3521,21 +3346,7 @@
         <w:rPr>
           <w:lang w:val="en-US"/>
         </w:rPr>
-        <w:t xml:space="preserve">{% </w:t>
-      </w:r>
-      <w:proofErr w:type="spellStart"/>
-      <w:r>
-        <w:rPr>
-          <w:lang w:val="en-US"/>
-        </w:rPr>
-        <w:t>endfor</w:t>
-      </w:r>
-      <w:proofErr w:type="spellEnd"/>
-      <w:r>
-        <w:rPr>
-          <w:lang w:val="en-US"/>
-        </w:rPr>
-        <w:t xml:space="preserve"> %}</w:t>
+        <w:t>{% endfor %}</w:t>
       </w:r>
     </w:p>
     <w:p>
@@ -3554,14 +3365,9 @@
       <w:bookmarkStart w:id="3" w:name="_Toc197688616"/>
       <w:bookmarkStart w:id="4" w:name="_Toc147849649"/>
       <w:r>
-        <w:t xml:space="preserve">Tugas </w:t>
-      </w:r>
-      <w:proofErr w:type="spellStart"/>
-      <w:r>
-        <w:t>Praktikum</w:t>
+        <w:t>Tugas Praktikum</w:t>
       </w:r>
       <w:bookmarkEnd w:id="3"/>
-      <w:proofErr w:type="spellEnd"/>
     </w:p>
     <w:p>
       <w:pPr>
@@ -3582,105 +3388,7 @@
         <w:rPr>
           <w:lang w:val="en-US"/>
         </w:rPr>
-        <w:t xml:space="preserve">{% if </w:t>
-      </w:r>
-      <w:proofErr w:type="spellStart"/>
-      <w:r>
-        <w:rPr>
-          <w:lang w:val="en-US"/>
-        </w:rPr>
-        <w:t>daftar_tugas|length</w:t>
-      </w:r>
-      <w:proofErr w:type="spellEnd"/>
-      <w:r>
-        <w:rPr>
-          <w:lang w:val="en-US"/>
-        </w:rPr>
-        <w:t xml:space="preserve"> == 0 %} (Bagian ini </w:t>
-      </w:r>
-      <w:proofErr w:type="spellStart"/>
-      <w:r>
-        <w:rPr>
-          <w:lang w:val="en-US"/>
-        </w:rPr>
-        <w:t>muncul</w:t>
-      </w:r>
-      <w:proofErr w:type="spellEnd"/>
-      <w:r>
-        <w:rPr>
-          <w:lang w:val="en-US"/>
-        </w:rPr>
-        <w:t xml:space="preserve"> </w:t>
-      </w:r>
-      <w:proofErr w:type="spellStart"/>
-      <w:r>
-        <w:rPr>
-          <w:lang w:val="en-US"/>
-        </w:rPr>
-        <w:t>jika</w:t>
-      </w:r>
-      <w:proofErr w:type="spellEnd"/>
-      <w:r>
-        <w:rPr>
-          <w:lang w:val="en-US"/>
-        </w:rPr>
-        <w:t xml:space="preserve"> Bab 2 </w:t>
-      </w:r>
-      <w:proofErr w:type="spellStart"/>
-      <w:r>
-        <w:rPr>
-          <w:lang w:val="en-US"/>
-        </w:rPr>
-        <w:t>kosong</w:t>
-      </w:r>
-      <w:proofErr w:type="spellEnd"/>
-      <w:r>
-        <w:rPr>
-          <w:lang w:val="en-US"/>
-        </w:rPr>
-        <w:t xml:space="preserve">) Tidak </w:t>
-      </w:r>
-      <w:proofErr w:type="spellStart"/>
-      <w:r>
-        <w:rPr>
-          <w:lang w:val="en-US"/>
-        </w:rPr>
-        <w:t>ada</w:t>
-      </w:r>
-      <w:proofErr w:type="spellEnd"/>
-      <w:r>
-        <w:rPr>
-          <w:lang w:val="en-US"/>
-        </w:rPr>
-        <w:t xml:space="preserve"> tugas </w:t>
-      </w:r>
-      <w:proofErr w:type="spellStart"/>
-      <w:r>
-        <w:rPr>
-          <w:lang w:val="en-US"/>
-        </w:rPr>
-        <w:t>praktikum</w:t>
-      </w:r>
-      <w:proofErr w:type="spellEnd"/>
-      <w:r>
-        <w:rPr>
-          <w:lang w:val="en-US"/>
-        </w:rPr>
-        <w:t xml:space="preserve"> pada </w:t>
-      </w:r>
-      <w:proofErr w:type="spellStart"/>
-      <w:r>
-        <w:rPr>
-          <w:lang w:val="en-US"/>
-        </w:rPr>
-        <w:t>modul</w:t>
-      </w:r>
-      <w:proofErr w:type="spellEnd"/>
-      <w:r>
-        <w:rPr>
-          <w:lang w:val="en-US"/>
-        </w:rPr>
-        <w:t xml:space="preserve"> ini.</w:t>
+        <w:t>{% if daftar_tugas|length == 0 %} (Bagian ini muncul jika Bab 2 kosong) Tidak ada tugas praktikum pada modul ini.</w:t>
       </w:r>
     </w:p>
     <w:p>
@@ -3700,63 +3408,7 @@
         <w:rPr>
           <w:lang w:val="en-US"/>
         </w:rPr>
-        <w:t xml:space="preserve">{% else %} (Bagian ini </w:t>
-      </w:r>
-      <w:proofErr w:type="spellStart"/>
-      <w:r>
-        <w:rPr>
-          <w:lang w:val="en-US"/>
-        </w:rPr>
-        <w:t>muncul</w:t>
-      </w:r>
-      <w:proofErr w:type="spellEnd"/>
-      <w:r>
-        <w:rPr>
-          <w:lang w:val="en-US"/>
-        </w:rPr>
-        <w:t xml:space="preserve"> </w:t>
-      </w:r>
-      <w:proofErr w:type="spellStart"/>
-      <w:r>
-        <w:rPr>
-          <w:lang w:val="en-US"/>
-        </w:rPr>
-        <w:t>jika</w:t>
-      </w:r>
-      <w:proofErr w:type="spellEnd"/>
-      <w:r>
-        <w:rPr>
-          <w:lang w:val="en-US"/>
-        </w:rPr>
-        <w:t xml:space="preserve"> Bab 2 </w:t>
-      </w:r>
-      <w:proofErr w:type="spellStart"/>
-      <w:r>
-        <w:rPr>
-          <w:lang w:val="en-US"/>
-        </w:rPr>
-        <w:t>berisi</w:t>
-      </w:r>
-      <w:proofErr w:type="spellEnd"/>
-      <w:r>
-        <w:rPr>
-          <w:lang w:val="en-US"/>
-        </w:rPr>
-        <w:t xml:space="preserve"> data) {% for tugas in </w:t>
-      </w:r>
-      <w:proofErr w:type="spellStart"/>
-      <w:r>
-        <w:rPr>
-          <w:lang w:val="en-US"/>
-        </w:rPr>
-        <w:t>daftar_tugas</w:t>
-      </w:r>
-      <w:proofErr w:type="spellEnd"/>
-      <w:r>
-        <w:rPr>
-          <w:lang w:val="en-US"/>
-        </w:rPr>
-        <w:t xml:space="preserve"> %}</w:t>
+        <w:t>{% else %} (Bagian ini muncul jika Bab 2 berisi data) {% for tugas in daftar_tugas %}</w:t>
       </w:r>
     </w:p>
     <w:p>
@@ -3776,91 +3428,7 @@
         <w:rPr>
           <w:lang w:val="en-US"/>
         </w:rPr>
-        <w:t>2.</w:t>
-      </w:r>
-      <w:proofErr w:type="gramStart"/>
-      <w:r>
-        <w:rPr>
-          <w:lang w:val="en-US"/>
-        </w:rPr>
-        <w:t xml:space="preserve">{{ </w:t>
-      </w:r>
-      <w:proofErr w:type="spellStart"/>
-      <w:r>
-        <w:rPr>
-          <w:lang w:val="en-US"/>
-        </w:rPr>
-        <w:t>loop</w:t>
-      </w:r>
-      <w:proofErr w:type="gramEnd"/>
-      <w:r>
-        <w:rPr>
-          <w:lang w:val="en-US"/>
-        </w:rPr>
-        <w:t>.</w:t>
-      </w:r>
-      <w:proofErr w:type="gramStart"/>
-      <w:r>
-        <w:rPr>
-          <w:lang w:val="en-US"/>
-        </w:rPr>
-        <w:t>index</w:t>
-      </w:r>
-      <w:proofErr w:type="spellEnd"/>
-      <w:r>
-        <w:rPr>
-          <w:lang w:val="en-US"/>
-        </w:rPr>
-        <w:t xml:space="preserve"> }</w:t>
-      </w:r>
-      <w:proofErr w:type="gramEnd"/>
-      <w:r>
-        <w:rPr>
-          <w:lang w:val="en-US"/>
-        </w:rPr>
-        <w:t xml:space="preserve">} </w:t>
-      </w:r>
-      <w:proofErr w:type="gramStart"/>
-      <w:r>
-        <w:rPr>
-          <w:lang w:val="en-US"/>
-        </w:rPr>
-        <w:t xml:space="preserve">{{ </w:t>
-      </w:r>
-      <w:proofErr w:type="spellStart"/>
-      <w:r>
-        <w:rPr>
-          <w:lang w:val="en-US"/>
-        </w:rPr>
-        <w:t>tugas</w:t>
-      </w:r>
-      <w:proofErr w:type="gramEnd"/>
-      <w:r>
-        <w:rPr>
-          <w:lang w:val="en-US"/>
-        </w:rPr>
-        <w:t>.judul_sub_</w:t>
-      </w:r>
-      <w:proofErr w:type="gramStart"/>
-      <w:r>
-        <w:rPr>
-          <w:lang w:val="en-US"/>
-        </w:rPr>
-        <w:t>bab</w:t>
-      </w:r>
-      <w:proofErr w:type="spellEnd"/>
-      <w:r>
-        <w:rPr>
-          <w:lang w:val="en-US"/>
-        </w:rPr>
-        <w:t xml:space="preserve"> }</w:t>
-      </w:r>
-      <w:proofErr w:type="gramEnd"/>
-      <w:r>
-        <w:rPr>
-          <w:lang w:val="en-US"/>
-        </w:rPr>
-        <w:t>} (Style: Heading 2)</w:t>
+        <w:t>2.{{ loop.index }} {{ tugas.judul_sub_bab }} (Style: Heading 2)</w:t>
       </w:r>
     </w:p>
     <w:p>
@@ -3880,49 +3448,7 @@
         <w:rPr>
           <w:lang w:val="en-US"/>
         </w:rPr>
-        <w:t xml:space="preserve">Soal: </w:t>
-      </w:r>
-      <w:proofErr w:type="gramStart"/>
-      <w:r>
-        <w:rPr>
-          <w:lang w:val="en-US"/>
-        </w:rPr>
-        <w:t xml:space="preserve">{{ </w:t>
-      </w:r>
-      <w:proofErr w:type="spellStart"/>
-      <w:r>
-        <w:rPr>
-          <w:lang w:val="en-US"/>
-        </w:rPr>
-        <w:t>tugas.isi</w:t>
-      </w:r>
-      <w:proofErr w:type="gramEnd"/>
-      <w:r>
-        <w:rPr>
-          <w:lang w:val="en-US"/>
-        </w:rPr>
-        <w:t>_</w:t>
-      </w:r>
-      <w:proofErr w:type="gramStart"/>
-      <w:r>
-        <w:rPr>
-          <w:lang w:val="en-US"/>
-        </w:rPr>
-        <w:t>soal</w:t>
-      </w:r>
-      <w:proofErr w:type="spellEnd"/>
-      <w:r>
-        <w:rPr>
-          <w:lang w:val="en-US"/>
-        </w:rPr>
-        <w:t xml:space="preserve"> }</w:t>
-      </w:r>
-      <w:proofErr w:type="gramEnd"/>
-      <w:r>
-        <w:rPr>
-          <w:lang w:val="en-US"/>
-        </w:rPr>
-        <w:t>}</w:t>
+        <w:t>Soal: {{ tugas.isi_soal }}</w:t>
       </w:r>
     </w:p>
     <w:p>
@@ -3938,61 +3464,11 @@
           <w:lang w:val="en-US"/>
         </w:rPr>
       </w:pPr>
-      <w:proofErr w:type="spellStart"/>
       <w:r>
         <w:rPr>
           <w:lang w:val="en-US"/>
         </w:rPr>
-        <w:t>Jawaban</w:t>
-      </w:r>
-      <w:proofErr w:type="spellEnd"/>
-      <w:r>
-        <w:rPr>
-          <w:lang w:val="en-US"/>
-        </w:rPr>
-        <w:t xml:space="preserve">: </w:t>
-      </w:r>
-      <w:proofErr w:type="gramStart"/>
-      <w:r>
-        <w:rPr>
-          <w:lang w:val="en-US"/>
-        </w:rPr>
-        <w:t xml:space="preserve">{{ </w:t>
-      </w:r>
-      <w:proofErr w:type="spellStart"/>
-      <w:r>
-        <w:rPr>
-          <w:lang w:val="en-US"/>
-        </w:rPr>
-        <w:t>tugas.isi</w:t>
-      </w:r>
-      <w:proofErr w:type="gramEnd"/>
-      <w:r>
-        <w:rPr>
-          <w:lang w:val="en-US"/>
-        </w:rPr>
-        <w:t>_</w:t>
-      </w:r>
-      <w:proofErr w:type="gramStart"/>
-      <w:r>
-        <w:rPr>
-          <w:lang w:val="en-US"/>
-        </w:rPr>
-        <w:t>jawaban</w:t>
-      </w:r>
-      <w:proofErr w:type="spellEnd"/>
-      <w:r>
-        <w:rPr>
-          <w:lang w:val="en-US"/>
-        </w:rPr>
-        <w:t xml:space="preserve"> }</w:t>
-      </w:r>
-      <w:proofErr w:type="gramEnd"/>
-      <w:r>
-        <w:rPr>
-          <w:lang w:val="en-US"/>
-        </w:rPr>
-        <w:t>}</w:t>
+        <w:t>Jawaban: {{ tugas.isi_jawaban }}</w:t>
       </w:r>
     </w:p>
     <w:p>
@@ -4012,197 +3488,7 @@
         <w:rPr>
           <w:lang w:val="en-US"/>
         </w:rPr>
-        <w:t xml:space="preserve">{% if </w:t>
-      </w:r>
-      <w:proofErr w:type="spellStart"/>
-      <w:r>
-        <w:rPr>
-          <w:lang w:val="en-US"/>
-        </w:rPr>
-        <w:t>tugas.ada_gambar</w:t>
-      </w:r>
-      <w:proofErr w:type="spellEnd"/>
-      <w:r>
-        <w:rPr>
-          <w:lang w:val="en-US"/>
-        </w:rPr>
-        <w:t xml:space="preserve"> %} Lampiran Bukti: {% for </w:t>
-      </w:r>
-      <w:proofErr w:type="spellStart"/>
-      <w:r>
-        <w:rPr>
-          <w:lang w:val="en-US"/>
-        </w:rPr>
-        <w:t>gbr</w:t>
-      </w:r>
-      <w:proofErr w:type="spellEnd"/>
-      <w:r>
-        <w:rPr>
-          <w:lang w:val="en-US"/>
-        </w:rPr>
-        <w:t xml:space="preserve"> in </w:t>
-      </w:r>
-      <w:proofErr w:type="spellStart"/>
-      <w:proofErr w:type="gramStart"/>
-      <w:r>
-        <w:rPr>
-          <w:lang w:val="en-US"/>
-        </w:rPr>
-        <w:t>tugas.list</w:t>
-      </w:r>
-      <w:proofErr w:type="gramEnd"/>
-      <w:r>
-        <w:rPr>
-          <w:lang w:val="en-US"/>
-        </w:rPr>
-        <w:t>_gambar</w:t>
-      </w:r>
-      <w:proofErr w:type="spellEnd"/>
-      <w:r>
-        <w:rPr>
-          <w:lang w:val="en-US"/>
-        </w:rPr>
-        <w:t xml:space="preserve"> %} </w:t>
-      </w:r>
-      <w:proofErr w:type="gramStart"/>
-      <w:r>
-        <w:rPr>
-          <w:lang w:val="en-US"/>
-        </w:rPr>
-        <w:t xml:space="preserve">{{ </w:t>
-      </w:r>
-      <w:proofErr w:type="spellStart"/>
-      <w:r>
-        <w:rPr>
-          <w:lang w:val="en-US"/>
-        </w:rPr>
-        <w:t>gbr</w:t>
-      </w:r>
-      <w:proofErr w:type="gramEnd"/>
-      <w:r>
-        <w:rPr>
-          <w:lang w:val="en-US"/>
-        </w:rPr>
-        <w:t>.objek_</w:t>
-      </w:r>
-      <w:proofErr w:type="gramStart"/>
-      <w:r>
-        <w:rPr>
-          <w:lang w:val="en-US"/>
-        </w:rPr>
-        <w:t>gambar</w:t>
-      </w:r>
-      <w:proofErr w:type="spellEnd"/>
-      <w:r>
-        <w:rPr>
-          <w:lang w:val="en-US"/>
-        </w:rPr>
-        <w:t xml:space="preserve"> }</w:t>
-      </w:r>
-      <w:proofErr w:type="gramEnd"/>
-      <w:r>
-        <w:rPr>
-          <w:lang w:val="en-US"/>
-        </w:rPr>
-        <w:t xml:space="preserve">} Gambar </w:t>
-      </w:r>
-      <w:proofErr w:type="gramStart"/>
-      <w:r>
-        <w:rPr>
-          <w:lang w:val="en-US"/>
-        </w:rPr>
-        <w:t xml:space="preserve">2.{{ </w:t>
-      </w:r>
-      <w:proofErr w:type="spellStart"/>
-      <w:r>
-        <w:rPr>
-          <w:lang w:val="en-US"/>
-        </w:rPr>
-        <w:t>gbr</w:t>
-      </w:r>
-      <w:proofErr w:type="gramEnd"/>
-      <w:r>
-        <w:rPr>
-          <w:lang w:val="en-US"/>
-        </w:rPr>
-        <w:t>.nomor_</w:t>
-      </w:r>
-      <w:proofErr w:type="gramStart"/>
-      <w:r>
-        <w:rPr>
-          <w:lang w:val="en-US"/>
-        </w:rPr>
-        <w:t>tampil</w:t>
-      </w:r>
-      <w:proofErr w:type="spellEnd"/>
-      <w:r>
-        <w:rPr>
-          <w:lang w:val="en-US"/>
-        </w:rPr>
-        <w:t xml:space="preserve"> }</w:t>
-      </w:r>
-      <w:proofErr w:type="gramEnd"/>
-      <w:r>
-        <w:rPr>
-          <w:lang w:val="en-US"/>
-        </w:rPr>
-        <w:t xml:space="preserve">} </w:t>
-      </w:r>
-      <w:proofErr w:type="gramStart"/>
-      <w:r>
-        <w:rPr>
-          <w:lang w:val="en-US"/>
-        </w:rPr>
-        <w:t xml:space="preserve">{{ </w:t>
-      </w:r>
-      <w:proofErr w:type="spellStart"/>
-      <w:r>
-        <w:rPr>
-          <w:lang w:val="en-US"/>
-        </w:rPr>
-        <w:t>gbr</w:t>
-      </w:r>
-      <w:proofErr w:type="gramEnd"/>
-      <w:r>
-        <w:rPr>
-          <w:lang w:val="en-US"/>
-        </w:rPr>
-        <w:t>.</w:t>
-      </w:r>
-      <w:proofErr w:type="gramStart"/>
-      <w:r>
-        <w:rPr>
-          <w:lang w:val="en-US"/>
-        </w:rPr>
-        <w:t>caption</w:t>
-      </w:r>
-      <w:proofErr w:type="spellEnd"/>
-      <w:r>
-        <w:rPr>
-          <w:lang w:val="en-US"/>
-        </w:rPr>
-        <w:t xml:space="preserve"> }</w:t>
-      </w:r>
-      <w:proofErr w:type="gramEnd"/>
-      <w:r>
-        <w:rPr>
-          <w:lang w:val="en-US"/>
-        </w:rPr>
-        <w:t xml:space="preserve">} (Style: Caption) {% </w:t>
-      </w:r>
-      <w:proofErr w:type="spellStart"/>
-      <w:r>
-        <w:rPr>
-          <w:lang w:val="en-US"/>
-        </w:rPr>
-        <w:t>endfor</w:t>
-      </w:r>
-      <w:proofErr w:type="spellEnd"/>
-      <w:r>
-        <w:rPr>
-          <w:lang w:val="en-US"/>
-        </w:rPr>
-        <w:t xml:space="preserve"> %} {% endif %}</w:t>
+        <w:t>{% if tugas.ada_gambar %} Lampiran Bukti: {% for gbr in tugas.list_gambar %} {{ gbr.objek_gambar }} Gambar 2.{{ gbr.nomor_tampil }} {{ gbr.caption }} (Style: Caption) {% endfor %} {% endif %}</w:t>
       </w:r>
     </w:p>
     <w:p>
@@ -4222,21 +3508,7 @@
         <w:rPr>
           <w:lang w:val="en-US"/>
         </w:rPr>
-        <w:t xml:space="preserve">{% </w:t>
-      </w:r>
-      <w:proofErr w:type="spellStart"/>
-      <w:r>
-        <w:rPr>
-          <w:lang w:val="en-US"/>
-        </w:rPr>
-        <w:t>endfor</w:t>
-      </w:r>
-      <w:proofErr w:type="spellEnd"/>
-      <w:r>
-        <w:rPr>
-          <w:lang w:val="en-US"/>
-        </w:rPr>
-        <w:t xml:space="preserve"> %} {% endif %}</w:t>
+        <w:t>{% endfor %} {% endif %}</w:t>
       </w:r>
     </w:p>
     <w:p>
@@ -4274,47 +3546,11 @@
           <w:lang w:val="en-US"/>
         </w:rPr>
       </w:pPr>
-      <w:proofErr w:type="gramStart"/>
       <w:r>
         <w:rPr>
           <w:lang w:val="en-US"/>
         </w:rPr>
-        <w:t xml:space="preserve">{{ </w:t>
-      </w:r>
-      <w:proofErr w:type="spellStart"/>
-      <w:r>
-        <w:rPr>
-          <w:lang w:val="en-US"/>
-        </w:rPr>
-        <w:t>isi</w:t>
-      </w:r>
-      <w:proofErr w:type="gramEnd"/>
-      <w:r>
-        <w:rPr>
-          <w:lang w:val="en-US"/>
-        </w:rPr>
-        <w:t>_</w:t>
-      </w:r>
-      <w:proofErr w:type="gramStart"/>
-      <w:r>
-        <w:rPr>
-          <w:lang w:val="en-US"/>
-        </w:rPr>
-        <w:t>kesimpulan</w:t>
-      </w:r>
-      <w:proofErr w:type="spellEnd"/>
-      <w:r>
-        <w:rPr>
-          <w:lang w:val="en-US"/>
-        </w:rPr>
-        <w:t xml:space="preserve"> }</w:t>
-      </w:r>
-      <w:proofErr w:type="gramEnd"/>
-      <w:r>
-        <w:rPr>
-          <w:lang w:val="en-US"/>
-        </w:rPr>
-        <w:t>}</w:t>
+        <w:t>{{ isi_kesimpulan }}</w:t>
       </w:r>
     </w:p>
     <w:sectPr>
@@ -4329,7 +3565,7 @@
 </file>
 
 <file path=word/endnotes.xml><?xml version="1.0" encoding="utf-8"?>
-<w:endnotes xmlns:wpc="http://schemas.microsoft.com/office/word/2010/wordprocessingCanvas" xmlns:cx="http://schemas.microsoft.com/office/drawing/2014/chartex" xmlns:cx1="http://schemas.microsoft.com/office/drawing/2015/9/8/chartex" xmlns:cx2="http://schemas.microsoft.com/office/drawing/2015/10/21/chartex" xmlns:cx3="http://schemas.microsoft.com/office/drawing/2016/5/9/chartex" xmlns:cx4="http://schemas.microsoft.com/office/drawing/2016/5/10/chartex" xmlns:cx5="http://schemas.microsoft.com/office/drawing/2016/5/11/chartex" xmlns:cx6="http://schemas.microsoft.com/office/drawing/2016/5/12/chartex" xmlns:cx7="http://schemas.microsoft.com/office/drawing/2016/5/13/chartex" xmlns:cx8="http://schemas.microsoft.com/office/drawing/2016/5/14/chartex" xmlns:mc="http://schemas.openxmlformats.org/markup-compatibility/2006" xmlns:aink="http://schemas.microsoft.com/office/drawing/2016/ink" xmlns:am3d="http://schemas.microsoft.com/office/drawing/2017/model3d" xmlns:o="urn:schemas-microsoft-com:office:office" xmlns:oel="http://schemas.microsoft.com/office/2019/extlst" xmlns:r="http://schemas.openxmlformats.org/officeDocument/2006/relationships" xmlns:m="http://schemas.openxmlformats.org/officeDocument/2006/math" xmlns:v="urn:schemas-microsoft-com:vml" xmlns:wp14="http://schemas.microsoft.com/office/word/2010/wordprocessingDrawing" xmlns:wp="http://schemas.openxmlformats.org/drawingml/2006/wordprocessingDrawing" xmlns:w10="urn:schemas-microsoft-com:office:word" xmlns:w="http://schemas.openxmlformats.org/wordprocessingml/2006/main" xmlns:w14="http://schemas.microsoft.com/office/word/2010/wordml" xmlns:w15="http://schemas.microsoft.com/office/word/2012/wordml" xmlns:w16cex="http://schemas.microsoft.com/office/word/2018/wordml/cex" xmlns:w16cid="http://schemas.microsoft.com/office/word/2016/wordml/cid" xmlns:w16="http://schemas.microsoft.com/office/word/2018/wordml" xmlns:w16du="http://schemas.microsoft.com/office/word/2023/wordml/word16du" xmlns:w16sdtdh="http://schemas.microsoft.com/office/word/2020/wordml/sdtdatahash" xmlns:w16sdtfl="http://schemas.microsoft.com/office/word/2024/wordml/sdtformatlock" xmlns:w16se="http://schemas.microsoft.com/office/word/2015/wordml/symex" xmlns:wpg="http://schemas.microsoft.com/office/word/2010/wordprocessingGroup" xmlns:wpi="http://schemas.microsoft.com/office/word/2010/wordprocessingInk" xmlns:wne="http://schemas.microsoft.com/office/word/2006/wordml" xmlns:wps="http://schemas.microsoft.com/office/word/2010/wordprocessingShape" mc:Ignorable="w14 w15 w16se w16cid w16 w16cex w16sdtdh w16sdtfl w16du wp14">
+<w:endnotes xmlns:wpc="http://schemas.microsoft.com/office/word/2010/wordprocessingCanvas" xmlns:cx="http://schemas.microsoft.com/office/drawing/2014/chartex" xmlns:cx1="http://schemas.microsoft.com/office/drawing/2015/9/8/chartex" xmlns:cx2="http://schemas.microsoft.com/office/drawing/2015/10/21/chartex" xmlns:cx3="http://schemas.microsoft.com/office/drawing/2016/5/9/chartex" xmlns:cx4="http://schemas.microsoft.com/office/drawing/2016/5/10/chartex" xmlns:cx5="http://schemas.microsoft.com/office/drawing/2016/5/11/chartex" xmlns:cx6="http://schemas.microsoft.com/office/drawing/2016/5/12/chartex" xmlns:cx7="http://schemas.microsoft.com/office/drawing/2016/5/13/chartex" xmlns:cx8="http://schemas.microsoft.com/office/drawing/2016/5/14/chartex" xmlns:mc="http://schemas.openxmlformats.org/markup-compatibility/2006" xmlns:aink="http://schemas.microsoft.com/office/drawing/2016/ink" xmlns:am3d="http://schemas.microsoft.com/office/drawing/2017/model3d" xmlns:o="urn:schemas-microsoft-com:office:office" xmlns:r="http://schemas.openxmlformats.org/officeDocument/2006/relationships" xmlns:m="http://schemas.openxmlformats.org/officeDocument/2006/math" xmlns:v="urn:schemas-microsoft-com:vml" xmlns:wp14="http://schemas.microsoft.com/office/word/2010/wordprocessingDrawing" xmlns:wp="http://schemas.openxmlformats.org/drawingml/2006/wordprocessingDrawing" xmlns:w10="urn:schemas-microsoft-com:office:word" xmlns:w="http://schemas.openxmlformats.org/wordprocessingml/2006/main" xmlns:w14="http://schemas.microsoft.com/office/word/2010/wordml" xmlns:w15="http://schemas.microsoft.com/office/word/2012/wordml" xmlns:w16cex="http://schemas.microsoft.com/office/word/2018/wordml/cex" xmlns:w16cid="http://schemas.microsoft.com/office/word/2016/wordml/cid" xmlns:w16="http://schemas.microsoft.com/office/word/2018/wordml" xmlns:w16se="http://schemas.microsoft.com/office/word/2015/wordml/symex" xmlns:wpg="http://schemas.microsoft.com/office/word/2010/wordprocessingGroup" xmlns:wpi="http://schemas.microsoft.com/office/word/2010/wordprocessingInk" xmlns:wne="http://schemas.microsoft.com/office/word/2006/wordml" xmlns:wps="http://schemas.microsoft.com/office/word/2010/wordprocessingShape" mc:Ignorable="w14 w15 w16se w16cid w16 w16cex wp14">
   <w:endnote w:type="separator" w:id="-1">
     <w:p>
       <w:pPr>
@@ -4356,7 +3592,7 @@
 </file>
 
 <file path=word/footer1.xml><?xml version="1.0" encoding="utf-8"?>
-<w:ftr xmlns:wpc="http://schemas.microsoft.com/office/word/2010/wordprocessingCanvas" xmlns:cx="http://schemas.microsoft.com/office/drawing/2014/chartex" xmlns:cx1="http://schemas.microsoft.com/office/drawing/2015/9/8/chartex" xmlns:cx2="http://schemas.microsoft.com/office/drawing/2015/10/21/chartex" xmlns:cx3="http://schemas.microsoft.com/office/drawing/2016/5/9/chartex" xmlns:cx4="http://schemas.microsoft.com/office/drawing/2016/5/10/chartex" xmlns:cx5="http://schemas.microsoft.com/office/drawing/2016/5/11/chartex" xmlns:cx6="http://schemas.microsoft.com/office/drawing/2016/5/12/chartex" xmlns:cx7="http://schemas.microsoft.com/office/drawing/2016/5/13/chartex" xmlns:cx8="http://schemas.microsoft.com/office/drawing/2016/5/14/chartex" xmlns:mc="http://schemas.openxmlformats.org/markup-compatibility/2006" xmlns:aink="http://schemas.microsoft.com/office/drawing/2016/ink" xmlns:am3d="http://schemas.microsoft.com/office/drawing/2017/model3d" xmlns:o="urn:schemas-microsoft-com:office:office" xmlns:oel="http://schemas.microsoft.com/office/2019/extlst" xmlns:r="http://schemas.openxmlformats.org/officeDocument/2006/relationships" xmlns:m="http://schemas.openxmlformats.org/officeDocument/2006/math" xmlns:v="urn:schemas-microsoft-com:vml" xmlns:wp14="http://schemas.microsoft.com/office/word/2010/wordprocessingDrawing" xmlns:wp="http://schemas.openxmlformats.org/drawingml/2006/wordprocessingDrawing" xmlns:w10="urn:schemas-microsoft-com:office:word" xmlns:w="http://schemas.openxmlformats.org/wordprocessingml/2006/main" xmlns:w14="http://schemas.microsoft.com/office/word/2010/wordml" xmlns:w15="http://schemas.microsoft.com/office/word/2012/wordml" xmlns:w16cex="http://schemas.microsoft.com/office/word/2018/wordml/cex" xmlns:w16cid="http://schemas.microsoft.com/office/word/2016/wordml/cid" xmlns:w16="http://schemas.microsoft.com/office/word/2018/wordml" xmlns:w16du="http://schemas.microsoft.com/office/word/2023/wordml/word16du" xmlns:w16sdtdh="http://schemas.microsoft.com/office/word/2020/wordml/sdtdatahash" xmlns:w16sdtfl="http://schemas.microsoft.com/office/word/2024/wordml/sdtformatlock" xmlns:w16se="http://schemas.microsoft.com/office/word/2015/wordml/symex" xmlns:wpg="http://schemas.microsoft.com/office/word/2010/wordprocessingGroup" xmlns:wpi="http://schemas.microsoft.com/office/word/2010/wordprocessingInk" xmlns:wne="http://schemas.microsoft.com/office/word/2006/wordml" xmlns:wps="http://schemas.microsoft.com/office/word/2010/wordprocessingShape" mc:Ignorable="w14 w15 w16se w16cid w16 w16cex w16sdtdh w16sdtfl w16du wp14">
+<w:ftr xmlns:wpc="http://schemas.microsoft.com/office/word/2010/wordprocessingCanvas" xmlns:cx="http://schemas.microsoft.com/office/drawing/2014/chartex" xmlns:cx1="http://schemas.microsoft.com/office/drawing/2015/9/8/chartex" xmlns:cx2="http://schemas.microsoft.com/office/drawing/2015/10/21/chartex" xmlns:cx3="http://schemas.microsoft.com/office/drawing/2016/5/9/chartex" xmlns:cx4="http://schemas.microsoft.com/office/drawing/2016/5/10/chartex" xmlns:cx5="http://schemas.microsoft.com/office/drawing/2016/5/11/chartex" xmlns:cx6="http://schemas.microsoft.com/office/drawing/2016/5/12/chartex" xmlns:cx7="http://schemas.microsoft.com/office/drawing/2016/5/13/chartex" xmlns:cx8="http://schemas.microsoft.com/office/drawing/2016/5/14/chartex" xmlns:mc="http://schemas.openxmlformats.org/markup-compatibility/2006" xmlns:aink="http://schemas.microsoft.com/office/drawing/2016/ink" xmlns:am3d="http://schemas.microsoft.com/office/drawing/2017/model3d" xmlns:o="urn:schemas-microsoft-com:office:office" xmlns:r="http://schemas.openxmlformats.org/officeDocument/2006/relationships" xmlns:m="http://schemas.openxmlformats.org/officeDocument/2006/math" xmlns:v="urn:schemas-microsoft-com:vml" xmlns:wp14="http://schemas.microsoft.com/office/word/2010/wordprocessingDrawing" xmlns:wp="http://schemas.openxmlformats.org/drawingml/2006/wordprocessingDrawing" xmlns:w10="urn:schemas-microsoft-com:office:word" xmlns:w="http://schemas.openxmlformats.org/wordprocessingml/2006/main" xmlns:w14="http://schemas.microsoft.com/office/word/2010/wordml" xmlns:w15="http://schemas.microsoft.com/office/word/2012/wordml" xmlns:w16cex="http://schemas.microsoft.com/office/word/2018/wordml/cex" xmlns:w16cid="http://schemas.microsoft.com/office/word/2016/wordml/cid" xmlns:w16="http://schemas.microsoft.com/office/word/2018/wordml" xmlns:w16se="http://schemas.microsoft.com/office/word/2015/wordml/symex" xmlns:wpg="http://schemas.microsoft.com/office/word/2010/wordprocessingGroup" xmlns:wpi="http://schemas.microsoft.com/office/word/2010/wordprocessingInk" xmlns:wne="http://schemas.microsoft.com/office/word/2006/wordml" xmlns:wps="http://schemas.microsoft.com/office/word/2010/wordprocessingShape" mc:Ignorable="w14 w15 w16se w16cid w16 w16cex wp14">
   <w:sdt>
     <w:sdtPr>
       <w:id w:val="-517623792"/>
@@ -4405,7 +3641,7 @@
 </file>
 
 <file path=word/footer2.xml><?xml version="1.0" encoding="utf-8"?>
-<w:ftr xmlns:wpc="http://schemas.microsoft.com/office/word/2010/wordprocessingCanvas" xmlns:cx="http://schemas.microsoft.com/office/drawing/2014/chartex" xmlns:cx1="http://schemas.microsoft.com/office/drawing/2015/9/8/chartex" xmlns:cx2="http://schemas.microsoft.com/office/drawing/2015/10/21/chartex" xmlns:cx3="http://schemas.microsoft.com/office/drawing/2016/5/9/chartex" xmlns:cx4="http://schemas.microsoft.com/office/drawing/2016/5/10/chartex" xmlns:cx5="http://schemas.microsoft.com/office/drawing/2016/5/11/chartex" xmlns:cx6="http://schemas.microsoft.com/office/drawing/2016/5/12/chartex" xmlns:cx7="http://schemas.microsoft.com/office/drawing/2016/5/13/chartex" xmlns:cx8="http://schemas.microsoft.com/office/drawing/2016/5/14/chartex" xmlns:mc="http://schemas.openxmlformats.org/markup-compatibility/2006" xmlns:aink="http://schemas.microsoft.com/office/drawing/2016/ink" xmlns:am3d="http://schemas.microsoft.com/office/drawing/2017/model3d" xmlns:o="urn:schemas-microsoft-com:office:office" xmlns:oel="http://schemas.microsoft.com/office/2019/extlst" xmlns:r="http://schemas.openxmlformats.org/officeDocument/2006/relationships" xmlns:m="http://schemas.openxmlformats.org/officeDocument/2006/math" xmlns:v="urn:schemas-microsoft-com:vml" xmlns:wp14="http://schemas.microsoft.com/office/word/2010/wordprocessingDrawing" xmlns:wp="http://schemas.openxmlformats.org/drawingml/2006/wordprocessingDrawing" xmlns:w10="urn:schemas-microsoft-com:office:word" xmlns:w="http://schemas.openxmlformats.org/wordprocessingml/2006/main" xmlns:w14="http://schemas.microsoft.com/office/word/2010/wordml" xmlns:w15="http://schemas.microsoft.com/office/word/2012/wordml" xmlns:w16cex="http://schemas.microsoft.com/office/word/2018/wordml/cex" xmlns:w16cid="http://schemas.microsoft.com/office/word/2016/wordml/cid" xmlns:w16="http://schemas.microsoft.com/office/word/2018/wordml" xmlns:w16du="http://schemas.microsoft.com/office/word/2023/wordml/word16du" xmlns:w16sdtdh="http://schemas.microsoft.com/office/word/2020/wordml/sdtdatahash" xmlns:w16sdtfl="http://schemas.microsoft.com/office/word/2024/wordml/sdtformatlock" xmlns:w16se="http://schemas.microsoft.com/office/word/2015/wordml/symex" xmlns:wpg="http://schemas.microsoft.com/office/word/2010/wordprocessingGroup" xmlns:wpi="http://schemas.microsoft.com/office/word/2010/wordprocessingInk" xmlns:wne="http://schemas.microsoft.com/office/word/2006/wordml" xmlns:wps="http://schemas.microsoft.com/office/word/2010/wordprocessingShape" mc:Ignorable="w14 w15 w16se w16cid w16 w16cex w16sdtdh w16sdtfl w16du wp14">
+<w:ftr xmlns:wpc="http://schemas.microsoft.com/office/word/2010/wordprocessingCanvas" xmlns:cx="http://schemas.microsoft.com/office/drawing/2014/chartex" xmlns:cx1="http://schemas.microsoft.com/office/drawing/2015/9/8/chartex" xmlns:cx2="http://schemas.microsoft.com/office/drawing/2015/10/21/chartex" xmlns:cx3="http://schemas.microsoft.com/office/drawing/2016/5/9/chartex" xmlns:cx4="http://schemas.microsoft.com/office/drawing/2016/5/10/chartex" xmlns:cx5="http://schemas.microsoft.com/office/drawing/2016/5/11/chartex" xmlns:cx6="http://schemas.microsoft.com/office/drawing/2016/5/12/chartex" xmlns:cx7="http://schemas.microsoft.com/office/drawing/2016/5/13/chartex" xmlns:cx8="http://schemas.microsoft.com/office/drawing/2016/5/14/chartex" xmlns:mc="http://schemas.openxmlformats.org/markup-compatibility/2006" xmlns:aink="http://schemas.microsoft.com/office/drawing/2016/ink" xmlns:am3d="http://schemas.microsoft.com/office/drawing/2017/model3d" xmlns:o="urn:schemas-microsoft-com:office:office" xmlns:r="http://schemas.openxmlformats.org/officeDocument/2006/relationships" xmlns:m="http://schemas.openxmlformats.org/officeDocument/2006/math" xmlns:v="urn:schemas-microsoft-com:vml" xmlns:wp14="http://schemas.microsoft.com/office/word/2010/wordprocessingDrawing" xmlns:wp="http://schemas.openxmlformats.org/drawingml/2006/wordprocessingDrawing" xmlns:w10="urn:schemas-microsoft-com:office:word" xmlns:w="http://schemas.openxmlformats.org/wordprocessingml/2006/main" xmlns:w14="http://schemas.microsoft.com/office/word/2010/wordml" xmlns:w15="http://schemas.microsoft.com/office/word/2012/wordml" xmlns:w16cex="http://schemas.microsoft.com/office/word/2018/wordml/cex" xmlns:w16cid="http://schemas.microsoft.com/office/word/2016/wordml/cid" xmlns:w16="http://schemas.microsoft.com/office/word/2018/wordml" xmlns:w16se="http://schemas.microsoft.com/office/word/2015/wordml/symex" xmlns:wpg="http://schemas.microsoft.com/office/word/2010/wordprocessingGroup" xmlns:wpi="http://schemas.microsoft.com/office/word/2010/wordprocessingInk" xmlns:wne="http://schemas.microsoft.com/office/word/2006/wordml" xmlns:wps="http://schemas.microsoft.com/office/word/2010/wordprocessingShape" mc:Ignorable="w14 w15 w16se w16cid w16 w16cex wp14">
   <w:sdt>
     <w:sdtPr>
       <w:id w:val="-234937495"/>
@@ -4454,7 +3690,7 @@
 </file>
 
 <file path=word/footnotes.xml><?xml version="1.0" encoding="utf-8"?>
-<w:footnotes xmlns:wpc="http://schemas.microsoft.com/office/word/2010/wordprocessingCanvas" xmlns:cx="http://schemas.microsoft.com/office/drawing/2014/chartex" xmlns:cx1="http://schemas.microsoft.com/office/drawing/2015/9/8/chartex" xmlns:cx2="http://schemas.microsoft.com/office/drawing/2015/10/21/chartex" xmlns:cx3="http://schemas.microsoft.com/office/drawing/2016/5/9/chartex" xmlns:cx4="http://schemas.microsoft.com/office/drawing/2016/5/10/chartex" xmlns:cx5="http://schemas.microsoft.com/office/drawing/2016/5/11/chartex" xmlns:cx6="http://schemas.microsoft.com/office/drawing/2016/5/12/chartex" xmlns:cx7="http://schemas.microsoft.com/office/drawing/2016/5/13/chartex" xmlns:cx8="http://schemas.microsoft.com/office/drawing/2016/5/14/chartex" xmlns:mc="http://schemas.openxmlformats.org/markup-compatibility/2006" xmlns:aink="http://schemas.microsoft.com/office/drawing/2016/ink" xmlns:am3d="http://schemas.microsoft.com/office/drawing/2017/model3d" xmlns:o="urn:schemas-microsoft-com:office:office" xmlns:oel="http://schemas.microsoft.com/office/2019/extlst" xmlns:r="http://schemas.openxmlformats.org/officeDocument/2006/relationships" xmlns:m="http://schemas.openxmlformats.org/officeDocument/2006/math" xmlns:v="urn:schemas-microsoft-com:vml" xmlns:wp14="http://schemas.microsoft.com/office/word/2010/wordprocessingDrawing" xmlns:wp="http://schemas.openxmlformats.org/drawingml/2006/wordprocessingDrawing" xmlns:w10="urn:schemas-microsoft-com:office:word" xmlns:w="http://schemas.openxmlformats.org/wordprocessingml/2006/main" xmlns:w14="http://schemas.microsoft.com/office/word/2010/wordml" xmlns:w15="http://schemas.microsoft.com/office/word/2012/wordml" xmlns:w16cex="http://schemas.microsoft.com/office/word/2018/wordml/cex" xmlns:w16cid="http://schemas.microsoft.com/office/word/2016/wordml/cid" xmlns:w16="http://schemas.microsoft.com/office/word/2018/wordml" xmlns:w16du="http://schemas.microsoft.com/office/word/2023/wordml/word16du" xmlns:w16sdtdh="http://schemas.microsoft.com/office/word/2020/wordml/sdtdatahash" xmlns:w16sdtfl="http://schemas.microsoft.com/office/word/2024/wordml/sdtformatlock" xmlns:w16se="http://schemas.microsoft.com/office/word/2015/wordml/symex" xmlns:wpg="http://schemas.microsoft.com/office/word/2010/wordprocessingGroup" xmlns:wpi="http://schemas.microsoft.com/office/word/2010/wordprocessingInk" xmlns:wne="http://schemas.microsoft.com/office/word/2006/wordml" xmlns:wps="http://schemas.microsoft.com/office/word/2010/wordprocessingShape" mc:Ignorable="w14 w15 w16se w16cid w16 w16cex w16sdtdh w16sdtfl w16du wp14">
+<w:footnotes xmlns:wpc="http://schemas.microsoft.com/office/word/2010/wordprocessingCanvas" xmlns:cx="http://schemas.microsoft.com/office/drawing/2014/chartex" xmlns:cx1="http://schemas.microsoft.com/office/drawing/2015/9/8/chartex" xmlns:cx2="http://schemas.microsoft.com/office/drawing/2015/10/21/chartex" xmlns:cx3="http://schemas.microsoft.com/office/drawing/2016/5/9/chartex" xmlns:cx4="http://schemas.microsoft.com/office/drawing/2016/5/10/chartex" xmlns:cx5="http://schemas.microsoft.com/office/drawing/2016/5/11/chartex" xmlns:cx6="http://schemas.microsoft.com/office/drawing/2016/5/12/chartex" xmlns:cx7="http://schemas.microsoft.com/office/drawing/2016/5/13/chartex" xmlns:cx8="http://schemas.microsoft.com/office/drawing/2016/5/14/chartex" xmlns:mc="http://schemas.openxmlformats.org/markup-compatibility/2006" xmlns:aink="http://schemas.microsoft.com/office/drawing/2016/ink" xmlns:am3d="http://schemas.microsoft.com/office/drawing/2017/model3d" xmlns:o="urn:schemas-microsoft-com:office:office" xmlns:r="http://schemas.openxmlformats.org/officeDocument/2006/relationships" xmlns:m="http://schemas.openxmlformats.org/officeDocument/2006/math" xmlns:v="urn:schemas-microsoft-com:vml" xmlns:wp14="http://schemas.microsoft.com/office/word/2010/wordprocessingDrawing" xmlns:wp="http://schemas.openxmlformats.org/drawingml/2006/wordprocessingDrawing" xmlns:w10="urn:schemas-microsoft-com:office:word" xmlns:w="http://schemas.openxmlformats.org/wordprocessingml/2006/main" xmlns:w14="http://schemas.microsoft.com/office/word/2010/wordml" xmlns:w15="http://schemas.microsoft.com/office/word/2012/wordml" xmlns:w16cex="http://schemas.microsoft.com/office/word/2018/wordml/cex" xmlns:w16cid="http://schemas.microsoft.com/office/word/2016/wordml/cid" xmlns:w16="http://schemas.microsoft.com/office/word/2018/wordml" xmlns:w16se="http://schemas.microsoft.com/office/word/2015/wordml/symex" xmlns:wpg="http://schemas.microsoft.com/office/word/2010/wordprocessingGroup" xmlns:wpi="http://schemas.microsoft.com/office/word/2010/wordprocessingInk" xmlns:wne="http://schemas.microsoft.com/office/word/2006/wordml" xmlns:wps="http://schemas.microsoft.com/office/word/2010/wordprocessingShape" mc:Ignorable="w14 w15 w16se w16cid w16 w16cex wp14">
   <w:footnote w:type="separator" w:id="-1">
     <w:p>
       <w:pPr>
@@ -4481,7 +3717,7 @@
 </file>
 
 <file path=word/numbering.xml><?xml version="1.0" encoding="utf-8"?>
-<w:numbering xmlns:wpc="http://schemas.microsoft.com/office/word/2010/wordprocessingCanvas" xmlns:cx="http://schemas.microsoft.com/office/drawing/2014/chartex" xmlns:cx1="http://schemas.microsoft.com/office/drawing/2015/9/8/chartex" xmlns:cx2="http://schemas.microsoft.com/office/drawing/2015/10/21/chartex" xmlns:cx3="http://schemas.microsoft.com/office/drawing/2016/5/9/chartex" xmlns:cx4="http://schemas.microsoft.com/office/drawing/2016/5/10/chartex" xmlns:cx5="http://schemas.microsoft.com/office/drawing/2016/5/11/chartex" xmlns:cx6="http://schemas.microsoft.com/office/drawing/2016/5/12/chartex" xmlns:cx7="http://schemas.microsoft.com/office/drawing/2016/5/13/chartex" xmlns:cx8="http://schemas.microsoft.com/office/drawing/2016/5/14/chartex" xmlns:mc="http://schemas.openxmlformats.org/markup-compatibility/2006" xmlns:aink="http://schemas.microsoft.com/office/drawing/2016/ink" xmlns:am3d="http://schemas.microsoft.com/office/drawing/2017/model3d" xmlns:o="urn:schemas-microsoft-com:office:office" xmlns:oel="http://schemas.microsoft.com/office/2019/extlst" xmlns:r="http://schemas.openxmlformats.org/officeDocument/2006/relationships" xmlns:m="http://schemas.openxmlformats.org/officeDocument/2006/math" xmlns:v="urn:schemas-microsoft-com:vml" xmlns:wp14="http://schemas.microsoft.com/office/word/2010/wordprocessingDrawing" xmlns:wp="http://schemas.openxmlformats.org/drawingml/2006/wordprocessingDrawing" xmlns:w10="urn:schemas-microsoft-com:office:word" xmlns:w="http://schemas.openxmlformats.org/wordprocessingml/2006/main" xmlns:w14="http://schemas.microsoft.com/office/word/2010/wordml" xmlns:w15="http://schemas.microsoft.com/office/word/2012/wordml" xmlns:w16cex="http://schemas.microsoft.com/office/word/2018/wordml/cex" xmlns:w16cid="http://schemas.microsoft.com/office/word/2016/wordml/cid" xmlns:w16="http://schemas.microsoft.com/office/word/2018/wordml" xmlns:w16du="http://schemas.microsoft.com/office/word/2023/wordml/word16du" xmlns:w16sdtdh="http://schemas.microsoft.com/office/word/2020/wordml/sdtdatahash" xmlns:w16sdtfl="http://schemas.microsoft.com/office/word/2024/wordml/sdtformatlock" xmlns:w16se="http://schemas.microsoft.com/office/word/2015/wordml/symex" xmlns:wpg="http://schemas.microsoft.com/office/word/2010/wordprocessingGroup" xmlns:wpi="http://schemas.microsoft.com/office/word/2010/wordprocessingInk" xmlns:wne="http://schemas.microsoft.com/office/word/2006/wordml" xmlns:wps="http://schemas.microsoft.com/office/word/2010/wordprocessingShape" mc:Ignorable="w14 w15 w16se w16cid w16 w16cex w16sdtdh w16sdtfl w16du wp14">
+<w:numbering xmlns:wpc="http://schemas.microsoft.com/office/word/2010/wordprocessingCanvas" xmlns:cx="http://schemas.microsoft.com/office/drawing/2014/chartex" xmlns:cx1="http://schemas.microsoft.com/office/drawing/2015/9/8/chartex" xmlns:cx2="http://schemas.microsoft.com/office/drawing/2015/10/21/chartex" xmlns:cx3="http://schemas.microsoft.com/office/drawing/2016/5/9/chartex" xmlns:cx4="http://schemas.microsoft.com/office/drawing/2016/5/10/chartex" xmlns:cx5="http://schemas.microsoft.com/office/drawing/2016/5/11/chartex" xmlns:cx6="http://schemas.microsoft.com/office/drawing/2016/5/12/chartex" xmlns:cx7="http://schemas.microsoft.com/office/drawing/2016/5/13/chartex" xmlns:cx8="http://schemas.microsoft.com/office/drawing/2016/5/14/chartex" xmlns:mc="http://schemas.openxmlformats.org/markup-compatibility/2006" xmlns:aink="http://schemas.microsoft.com/office/drawing/2016/ink" xmlns:am3d="http://schemas.microsoft.com/office/drawing/2017/model3d" xmlns:o="urn:schemas-microsoft-com:office:office" xmlns:r="http://schemas.openxmlformats.org/officeDocument/2006/relationships" xmlns:m="http://schemas.openxmlformats.org/officeDocument/2006/math" xmlns:v="urn:schemas-microsoft-com:vml" xmlns:wp14="http://schemas.microsoft.com/office/word/2010/wordprocessingDrawing" xmlns:wp="http://schemas.openxmlformats.org/drawingml/2006/wordprocessingDrawing" xmlns:w10="urn:schemas-microsoft-com:office:word" xmlns:w="http://schemas.openxmlformats.org/wordprocessingml/2006/main" xmlns:w14="http://schemas.microsoft.com/office/word/2010/wordml" xmlns:w15="http://schemas.microsoft.com/office/word/2012/wordml" xmlns:w16cex="http://schemas.microsoft.com/office/word/2018/wordml/cex" xmlns:w16cid="http://schemas.microsoft.com/office/word/2016/wordml/cid" xmlns:w16="http://schemas.microsoft.com/office/word/2018/wordml" xmlns:w16se="http://schemas.microsoft.com/office/word/2015/wordml/symex" xmlns:wpg="http://schemas.microsoft.com/office/word/2010/wordprocessingGroup" xmlns:wpi="http://schemas.microsoft.com/office/word/2010/wordprocessingInk" xmlns:wne="http://schemas.microsoft.com/office/word/2006/wordml" xmlns:wps="http://schemas.microsoft.com/office/word/2010/wordprocessingShape" mc:Ignorable="w14 w15 w16se w16cid w16 w16cex wp14">
   <w:abstractNum w:abstractNumId="0" w15:restartNumberingAfterBreak="0">
     <w:nsid w:val="01344BC1"/>
     <w:multiLevelType w:val="hybridMultilevel"/>
@@ -7481,106 +6717,106 @@
       </w:pPr>
     </w:lvl>
   </w:abstractNum>
-  <w:num w:numId="1" w16cid:durableId="1654677218">
+  <w:num w:numId="1">
     <w:abstractNumId w:val="31"/>
   </w:num>
-  <w:num w:numId="2" w16cid:durableId="175121552">
+  <w:num w:numId="2">
     <w:abstractNumId w:val="25"/>
   </w:num>
-  <w:num w:numId="3" w16cid:durableId="596401328">
+  <w:num w:numId="3">
     <w:abstractNumId w:val="10"/>
   </w:num>
-  <w:num w:numId="4" w16cid:durableId="389117485">
+  <w:num w:numId="4">
     <w:abstractNumId w:val="9"/>
   </w:num>
-  <w:num w:numId="5" w16cid:durableId="1755279736">
+  <w:num w:numId="5">
     <w:abstractNumId w:val="22"/>
   </w:num>
-  <w:num w:numId="6" w16cid:durableId="172231383">
+  <w:num w:numId="6">
     <w:abstractNumId w:val="2"/>
   </w:num>
-  <w:num w:numId="7" w16cid:durableId="2070955809">
+  <w:num w:numId="7">
     <w:abstractNumId w:val="32"/>
   </w:num>
-  <w:num w:numId="8" w16cid:durableId="576212238">
+  <w:num w:numId="8">
     <w:abstractNumId w:val="7"/>
   </w:num>
-  <w:num w:numId="9" w16cid:durableId="582029936">
+  <w:num w:numId="9">
     <w:abstractNumId w:val="0"/>
   </w:num>
-  <w:num w:numId="10" w16cid:durableId="1967926187">
+  <w:num w:numId="10">
     <w:abstractNumId w:val="1"/>
   </w:num>
-  <w:num w:numId="11" w16cid:durableId="1896546671">
+  <w:num w:numId="11">
     <w:abstractNumId w:val="14"/>
   </w:num>
-  <w:num w:numId="12" w16cid:durableId="531456458">
+  <w:num w:numId="12">
     <w:abstractNumId w:val="21"/>
   </w:num>
-  <w:num w:numId="13" w16cid:durableId="4984714">
+  <w:num w:numId="13">
     <w:abstractNumId w:val="17"/>
   </w:num>
-  <w:num w:numId="14" w16cid:durableId="1938446030">
+  <w:num w:numId="14">
     <w:abstractNumId w:val="30"/>
   </w:num>
-  <w:num w:numId="15" w16cid:durableId="1294094243">
+  <w:num w:numId="15">
     <w:abstractNumId w:val="28"/>
   </w:num>
-  <w:num w:numId="16" w16cid:durableId="724648704">
+  <w:num w:numId="16">
     <w:abstractNumId w:val="4"/>
   </w:num>
-  <w:num w:numId="17" w16cid:durableId="852380466">
+  <w:num w:numId="17">
     <w:abstractNumId w:val="3"/>
   </w:num>
-  <w:num w:numId="18" w16cid:durableId="791482080">
+  <w:num w:numId="18">
     <w:abstractNumId w:val="26"/>
   </w:num>
-  <w:num w:numId="19" w16cid:durableId="122626575">
+  <w:num w:numId="19">
     <w:abstractNumId w:val="19"/>
   </w:num>
-  <w:num w:numId="20" w16cid:durableId="1455562247">
+  <w:num w:numId="20">
     <w:abstractNumId w:val="15"/>
   </w:num>
-  <w:num w:numId="21" w16cid:durableId="1288583248">
+  <w:num w:numId="21">
     <w:abstractNumId w:val="5"/>
   </w:num>
-  <w:num w:numId="22" w16cid:durableId="723527819">
+  <w:num w:numId="22">
     <w:abstractNumId w:val="6"/>
   </w:num>
-  <w:num w:numId="23" w16cid:durableId="160238791">
+  <w:num w:numId="23">
     <w:abstractNumId w:val="20"/>
   </w:num>
-  <w:num w:numId="24" w16cid:durableId="1008675173">
+  <w:num w:numId="24">
     <w:abstractNumId w:val="13"/>
   </w:num>
-  <w:num w:numId="25" w16cid:durableId="2130510195">
+  <w:num w:numId="25">
     <w:abstractNumId w:val="18"/>
   </w:num>
-  <w:num w:numId="26" w16cid:durableId="2072540866">
+  <w:num w:numId="26">
     <w:abstractNumId w:val="11"/>
   </w:num>
-  <w:num w:numId="27" w16cid:durableId="934555663">
+  <w:num w:numId="27">
     <w:abstractNumId w:val="27"/>
   </w:num>
-  <w:num w:numId="28" w16cid:durableId="1514300958">
+  <w:num w:numId="28">
     <w:abstractNumId w:val="23"/>
   </w:num>
-  <w:num w:numId="29" w16cid:durableId="1519276575">
+  <w:num w:numId="29">
     <w:abstractNumId w:val="16"/>
   </w:num>
-  <w:num w:numId="30" w16cid:durableId="1262296187">
+  <w:num w:numId="30">
     <w:abstractNumId w:val="24"/>
   </w:num>
-  <w:num w:numId="31" w16cid:durableId="23289935">
+  <w:num w:numId="31">
     <w:abstractNumId w:val="33"/>
   </w:num>
-  <w:num w:numId="32" w16cid:durableId="1483085652">
+  <w:num w:numId="32">
     <w:abstractNumId w:val="12"/>
   </w:num>
-  <w:num w:numId="33" w16cid:durableId="1144812362">
+  <w:num w:numId="33">
     <w:abstractNumId w:val="8"/>
   </w:num>
-  <w:num w:numId="34" w16cid:durableId="1309047552">
+  <w:num w:numId="34">
     <w:abstractNumId w:val="29"/>
   </w:num>
   <w:numIdMacAtCleanup w:val="2"/>
@@ -7588,7 +6824,7 @@
 </file>
 
 <file path=word/styles.xml><?xml version="1.0" encoding="utf-8"?>
-<w:styles xmlns:mc="http://schemas.openxmlformats.org/markup-compatibility/2006" xmlns:r="http://schemas.openxmlformats.org/officeDocument/2006/relationships" xmlns:w="http://schemas.openxmlformats.org/wordprocessingml/2006/main" xmlns:w14="http://schemas.microsoft.com/office/word/2010/wordml" xmlns:w15="http://schemas.microsoft.com/office/word/2012/wordml" xmlns:w16cex="http://schemas.microsoft.com/office/word/2018/wordml/cex" xmlns:w16cid="http://schemas.microsoft.com/office/word/2016/wordml/cid" xmlns:w16="http://schemas.microsoft.com/office/word/2018/wordml" xmlns:w16du="http://schemas.microsoft.com/office/word/2023/wordml/word16du" xmlns:w16sdtdh="http://schemas.microsoft.com/office/word/2020/wordml/sdtdatahash" xmlns:w16sdtfl="http://schemas.microsoft.com/office/word/2024/wordml/sdtformatlock" xmlns:w16se="http://schemas.microsoft.com/office/word/2015/wordml/symex" mc:Ignorable="w14 w15 w16se w16cid w16 w16cex w16sdtdh w16sdtfl w16du">
+<w:styles xmlns:mc="http://schemas.openxmlformats.org/markup-compatibility/2006" xmlns:r="http://schemas.openxmlformats.org/officeDocument/2006/relationships" xmlns:w="http://schemas.openxmlformats.org/wordprocessingml/2006/main" xmlns:w14="http://schemas.microsoft.com/office/word/2010/wordml" xmlns:w15="http://schemas.microsoft.com/office/word/2012/wordml" xmlns:w16cex="http://schemas.microsoft.com/office/word/2018/wordml/cex" xmlns:w16cid="http://schemas.microsoft.com/office/word/2016/wordml/cid" xmlns:w16="http://schemas.microsoft.com/office/word/2018/wordml" xmlns:w16se="http://schemas.microsoft.com/office/word/2015/wordml/symex" mc:Ignorable="w14 w15 w16se w16cid w16 w16cex">
   <w:docDefaults>
     <w:rPrDefault>
       <w:rPr>
@@ -8239,6 +7475,7 @@
   <w:style w:type="character" w:default="1" w:styleId="DefaultParagraphFont">
     <w:name w:val="Default Paragraph Font"/>
     <w:uiPriority w:val="1"/>
+    <w:semiHidden/>
     <w:unhideWhenUsed/>
   </w:style>
   <w:style w:type="table" w:default="1" w:styleId="TableNormal">

</xml_diff>

<commit_message>
perbaikan layout langkah kerja manual selesai
</commit_message>
<xml_diff>
--- a/kuliah/DocumentGenerator_Laporan_Praktikum/src/templates/format-1.docx
+++ b/kuliah/DocumentGenerator_Laporan_Praktikum/src/templates/format-1.docx
@@ -1,6 +1,6 @@
 
 <file path=word/document.xml><?xml version="1.0" encoding="utf-8"?>
-<w:document xmlns:wpc="http://schemas.microsoft.com/office/word/2010/wordprocessingCanvas" xmlns:cx="http://schemas.microsoft.com/office/drawing/2014/chartex" xmlns:cx1="http://schemas.microsoft.com/office/drawing/2015/9/8/chartex" xmlns:cx2="http://schemas.microsoft.com/office/drawing/2015/10/21/chartex" xmlns:cx3="http://schemas.microsoft.com/office/drawing/2016/5/9/chartex" xmlns:cx4="http://schemas.microsoft.com/office/drawing/2016/5/10/chartex" xmlns:cx5="http://schemas.microsoft.com/office/drawing/2016/5/11/chartex" xmlns:cx6="http://schemas.microsoft.com/office/drawing/2016/5/12/chartex" xmlns:cx7="http://schemas.microsoft.com/office/drawing/2016/5/13/chartex" xmlns:cx8="http://schemas.microsoft.com/office/drawing/2016/5/14/chartex" xmlns:mc="http://schemas.openxmlformats.org/markup-compatibility/2006" xmlns:aink="http://schemas.microsoft.com/office/drawing/2016/ink" xmlns:am3d="http://schemas.microsoft.com/office/drawing/2017/model3d" xmlns:o="urn:schemas-microsoft-com:office:office" xmlns:r="http://schemas.openxmlformats.org/officeDocument/2006/relationships" xmlns:m="http://schemas.openxmlformats.org/officeDocument/2006/math" xmlns:v="urn:schemas-microsoft-com:vml" xmlns:wp14="http://schemas.microsoft.com/office/word/2010/wordprocessingDrawing" xmlns:wp="http://schemas.openxmlformats.org/drawingml/2006/wordprocessingDrawing" xmlns:w10="urn:schemas-microsoft-com:office:word" xmlns:w="http://schemas.openxmlformats.org/wordprocessingml/2006/main" xmlns:w14="http://schemas.microsoft.com/office/word/2010/wordml" xmlns:w15="http://schemas.microsoft.com/office/word/2012/wordml" xmlns:w16cex="http://schemas.microsoft.com/office/word/2018/wordml/cex" xmlns:w16cid="http://schemas.microsoft.com/office/word/2016/wordml/cid" xmlns:w16="http://schemas.microsoft.com/office/word/2018/wordml" xmlns:w16se="http://schemas.microsoft.com/office/word/2015/wordml/symex" xmlns:wpg="http://schemas.microsoft.com/office/word/2010/wordprocessingGroup" xmlns:wpi="http://schemas.microsoft.com/office/word/2010/wordprocessingInk" xmlns:wne="http://schemas.microsoft.com/office/word/2006/wordml" xmlns:wps="http://schemas.microsoft.com/office/word/2010/wordprocessingShape" mc:Ignorable="w14 w15 w16se w16cid w16 w16cex wp14">
+<w:document xmlns:wpc="http://schemas.microsoft.com/office/word/2010/wordprocessingCanvas" xmlns:cx="http://schemas.microsoft.com/office/drawing/2014/chartex" xmlns:cx1="http://schemas.microsoft.com/office/drawing/2015/9/8/chartex" xmlns:cx2="http://schemas.microsoft.com/office/drawing/2015/10/21/chartex" xmlns:cx3="http://schemas.microsoft.com/office/drawing/2016/5/9/chartex" xmlns:cx4="http://schemas.microsoft.com/office/drawing/2016/5/10/chartex" xmlns:cx5="http://schemas.microsoft.com/office/drawing/2016/5/11/chartex" xmlns:cx6="http://schemas.microsoft.com/office/drawing/2016/5/12/chartex" xmlns:cx7="http://schemas.microsoft.com/office/drawing/2016/5/13/chartex" xmlns:cx8="http://schemas.microsoft.com/office/drawing/2016/5/14/chartex" xmlns:mc="http://schemas.openxmlformats.org/markup-compatibility/2006" xmlns:aink="http://schemas.microsoft.com/office/drawing/2016/ink" xmlns:am3d="http://schemas.microsoft.com/office/drawing/2017/model3d" xmlns:o="urn:schemas-microsoft-com:office:office" xmlns:oel="http://schemas.microsoft.com/office/2019/extlst" xmlns:r="http://schemas.openxmlformats.org/officeDocument/2006/relationships" xmlns:m="http://schemas.openxmlformats.org/officeDocument/2006/math" xmlns:v="urn:schemas-microsoft-com:vml" xmlns:wp14="http://schemas.microsoft.com/office/word/2010/wordprocessingDrawing" xmlns:wp="http://schemas.openxmlformats.org/drawingml/2006/wordprocessingDrawing" xmlns:w10="urn:schemas-microsoft-com:office:word" xmlns:w="http://schemas.openxmlformats.org/wordprocessingml/2006/main" xmlns:w14="http://schemas.microsoft.com/office/word/2010/wordml" xmlns:w15="http://schemas.microsoft.com/office/word/2012/wordml" xmlns:w16cex="http://schemas.microsoft.com/office/word/2018/wordml/cex" xmlns:w16cid="http://schemas.microsoft.com/office/word/2016/wordml/cid" xmlns:w16="http://schemas.microsoft.com/office/word/2018/wordml" xmlns:w16du="http://schemas.microsoft.com/office/word/2023/wordml/word16du" xmlns:w16sdtdh="http://schemas.microsoft.com/office/word/2020/wordml/sdtdatahash" xmlns:w16sdtfl="http://schemas.microsoft.com/office/word/2024/wordml/sdtformatlock" xmlns:w16se="http://schemas.microsoft.com/office/word/2015/wordml/symex" xmlns:wpg="http://schemas.microsoft.com/office/word/2010/wordprocessingGroup" xmlns:wpi="http://schemas.microsoft.com/office/word/2010/wordprocessingInk" xmlns:wne="http://schemas.microsoft.com/office/word/2006/wordml" xmlns:wps="http://schemas.microsoft.com/office/word/2010/wordprocessingShape" mc:Ignorable="w14 w15 w16se w16cid w16 w16cex w16sdtdh w16sdtfl w16du wp14">
   <w:body>
     <w:p>
       <w:pPr>
@@ -30,6 +30,7 @@
           <w:lang w:val="en-US"/>
         </w:rPr>
       </w:pPr>
+      <w:proofErr w:type="gramStart"/>
       <w:r>
         <w:rPr>
           <w:b/>
@@ -37,43 +38,29 @@
           <w:szCs w:val="28"/>
           <w:lang w:val="en-US"/>
         </w:rPr>
-        <w:t>{{ mata_kuliah }}</w:t>
-      </w:r>
-    </w:p>
-    <w:p>
-      <w:pPr>
-        <w:jc w:val="center"/>
-        <w:rPr>
-          <w:b/>
-        </w:rPr>
-      </w:pPr>
-    </w:p>
-    <w:p>
-      <w:pPr>
-        <w:jc w:val="center"/>
-        <w:rPr>
-          <w:b/>
-        </w:rPr>
-      </w:pPr>
-    </w:p>
-    <w:p>
-      <w:pPr>
-        <w:jc w:val="center"/>
+        <w:t xml:space="preserve">{{ </w:t>
+      </w:r>
+      <w:proofErr w:type="spellStart"/>
+      <w:r>
         <w:rPr>
           <w:b/>
           <w:sz w:val="28"/>
           <w:szCs w:val="28"/>
           <w:lang w:val="en-US"/>
         </w:rPr>
-      </w:pPr>
+        <w:t>mata</w:t>
+      </w:r>
+      <w:proofErr w:type="gramEnd"/>
       <w:r>
         <w:rPr>
           <w:b/>
           <w:sz w:val="28"/>
           <w:szCs w:val="28"/>
-        </w:rPr>
-        <w:t>MODUL</w:t>
-      </w:r>
+          <w:lang w:val="en-US"/>
+        </w:rPr>
+        <w:t>_</w:t>
+      </w:r>
+      <w:proofErr w:type="gramStart"/>
       <w:r>
         <w:rPr>
           <w:b/>
@@ -81,8 +68,9 @@
           <w:szCs w:val="28"/>
           <w:lang w:val="en-US"/>
         </w:rPr>
-        <w:t xml:space="preserve"> </w:t>
-      </w:r>
+        <w:t>kuliah</w:t>
+      </w:r>
+      <w:proofErr w:type="spellEnd"/>
       <w:r>
         <w:rPr>
           <w:b/>
@@ -90,67 +78,90 @@
           <w:szCs w:val="28"/>
           <w:lang w:val="en-US"/>
         </w:rPr>
-        <w:t>{{ nomor_modul }}</w:t>
-      </w:r>
-    </w:p>
-    <w:p>
-      <w:pPr>
-        <w:jc w:val="center"/>
+        <w:t xml:space="preserve"> }</w:t>
+      </w:r>
+      <w:proofErr w:type="gramEnd"/>
+      <w:r>
         <w:rPr>
           <w:b/>
           <w:sz w:val="28"/>
           <w:szCs w:val="28"/>
           <w:lang w:val="en-US"/>
         </w:rPr>
-      </w:pPr>
-      <w:r>
+        <w:t>}</w:t>
+      </w:r>
+    </w:p>
+    <w:p>
+      <w:pPr>
+        <w:jc w:val="center"/>
+        <w:rPr>
+          <w:b/>
+        </w:rPr>
+      </w:pPr>
+    </w:p>
+    <w:p>
+      <w:pPr>
+        <w:jc w:val="center"/>
+        <w:rPr>
+          <w:b/>
+        </w:rPr>
+      </w:pPr>
+    </w:p>
+    <w:p>
+      <w:pPr>
+        <w:jc w:val="center"/>
         <w:rPr>
           <w:b/>
           <w:sz w:val="28"/>
           <w:szCs w:val="28"/>
           <w:lang w:val="en-US"/>
         </w:rPr>
-        <w:t>{{ judul }}</w:t>
-      </w:r>
-    </w:p>
-    <w:p>
-      <w:pPr>
-        <w:jc w:val="center"/>
-        <w:rPr>
-          <w:b/>
-        </w:rPr>
-      </w:pPr>
-    </w:p>
-    <w:p>
-      <w:pPr>
-        <w:jc w:val="center"/>
-        <w:rPr>
-          <w:b/>
-        </w:rPr>
-      </w:pPr>
-    </w:p>
-    <w:p>
-      <w:pPr>
-        <w:jc w:val="center"/>
-        <w:rPr>
-          <w:b/>
-        </w:rPr>
-      </w:pPr>
-    </w:p>
-    <w:p>
-      <w:pPr>
-        <w:jc w:val="center"/>
+      </w:pPr>
+      <w:r>
         <w:rPr>
           <w:b/>
           <w:sz w:val="28"/>
           <w:szCs w:val="28"/>
         </w:rPr>
-      </w:pPr>
+        <w:t>MODUL</w:t>
+      </w:r>
       <w:r>
         <w:rPr>
           <w:b/>
-        </w:rPr>
-        <w:t>DISUSUN OLEH :</w:t>
+          <w:sz w:val="28"/>
+          <w:szCs w:val="28"/>
+          <w:lang w:val="en-US"/>
+        </w:rPr>
+        <w:t xml:space="preserve"> </w:t>
+      </w:r>
+      <w:r>
+        <w:rPr>
+          <w:b/>
+          <w:sz w:val="28"/>
+          <w:szCs w:val="28"/>
+          <w:lang w:val="en-US"/>
+        </w:rPr>
+        <w:t xml:space="preserve">{{ </w:t>
+      </w:r>
+      <w:proofErr w:type="spellStart"/>
+      <w:r>
+        <w:rPr>
+          <w:b/>
+          <w:sz w:val="28"/>
+          <w:szCs w:val="28"/>
+          <w:lang w:val="en-US"/>
+        </w:rPr>
+        <w:t>nomor_modul</w:t>
+      </w:r>
+      <w:proofErr w:type="spellEnd"/>
+      <w:r>
+        <w:rPr>
+          <w:b/>
+          <w:sz w:val="28"/>
+          <w:szCs w:val="28"/>
+          <w:lang w:val="en-US"/>
+        </w:rPr>
+        <w:t xml:space="preserve"> }}</w:t>
       </w:r>
     </w:p>
     <w:p>
@@ -158,28 +169,128 @@
         <w:jc w:val="center"/>
         <w:rPr>
           <w:b/>
-          <w:lang w:val="en-US"/>
-        </w:rPr>
-      </w:pPr>
+          <w:sz w:val="28"/>
+          <w:szCs w:val="28"/>
+          <w:lang w:val="en-US"/>
+        </w:rPr>
+      </w:pPr>
+      <w:proofErr w:type="gramStart"/>
       <w:r>
         <w:rPr>
           <w:b/>
-          <w:lang w:val="en-US"/>
-        </w:rPr>
-        <w:t>{{ nama }}</w:t>
-      </w:r>
+          <w:sz w:val="28"/>
+          <w:szCs w:val="28"/>
+          <w:lang w:val="en-US"/>
+        </w:rPr>
+        <w:t xml:space="preserve">{{ </w:t>
+      </w:r>
+      <w:proofErr w:type="spellStart"/>
       <w:r>
         <w:rPr>
           <w:b/>
+          <w:sz w:val="28"/>
+          <w:szCs w:val="28"/>
+          <w:lang w:val="en-US"/>
+        </w:rPr>
+        <w:t>judul</w:t>
+      </w:r>
+      <w:proofErr w:type="spellEnd"/>
+      <w:proofErr w:type="gramEnd"/>
+      <w:r>
+        <w:rPr>
+          <w:b/>
+          <w:sz w:val="28"/>
+          <w:szCs w:val="28"/>
+          <w:lang w:val="en-US"/>
+        </w:rPr>
+        <w:t xml:space="preserve"> }}</w:t>
+      </w:r>
+    </w:p>
+    <w:p>
+      <w:pPr>
+        <w:jc w:val="center"/>
+        <w:rPr>
+          <w:b/>
+        </w:rPr>
+      </w:pPr>
+    </w:p>
+    <w:p>
+      <w:pPr>
+        <w:jc w:val="center"/>
+        <w:rPr>
+          <w:b/>
+        </w:rPr>
+      </w:pPr>
+    </w:p>
+    <w:p>
+      <w:pPr>
+        <w:jc w:val="center"/>
+        <w:rPr>
+          <w:b/>
+        </w:rPr>
+      </w:pPr>
+    </w:p>
+    <w:p>
+      <w:pPr>
+        <w:jc w:val="center"/>
+        <w:rPr>
+          <w:b/>
+          <w:sz w:val="28"/>
+          <w:szCs w:val="28"/>
+        </w:rPr>
+      </w:pPr>
+      <w:r>
+        <w:rPr>
+          <w:b/>
+        </w:rPr>
+        <w:t>DISUSUN OLEH :</w:t>
+      </w:r>
+    </w:p>
+    <w:p>
+      <w:pPr>
+        <w:jc w:val="center"/>
+        <w:rPr>
+          <w:b/>
+          <w:lang w:val="en-US"/>
+        </w:rPr>
+      </w:pPr>
+      <w:proofErr w:type="gramStart"/>
+      <w:r>
+        <w:rPr>
+          <w:b/>
+          <w:lang w:val="en-US"/>
+        </w:rPr>
+        <w:t>{{ nama</w:t>
+      </w:r>
+      <w:proofErr w:type="gramEnd"/>
+      <w:r>
+        <w:rPr>
+          <w:b/>
+          <w:lang w:val="en-US"/>
+        </w:rPr>
+        <w:t xml:space="preserve"> }}</w:t>
+      </w:r>
+      <w:r>
+        <w:rPr>
+          <w:b/>
         </w:rPr>
         <w:tab/>
       </w:r>
+      <w:proofErr w:type="gramStart"/>
       <w:r>
         <w:rPr>
           <w:b/>
           <w:lang w:val="en-US"/>
         </w:rPr>
-        <w:t>{{ nim }}</w:t>
+        <w:t>{{ nim</w:t>
+      </w:r>
+      <w:proofErr w:type="gramEnd"/>
+      <w:r>
+        <w:rPr>
+          <w:b/>
+          <w:lang w:val="en-US"/>
+        </w:rPr>
+        <w:t xml:space="preserve"> }}</w:t>
       </w:r>
     </w:p>
     <w:p>
@@ -2960,10 +3071,11 @@
           <w:ilvl w:val="0"/>
           <w:numId w:val="0"/>
         </w:numPr>
-        <w:spacing w:before="0" w:after="240"/>
+        <w:spacing w:before="0" w:after="480"/>
       </w:pPr>
       <w:bookmarkStart w:id="0" w:name="_Toc197688582"/>
       <w:r>
+        <w:lastRenderedPageBreak/>
         <w:t>DAFTAR GAMBAR</w:t>
       </w:r>
       <w:bookmarkEnd w:id="0"/>
@@ -3043,11 +3155,12 @@
     <w:p>
       <w:pPr>
         <w:pStyle w:val="Heading1"/>
-        <w:spacing w:before="0" w:after="0"/>
+        <w:spacing w:before="0" w:after="340"/>
         <w:ind w:left="1077" w:hanging="1077"/>
       </w:pPr>
       <w:bookmarkStart w:id="1" w:name="_Toc197688583"/>
       <w:r>
+        <w:lastRenderedPageBreak/>
         <w:t>HASIL PRAKTIKUM</w:t>
       </w:r>
       <w:bookmarkEnd w:id="1"/>
@@ -3066,7 +3179,25 @@
           <w:szCs w:val="34"/>
           <w:lang w:val="en-US"/>
         </w:rPr>
-        <w:t>{% for item in daftar_sub_bab %}</w:t>
+        <w:t xml:space="preserve">{% for item in </w:t>
+      </w:r>
+      <w:proofErr w:type="spellStart"/>
+      <w:r>
+        <w:rPr>
+          <w:sz w:val="34"/>
+          <w:szCs w:val="34"/>
+          <w:lang w:val="en-US"/>
+        </w:rPr>
+        <w:t>daftar_sub_bab</w:t>
+      </w:r>
+      <w:proofErr w:type="spellEnd"/>
+      <w:r>
+        <w:rPr>
+          <w:sz w:val="34"/>
+          <w:szCs w:val="34"/>
+          <w:lang w:val="en-US"/>
+        </w:rPr>
+        <w:t xml:space="preserve"> %}</w:t>
       </w:r>
     </w:p>
     <w:p>
@@ -3078,7 +3209,55 @@
         </w:numPr>
       </w:pPr>
       <w:r>
-        <w:t>1.{{ loop.index }} {{ item.judul_sub_bab }}</w:t>
+        <w:t>1.</w:t>
+      </w:r>
+      <w:proofErr w:type="gramStart"/>
+      <w:r>
+        <w:t xml:space="preserve">{{ </w:t>
+      </w:r>
+      <w:proofErr w:type="spellStart"/>
+      <w:r>
+        <w:t>loop</w:t>
+      </w:r>
+      <w:proofErr w:type="gramEnd"/>
+      <w:r>
+        <w:t>.</w:t>
+      </w:r>
+      <w:proofErr w:type="gramStart"/>
+      <w:r>
+        <w:t>index</w:t>
+      </w:r>
+      <w:proofErr w:type="spellEnd"/>
+      <w:r>
+        <w:t xml:space="preserve"> }</w:t>
+      </w:r>
+      <w:proofErr w:type="gramEnd"/>
+      <w:r>
+        <w:t xml:space="preserve">} </w:t>
+      </w:r>
+      <w:proofErr w:type="gramStart"/>
+      <w:r>
+        <w:t xml:space="preserve">{{ </w:t>
+      </w:r>
+      <w:proofErr w:type="spellStart"/>
+      <w:r>
+        <w:t>item</w:t>
+      </w:r>
+      <w:proofErr w:type="gramEnd"/>
+      <w:r>
+        <w:t>.judul_sub_</w:t>
+      </w:r>
+      <w:proofErr w:type="gramStart"/>
+      <w:r>
+        <w:t>bab</w:t>
+      </w:r>
+      <w:proofErr w:type="spellEnd"/>
+      <w:r>
+        <w:t xml:space="preserve"> }</w:t>
+      </w:r>
+      <w:proofErr w:type="gramEnd"/>
+      <w:r>
+        <w:t>}</w:t>
       </w:r>
     </w:p>
     <w:p>
@@ -3108,8 +3287,29 @@
       <w:r>
         <w:t xml:space="preserve"> </w:t>
       </w:r>
-      <w:r>
-        <w:t>{{ item.label_point_a }}</w:t>
+      <w:proofErr w:type="gramStart"/>
+      <w:r>
+        <w:t xml:space="preserve">{{ </w:t>
+      </w:r>
+      <w:proofErr w:type="spellStart"/>
+      <w:r>
+        <w:t>item</w:t>
+      </w:r>
+      <w:proofErr w:type="gramEnd"/>
+      <w:r>
+        <w:t>.label_point_</w:t>
+      </w:r>
+      <w:proofErr w:type="gramStart"/>
+      <w:r>
+        <w:t>a</w:t>
+      </w:r>
+      <w:proofErr w:type="spellEnd"/>
+      <w:r>
+        <w:t xml:space="preserve"> }</w:t>
+      </w:r>
+      <w:proofErr w:type="gramEnd"/>
+      <w:r>
+        <w:t>}</w:t>
       </w:r>
       <w:r>
         <w:t xml:space="preserve"> </w:t>
@@ -3117,7 +3317,7 @@
     </w:p>
     <w:p>
       <w:pPr>
-        <w:ind w:left="1021"/>
+        <w:ind w:left="1321" w:hanging="357"/>
         <w:jc w:val="left"/>
       </w:pPr>
       <w:r>
@@ -3137,16 +3337,23 @@
       <w:pPr>
         <w:pStyle w:val="Code"/>
       </w:pPr>
-      <w:r>
-        <w:t>{{ k.isi }}</w:t>
+      <w:proofErr w:type="gramStart"/>
+      <w:r>
+        <w:t xml:space="preserve">{{ </w:t>
+      </w:r>
+      <w:proofErr w:type="spellStart"/>
+      <w:r>
+        <w:t>k.isi</w:t>
+      </w:r>
+      <w:proofErr w:type="spellEnd"/>
+      <w:proofErr w:type="gramEnd"/>
+      <w:r>
+        <w:t xml:space="preserve"> }}</w:t>
       </w:r>
     </w:p>
     <w:p>
       <w:pPr>
-        <w:ind w:left="1021"/>
-        <w:rPr>
-          <w:lang w:val="en-US"/>
-        </w:rPr>
+        <w:ind w:left="1378" w:hanging="357"/>
       </w:pPr>
       <w:r>
         <w:t>{% endfor %}</w:t>
@@ -3155,108 +3362,24 @@
         <w:t>{% else %}</w:t>
       </w:r>
       <w:r>
-        <w:rPr>
-          <w:lang w:val="en-US"/>
-        </w:rPr>
-        <w:t>{% for langkah in item.langkah_list %}</w:t>
-      </w:r>
-    </w:p>
-    <w:tbl>
-      <w:tblPr>
-        <w:tblStyle w:val="TableGrid"/>
-        <w:tblW w:w="7054" w:type="dxa"/>
-        <w:tblInd w:w="1021" w:type="dxa"/>
-        <w:tblBorders>
-          <w:top w:val="none" w:sz="0" w:space="0" w:color="auto"/>
-          <w:left w:val="none" w:sz="0" w:space="0" w:color="auto"/>
-          <w:bottom w:val="none" w:sz="0" w:space="0" w:color="auto"/>
-          <w:right w:val="none" w:sz="0" w:space="0" w:color="auto"/>
-          <w:insideH w:val="none" w:sz="0" w:space="0" w:color="auto"/>
-          <w:insideV w:val="none" w:sz="0" w:space="0" w:color="auto"/>
-        </w:tblBorders>
-        <w:tblLook w:val="04A0" w:firstRow="1" w:lastRow="0" w:firstColumn="1" w:lastColumn="0" w:noHBand="0" w:noVBand="1"/>
-      </w:tblPr>
-      <w:tblGrid>
-        <w:gridCol w:w="1663"/>
-        <w:gridCol w:w="5391"/>
-      </w:tblGrid>
-      <w:tr>
-        <w:tc>
-          <w:tcPr>
-            <w:tcW w:w="250" w:type="dxa"/>
-          </w:tcPr>
-          <w:p>
-            <w:pPr>
-              <w:rPr>
-                <w:lang w:val="en-US"/>
-              </w:rPr>
-            </w:pPr>
-            <w:r>
-              <w:rPr>
-                <w:lang w:val="en-US"/>
-              </w:rPr>
-              <w:t>{{ langkah</w:t>
-            </w:r>
-            <w:r>
-              <w:rPr>
-                <w:lang w:val="en-US"/>
-              </w:rPr>
-              <w:t>.</w:t>
-            </w:r>
-            <w:r>
-              <w:rPr>
-                <w:lang w:val="en-US"/>
-              </w:rPr>
-              <w:t>nomor }}</w:t>
-            </w:r>
-            <w:r>
-              <w:rPr>
-                <w:lang w:val="en-US"/>
-              </w:rPr>
-              <w:t>.</w:t>
-            </w:r>
-          </w:p>
-        </w:tc>
-        <w:tc>
-          <w:tcPr>
-            <w:tcW w:w="6804" w:type="dxa"/>
-          </w:tcPr>
-          <w:p>
-            <w:pPr>
-              <w:rPr>
-                <w:lang w:val="en-US"/>
-              </w:rPr>
-            </w:pPr>
-            <w:r>
-              <w:rPr>
-                <w:lang w:val="en-US"/>
-              </w:rPr>
-              <w:t>{{ langkah.langkah_kerja }}</w:t>
-            </w:r>
-          </w:p>
-        </w:tc>
-      </w:tr>
-    </w:tbl>
-    <w:p>
-      <w:pPr>
-        <w:ind w:left="1021"/>
-      </w:pPr>
-      <w:r>
-        <w:rPr>
-          <w:lang w:val="en-US"/>
-        </w:rPr>
-        <w:t>{% endfor %}</w:t>
+        <w:t>{% for baris in item.isi_point_a %}</w:t>
       </w:r>
     </w:p>
     <w:p>
       <w:pPr>
-        <w:ind w:left="1021"/>
-        <w:rPr>
-          <w:lang w:val="en-US"/>
-        </w:rPr>
-      </w:pPr>
-      <w:r>
-        <w:t>{% endif %}</w:t>
+        <w:ind w:left="1378" w:hanging="357"/>
+      </w:pPr>
+      <w:r>
+        <w:t>{{ baris }}</w:t>
+      </w:r>
+      <w:r>
+        <w:t xml:space="preserve"> </w:t>
+      </w:r>
+      <w:r>
+        <w:t>{% endfor %}</w:t>
+      </w:r>
+      <w:r>
+        <w:t xml:space="preserve"> {% endif %}</w:t>
       </w:r>
     </w:p>
     <w:p>
@@ -3266,6 +3389,7 @@
           <w:ilvl w:val="0"/>
           <w:numId w:val="0"/>
         </w:numPr>
+        <w:spacing w:before="240"/>
         <w:ind w:left="510" w:hanging="153"/>
       </w:pPr>
       <w:r>
@@ -3301,7 +3425,43 @@
         <w:rPr>
           <w:lang w:val="en-US"/>
         </w:rPr>
-        <w:t>{% for gbr in item.list_gambar %}</w:t>
+        <w:t xml:space="preserve">{% for </w:t>
+      </w:r>
+      <w:proofErr w:type="spellStart"/>
+      <w:r>
+        <w:rPr>
+          <w:lang w:val="en-US"/>
+        </w:rPr>
+        <w:t>gbr</w:t>
+      </w:r>
+      <w:proofErr w:type="spellEnd"/>
+      <w:r>
+        <w:rPr>
+          <w:lang w:val="en-US"/>
+        </w:rPr>
+        <w:t xml:space="preserve"> in </w:t>
+      </w:r>
+      <w:proofErr w:type="spellStart"/>
+      <w:proofErr w:type="gramStart"/>
+      <w:r>
+        <w:rPr>
+          <w:lang w:val="en-US"/>
+        </w:rPr>
+        <w:t>item.list</w:t>
+      </w:r>
+      <w:proofErr w:type="gramEnd"/>
+      <w:r>
+        <w:rPr>
+          <w:lang w:val="en-US"/>
+        </w:rPr>
+        <w:t>_gambar</w:t>
+      </w:r>
+      <w:proofErr w:type="spellEnd"/>
+      <w:r>
+        <w:rPr>
+          <w:lang w:val="en-US"/>
+        </w:rPr>
+        <w:t xml:space="preserve"> %}</w:t>
       </w:r>
       <w:r>
         <w:rPr>
@@ -3309,11 +3469,47 @@
         </w:rPr>
         <w:t xml:space="preserve"> </w:t>
       </w:r>
-      <w:r>
-        <w:rPr>
-          <w:lang w:val="en-US"/>
-        </w:rPr>
-        <w:t>{{ gbr.objek_gambar }}</w:t>
+      <w:proofErr w:type="gramStart"/>
+      <w:r>
+        <w:rPr>
+          <w:lang w:val="en-US"/>
+        </w:rPr>
+        <w:t xml:space="preserve">{{ </w:t>
+      </w:r>
+      <w:proofErr w:type="spellStart"/>
+      <w:r>
+        <w:rPr>
+          <w:lang w:val="en-US"/>
+        </w:rPr>
+        <w:t>gbr</w:t>
+      </w:r>
+      <w:proofErr w:type="gramEnd"/>
+      <w:r>
+        <w:rPr>
+          <w:lang w:val="en-US"/>
+        </w:rPr>
+        <w:t>.objek_</w:t>
+      </w:r>
+      <w:proofErr w:type="gramStart"/>
+      <w:r>
+        <w:rPr>
+          <w:lang w:val="en-US"/>
+        </w:rPr>
+        <w:t>gambar</w:t>
+      </w:r>
+      <w:proofErr w:type="spellEnd"/>
+      <w:r>
+        <w:rPr>
+          <w:lang w:val="en-US"/>
+        </w:rPr>
+        <w:t xml:space="preserve"> }</w:t>
+      </w:r>
+      <w:proofErr w:type="gramEnd"/>
+      <w:r>
+        <w:rPr>
+          <w:lang w:val="en-US"/>
+        </w:rPr>
+        <w:t>}</w:t>
       </w:r>
     </w:p>
     <w:p>
@@ -3402,7 +3598,21 @@
         <w:rPr>
           <w:lang w:val="en-US"/>
         </w:rPr>
-        <w:t>{% endfor %}</w:t>
+        <w:t xml:space="preserve">{% </w:t>
+      </w:r>
+      <w:proofErr w:type="spellStart"/>
+      <w:r>
+        <w:rPr>
+          <w:lang w:val="en-US"/>
+        </w:rPr>
+        <w:t>endfor</w:t>
+      </w:r>
+      <w:proofErr w:type="spellEnd"/>
+      <w:r>
+        <w:rPr>
+          <w:lang w:val="en-US"/>
+        </w:rPr>
+        <w:t xml:space="preserve"> %}</w:t>
       </w:r>
     </w:p>
     <w:p>
@@ -3415,24 +3625,131 @@
     <w:p>
       <w:pPr>
         <w:pStyle w:val="Heading1"/>
-        <w:spacing w:after="0"/>
+        <w:spacing w:before="340" w:after="340"/>
         <w:ind w:left="1077" w:hanging="1077"/>
       </w:pPr>
       <w:bookmarkStart w:id="3" w:name="_Toc197688616"/>
       <w:bookmarkStart w:id="4" w:name="_Toc147849649"/>
       <w:r>
-        <w:t>Tugas Praktikum</w:t>
+        <w:t xml:space="preserve">Tugas </w:t>
+      </w:r>
+      <w:proofErr w:type="spellStart"/>
+      <w:r>
+        <w:t>Praktikum</w:t>
       </w:r>
       <w:bookmarkEnd w:id="3"/>
+      <w:proofErr w:type="spellEnd"/>
     </w:p>
     <w:p>
       <w:pPr>
         <w:rPr>
-          <w:sz w:val="34"/>
-          <w:szCs w:val="34"/>
-          <w:lang w:val="en-US"/>
-        </w:rPr>
-      </w:pPr>
+          <w:lang w:val="en-US"/>
+        </w:rPr>
+      </w:pPr>
+      <w:r>
+        <w:rPr>
+          <w:lang w:val="en-US"/>
+        </w:rPr>
+        <w:t xml:space="preserve">{% if </w:t>
+      </w:r>
+      <w:proofErr w:type="spellStart"/>
+      <w:r>
+        <w:rPr>
+          <w:lang w:val="en-US"/>
+        </w:rPr>
+        <w:t>daftar_tugas|length</w:t>
+      </w:r>
+      <w:proofErr w:type="spellEnd"/>
+      <w:r>
+        <w:rPr>
+          <w:lang w:val="en-US"/>
+        </w:rPr>
+        <w:t xml:space="preserve"> == 0 %} (Bagian ini </w:t>
+      </w:r>
+      <w:proofErr w:type="spellStart"/>
+      <w:r>
+        <w:rPr>
+          <w:lang w:val="en-US"/>
+        </w:rPr>
+        <w:t>muncul</w:t>
+      </w:r>
+      <w:proofErr w:type="spellEnd"/>
+      <w:r>
+        <w:rPr>
+          <w:lang w:val="en-US"/>
+        </w:rPr>
+        <w:t xml:space="preserve"> </w:t>
+      </w:r>
+      <w:proofErr w:type="spellStart"/>
+      <w:r>
+        <w:rPr>
+          <w:lang w:val="en-US"/>
+        </w:rPr>
+        <w:t>jika</w:t>
+      </w:r>
+      <w:proofErr w:type="spellEnd"/>
+      <w:r>
+        <w:rPr>
+          <w:lang w:val="en-US"/>
+        </w:rPr>
+        <w:t xml:space="preserve"> Bab 2 </w:t>
+      </w:r>
+      <w:proofErr w:type="spellStart"/>
+      <w:r>
+        <w:rPr>
+          <w:lang w:val="en-US"/>
+        </w:rPr>
+        <w:t>kosong</w:t>
+      </w:r>
+      <w:proofErr w:type="spellEnd"/>
+      <w:r>
+        <w:rPr>
+          <w:lang w:val="en-US"/>
+        </w:rPr>
+        <w:t xml:space="preserve">) Tidak </w:t>
+      </w:r>
+      <w:proofErr w:type="spellStart"/>
+      <w:r>
+        <w:rPr>
+          <w:lang w:val="en-US"/>
+        </w:rPr>
+        <w:t>ada</w:t>
+      </w:r>
+      <w:proofErr w:type="spellEnd"/>
+      <w:r>
+        <w:rPr>
+          <w:lang w:val="en-US"/>
+        </w:rPr>
+        <w:t xml:space="preserve"> tugas </w:t>
+      </w:r>
+      <w:proofErr w:type="spellStart"/>
+      <w:r>
+        <w:rPr>
+          <w:lang w:val="en-US"/>
+        </w:rPr>
+        <w:t>praktikum</w:t>
+      </w:r>
+      <w:proofErr w:type="spellEnd"/>
+      <w:r>
+        <w:rPr>
+          <w:lang w:val="en-US"/>
+        </w:rPr>
+        <w:t xml:space="preserve"> pada </w:t>
+      </w:r>
+      <w:proofErr w:type="spellStart"/>
+      <w:r>
+        <w:rPr>
+          <w:lang w:val="en-US"/>
+        </w:rPr>
+        <w:t>modul</w:t>
+      </w:r>
+      <w:proofErr w:type="spellEnd"/>
+      <w:r>
+        <w:rPr>
+          <w:lang w:val="en-US"/>
+        </w:rPr>
+        <w:t xml:space="preserve"> ini.</w:t>
+      </w:r>
     </w:p>
     <w:p>
       <w:pPr>
@@ -3440,12 +3757,6 @@
           <w:lang w:val="en-US"/>
         </w:rPr>
       </w:pPr>
-      <w:r>
-        <w:rPr>
-          <w:lang w:val="en-US"/>
-        </w:rPr>
-        <w:t>{% if daftar_tugas|length == 0 %} (Bagian ini muncul jika Bab 2 kosong) Tidak ada tugas praktikum pada modul ini.</w:t>
-      </w:r>
     </w:p>
     <w:p>
       <w:pPr>
@@ -3453,6 +3764,68 @@
           <w:lang w:val="en-US"/>
         </w:rPr>
       </w:pPr>
+      <w:r>
+        <w:rPr>
+          <w:lang w:val="en-US"/>
+        </w:rPr>
+        <w:t xml:space="preserve">{% else %} (Bagian ini </w:t>
+      </w:r>
+      <w:proofErr w:type="spellStart"/>
+      <w:r>
+        <w:rPr>
+          <w:lang w:val="en-US"/>
+        </w:rPr>
+        <w:t>muncul</w:t>
+      </w:r>
+      <w:proofErr w:type="spellEnd"/>
+      <w:r>
+        <w:rPr>
+          <w:lang w:val="en-US"/>
+        </w:rPr>
+        <w:t xml:space="preserve"> </w:t>
+      </w:r>
+      <w:proofErr w:type="spellStart"/>
+      <w:r>
+        <w:rPr>
+          <w:lang w:val="en-US"/>
+        </w:rPr>
+        <w:t>jika</w:t>
+      </w:r>
+      <w:proofErr w:type="spellEnd"/>
+      <w:r>
+        <w:rPr>
+          <w:lang w:val="en-US"/>
+        </w:rPr>
+        <w:t xml:space="preserve"> Bab 2 </w:t>
+      </w:r>
+      <w:proofErr w:type="spellStart"/>
+      <w:r>
+        <w:rPr>
+          <w:lang w:val="en-US"/>
+        </w:rPr>
+        <w:t>berisi</w:t>
+      </w:r>
+      <w:proofErr w:type="spellEnd"/>
+      <w:r>
+        <w:rPr>
+          <w:lang w:val="en-US"/>
+        </w:rPr>
+        <w:t xml:space="preserve"> data) {% for tugas in </w:t>
+      </w:r>
+      <w:proofErr w:type="spellStart"/>
+      <w:r>
+        <w:rPr>
+          <w:lang w:val="en-US"/>
+        </w:rPr>
+        <w:t>daftar_tugas</w:t>
+      </w:r>
+      <w:proofErr w:type="spellEnd"/>
+      <w:r>
+        <w:rPr>
+          <w:lang w:val="en-US"/>
+        </w:rPr>
+        <w:t xml:space="preserve"> %}</w:t>
+      </w:r>
     </w:p>
     <w:p>
       <w:pPr>
@@ -3460,12 +3833,6 @@
           <w:lang w:val="en-US"/>
         </w:rPr>
       </w:pPr>
-      <w:r>
-        <w:rPr>
-          <w:lang w:val="en-US"/>
-        </w:rPr>
-        <w:t>{% else %} (Bagian ini muncul jika Bab 2 berisi data) {% for tugas in daftar_tugas %}</w:t>
-      </w:r>
     </w:p>
     <w:p>
       <w:pPr>
@@ -3473,6 +3840,96 @@
           <w:lang w:val="en-US"/>
         </w:rPr>
       </w:pPr>
+      <w:r>
+        <w:rPr>
+          <w:lang w:val="en-US"/>
+        </w:rPr>
+        <w:t>2.</w:t>
+      </w:r>
+      <w:proofErr w:type="gramStart"/>
+      <w:r>
+        <w:rPr>
+          <w:lang w:val="en-US"/>
+        </w:rPr>
+        <w:t xml:space="preserve">{{ </w:t>
+      </w:r>
+      <w:proofErr w:type="spellStart"/>
+      <w:r>
+        <w:rPr>
+          <w:lang w:val="en-US"/>
+        </w:rPr>
+        <w:t>loop</w:t>
+      </w:r>
+      <w:proofErr w:type="gramEnd"/>
+      <w:r>
+        <w:rPr>
+          <w:lang w:val="en-US"/>
+        </w:rPr>
+        <w:t>.</w:t>
+      </w:r>
+      <w:proofErr w:type="gramStart"/>
+      <w:r>
+        <w:rPr>
+          <w:lang w:val="en-US"/>
+        </w:rPr>
+        <w:t>index</w:t>
+      </w:r>
+      <w:proofErr w:type="spellEnd"/>
+      <w:r>
+        <w:rPr>
+          <w:lang w:val="en-US"/>
+        </w:rPr>
+        <w:t xml:space="preserve"> }</w:t>
+      </w:r>
+      <w:proofErr w:type="gramEnd"/>
+      <w:r>
+        <w:rPr>
+          <w:lang w:val="en-US"/>
+        </w:rPr>
+        <w:t xml:space="preserve">} </w:t>
+      </w:r>
+      <w:proofErr w:type="gramStart"/>
+      <w:r>
+        <w:rPr>
+          <w:lang w:val="en-US"/>
+        </w:rPr>
+        <w:t xml:space="preserve">{{ </w:t>
+      </w:r>
+      <w:proofErr w:type="spellStart"/>
+      <w:r>
+        <w:rPr>
+          <w:lang w:val="en-US"/>
+        </w:rPr>
+        <w:t>tugas</w:t>
+      </w:r>
+      <w:proofErr w:type="gramEnd"/>
+      <w:r>
+        <w:rPr>
+          <w:lang w:val="en-US"/>
+        </w:rPr>
+        <w:t>.judul_sub_</w:t>
+      </w:r>
+      <w:proofErr w:type="gramStart"/>
+      <w:r>
+        <w:rPr>
+          <w:lang w:val="en-US"/>
+        </w:rPr>
+        <w:t>bab</w:t>
+      </w:r>
+      <w:proofErr w:type="spellEnd"/>
+      <w:r>
+        <w:rPr>
+          <w:lang w:val="en-US"/>
+        </w:rPr>
+        <w:t xml:space="preserve"> }</w:t>
+      </w:r>
+      <w:proofErr w:type="gramEnd"/>
+      <w:r>
+        <w:rPr>
+          <w:lang w:val="en-US"/>
+        </w:rPr>
+        <w:t>} (Style: Heading 2)</w:t>
+      </w:r>
     </w:p>
     <w:p>
       <w:pPr>
@@ -3480,12 +3937,6 @@
           <w:lang w:val="en-US"/>
         </w:rPr>
       </w:pPr>
-      <w:r>
-        <w:rPr>
-          <w:lang w:val="en-US"/>
-        </w:rPr>
-        <w:t>2.{{ loop.index }} {{ tugas.judul_sub_bab }} (Style: Heading 2)</w:t>
-      </w:r>
     </w:p>
     <w:p>
       <w:pPr>
@@ -3493,6 +3944,54 @@
           <w:lang w:val="en-US"/>
         </w:rPr>
       </w:pPr>
+      <w:r>
+        <w:rPr>
+          <w:lang w:val="en-US"/>
+        </w:rPr>
+        <w:t xml:space="preserve">Soal: </w:t>
+      </w:r>
+      <w:proofErr w:type="gramStart"/>
+      <w:r>
+        <w:rPr>
+          <w:lang w:val="en-US"/>
+        </w:rPr>
+        <w:t xml:space="preserve">{{ </w:t>
+      </w:r>
+      <w:proofErr w:type="spellStart"/>
+      <w:r>
+        <w:rPr>
+          <w:lang w:val="en-US"/>
+        </w:rPr>
+        <w:t>tugas.isi</w:t>
+      </w:r>
+      <w:proofErr w:type="gramEnd"/>
+      <w:r>
+        <w:rPr>
+          <w:lang w:val="en-US"/>
+        </w:rPr>
+        <w:t>_</w:t>
+      </w:r>
+      <w:proofErr w:type="gramStart"/>
+      <w:r>
+        <w:rPr>
+          <w:lang w:val="en-US"/>
+        </w:rPr>
+        <w:t>soal</w:t>
+      </w:r>
+      <w:proofErr w:type="spellEnd"/>
+      <w:r>
+        <w:rPr>
+          <w:lang w:val="en-US"/>
+        </w:rPr>
+        <w:t xml:space="preserve"> }</w:t>
+      </w:r>
+      <w:proofErr w:type="gramEnd"/>
+      <w:r>
+        <w:rPr>
+          <w:lang w:val="en-US"/>
+        </w:rPr>
+        <w:t>}</w:t>
+      </w:r>
     </w:p>
     <w:p>
       <w:pPr>
@@ -3500,12 +3999,6 @@
           <w:lang w:val="en-US"/>
         </w:rPr>
       </w:pPr>
-      <w:r>
-        <w:rPr>
-          <w:lang w:val="en-US"/>
-        </w:rPr>
-        <w:t>Soal: {{ tugas.isi_soal }}</w:t>
-      </w:r>
     </w:p>
     <w:p>
       <w:pPr>
@@ -3513,6 +4006,62 @@
           <w:lang w:val="en-US"/>
         </w:rPr>
       </w:pPr>
+      <w:proofErr w:type="spellStart"/>
+      <w:r>
+        <w:rPr>
+          <w:lang w:val="en-US"/>
+        </w:rPr>
+        <w:t>Jawaban</w:t>
+      </w:r>
+      <w:proofErr w:type="spellEnd"/>
+      <w:r>
+        <w:rPr>
+          <w:lang w:val="en-US"/>
+        </w:rPr>
+        <w:t xml:space="preserve">: </w:t>
+      </w:r>
+      <w:proofErr w:type="gramStart"/>
+      <w:r>
+        <w:rPr>
+          <w:lang w:val="en-US"/>
+        </w:rPr>
+        <w:t xml:space="preserve">{{ </w:t>
+      </w:r>
+      <w:proofErr w:type="spellStart"/>
+      <w:r>
+        <w:rPr>
+          <w:lang w:val="en-US"/>
+        </w:rPr>
+        <w:t>tugas.isi</w:t>
+      </w:r>
+      <w:proofErr w:type="gramEnd"/>
+      <w:r>
+        <w:rPr>
+          <w:lang w:val="en-US"/>
+        </w:rPr>
+        <w:t>_</w:t>
+      </w:r>
+      <w:proofErr w:type="gramStart"/>
+      <w:r>
+        <w:rPr>
+          <w:lang w:val="en-US"/>
+        </w:rPr>
+        <w:t>jawaban</w:t>
+      </w:r>
+      <w:proofErr w:type="spellEnd"/>
+      <w:r>
+        <w:rPr>
+          <w:lang w:val="en-US"/>
+        </w:rPr>
+        <w:t xml:space="preserve"> }</w:t>
+      </w:r>
+      <w:proofErr w:type="gramEnd"/>
+      <w:r>
+        <w:rPr>
+          <w:lang w:val="en-US"/>
+        </w:rPr>
+        <w:t>}</w:t>
+      </w:r>
     </w:p>
     <w:p>
       <w:pPr>
@@ -3520,12 +4069,6 @@
           <w:lang w:val="en-US"/>
         </w:rPr>
       </w:pPr>
-      <w:r>
-        <w:rPr>
-          <w:lang w:val="en-US"/>
-        </w:rPr>
-        <w:t>Jawaban: {{ tugas.isi_jawaban }}</w:t>
-      </w:r>
     </w:p>
     <w:p>
       <w:pPr>
@@ -3533,6 +4076,203 @@
           <w:lang w:val="en-US"/>
         </w:rPr>
       </w:pPr>
+      <w:r>
+        <w:rPr>
+          <w:lang w:val="en-US"/>
+        </w:rPr>
+        <w:lastRenderedPageBreak/>
+        <w:t xml:space="preserve">{% if </w:t>
+      </w:r>
+      <w:proofErr w:type="spellStart"/>
+      <w:r>
+        <w:rPr>
+          <w:lang w:val="en-US"/>
+        </w:rPr>
+        <w:t>tugas.ada_gambar</w:t>
+      </w:r>
+      <w:proofErr w:type="spellEnd"/>
+      <w:r>
+        <w:rPr>
+          <w:lang w:val="en-US"/>
+        </w:rPr>
+        <w:t xml:space="preserve"> %} Lampiran Bukti: {% for </w:t>
+      </w:r>
+      <w:proofErr w:type="spellStart"/>
+      <w:r>
+        <w:rPr>
+          <w:lang w:val="en-US"/>
+        </w:rPr>
+        <w:t>gbr</w:t>
+      </w:r>
+      <w:proofErr w:type="spellEnd"/>
+      <w:r>
+        <w:rPr>
+          <w:lang w:val="en-US"/>
+        </w:rPr>
+        <w:t xml:space="preserve"> in </w:t>
+      </w:r>
+      <w:proofErr w:type="spellStart"/>
+      <w:proofErr w:type="gramStart"/>
+      <w:r>
+        <w:rPr>
+          <w:lang w:val="en-US"/>
+        </w:rPr>
+        <w:t>tugas.list</w:t>
+      </w:r>
+      <w:proofErr w:type="gramEnd"/>
+      <w:r>
+        <w:rPr>
+          <w:lang w:val="en-US"/>
+        </w:rPr>
+        <w:t>_gambar</w:t>
+      </w:r>
+      <w:proofErr w:type="spellEnd"/>
+      <w:r>
+        <w:rPr>
+          <w:lang w:val="en-US"/>
+        </w:rPr>
+        <w:t xml:space="preserve"> %} </w:t>
+      </w:r>
+      <w:proofErr w:type="gramStart"/>
+      <w:r>
+        <w:rPr>
+          <w:lang w:val="en-US"/>
+        </w:rPr>
+        <w:t xml:space="preserve">{{ </w:t>
+      </w:r>
+      <w:proofErr w:type="spellStart"/>
+      <w:r>
+        <w:rPr>
+          <w:lang w:val="en-US"/>
+        </w:rPr>
+        <w:t>gbr</w:t>
+      </w:r>
+      <w:proofErr w:type="gramEnd"/>
+      <w:r>
+        <w:rPr>
+          <w:lang w:val="en-US"/>
+        </w:rPr>
+        <w:t>.objek_</w:t>
+      </w:r>
+      <w:proofErr w:type="gramStart"/>
+      <w:r>
+        <w:rPr>
+          <w:lang w:val="en-US"/>
+        </w:rPr>
+        <w:t>gambar</w:t>
+      </w:r>
+      <w:proofErr w:type="spellEnd"/>
+      <w:r>
+        <w:rPr>
+          <w:lang w:val="en-US"/>
+        </w:rPr>
+        <w:t xml:space="preserve"> }</w:t>
+      </w:r>
+      <w:proofErr w:type="gramEnd"/>
+      <w:r>
+        <w:rPr>
+          <w:lang w:val="en-US"/>
+        </w:rPr>
+        <w:t xml:space="preserve">} Gambar </w:t>
+      </w:r>
+      <w:proofErr w:type="gramStart"/>
+      <w:r>
+        <w:rPr>
+          <w:lang w:val="en-US"/>
+        </w:rPr>
+        <w:t xml:space="preserve">2.{{ </w:t>
+      </w:r>
+      <w:proofErr w:type="spellStart"/>
+      <w:r>
+        <w:rPr>
+          <w:lang w:val="en-US"/>
+        </w:rPr>
+        <w:t>gbr</w:t>
+      </w:r>
+      <w:proofErr w:type="gramEnd"/>
+      <w:r>
+        <w:rPr>
+          <w:lang w:val="en-US"/>
+        </w:rPr>
+        <w:t>.nomor_</w:t>
+      </w:r>
+      <w:proofErr w:type="gramStart"/>
+      <w:r>
+        <w:rPr>
+          <w:lang w:val="en-US"/>
+        </w:rPr>
+        <w:t>tampil</w:t>
+      </w:r>
+      <w:proofErr w:type="spellEnd"/>
+      <w:r>
+        <w:rPr>
+          <w:lang w:val="en-US"/>
+        </w:rPr>
+        <w:t xml:space="preserve"> }</w:t>
+      </w:r>
+      <w:proofErr w:type="gramEnd"/>
+      <w:r>
+        <w:rPr>
+          <w:lang w:val="en-US"/>
+        </w:rPr>
+        <w:t xml:space="preserve">} </w:t>
+      </w:r>
+      <w:proofErr w:type="gramStart"/>
+      <w:r>
+        <w:rPr>
+          <w:lang w:val="en-US"/>
+        </w:rPr>
+        <w:t xml:space="preserve">{{ </w:t>
+      </w:r>
+      <w:proofErr w:type="spellStart"/>
+      <w:r>
+        <w:rPr>
+          <w:lang w:val="en-US"/>
+        </w:rPr>
+        <w:t>gbr</w:t>
+      </w:r>
+      <w:proofErr w:type="gramEnd"/>
+      <w:r>
+        <w:rPr>
+          <w:lang w:val="en-US"/>
+        </w:rPr>
+        <w:t>.</w:t>
+      </w:r>
+      <w:proofErr w:type="gramStart"/>
+      <w:r>
+        <w:rPr>
+          <w:lang w:val="en-US"/>
+        </w:rPr>
+        <w:t>caption</w:t>
+      </w:r>
+      <w:proofErr w:type="spellEnd"/>
+      <w:r>
+        <w:rPr>
+          <w:lang w:val="en-US"/>
+        </w:rPr>
+        <w:t xml:space="preserve"> }</w:t>
+      </w:r>
+      <w:proofErr w:type="gramEnd"/>
+      <w:r>
+        <w:rPr>
+          <w:lang w:val="en-US"/>
+        </w:rPr>
+        <w:t xml:space="preserve">} (Style: Caption) {% </w:t>
+      </w:r>
+      <w:proofErr w:type="spellStart"/>
+      <w:r>
+        <w:rPr>
+          <w:lang w:val="en-US"/>
+        </w:rPr>
+        <w:t>endfor</w:t>
+      </w:r>
+      <w:proofErr w:type="spellEnd"/>
+      <w:r>
+        <w:rPr>
+          <w:lang w:val="en-US"/>
+        </w:rPr>
+        <w:t xml:space="preserve"> %} {% endif %}</w:t>
+      </w:r>
     </w:p>
     <w:p>
       <w:pPr>
@@ -3540,12 +4280,6 @@
           <w:lang w:val="en-US"/>
         </w:rPr>
       </w:pPr>
-      <w:r>
-        <w:rPr>
-          <w:lang w:val="en-US"/>
-        </w:rPr>
-        <w:t>{% if tugas.ada_gambar %} Lampiran Bukti: {% for gbr in tugas.list_gambar %} {{ gbr.objek_gambar }} Gambar 2.{{ gbr.nomor_tampil }} {{ gbr.caption }} (Style: Caption) {% endfor %} {% endif %}</w:t>
-      </w:r>
     </w:p>
     <w:p>
       <w:pPr>
@@ -3553,6 +4287,26 @@
           <w:lang w:val="en-US"/>
         </w:rPr>
       </w:pPr>
+      <w:r>
+        <w:rPr>
+          <w:lang w:val="en-US"/>
+        </w:rPr>
+        <w:t xml:space="preserve">{% </w:t>
+      </w:r>
+      <w:proofErr w:type="spellStart"/>
+      <w:r>
+        <w:rPr>
+          <w:lang w:val="en-US"/>
+        </w:rPr>
+        <w:t>endfor</w:t>
+      </w:r>
+      <w:proofErr w:type="spellEnd"/>
+      <w:r>
+        <w:rPr>
+          <w:lang w:val="en-US"/>
+        </w:rPr>
+        <w:t xml:space="preserve"> %} {% endif %}</w:t>
+      </w:r>
     </w:p>
     <w:p>
       <w:pPr>
@@ -3560,24 +4314,11 @@
           <w:lang w:val="en-US"/>
         </w:rPr>
       </w:pPr>
-      <w:r>
-        <w:rPr>
-          <w:lang w:val="en-US"/>
-        </w:rPr>
-        <w:t>{% endfor %} {% endif %}</w:t>
-      </w:r>
     </w:p>
     <w:p>
       <w:pPr>
-        <w:rPr>
-          <w:lang w:val="en-US"/>
-        </w:rPr>
-      </w:pPr>
-    </w:p>
-    <w:p>
-      <w:pPr>
         <w:pStyle w:val="Heading1"/>
-        <w:spacing w:before="0" w:after="0"/>
+        <w:spacing w:before="340" w:after="340"/>
         <w:ind w:left="1077" w:hanging="1077"/>
       </w:pPr>
       <w:bookmarkStart w:id="5" w:name="_Toc197688617"/>
@@ -3590,23 +4331,50 @@
     <w:p>
       <w:pPr>
         <w:rPr>
-          <w:sz w:val="34"/>
-          <w:szCs w:val="34"/>
-          <w:lang w:val="en-US"/>
-        </w:rPr>
-      </w:pPr>
-    </w:p>
-    <w:p>
-      <w:pPr>
-        <w:rPr>
-          <w:lang w:val="en-US"/>
-        </w:rPr>
-      </w:pPr>
-      <w:r>
-        <w:rPr>
-          <w:lang w:val="en-US"/>
-        </w:rPr>
-        <w:t>{{ isi_kesimpulan }}</w:t>
+          <w:lang w:val="en-US"/>
+        </w:rPr>
+      </w:pPr>
+      <w:proofErr w:type="gramStart"/>
+      <w:r>
+        <w:rPr>
+          <w:lang w:val="en-US"/>
+        </w:rPr>
+        <w:t xml:space="preserve">{{ </w:t>
+      </w:r>
+      <w:proofErr w:type="spellStart"/>
+      <w:r>
+        <w:rPr>
+          <w:lang w:val="en-US"/>
+        </w:rPr>
+        <w:t>isi</w:t>
+      </w:r>
+      <w:proofErr w:type="gramEnd"/>
+      <w:r>
+        <w:rPr>
+          <w:lang w:val="en-US"/>
+        </w:rPr>
+        <w:t>_</w:t>
+      </w:r>
+      <w:proofErr w:type="gramStart"/>
+      <w:r>
+        <w:rPr>
+          <w:lang w:val="en-US"/>
+        </w:rPr>
+        <w:t>kesimpulan</w:t>
+      </w:r>
+      <w:proofErr w:type="spellEnd"/>
+      <w:r>
+        <w:rPr>
+          <w:lang w:val="en-US"/>
+        </w:rPr>
+        <w:t xml:space="preserve"> }</w:t>
+      </w:r>
+      <w:proofErr w:type="gramEnd"/>
+      <w:r>
+        <w:rPr>
+          <w:lang w:val="en-US"/>
+        </w:rPr>
+        <w:t>}</w:t>
       </w:r>
     </w:p>
     <w:sectPr>
@@ -3621,7 +4389,7 @@
 </file>
 
 <file path=word/endnotes.xml><?xml version="1.0" encoding="utf-8"?>
-<w:endnotes xmlns:wpc="http://schemas.microsoft.com/office/word/2010/wordprocessingCanvas" xmlns:cx="http://schemas.microsoft.com/office/drawing/2014/chartex" xmlns:cx1="http://schemas.microsoft.com/office/drawing/2015/9/8/chartex" xmlns:cx2="http://schemas.microsoft.com/office/drawing/2015/10/21/chartex" xmlns:cx3="http://schemas.microsoft.com/office/drawing/2016/5/9/chartex" xmlns:cx4="http://schemas.microsoft.com/office/drawing/2016/5/10/chartex" xmlns:cx5="http://schemas.microsoft.com/office/drawing/2016/5/11/chartex" xmlns:cx6="http://schemas.microsoft.com/office/drawing/2016/5/12/chartex" xmlns:cx7="http://schemas.microsoft.com/office/drawing/2016/5/13/chartex" xmlns:cx8="http://schemas.microsoft.com/office/drawing/2016/5/14/chartex" xmlns:mc="http://schemas.openxmlformats.org/markup-compatibility/2006" xmlns:aink="http://schemas.microsoft.com/office/drawing/2016/ink" xmlns:am3d="http://schemas.microsoft.com/office/drawing/2017/model3d" xmlns:o="urn:schemas-microsoft-com:office:office" xmlns:r="http://schemas.openxmlformats.org/officeDocument/2006/relationships" xmlns:m="http://schemas.openxmlformats.org/officeDocument/2006/math" xmlns:v="urn:schemas-microsoft-com:vml" xmlns:wp14="http://schemas.microsoft.com/office/word/2010/wordprocessingDrawing" xmlns:wp="http://schemas.openxmlformats.org/drawingml/2006/wordprocessingDrawing" xmlns:w10="urn:schemas-microsoft-com:office:word" xmlns:w="http://schemas.openxmlformats.org/wordprocessingml/2006/main" xmlns:w14="http://schemas.microsoft.com/office/word/2010/wordml" xmlns:w15="http://schemas.microsoft.com/office/word/2012/wordml" xmlns:w16cex="http://schemas.microsoft.com/office/word/2018/wordml/cex" xmlns:w16cid="http://schemas.microsoft.com/office/word/2016/wordml/cid" xmlns:w16="http://schemas.microsoft.com/office/word/2018/wordml" xmlns:w16se="http://schemas.microsoft.com/office/word/2015/wordml/symex" xmlns:wpg="http://schemas.microsoft.com/office/word/2010/wordprocessingGroup" xmlns:wpi="http://schemas.microsoft.com/office/word/2010/wordprocessingInk" xmlns:wne="http://schemas.microsoft.com/office/word/2006/wordml" xmlns:wps="http://schemas.microsoft.com/office/word/2010/wordprocessingShape" mc:Ignorable="w14 w15 w16se w16cid w16 w16cex wp14">
+<w:endnotes xmlns:wpc="http://schemas.microsoft.com/office/word/2010/wordprocessingCanvas" xmlns:cx="http://schemas.microsoft.com/office/drawing/2014/chartex" xmlns:cx1="http://schemas.microsoft.com/office/drawing/2015/9/8/chartex" xmlns:cx2="http://schemas.microsoft.com/office/drawing/2015/10/21/chartex" xmlns:cx3="http://schemas.microsoft.com/office/drawing/2016/5/9/chartex" xmlns:cx4="http://schemas.microsoft.com/office/drawing/2016/5/10/chartex" xmlns:cx5="http://schemas.microsoft.com/office/drawing/2016/5/11/chartex" xmlns:cx6="http://schemas.microsoft.com/office/drawing/2016/5/12/chartex" xmlns:cx7="http://schemas.microsoft.com/office/drawing/2016/5/13/chartex" xmlns:cx8="http://schemas.microsoft.com/office/drawing/2016/5/14/chartex" xmlns:mc="http://schemas.openxmlformats.org/markup-compatibility/2006" xmlns:aink="http://schemas.microsoft.com/office/drawing/2016/ink" xmlns:am3d="http://schemas.microsoft.com/office/drawing/2017/model3d" xmlns:o="urn:schemas-microsoft-com:office:office" xmlns:oel="http://schemas.microsoft.com/office/2019/extlst" xmlns:r="http://schemas.openxmlformats.org/officeDocument/2006/relationships" xmlns:m="http://schemas.openxmlformats.org/officeDocument/2006/math" xmlns:v="urn:schemas-microsoft-com:vml" xmlns:wp14="http://schemas.microsoft.com/office/word/2010/wordprocessingDrawing" xmlns:wp="http://schemas.openxmlformats.org/drawingml/2006/wordprocessingDrawing" xmlns:w10="urn:schemas-microsoft-com:office:word" xmlns:w="http://schemas.openxmlformats.org/wordprocessingml/2006/main" xmlns:w14="http://schemas.microsoft.com/office/word/2010/wordml" xmlns:w15="http://schemas.microsoft.com/office/word/2012/wordml" xmlns:w16cex="http://schemas.microsoft.com/office/word/2018/wordml/cex" xmlns:w16cid="http://schemas.microsoft.com/office/word/2016/wordml/cid" xmlns:w16="http://schemas.microsoft.com/office/word/2018/wordml" xmlns:w16du="http://schemas.microsoft.com/office/word/2023/wordml/word16du" xmlns:w16sdtdh="http://schemas.microsoft.com/office/word/2020/wordml/sdtdatahash" xmlns:w16sdtfl="http://schemas.microsoft.com/office/word/2024/wordml/sdtformatlock" xmlns:w16se="http://schemas.microsoft.com/office/word/2015/wordml/symex" xmlns:wpg="http://schemas.microsoft.com/office/word/2010/wordprocessingGroup" xmlns:wpi="http://schemas.microsoft.com/office/word/2010/wordprocessingInk" xmlns:wne="http://schemas.microsoft.com/office/word/2006/wordml" xmlns:wps="http://schemas.microsoft.com/office/word/2010/wordprocessingShape" mc:Ignorable="w14 w15 w16se w16cid w16 w16cex w16sdtdh w16sdtfl w16du wp14">
   <w:endnote w:type="separator" w:id="-1">
     <w:p>
       <w:pPr>
@@ -3648,7 +4416,7 @@
 </file>
 
 <file path=word/footer1.xml><?xml version="1.0" encoding="utf-8"?>
-<w:ftr xmlns:wpc="http://schemas.microsoft.com/office/word/2010/wordprocessingCanvas" xmlns:cx="http://schemas.microsoft.com/office/drawing/2014/chartex" xmlns:cx1="http://schemas.microsoft.com/office/drawing/2015/9/8/chartex" xmlns:cx2="http://schemas.microsoft.com/office/drawing/2015/10/21/chartex" xmlns:cx3="http://schemas.microsoft.com/office/drawing/2016/5/9/chartex" xmlns:cx4="http://schemas.microsoft.com/office/drawing/2016/5/10/chartex" xmlns:cx5="http://schemas.microsoft.com/office/drawing/2016/5/11/chartex" xmlns:cx6="http://schemas.microsoft.com/office/drawing/2016/5/12/chartex" xmlns:cx7="http://schemas.microsoft.com/office/drawing/2016/5/13/chartex" xmlns:cx8="http://schemas.microsoft.com/office/drawing/2016/5/14/chartex" xmlns:mc="http://schemas.openxmlformats.org/markup-compatibility/2006" xmlns:aink="http://schemas.microsoft.com/office/drawing/2016/ink" xmlns:am3d="http://schemas.microsoft.com/office/drawing/2017/model3d" xmlns:o="urn:schemas-microsoft-com:office:office" xmlns:r="http://schemas.openxmlformats.org/officeDocument/2006/relationships" xmlns:m="http://schemas.openxmlformats.org/officeDocument/2006/math" xmlns:v="urn:schemas-microsoft-com:vml" xmlns:wp14="http://schemas.microsoft.com/office/word/2010/wordprocessingDrawing" xmlns:wp="http://schemas.openxmlformats.org/drawingml/2006/wordprocessingDrawing" xmlns:w10="urn:schemas-microsoft-com:office:word" xmlns:w="http://schemas.openxmlformats.org/wordprocessingml/2006/main" xmlns:w14="http://schemas.microsoft.com/office/word/2010/wordml" xmlns:w15="http://schemas.microsoft.com/office/word/2012/wordml" xmlns:w16cex="http://schemas.microsoft.com/office/word/2018/wordml/cex" xmlns:w16cid="http://schemas.microsoft.com/office/word/2016/wordml/cid" xmlns:w16="http://schemas.microsoft.com/office/word/2018/wordml" xmlns:w16se="http://schemas.microsoft.com/office/word/2015/wordml/symex" xmlns:wpg="http://schemas.microsoft.com/office/word/2010/wordprocessingGroup" xmlns:wpi="http://schemas.microsoft.com/office/word/2010/wordprocessingInk" xmlns:wne="http://schemas.microsoft.com/office/word/2006/wordml" xmlns:wps="http://schemas.microsoft.com/office/word/2010/wordprocessingShape" mc:Ignorable="w14 w15 w16se w16cid w16 w16cex wp14">
+<w:ftr xmlns:wpc="http://schemas.microsoft.com/office/word/2010/wordprocessingCanvas" xmlns:cx="http://schemas.microsoft.com/office/drawing/2014/chartex" xmlns:cx1="http://schemas.microsoft.com/office/drawing/2015/9/8/chartex" xmlns:cx2="http://schemas.microsoft.com/office/drawing/2015/10/21/chartex" xmlns:cx3="http://schemas.microsoft.com/office/drawing/2016/5/9/chartex" xmlns:cx4="http://schemas.microsoft.com/office/drawing/2016/5/10/chartex" xmlns:cx5="http://schemas.microsoft.com/office/drawing/2016/5/11/chartex" xmlns:cx6="http://schemas.microsoft.com/office/drawing/2016/5/12/chartex" xmlns:cx7="http://schemas.microsoft.com/office/drawing/2016/5/13/chartex" xmlns:cx8="http://schemas.microsoft.com/office/drawing/2016/5/14/chartex" xmlns:mc="http://schemas.openxmlformats.org/markup-compatibility/2006" xmlns:aink="http://schemas.microsoft.com/office/drawing/2016/ink" xmlns:am3d="http://schemas.microsoft.com/office/drawing/2017/model3d" xmlns:o="urn:schemas-microsoft-com:office:office" xmlns:oel="http://schemas.microsoft.com/office/2019/extlst" xmlns:r="http://schemas.openxmlformats.org/officeDocument/2006/relationships" xmlns:m="http://schemas.openxmlformats.org/officeDocument/2006/math" xmlns:v="urn:schemas-microsoft-com:vml" xmlns:wp14="http://schemas.microsoft.com/office/word/2010/wordprocessingDrawing" xmlns:wp="http://schemas.openxmlformats.org/drawingml/2006/wordprocessingDrawing" xmlns:w10="urn:schemas-microsoft-com:office:word" xmlns:w="http://schemas.openxmlformats.org/wordprocessingml/2006/main" xmlns:w14="http://schemas.microsoft.com/office/word/2010/wordml" xmlns:w15="http://schemas.microsoft.com/office/word/2012/wordml" xmlns:w16cex="http://schemas.microsoft.com/office/word/2018/wordml/cex" xmlns:w16cid="http://schemas.microsoft.com/office/word/2016/wordml/cid" xmlns:w16="http://schemas.microsoft.com/office/word/2018/wordml" xmlns:w16du="http://schemas.microsoft.com/office/word/2023/wordml/word16du" xmlns:w16sdtdh="http://schemas.microsoft.com/office/word/2020/wordml/sdtdatahash" xmlns:w16sdtfl="http://schemas.microsoft.com/office/word/2024/wordml/sdtformatlock" xmlns:w16se="http://schemas.microsoft.com/office/word/2015/wordml/symex" xmlns:wpg="http://schemas.microsoft.com/office/word/2010/wordprocessingGroup" xmlns:wpi="http://schemas.microsoft.com/office/word/2010/wordprocessingInk" xmlns:wne="http://schemas.microsoft.com/office/word/2006/wordml" xmlns:wps="http://schemas.microsoft.com/office/word/2010/wordprocessingShape" mc:Ignorable="w14 w15 w16se w16cid w16 w16cex w16sdtdh w16sdtfl w16du wp14">
   <w:sdt>
     <w:sdtPr>
       <w:id w:val="-517623792"/>
@@ -3697,7 +4465,7 @@
 </file>
 
 <file path=word/footer2.xml><?xml version="1.0" encoding="utf-8"?>
-<w:ftr xmlns:wpc="http://schemas.microsoft.com/office/word/2010/wordprocessingCanvas" xmlns:cx="http://schemas.microsoft.com/office/drawing/2014/chartex" xmlns:cx1="http://schemas.microsoft.com/office/drawing/2015/9/8/chartex" xmlns:cx2="http://schemas.microsoft.com/office/drawing/2015/10/21/chartex" xmlns:cx3="http://schemas.microsoft.com/office/drawing/2016/5/9/chartex" xmlns:cx4="http://schemas.microsoft.com/office/drawing/2016/5/10/chartex" xmlns:cx5="http://schemas.microsoft.com/office/drawing/2016/5/11/chartex" xmlns:cx6="http://schemas.microsoft.com/office/drawing/2016/5/12/chartex" xmlns:cx7="http://schemas.microsoft.com/office/drawing/2016/5/13/chartex" xmlns:cx8="http://schemas.microsoft.com/office/drawing/2016/5/14/chartex" xmlns:mc="http://schemas.openxmlformats.org/markup-compatibility/2006" xmlns:aink="http://schemas.microsoft.com/office/drawing/2016/ink" xmlns:am3d="http://schemas.microsoft.com/office/drawing/2017/model3d" xmlns:o="urn:schemas-microsoft-com:office:office" xmlns:r="http://schemas.openxmlformats.org/officeDocument/2006/relationships" xmlns:m="http://schemas.openxmlformats.org/officeDocument/2006/math" xmlns:v="urn:schemas-microsoft-com:vml" xmlns:wp14="http://schemas.microsoft.com/office/word/2010/wordprocessingDrawing" xmlns:wp="http://schemas.openxmlformats.org/drawingml/2006/wordprocessingDrawing" xmlns:w10="urn:schemas-microsoft-com:office:word" xmlns:w="http://schemas.openxmlformats.org/wordprocessingml/2006/main" xmlns:w14="http://schemas.microsoft.com/office/word/2010/wordml" xmlns:w15="http://schemas.microsoft.com/office/word/2012/wordml" xmlns:w16cex="http://schemas.microsoft.com/office/word/2018/wordml/cex" xmlns:w16cid="http://schemas.microsoft.com/office/word/2016/wordml/cid" xmlns:w16="http://schemas.microsoft.com/office/word/2018/wordml" xmlns:w16se="http://schemas.microsoft.com/office/word/2015/wordml/symex" xmlns:wpg="http://schemas.microsoft.com/office/word/2010/wordprocessingGroup" xmlns:wpi="http://schemas.microsoft.com/office/word/2010/wordprocessingInk" xmlns:wne="http://schemas.microsoft.com/office/word/2006/wordml" xmlns:wps="http://schemas.microsoft.com/office/word/2010/wordprocessingShape" mc:Ignorable="w14 w15 w16se w16cid w16 w16cex wp14">
+<w:ftr xmlns:wpc="http://schemas.microsoft.com/office/word/2010/wordprocessingCanvas" xmlns:cx="http://schemas.microsoft.com/office/drawing/2014/chartex" xmlns:cx1="http://schemas.microsoft.com/office/drawing/2015/9/8/chartex" xmlns:cx2="http://schemas.microsoft.com/office/drawing/2015/10/21/chartex" xmlns:cx3="http://schemas.microsoft.com/office/drawing/2016/5/9/chartex" xmlns:cx4="http://schemas.microsoft.com/office/drawing/2016/5/10/chartex" xmlns:cx5="http://schemas.microsoft.com/office/drawing/2016/5/11/chartex" xmlns:cx6="http://schemas.microsoft.com/office/drawing/2016/5/12/chartex" xmlns:cx7="http://schemas.microsoft.com/office/drawing/2016/5/13/chartex" xmlns:cx8="http://schemas.microsoft.com/office/drawing/2016/5/14/chartex" xmlns:mc="http://schemas.openxmlformats.org/markup-compatibility/2006" xmlns:aink="http://schemas.microsoft.com/office/drawing/2016/ink" xmlns:am3d="http://schemas.microsoft.com/office/drawing/2017/model3d" xmlns:o="urn:schemas-microsoft-com:office:office" xmlns:oel="http://schemas.microsoft.com/office/2019/extlst" xmlns:r="http://schemas.openxmlformats.org/officeDocument/2006/relationships" xmlns:m="http://schemas.openxmlformats.org/officeDocument/2006/math" xmlns:v="urn:schemas-microsoft-com:vml" xmlns:wp14="http://schemas.microsoft.com/office/word/2010/wordprocessingDrawing" xmlns:wp="http://schemas.openxmlformats.org/drawingml/2006/wordprocessingDrawing" xmlns:w10="urn:schemas-microsoft-com:office:word" xmlns:w="http://schemas.openxmlformats.org/wordprocessingml/2006/main" xmlns:w14="http://schemas.microsoft.com/office/word/2010/wordml" xmlns:w15="http://schemas.microsoft.com/office/word/2012/wordml" xmlns:w16cex="http://schemas.microsoft.com/office/word/2018/wordml/cex" xmlns:w16cid="http://schemas.microsoft.com/office/word/2016/wordml/cid" xmlns:w16="http://schemas.microsoft.com/office/word/2018/wordml" xmlns:w16du="http://schemas.microsoft.com/office/word/2023/wordml/word16du" xmlns:w16sdtdh="http://schemas.microsoft.com/office/word/2020/wordml/sdtdatahash" xmlns:w16sdtfl="http://schemas.microsoft.com/office/word/2024/wordml/sdtformatlock" xmlns:w16se="http://schemas.microsoft.com/office/word/2015/wordml/symex" xmlns:wpg="http://schemas.microsoft.com/office/word/2010/wordprocessingGroup" xmlns:wpi="http://schemas.microsoft.com/office/word/2010/wordprocessingInk" xmlns:wne="http://schemas.microsoft.com/office/word/2006/wordml" xmlns:wps="http://schemas.microsoft.com/office/word/2010/wordprocessingShape" mc:Ignorable="w14 w15 w16se w16cid w16 w16cex w16sdtdh w16sdtfl w16du wp14">
   <w:sdt>
     <w:sdtPr>
       <w:id w:val="-234937495"/>
@@ -3746,7 +4514,7 @@
 </file>
 
 <file path=word/footnotes.xml><?xml version="1.0" encoding="utf-8"?>
-<w:footnotes xmlns:wpc="http://schemas.microsoft.com/office/word/2010/wordprocessingCanvas" xmlns:cx="http://schemas.microsoft.com/office/drawing/2014/chartex" xmlns:cx1="http://schemas.microsoft.com/office/drawing/2015/9/8/chartex" xmlns:cx2="http://schemas.microsoft.com/office/drawing/2015/10/21/chartex" xmlns:cx3="http://schemas.microsoft.com/office/drawing/2016/5/9/chartex" xmlns:cx4="http://schemas.microsoft.com/office/drawing/2016/5/10/chartex" xmlns:cx5="http://schemas.microsoft.com/office/drawing/2016/5/11/chartex" xmlns:cx6="http://schemas.microsoft.com/office/drawing/2016/5/12/chartex" xmlns:cx7="http://schemas.microsoft.com/office/drawing/2016/5/13/chartex" xmlns:cx8="http://schemas.microsoft.com/office/drawing/2016/5/14/chartex" xmlns:mc="http://schemas.openxmlformats.org/markup-compatibility/2006" xmlns:aink="http://schemas.microsoft.com/office/drawing/2016/ink" xmlns:am3d="http://schemas.microsoft.com/office/drawing/2017/model3d" xmlns:o="urn:schemas-microsoft-com:office:office" xmlns:r="http://schemas.openxmlformats.org/officeDocument/2006/relationships" xmlns:m="http://schemas.openxmlformats.org/officeDocument/2006/math" xmlns:v="urn:schemas-microsoft-com:vml" xmlns:wp14="http://schemas.microsoft.com/office/word/2010/wordprocessingDrawing" xmlns:wp="http://schemas.openxmlformats.org/drawingml/2006/wordprocessingDrawing" xmlns:w10="urn:schemas-microsoft-com:office:word" xmlns:w="http://schemas.openxmlformats.org/wordprocessingml/2006/main" xmlns:w14="http://schemas.microsoft.com/office/word/2010/wordml" xmlns:w15="http://schemas.microsoft.com/office/word/2012/wordml" xmlns:w16cex="http://schemas.microsoft.com/office/word/2018/wordml/cex" xmlns:w16cid="http://schemas.microsoft.com/office/word/2016/wordml/cid" xmlns:w16="http://schemas.microsoft.com/office/word/2018/wordml" xmlns:w16se="http://schemas.microsoft.com/office/word/2015/wordml/symex" xmlns:wpg="http://schemas.microsoft.com/office/word/2010/wordprocessingGroup" xmlns:wpi="http://schemas.microsoft.com/office/word/2010/wordprocessingInk" xmlns:wne="http://schemas.microsoft.com/office/word/2006/wordml" xmlns:wps="http://schemas.microsoft.com/office/word/2010/wordprocessingShape" mc:Ignorable="w14 w15 w16se w16cid w16 w16cex wp14">
+<w:footnotes xmlns:wpc="http://schemas.microsoft.com/office/word/2010/wordprocessingCanvas" xmlns:cx="http://schemas.microsoft.com/office/drawing/2014/chartex" xmlns:cx1="http://schemas.microsoft.com/office/drawing/2015/9/8/chartex" xmlns:cx2="http://schemas.microsoft.com/office/drawing/2015/10/21/chartex" xmlns:cx3="http://schemas.microsoft.com/office/drawing/2016/5/9/chartex" xmlns:cx4="http://schemas.microsoft.com/office/drawing/2016/5/10/chartex" xmlns:cx5="http://schemas.microsoft.com/office/drawing/2016/5/11/chartex" xmlns:cx6="http://schemas.microsoft.com/office/drawing/2016/5/12/chartex" xmlns:cx7="http://schemas.microsoft.com/office/drawing/2016/5/13/chartex" xmlns:cx8="http://schemas.microsoft.com/office/drawing/2016/5/14/chartex" xmlns:mc="http://schemas.openxmlformats.org/markup-compatibility/2006" xmlns:aink="http://schemas.microsoft.com/office/drawing/2016/ink" xmlns:am3d="http://schemas.microsoft.com/office/drawing/2017/model3d" xmlns:o="urn:schemas-microsoft-com:office:office" xmlns:oel="http://schemas.microsoft.com/office/2019/extlst" xmlns:r="http://schemas.openxmlformats.org/officeDocument/2006/relationships" xmlns:m="http://schemas.openxmlformats.org/officeDocument/2006/math" xmlns:v="urn:schemas-microsoft-com:vml" xmlns:wp14="http://schemas.microsoft.com/office/word/2010/wordprocessingDrawing" xmlns:wp="http://schemas.openxmlformats.org/drawingml/2006/wordprocessingDrawing" xmlns:w10="urn:schemas-microsoft-com:office:word" xmlns:w="http://schemas.openxmlformats.org/wordprocessingml/2006/main" xmlns:w14="http://schemas.microsoft.com/office/word/2010/wordml" xmlns:w15="http://schemas.microsoft.com/office/word/2012/wordml" xmlns:w16cex="http://schemas.microsoft.com/office/word/2018/wordml/cex" xmlns:w16cid="http://schemas.microsoft.com/office/word/2016/wordml/cid" xmlns:w16="http://schemas.microsoft.com/office/word/2018/wordml" xmlns:w16du="http://schemas.microsoft.com/office/word/2023/wordml/word16du" xmlns:w16sdtdh="http://schemas.microsoft.com/office/word/2020/wordml/sdtdatahash" xmlns:w16sdtfl="http://schemas.microsoft.com/office/word/2024/wordml/sdtformatlock" xmlns:w16se="http://schemas.microsoft.com/office/word/2015/wordml/symex" xmlns:wpg="http://schemas.microsoft.com/office/word/2010/wordprocessingGroup" xmlns:wpi="http://schemas.microsoft.com/office/word/2010/wordprocessingInk" xmlns:wne="http://schemas.microsoft.com/office/word/2006/wordml" xmlns:wps="http://schemas.microsoft.com/office/word/2010/wordprocessingShape" mc:Ignorable="w14 w15 w16se w16cid w16 w16cex w16sdtdh w16sdtfl w16du wp14">
   <w:footnote w:type="separator" w:id="-1">
     <w:p>
       <w:pPr>
@@ -3773,7 +4541,7 @@
 </file>
 
 <file path=word/numbering.xml><?xml version="1.0" encoding="utf-8"?>
-<w:numbering xmlns:wpc="http://schemas.microsoft.com/office/word/2010/wordprocessingCanvas" xmlns:cx="http://schemas.microsoft.com/office/drawing/2014/chartex" xmlns:cx1="http://schemas.microsoft.com/office/drawing/2015/9/8/chartex" xmlns:cx2="http://schemas.microsoft.com/office/drawing/2015/10/21/chartex" xmlns:cx3="http://schemas.microsoft.com/office/drawing/2016/5/9/chartex" xmlns:cx4="http://schemas.microsoft.com/office/drawing/2016/5/10/chartex" xmlns:cx5="http://schemas.microsoft.com/office/drawing/2016/5/11/chartex" xmlns:cx6="http://schemas.microsoft.com/office/drawing/2016/5/12/chartex" xmlns:cx7="http://schemas.microsoft.com/office/drawing/2016/5/13/chartex" xmlns:cx8="http://schemas.microsoft.com/office/drawing/2016/5/14/chartex" xmlns:mc="http://schemas.openxmlformats.org/markup-compatibility/2006" xmlns:aink="http://schemas.microsoft.com/office/drawing/2016/ink" xmlns:am3d="http://schemas.microsoft.com/office/drawing/2017/model3d" xmlns:o="urn:schemas-microsoft-com:office:office" xmlns:r="http://schemas.openxmlformats.org/officeDocument/2006/relationships" xmlns:m="http://schemas.openxmlformats.org/officeDocument/2006/math" xmlns:v="urn:schemas-microsoft-com:vml" xmlns:wp14="http://schemas.microsoft.com/office/word/2010/wordprocessingDrawing" xmlns:wp="http://schemas.openxmlformats.org/drawingml/2006/wordprocessingDrawing" xmlns:w10="urn:schemas-microsoft-com:office:word" xmlns:w="http://schemas.openxmlformats.org/wordprocessingml/2006/main" xmlns:w14="http://schemas.microsoft.com/office/word/2010/wordml" xmlns:w15="http://schemas.microsoft.com/office/word/2012/wordml" xmlns:w16cex="http://schemas.microsoft.com/office/word/2018/wordml/cex" xmlns:w16cid="http://schemas.microsoft.com/office/word/2016/wordml/cid" xmlns:w16="http://schemas.microsoft.com/office/word/2018/wordml" xmlns:w16se="http://schemas.microsoft.com/office/word/2015/wordml/symex" xmlns:wpg="http://schemas.microsoft.com/office/word/2010/wordprocessingGroup" xmlns:wpi="http://schemas.microsoft.com/office/word/2010/wordprocessingInk" xmlns:wne="http://schemas.microsoft.com/office/word/2006/wordml" xmlns:wps="http://schemas.microsoft.com/office/word/2010/wordprocessingShape" mc:Ignorable="w14 w15 w16se w16cid w16 w16cex wp14">
+<w:numbering xmlns:wpc="http://schemas.microsoft.com/office/word/2010/wordprocessingCanvas" xmlns:cx="http://schemas.microsoft.com/office/drawing/2014/chartex" xmlns:cx1="http://schemas.microsoft.com/office/drawing/2015/9/8/chartex" xmlns:cx2="http://schemas.microsoft.com/office/drawing/2015/10/21/chartex" xmlns:cx3="http://schemas.microsoft.com/office/drawing/2016/5/9/chartex" xmlns:cx4="http://schemas.microsoft.com/office/drawing/2016/5/10/chartex" xmlns:cx5="http://schemas.microsoft.com/office/drawing/2016/5/11/chartex" xmlns:cx6="http://schemas.microsoft.com/office/drawing/2016/5/12/chartex" xmlns:cx7="http://schemas.microsoft.com/office/drawing/2016/5/13/chartex" xmlns:cx8="http://schemas.microsoft.com/office/drawing/2016/5/14/chartex" xmlns:mc="http://schemas.openxmlformats.org/markup-compatibility/2006" xmlns:aink="http://schemas.microsoft.com/office/drawing/2016/ink" xmlns:am3d="http://schemas.microsoft.com/office/drawing/2017/model3d" xmlns:o="urn:schemas-microsoft-com:office:office" xmlns:oel="http://schemas.microsoft.com/office/2019/extlst" xmlns:r="http://schemas.openxmlformats.org/officeDocument/2006/relationships" xmlns:m="http://schemas.openxmlformats.org/officeDocument/2006/math" xmlns:v="urn:schemas-microsoft-com:vml" xmlns:wp14="http://schemas.microsoft.com/office/word/2010/wordprocessingDrawing" xmlns:wp="http://schemas.openxmlformats.org/drawingml/2006/wordprocessingDrawing" xmlns:w10="urn:schemas-microsoft-com:office:word" xmlns:w="http://schemas.openxmlformats.org/wordprocessingml/2006/main" xmlns:w14="http://schemas.microsoft.com/office/word/2010/wordml" xmlns:w15="http://schemas.microsoft.com/office/word/2012/wordml" xmlns:w16cex="http://schemas.microsoft.com/office/word/2018/wordml/cex" xmlns:w16cid="http://schemas.microsoft.com/office/word/2016/wordml/cid" xmlns:w16="http://schemas.microsoft.com/office/word/2018/wordml" xmlns:w16du="http://schemas.microsoft.com/office/word/2023/wordml/word16du" xmlns:w16sdtdh="http://schemas.microsoft.com/office/word/2020/wordml/sdtdatahash" xmlns:w16sdtfl="http://schemas.microsoft.com/office/word/2024/wordml/sdtformatlock" xmlns:w16se="http://schemas.microsoft.com/office/word/2015/wordml/symex" xmlns:wpg="http://schemas.microsoft.com/office/word/2010/wordprocessingGroup" xmlns:wpi="http://schemas.microsoft.com/office/word/2010/wordprocessingInk" xmlns:wne="http://schemas.microsoft.com/office/word/2006/wordml" xmlns:wps="http://schemas.microsoft.com/office/word/2010/wordprocessingShape" mc:Ignorable="w14 w15 w16se w16cid w16 w16cex w16sdtdh w16sdtfl w16du wp14">
   <w:abstractNum w:abstractNumId="0" w15:restartNumberingAfterBreak="0">
     <w:nsid w:val="01344BC1"/>
     <w:multiLevelType w:val="hybridMultilevel"/>
@@ -6773,106 +7541,106 @@
       </w:pPr>
     </w:lvl>
   </w:abstractNum>
-  <w:num w:numId="1">
+  <w:num w:numId="1" w16cid:durableId="1654677218">
     <w:abstractNumId w:val="31"/>
   </w:num>
-  <w:num w:numId="2">
+  <w:num w:numId="2" w16cid:durableId="175121552">
     <w:abstractNumId w:val="25"/>
   </w:num>
-  <w:num w:numId="3">
+  <w:num w:numId="3" w16cid:durableId="596401328">
     <w:abstractNumId w:val="10"/>
   </w:num>
-  <w:num w:numId="4">
+  <w:num w:numId="4" w16cid:durableId="389117485">
     <w:abstractNumId w:val="9"/>
   </w:num>
-  <w:num w:numId="5">
+  <w:num w:numId="5" w16cid:durableId="1755279736">
     <w:abstractNumId w:val="22"/>
   </w:num>
-  <w:num w:numId="6">
+  <w:num w:numId="6" w16cid:durableId="172231383">
     <w:abstractNumId w:val="2"/>
   </w:num>
-  <w:num w:numId="7">
+  <w:num w:numId="7" w16cid:durableId="2070955809">
     <w:abstractNumId w:val="32"/>
   </w:num>
-  <w:num w:numId="8">
+  <w:num w:numId="8" w16cid:durableId="576212238">
     <w:abstractNumId w:val="7"/>
   </w:num>
-  <w:num w:numId="9">
+  <w:num w:numId="9" w16cid:durableId="582029936">
     <w:abstractNumId w:val="0"/>
   </w:num>
-  <w:num w:numId="10">
+  <w:num w:numId="10" w16cid:durableId="1967926187">
     <w:abstractNumId w:val="1"/>
   </w:num>
-  <w:num w:numId="11">
+  <w:num w:numId="11" w16cid:durableId="1896546671">
     <w:abstractNumId w:val="14"/>
   </w:num>
-  <w:num w:numId="12">
+  <w:num w:numId="12" w16cid:durableId="531456458">
     <w:abstractNumId w:val="21"/>
   </w:num>
-  <w:num w:numId="13">
+  <w:num w:numId="13" w16cid:durableId="4984714">
     <w:abstractNumId w:val="17"/>
   </w:num>
-  <w:num w:numId="14">
+  <w:num w:numId="14" w16cid:durableId="1938446030">
     <w:abstractNumId w:val="30"/>
   </w:num>
-  <w:num w:numId="15">
+  <w:num w:numId="15" w16cid:durableId="1294094243">
     <w:abstractNumId w:val="28"/>
   </w:num>
-  <w:num w:numId="16">
+  <w:num w:numId="16" w16cid:durableId="724648704">
     <w:abstractNumId w:val="4"/>
   </w:num>
-  <w:num w:numId="17">
+  <w:num w:numId="17" w16cid:durableId="852380466">
     <w:abstractNumId w:val="3"/>
   </w:num>
-  <w:num w:numId="18">
+  <w:num w:numId="18" w16cid:durableId="791482080">
     <w:abstractNumId w:val="26"/>
   </w:num>
-  <w:num w:numId="19">
+  <w:num w:numId="19" w16cid:durableId="122626575">
     <w:abstractNumId w:val="19"/>
   </w:num>
-  <w:num w:numId="20">
+  <w:num w:numId="20" w16cid:durableId="1455562247">
     <w:abstractNumId w:val="15"/>
   </w:num>
-  <w:num w:numId="21">
+  <w:num w:numId="21" w16cid:durableId="1288583248">
     <w:abstractNumId w:val="5"/>
   </w:num>
-  <w:num w:numId="22">
+  <w:num w:numId="22" w16cid:durableId="723527819">
     <w:abstractNumId w:val="6"/>
   </w:num>
-  <w:num w:numId="23">
+  <w:num w:numId="23" w16cid:durableId="160238791">
     <w:abstractNumId w:val="20"/>
   </w:num>
-  <w:num w:numId="24">
+  <w:num w:numId="24" w16cid:durableId="1008675173">
     <w:abstractNumId w:val="13"/>
   </w:num>
-  <w:num w:numId="25">
+  <w:num w:numId="25" w16cid:durableId="2130510195">
     <w:abstractNumId w:val="18"/>
   </w:num>
-  <w:num w:numId="26">
+  <w:num w:numId="26" w16cid:durableId="2072540866">
     <w:abstractNumId w:val="11"/>
   </w:num>
-  <w:num w:numId="27">
+  <w:num w:numId="27" w16cid:durableId="934555663">
     <w:abstractNumId w:val="27"/>
   </w:num>
-  <w:num w:numId="28">
+  <w:num w:numId="28" w16cid:durableId="1514300958">
     <w:abstractNumId w:val="23"/>
   </w:num>
-  <w:num w:numId="29">
+  <w:num w:numId="29" w16cid:durableId="1519276575">
     <w:abstractNumId w:val="16"/>
   </w:num>
-  <w:num w:numId="30">
+  <w:num w:numId="30" w16cid:durableId="1262296187">
     <w:abstractNumId w:val="24"/>
   </w:num>
-  <w:num w:numId="31">
+  <w:num w:numId="31" w16cid:durableId="23289935">
     <w:abstractNumId w:val="33"/>
   </w:num>
-  <w:num w:numId="32">
+  <w:num w:numId="32" w16cid:durableId="1483085652">
     <w:abstractNumId w:val="12"/>
   </w:num>
-  <w:num w:numId="33">
+  <w:num w:numId="33" w16cid:durableId="1144812362">
     <w:abstractNumId w:val="8"/>
   </w:num>
-  <w:num w:numId="34">
+  <w:num w:numId="34" w16cid:durableId="1309047552">
     <w:abstractNumId w:val="29"/>
   </w:num>
   <w:numIdMacAtCleanup w:val="2"/>
@@ -6880,7 +7648,7 @@
 </file>
 
 <file path=word/styles.xml><?xml version="1.0" encoding="utf-8"?>
-<w:styles xmlns:mc="http://schemas.openxmlformats.org/markup-compatibility/2006" xmlns:r="http://schemas.openxmlformats.org/officeDocument/2006/relationships" xmlns:w="http://schemas.openxmlformats.org/wordprocessingml/2006/main" xmlns:w14="http://schemas.microsoft.com/office/word/2010/wordml" xmlns:w15="http://schemas.microsoft.com/office/word/2012/wordml" xmlns:w16cex="http://schemas.microsoft.com/office/word/2018/wordml/cex" xmlns:w16cid="http://schemas.microsoft.com/office/word/2016/wordml/cid" xmlns:w16="http://schemas.microsoft.com/office/word/2018/wordml" xmlns:w16se="http://schemas.microsoft.com/office/word/2015/wordml/symex" mc:Ignorable="w14 w15 w16se w16cid w16 w16cex">
+<w:styles xmlns:mc="http://schemas.openxmlformats.org/markup-compatibility/2006" xmlns:r="http://schemas.openxmlformats.org/officeDocument/2006/relationships" xmlns:w="http://schemas.openxmlformats.org/wordprocessingml/2006/main" xmlns:w14="http://schemas.microsoft.com/office/word/2010/wordml" xmlns:w15="http://schemas.microsoft.com/office/word/2012/wordml" xmlns:w16cex="http://schemas.microsoft.com/office/word/2018/wordml/cex" xmlns:w16cid="http://schemas.microsoft.com/office/word/2016/wordml/cid" xmlns:w16="http://schemas.microsoft.com/office/word/2018/wordml" xmlns:w16du="http://schemas.microsoft.com/office/word/2023/wordml/word16du" xmlns:w16sdtdh="http://schemas.microsoft.com/office/word/2020/wordml/sdtdatahash" xmlns:w16sdtfl="http://schemas.microsoft.com/office/word/2024/wordml/sdtformatlock" xmlns:w16se="http://schemas.microsoft.com/office/word/2015/wordml/symex" mc:Ignorable="w14 w15 w16se w16cid w16 w16cex w16sdtdh w16sdtfl w16du">
   <w:docDefaults>
     <w:rPrDefault>
       <w:rPr>

</xml_diff>

<commit_message>
merapihkan layout gambar dan langkah kerja baik manual atau AI
</commit_message>
<xml_diff>
--- a/kuliah/DocumentGenerator_Laporan_Praktikum/src/templates/format-1.docx
+++ b/kuliah/DocumentGenerator_Laporan_Praktikum/src/templates/format-1.docx
@@ -174,7 +174,6 @@
           <w:lang w:val="en-US"/>
         </w:rPr>
       </w:pPr>
-      <w:proofErr w:type="gramStart"/>
       <w:r>
         <w:rPr>
           <w:b/>
@@ -195,7 +194,6 @@
         <w:t>judul</w:t>
       </w:r>
       <w:proofErr w:type="spellEnd"/>
-      <w:proofErr w:type="gramEnd"/>
       <w:r>
         <w:rPr>
           <w:b/>
@@ -254,43 +252,25 @@
           <w:lang w:val="en-US"/>
         </w:rPr>
       </w:pPr>
-      <w:proofErr w:type="gramStart"/>
       <w:r>
         <w:rPr>
           <w:b/>
           <w:lang w:val="en-US"/>
         </w:rPr>
-        <w:t>{{ nama</w:t>
-      </w:r>
-      <w:proofErr w:type="gramEnd"/>
+        <w:t>{{ nama }}</w:t>
+      </w:r>
       <w:r>
         <w:rPr>
           <w:b/>
-          <w:lang w:val="en-US"/>
-        </w:rPr>
-        <w:t xml:space="preserve"> }}</w:t>
+        </w:rPr>
+        <w:tab/>
       </w:r>
       <w:r>
         <w:rPr>
           <w:b/>
-        </w:rPr>
-        <w:tab/>
-      </w:r>
-      <w:proofErr w:type="gramStart"/>
-      <w:r>
-        <w:rPr>
-          <w:b/>
-          <w:lang w:val="en-US"/>
-        </w:rPr>
-        <w:t>{{ nim</w:t>
-      </w:r>
-      <w:proofErr w:type="gramEnd"/>
-      <w:r>
-        <w:rPr>
-          <w:b/>
-          <w:lang w:val="en-US"/>
-        </w:rPr>
-        <w:t xml:space="preserve"> }}</w:t>
+          <w:lang w:val="en-US"/>
+        </w:rPr>
+        <w:t>{{ nim }}</w:t>
       </w:r>
     </w:p>
     <w:p>
@@ -3209,55 +3189,23 @@
         </w:numPr>
       </w:pPr>
       <w:r>
-        <w:t>1.</w:t>
-      </w:r>
-      <w:proofErr w:type="gramStart"/>
-      <w:r>
-        <w:t xml:space="preserve">{{ </w:t>
+        <w:t xml:space="preserve">1.{{ </w:t>
       </w:r>
       <w:proofErr w:type="spellStart"/>
       <w:r>
-        <w:t>loop</w:t>
-      </w:r>
-      <w:proofErr w:type="gramEnd"/>
-      <w:r>
-        <w:t>.</w:t>
-      </w:r>
-      <w:proofErr w:type="gramStart"/>
-      <w:r>
-        <w:t>index</w:t>
+        <w:t>loop.index</w:t>
       </w:r>
       <w:proofErr w:type="spellEnd"/>
       <w:r>
-        <w:t xml:space="preserve"> }</w:t>
-      </w:r>
-      <w:proofErr w:type="gramEnd"/>
-      <w:r>
-        <w:t xml:space="preserve">} </w:t>
-      </w:r>
-      <w:proofErr w:type="gramStart"/>
-      <w:r>
-        <w:t xml:space="preserve">{{ </w:t>
+        <w:t xml:space="preserve"> }} {{ </w:t>
       </w:r>
       <w:proofErr w:type="spellStart"/>
       <w:r>
-        <w:t>item</w:t>
-      </w:r>
-      <w:proofErr w:type="gramEnd"/>
-      <w:r>
-        <w:t>.judul_sub_</w:t>
-      </w:r>
-      <w:proofErr w:type="gramStart"/>
-      <w:r>
-        <w:t>bab</w:t>
+        <w:t>item.judul_sub_bab</w:t>
       </w:r>
       <w:proofErr w:type="spellEnd"/>
       <w:r>
-        <w:t xml:space="preserve"> }</w:t>
-      </w:r>
-      <w:proofErr w:type="gramEnd"/>
-      <w:r>
-        <w:t>}</w:t>
+        <w:t xml:space="preserve"> }}</w:t>
       </w:r>
     </w:p>
     <w:p>
@@ -3515,6 +3463,8 @@
     <w:p>
       <w:pPr>
         <w:pStyle w:val="captions"/>
+        <w:spacing w:after="240"/>
+        <w:ind w:left="1077"/>
       </w:pPr>
       <w:bookmarkStart w:id="2" w:name="_Toc221452899"/>
       <w:r>

</xml_diff>

<commit_message>
memperbaiki logika bisnis source code multiple dan single
</commit_message>
<xml_diff>
--- a/kuliah/DocumentGenerator_Laporan_Praktikum/src/templates/format-1.docx
+++ b/kuliah/DocumentGenerator_Laporan_Praktikum/src/templates/format-1.docx
@@ -30,7 +30,6 @@
           <w:lang w:val="en-US"/>
         </w:rPr>
       </w:pPr>
-      <w:proofErr w:type="gramStart"/>
       <w:r>
         <w:rPr>
           <w:b/>
@@ -38,19 +37,43 @@
           <w:szCs w:val="28"/>
           <w:lang w:val="en-US"/>
         </w:rPr>
-        <w:t xml:space="preserve">{{ </w:t>
+        <w:t>{{ mata_kuliah }}</w:t>
       </w:r>
-      <w:proofErr w:type="spellStart"/>
-      <w:r>
+    </w:p>
+    <w:p>
+      <w:pPr>
+        <w:jc w:val="center"/>
+        <w:rPr>
+          <w:b/>
+        </w:rPr>
+      </w:pPr>
+    </w:p>
+    <w:p>
+      <w:pPr>
+        <w:jc w:val="center"/>
+        <w:rPr>
+          <w:b/>
+        </w:rPr>
+      </w:pPr>
+    </w:p>
+    <w:p>
+      <w:pPr>
+        <w:jc w:val="center"/>
         <w:rPr>
           <w:b/>
           <w:sz w:val="28"/>
           <w:szCs w:val="28"/>
           <w:lang w:val="en-US"/>
         </w:rPr>
-        <w:t>mata</w:t>
+      </w:pPr>
+      <w:r>
+        <w:rPr>
+          <w:b/>
+          <w:sz w:val="28"/>
+          <w:szCs w:val="28"/>
+        </w:rPr>
+        <w:t>MODUL</w:t>
       </w:r>
-      <w:proofErr w:type="gramEnd"/>
       <w:r>
         <w:rPr>
           <w:b/>
@@ -58,9 +81,8 @@
           <w:szCs w:val="28"/>
           <w:lang w:val="en-US"/>
         </w:rPr>
-        <w:t>_</w:t>
+        <w:t xml:space="preserve"> </w:t>
       </w:r>
-      <w:proofErr w:type="gramStart"/>
       <w:r>
         <w:rPr>
           <w:b/>
@@ -68,19 +90,19 @@
           <w:szCs w:val="28"/>
           <w:lang w:val="en-US"/>
         </w:rPr>
-        <w:t>kuliah</w:t>
+        <w:t>{{ nomor_modul }}</w:t>
       </w:r>
-      <w:proofErr w:type="spellEnd"/>
-      <w:r>
+    </w:p>
+    <w:p>
+      <w:pPr>
+        <w:jc w:val="center"/>
         <w:rPr>
           <w:b/>
           <w:sz w:val="28"/>
           <w:szCs w:val="28"/>
           <w:lang w:val="en-US"/>
         </w:rPr>
-        <w:t xml:space="preserve"> }</w:t>
-      </w:r>
-      <w:proofErr w:type="gramEnd"/>
+      </w:pPr>
       <w:r>
         <w:rPr>
           <w:b/>
@@ -88,120 +110,7 @@
           <w:szCs w:val="28"/>
           <w:lang w:val="en-US"/>
         </w:rPr>
-        <w:t>}</w:t>
-      </w:r>
-    </w:p>
-    <w:p>
-      <w:pPr>
-        <w:jc w:val="center"/>
-        <w:rPr>
-          <w:b/>
-        </w:rPr>
-      </w:pPr>
-    </w:p>
-    <w:p>
-      <w:pPr>
-        <w:jc w:val="center"/>
-        <w:rPr>
-          <w:b/>
-        </w:rPr>
-      </w:pPr>
-    </w:p>
-    <w:p>
-      <w:pPr>
-        <w:jc w:val="center"/>
-        <w:rPr>
-          <w:b/>
-          <w:sz w:val="28"/>
-          <w:szCs w:val="28"/>
-          <w:lang w:val="en-US"/>
-        </w:rPr>
-      </w:pPr>
-      <w:r>
-        <w:rPr>
-          <w:b/>
-          <w:sz w:val="28"/>
-          <w:szCs w:val="28"/>
-        </w:rPr>
-        <w:t>MODUL</w:t>
-      </w:r>
-      <w:r>
-        <w:rPr>
-          <w:b/>
-          <w:sz w:val="28"/>
-          <w:szCs w:val="28"/>
-          <w:lang w:val="en-US"/>
-        </w:rPr>
-        <w:t xml:space="preserve"> </w:t>
-      </w:r>
-      <w:r>
-        <w:rPr>
-          <w:b/>
-          <w:sz w:val="28"/>
-          <w:szCs w:val="28"/>
-          <w:lang w:val="en-US"/>
-        </w:rPr>
-        <w:t xml:space="preserve">{{ </w:t>
-      </w:r>
-      <w:proofErr w:type="spellStart"/>
-      <w:r>
-        <w:rPr>
-          <w:b/>
-          <w:sz w:val="28"/>
-          <w:szCs w:val="28"/>
-          <w:lang w:val="en-US"/>
-        </w:rPr>
-        <w:t>nomor_modul</w:t>
-      </w:r>
-      <w:proofErr w:type="spellEnd"/>
-      <w:r>
-        <w:rPr>
-          <w:b/>
-          <w:sz w:val="28"/>
-          <w:szCs w:val="28"/>
-          <w:lang w:val="en-US"/>
-        </w:rPr>
-        <w:t xml:space="preserve"> }}</w:t>
-      </w:r>
-    </w:p>
-    <w:p>
-      <w:pPr>
-        <w:jc w:val="center"/>
-        <w:rPr>
-          <w:b/>
-          <w:sz w:val="28"/>
-          <w:szCs w:val="28"/>
-          <w:lang w:val="en-US"/>
-        </w:rPr>
-      </w:pPr>
-      <w:r>
-        <w:rPr>
-          <w:b/>
-          <w:sz w:val="28"/>
-          <w:szCs w:val="28"/>
-          <w:lang w:val="en-US"/>
-        </w:rPr>
-        <w:t xml:space="preserve">{{ </w:t>
-      </w:r>
-      <w:proofErr w:type="spellStart"/>
-      <w:r>
-        <w:rPr>
-          <w:b/>
-          <w:sz w:val="28"/>
-          <w:szCs w:val="28"/>
-          <w:lang w:val="en-US"/>
-        </w:rPr>
-        <w:t>judul</w:t>
-      </w:r>
-      <w:proofErr w:type="spellEnd"/>
-      <w:r>
-        <w:rPr>
-          <w:b/>
-          <w:sz w:val="28"/>
-          <w:szCs w:val="28"/>
-          <w:lang w:val="en-US"/>
-        </w:rPr>
-        <w:t xml:space="preserve"> }}</w:t>
+        <w:t>{{ judul }}</w:t>
       </w:r>
     </w:p>
     <w:p>
@@ -3159,25 +3068,7 @@
           <w:szCs w:val="34"/>
           <w:lang w:val="en-US"/>
         </w:rPr>
-        <w:t xml:space="preserve">{% for item in </w:t>
-      </w:r>
-      <w:proofErr w:type="spellStart"/>
-      <w:r>
-        <w:rPr>
-          <w:sz w:val="34"/>
-          <w:szCs w:val="34"/>
-          <w:lang w:val="en-US"/>
-        </w:rPr>
-        <w:t>daftar_sub_bab</w:t>
-      </w:r>
-      <w:proofErr w:type="spellEnd"/>
-      <w:r>
-        <w:rPr>
-          <w:sz w:val="34"/>
-          <w:szCs w:val="34"/>
-          <w:lang w:val="en-US"/>
-        </w:rPr>
-        <w:t xml:space="preserve"> %}</w:t>
+        <w:t>{% for item in daftar_sub_bab %}</w:t>
       </w:r>
     </w:p>
     <w:p>
@@ -3189,23 +3080,7 @@
         </w:numPr>
       </w:pPr>
       <w:r>
-        <w:t xml:space="preserve">1.{{ </w:t>
-      </w:r>
-      <w:proofErr w:type="spellStart"/>
-      <w:r>
-        <w:t>loop.index</w:t>
-      </w:r>
-      <w:proofErr w:type="spellEnd"/>
-      <w:r>
-        <w:t xml:space="preserve"> }} {{ </w:t>
-      </w:r>
-      <w:proofErr w:type="spellStart"/>
-      <w:r>
-        <w:t>item.judul_sub_bab</w:t>
-      </w:r>
-      <w:proofErr w:type="spellEnd"/>
-      <w:r>
-        <w:t xml:space="preserve"> }}</w:t>
+        <w:t>1.{{ loop.index }} {{ item.judul_sub_bab }}</w:t>
       </w:r>
     </w:p>
     <w:p>
@@ -3235,29 +3110,8 @@
       <w:r>
         <w:t xml:space="preserve"> </w:t>
       </w:r>
-      <w:proofErr w:type="gramStart"/>
       <w:r>
-        <w:t xml:space="preserve">{{ </w:t>
-      </w:r>
-      <w:proofErr w:type="spellStart"/>
-      <w:r>
-        <w:t>item</w:t>
-      </w:r>
-      <w:proofErr w:type="gramEnd"/>
-      <w:r>
-        <w:t>.label_point_</w:t>
-      </w:r>
-      <w:proofErr w:type="gramStart"/>
-      <w:r>
-        <w:t>a</w:t>
-      </w:r>
-      <w:proofErr w:type="spellEnd"/>
-      <w:r>
-        <w:t xml:space="preserve"> }</w:t>
-      </w:r>
-      <w:proofErr w:type="gramEnd"/>
-      <w:r>
-        <w:t>}</w:t>
+        <w:t>{{ item.label_point_a }}</w:t>
       </w:r>
       <w:r>
         <w:t xml:space="preserve"> </w:t>
@@ -3285,18 +3139,8 @@
       <w:pPr>
         <w:pStyle w:val="Code"/>
       </w:pPr>
-      <w:proofErr w:type="gramStart"/>
       <w:r>
-        <w:t xml:space="preserve">{{ </w:t>
-      </w:r>
-      <w:proofErr w:type="spellStart"/>
-      <w:r>
-        <w:t>k.isi</w:t>
-      </w:r>
-      <w:proofErr w:type="spellEnd"/>
-      <w:proofErr w:type="gramEnd"/>
-      <w:r>
-        <w:t xml:space="preserve"> }}</w:t>
+        <w:t>{{ k.isi }}</w:t>
       </w:r>
     </w:p>
     <w:p>
@@ -3373,43 +3217,7 @@
         <w:rPr>
           <w:lang w:val="en-US"/>
         </w:rPr>
-        <w:t xml:space="preserve">{% for </w:t>
-      </w:r>
-      <w:proofErr w:type="spellStart"/>
-      <w:r>
-        <w:rPr>
-          <w:lang w:val="en-US"/>
-        </w:rPr>
-        <w:t>gbr</w:t>
-      </w:r>
-      <w:proofErr w:type="spellEnd"/>
-      <w:r>
-        <w:rPr>
-          <w:lang w:val="en-US"/>
-        </w:rPr>
-        <w:t xml:space="preserve"> in </w:t>
-      </w:r>
-      <w:proofErr w:type="spellStart"/>
-      <w:proofErr w:type="gramStart"/>
-      <w:r>
-        <w:rPr>
-          <w:lang w:val="en-US"/>
-        </w:rPr>
-        <w:t>item.list</w:t>
-      </w:r>
-      <w:proofErr w:type="gramEnd"/>
-      <w:r>
-        <w:rPr>
-          <w:lang w:val="en-US"/>
-        </w:rPr>
-        <w:t>_gambar</w:t>
-      </w:r>
-      <w:proofErr w:type="spellEnd"/>
-      <w:r>
-        <w:rPr>
-          <w:lang w:val="en-US"/>
-        </w:rPr>
-        <w:t xml:space="preserve"> %}</w:t>
+        <w:t>{% for gbr in item.list_gambar %}</w:t>
       </w:r>
       <w:r>
         <w:rPr>
@@ -3417,47 +3225,11 @@
         </w:rPr>
         <w:t xml:space="preserve"> </w:t>
       </w:r>
-      <w:proofErr w:type="gramStart"/>
       <w:r>
         <w:rPr>
           <w:lang w:val="en-US"/>
         </w:rPr>
-        <w:t xml:space="preserve">{{ </w:t>
-      </w:r>
-      <w:proofErr w:type="spellStart"/>
-      <w:r>
-        <w:rPr>
-          <w:lang w:val="en-US"/>
-        </w:rPr>
-        <w:t>gbr</w:t>
-      </w:r>
-      <w:proofErr w:type="gramEnd"/>
-      <w:r>
-        <w:rPr>
-          <w:lang w:val="en-US"/>
-        </w:rPr>
-        <w:t>.objek_</w:t>
-      </w:r>
-      <w:proofErr w:type="gramStart"/>
-      <w:r>
-        <w:rPr>
-          <w:lang w:val="en-US"/>
-        </w:rPr>
-        <w:t>gambar</w:t>
-      </w:r>
-      <w:proofErr w:type="spellEnd"/>
-      <w:r>
-        <w:rPr>
-          <w:lang w:val="en-US"/>
-        </w:rPr>
-        <w:t xml:space="preserve"> }</w:t>
-      </w:r>
-      <w:proofErr w:type="gramEnd"/>
-      <w:r>
-        <w:rPr>
-          <w:lang w:val="en-US"/>
-        </w:rPr>
-        <w:t>}</w:t>
+        <w:t>{{ gbr.objek_gambar }}</w:t>
       </w:r>
     </w:p>
     <w:p>
@@ -3548,21 +3320,7 @@
         <w:rPr>
           <w:lang w:val="en-US"/>
         </w:rPr>
-        <w:t xml:space="preserve">{% </w:t>
-      </w:r>
-      <w:proofErr w:type="spellStart"/>
-      <w:r>
-        <w:rPr>
-          <w:lang w:val="en-US"/>
-        </w:rPr>
-        <w:t>endfor</w:t>
-      </w:r>
-      <w:proofErr w:type="spellEnd"/>
-      <w:r>
-        <w:rPr>
-          <w:lang w:val="en-US"/>
-        </w:rPr>
-        <w:t xml:space="preserve"> %}</w:t>
+        <w:t>{% endfor %}</w:t>
       </w:r>
     </w:p>
     <w:p>
@@ -3581,14 +3339,9 @@
       <w:bookmarkStart w:id="3" w:name="_Toc197688616"/>
       <w:bookmarkStart w:id="4" w:name="_Toc147849649"/>
       <w:r>
-        <w:t xml:space="preserve">Tugas </w:t>
-      </w:r>
-      <w:proofErr w:type="spellStart"/>
-      <w:r>
-        <w:t>Praktikum</w:t>
+        <w:t>Tugas Praktikum</w:t>
       </w:r>
       <w:bookmarkEnd w:id="3"/>
-      <w:proofErr w:type="spellEnd"/>
     </w:p>
     <w:p>
       <w:pPr>
@@ -3600,105 +3353,7 @@
         <w:rPr>
           <w:lang w:val="en-US"/>
         </w:rPr>
-        <w:t xml:space="preserve">{% if </w:t>
-      </w:r>
-      <w:proofErr w:type="spellStart"/>
-      <w:r>
-        <w:rPr>
-          <w:lang w:val="en-US"/>
-        </w:rPr>
-        <w:t>daftar_tugas|length</w:t>
-      </w:r>
-      <w:proofErr w:type="spellEnd"/>
-      <w:r>
-        <w:rPr>
-          <w:lang w:val="en-US"/>
-        </w:rPr>
-        <w:t xml:space="preserve"> == 0 %} (Bagian ini </w:t>
-      </w:r>
-      <w:proofErr w:type="spellStart"/>
-      <w:r>
-        <w:rPr>
-          <w:lang w:val="en-US"/>
-        </w:rPr>
-        <w:t>muncul</w:t>
-      </w:r>
-      <w:proofErr w:type="spellEnd"/>
-      <w:r>
-        <w:rPr>
-          <w:lang w:val="en-US"/>
-        </w:rPr>
-        <w:t xml:space="preserve"> </w:t>
-      </w:r>
-      <w:proofErr w:type="spellStart"/>
-      <w:r>
-        <w:rPr>
-          <w:lang w:val="en-US"/>
-        </w:rPr>
-        <w:t>jika</w:t>
-      </w:r>
-      <w:proofErr w:type="spellEnd"/>
-      <w:r>
-        <w:rPr>
-          <w:lang w:val="en-US"/>
-        </w:rPr>
-        <w:t xml:space="preserve"> Bab 2 </w:t>
-      </w:r>
-      <w:proofErr w:type="spellStart"/>
-      <w:r>
-        <w:rPr>
-          <w:lang w:val="en-US"/>
-        </w:rPr>
-        <w:t>kosong</w:t>
-      </w:r>
-      <w:proofErr w:type="spellEnd"/>
-      <w:r>
-        <w:rPr>
-          <w:lang w:val="en-US"/>
-        </w:rPr>
-        <w:t xml:space="preserve">) Tidak </w:t>
-      </w:r>
-      <w:proofErr w:type="spellStart"/>
-      <w:r>
-        <w:rPr>
-          <w:lang w:val="en-US"/>
-        </w:rPr>
-        <w:t>ada</w:t>
-      </w:r>
-      <w:proofErr w:type="spellEnd"/>
-      <w:r>
-        <w:rPr>
-          <w:lang w:val="en-US"/>
-        </w:rPr>
-        <w:t xml:space="preserve"> tugas </w:t>
-      </w:r>
-      <w:proofErr w:type="spellStart"/>
-      <w:r>
-        <w:rPr>
-          <w:lang w:val="en-US"/>
-        </w:rPr>
-        <w:t>praktikum</w:t>
-      </w:r>
-      <w:proofErr w:type="spellEnd"/>
-      <w:r>
-        <w:rPr>
-          <w:lang w:val="en-US"/>
-        </w:rPr>
-        <w:t xml:space="preserve"> pada </w:t>
-      </w:r>
-      <w:proofErr w:type="spellStart"/>
-      <w:r>
-        <w:rPr>
-          <w:lang w:val="en-US"/>
-        </w:rPr>
-        <w:t>modul</w:t>
-      </w:r>
-      <w:proofErr w:type="spellEnd"/>
-      <w:r>
-        <w:rPr>
-          <w:lang w:val="en-US"/>
-        </w:rPr>
-        <w:t xml:space="preserve"> ini.</w:t>
+        <w:t>{% if daftar_tugas|length == 0 %} (Bagian ini muncul jika Bab 2 kosong) Tidak ada tugas praktikum pada modul ini.</w:t>
       </w:r>
     </w:p>
     <w:p>
@@ -3718,63 +3373,7 @@
         <w:rPr>
           <w:lang w:val="en-US"/>
         </w:rPr>
-        <w:t xml:space="preserve">{% else %} (Bagian ini </w:t>
-      </w:r>
-      <w:proofErr w:type="spellStart"/>
-      <w:r>
-        <w:rPr>
-          <w:lang w:val="en-US"/>
-        </w:rPr>
-        <w:t>muncul</w:t>
-      </w:r>
-      <w:proofErr w:type="spellEnd"/>
-      <w:r>
-        <w:rPr>
-          <w:lang w:val="en-US"/>
-        </w:rPr>
-        <w:t xml:space="preserve"> </w:t>
-      </w:r>
-      <w:proofErr w:type="spellStart"/>
-      <w:r>
-        <w:rPr>
-          <w:lang w:val="en-US"/>
-        </w:rPr>
-        <w:t>jika</w:t>
-      </w:r>
-      <w:proofErr w:type="spellEnd"/>
-      <w:r>
-        <w:rPr>
-          <w:lang w:val="en-US"/>
-        </w:rPr>
-        <w:t xml:space="preserve"> Bab 2 </w:t>
-      </w:r>
-      <w:proofErr w:type="spellStart"/>
-      <w:r>
-        <w:rPr>
-          <w:lang w:val="en-US"/>
-        </w:rPr>
-        <w:t>berisi</w:t>
-      </w:r>
-      <w:proofErr w:type="spellEnd"/>
-      <w:r>
-        <w:rPr>
-          <w:lang w:val="en-US"/>
-        </w:rPr>
-        <w:t xml:space="preserve"> data) {% for tugas in </w:t>
-      </w:r>
-      <w:proofErr w:type="spellStart"/>
-      <w:r>
-        <w:rPr>
-          <w:lang w:val="en-US"/>
-        </w:rPr>
-        <w:t>daftar_tugas</w:t>
-      </w:r>
-      <w:proofErr w:type="spellEnd"/>
-      <w:r>
-        <w:rPr>
-          <w:lang w:val="en-US"/>
-        </w:rPr>
-        <w:t xml:space="preserve"> %}</w:t>
+        <w:t>{% else %} (Bagian ini muncul jika Bab 2 berisi data) {% for tugas in daftar_tugas %}</w:t>
       </w:r>
     </w:p>
     <w:p>
@@ -3794,91 +3393,7 @@
         <w:rPr>
           <w:lang w:val="en-US"/>
         </w:rPr>
-        <w:t>2.</w:t>
-      </w:r>
-      <w:proofErr w:type="gramStart"/>
-      <w:r>
-        <w:rPr>
-          <w:lang w:val="en-US"/>
-        </w:rPr>
-        <w:t xml:space="preserve">{{ </w:t>
-      </w:r>
-      <w:proofErr w:type="spellStart"/>
-      <w:r>
-        <w:rPr>
-          <w:lang w:val="en-US"/>
-        </w:rPr>
-        <w:t>loop</w:t>
-      </w:r>
-      <w:proofErr w:type="gramEnd"/>
-      <w:r>
-        <w:rPr>
-          <w:lang w:val="en-US"/>
-        </w:rPr>
-        <w:t>.</w:t>
-      </w:r>
-      <w:proofErr w:type="gramStart"/>
-      <w:r>
-        <w:rPr>
-          <w:lang w:val="en-US"/>
-        </w:rPr>
-        <w:t>index</w:t>
-      </w:r>
-      <w:proofErr w:type="spellEnd"/>
-      <w:r>
-        <w:rPr>
-          <w:lang w:val="en-US"/>
-        </w:rPr>
-        <w:t xml:space="preserve"> }</w:t>
-      </w:r>
-      <w:proofErr w:type="gramEnd"/>
-      <w:r>
-        <w:rPr>
-          <w:lang w:val="en-US"/>
-        </w:rPr>
-        <w:t xml:space="preserve">} </w:t>
-      </w:r>
-      <w:proofErr w:type="gramStart"/>
-      <w:r>
-        <w:rPr>
-          <w:lang w:val="en-US"/>
-        </w:rPr>
-        <w:t xml:space="preserve">{{ </w:t>
-      </w:r>
-      <w:proofErr w:type="spellStart"/>
-      <w:r>
-        <w:rPr>
-          <w:lang w:val="en-US"/>
-        </w:rPr>
-        <w:t>tugas</w:t>
-      </w:r>
-      <w:proofErr w:type="gramEnd"/>
-      <w:r>
-        <w:rPr>
-          <w:lang w:val="en-US"/>
-        </w:rPr>
-        <w:t>.judul_sub_</w:t>
-      </w:r>
-      <w:proofErr w:type="gramStart"/>
-      <w:r>
-        <w:rPr>
-          <w:lang w:val="en-US"/>
-        </w:rPr>
-        <w:t>bab</w:t>
-      </w:r>
-      <w:proofErr w:type="spellEnd"/>
-      <w:r>
-        <w:rPr>
-          <w:lang w:val="en-US"/>
-        </w:rPr>
-        <w:t xml:space="preserve"> }</w:t>
-      </w:r>
-      <w:proofErr w:type="gramEnd"/>
-      <w:r>
-        <w:rPr>
-          <w:lang w:val="en-US"/>
-        </w:rPr>
-        <w:t>} (Style: Heading 2)</w:t>
+        <w:t>2.{{ loop.index }} {{ tugas.judul_sub_bab }} (Style: Heading 2)</w:t>
       </w:r>
     </w:p>
     <w:p>
@@ -3898,49 +3413,7 @@
         <w:rPr>
           <w:lang w:val="en-US"/>
         </w:rPr>
-        <w:t xml:space="preserve">Soal: </w:t>
-      </w:r>
-      <w:proofErr w:type="gramStart"/>
-      <w:r>
-        <w:rPr>
-          <w:lang w:val="en-US"/>
-        </w:rPr>
-        <w:t xml:space="preserve">{{ </w:t>
-      </w:r>
-      <w:proofErr w:type="spellStart"/>
-      <w:r>
-        <w:rPr>
-          <w:lang w:val="en-US"/>
-        </w:rPr>
-        <w:t>tugas.isi</w:t>
-      </w:r>
-      <w:proofErr w:type="gramEnd"/>
-      <w:r>
-        <w:rPr>
-          <w:lang w:val="en-US"/>
-        </w:rPr>
-        <w:t>_</w:t>
-      </w:r>
-      <w:proofErr w:type="gramStart"/>
-      <w:r>
-        <w:rPr>
-          <w:lang w:val="en-US"/>
-        </w:rPr>
-        <w:t>soal</w:t>
-      </w:r>
-      <w:proofErr w:type="spellEnd"/>
-      <w:r>
-        <w:rPr>
-          <w:lang w:val="en-US"/>
-        </w:rPr>
-        <w:t xml:space="preserve"> }</w:t>
-      </w:r>
-      <w:proofErr w:type="gramEnd"/>
-      <w:r>
-        <w:rPr>
-          <w:lang w:val="en-US"/>
-        </w:rPr>
-        <w:t>}</w:t>
+        <w:t>Soal: {{ tugas.isi_soal }}</w:t>
       </w:r>
     </w:p>
     <w:p>
@@ -3956,61 +3429,11 @@
           <w:lang w:val="en-US"/>
         </w:rPr>
       </w:pPr>
-      <w:proofErr w:type="spellStart"/>
       <w:r>
         <w:rPr>
           <w:lang w:val="en-US"/>
         </w:rPr>
-        <w:t>Jawaban</w:t>
-      </w:r>
-      <w:proofErr w:type="spellEnd"/>
-      <w:r>
-        <w:rPr>
-          <w:lang w:val="en-US"/>
-        </w:rPr>
-        <w:t xml:space="preserve">: </w:t>
-      </w:r>
-      <w:proofErr w:type="gramStart"/>
-      <w:r>
-        <w:rPr>
-          <w:lang w:val="en-US"/>
-        </w:rPr>
-        <w:t xml:space="preserve">{{ </w:t>
-      </w:r>
-      <w:proofErr w:type="spellStart"/>
-      <w:r>
-        <w:rPr>
-          <w:lang w:val="en-US"/>
-        </w:rPr>
-        <w:t>tugas.isi</w:t>
-      </w:r>
-      <w:proofErr w:type="gramEnd"/>
-      <w:r>
-        <w:rPr>
-          <w:lang w:val="en-US"/>
-        </w:rPr>
-        <w:t>_</w:t>
-      </w:r>
-      <w:proofErr w:type="gramStart"/>
-      <w:r>
-        <w:rPr>
-          <w:lang w:val="en-US"/>
-        </w:rPr>
-        <w:t>jawaban</w:t>
-      </w:r>
-      <w:proofErr w:type="spellEnd"/>
-      <w:r>
-        <w:rPr>
-          <w:lang w:val="en-US"/>
-        </w:rPr>
-        <w:t xml:space="preserve"> }</w:t>
-      </w:r>
-      <w:proofErr w:type="gramEnd"/>
-      <w:r>
-        <w:rPr>
-          <w:lang w:val="en-US"/>
-        </w:rPr>
-        <w:t>}</w:t>
+        <w:t>Jawaban: {{ tugas.isi_jawaban }}</w:t>
       </w:r>
     </w:p>
     <w:p>
@@ -4031,197 +3454,7 @@
           <w:lang w:val="en-US"/>
         </w:rPr>
         <w:lastRenderedPageBreak/>
-        <w:t xml:space="preserve">{% if </w:t>
-      </w:r>
-      <w:proofErr w:type="spellStart"/>
-      <w:r>
-        <w:rPr>
-          <w:lang w:val="en-US"/>
-        </w:rPr>
-        <w:t>tugas.ada_gambar</w:t>
-      </w:r>
-      <w:proofErr w:type="spellEnd"/>
-      <w:r>
-        <w:rPr>
-          <w:lang w:val="en-US"/>
-        </w:rPr>
-        <w:t xml:space="preserve"> %} Lampiran Bukti: {% for </w:t>
-      </w:r>
-      <w:proofErr w:type="spellStart"/>
-      <w:r>
-        <w:rPr>
-          <w:lang w:val="en-US"/>
-        </w:rPr>
-        <w:t>gbr</w:t>
-      </w:r>
-      <w:proofErr w:type="spellEnd"/>
-      <w:r>
-        <w:rPr>
-          <w:lang w:val="en-US"/>
-        </w:rPr>
-        <w:t xml:space="preserve"> in </w:t>
-      </w:r>
-      <w:proofErr w:type="spellStart"/>
-      <w:proofErr w:type="gramStart"/>
-      <w:r>
-        <w:rPr>
-          <w:lang w:val="en-US"/>
-        </w:rPr>
-        <w:t>tugas.list</w:t>
-      </w:r>
-      <w:proofErr w:type="gramEnd"/>
-      <w:r>
-        <w:rPr>
-          <w:lang w:val="en-US"/>
-        </w:rPr>
-        <w:t>_gambar</w:t>
-      </w:r>
-      <w:proofErr w:type="spellEnd"/>
-      <w:r>
-        <w:rPr>
-          <w:lang w:val="en-US"/>
-        </w:rPr>
-        <w:t xml:space="preserve"> %} </w:t>
-      </w:r>
-      <w:proofErr w:type="gramStart"/>
-      <w:r>
-        <w:rPr>
-          <w:lang w:val="en-US"/>
-        </w:rPr>
-        <w:t xml:space="preserve">{{ </w:t>
-      </w:r>
-      <w:proofErr w:type="spellStart"/>
-      <w:r>
-        <w:rPr>
-          <w:lang w:val="en-US"/>
-        </w:rPr>
-        <w:t>gbr</w:t>
-      </w:r>
-      <w:proofErr w:type="gramEnd"/>
-      <w:r>
-        <w:rPr>
-          <w:lang w:val="en-US"/>
-        </w:rPr>
-        <w:t>.objek_</w:t>
-      </w:r>
-      <w:proofErr w:type="gramStart"/>
-      <w:r>
-        <w:rPr>
-          <w:lang w:val="en-US"/>
-        </w:rPr>
-        <w:t>gambar</w:t>
-      </w:r>
-      <w:proofErr w:type="spellEnd"/>
-      <w:r>
-        <w:rPr>
-          <w:lang w:val="en-US"/>
-        </w:rPr>
-        <w:t xml:space="preserve"> }</w:t>
-      </w:r>
-      <w:proofErr w:type="gramEnd"/>
-      <w:r>
-        <w:rPr>
-          <w:lang w:val="en-US"/>
-        </w:rPr>
-        <w:t xml:space="preserve">} Gambar </w:t>
-      </w:r>
-      <w:proofErr w:type="gramStart"/>
-      <w:r>
-        <w:rPr>
-          <w:lang w:val="en-US"/>
-        </w:rPr>
-        <w:t xml:space="preserve">2.{{ </w:t>
-      </w:r>
-      <w:proofErr w:type="spellStart"/>
-      <w:r>
-        <w:rPr>
-          <w:lang w:val="en-US"/>
-        </w:rPr>
-        <w:t>gbr</w:t>
-      </w:r>
-      <w:proofErr w:type="gramEnd"/>
-      <w:r>
-        <w:rPr>
-          <w:lang w:val="en-US"/>
-        </w:rPr>
-        <w:t>.nomor_</w:t>
-      </w:r>
-      <w:proofErr w:type="gramStart"/>
-      <w:r>
-        <w:rPr>
-          <w:lang w:val="en-US"/>
-        </w:rPr>
-        <w:t>tampil</w:t>
-      </w:r>
-      <w:proofErr w:type="spellEnd"/>
-      <w:r>
-        <w:rPr>
-          <w:lang w:val="en-US"/>
-        </w:rPr>
-        <w:t xml:space="preserve"> }</w:t>
-      </w:r>
-      <w:proofErr w:type="gramEnd"/>
-      <w:r>
-        <w:rPr>
-          <w:lang w:val="en-US"/>
-        </w:rPr>
-        <w:t xml:space="preserve">} </w:t>
-      </w:r>
-      <w:proofErr w:type="gramStart"/>
-      <w:r>
-        <w:rPr>
-          <w:lang w:val="en-US"/>
-        </w:rPr>
-        <w:t xml:space="preserve">{{ </w:t>
-      </w:r>
-      <w:proofErr w:type="spellStart"/>
-      <w:r>
-        <w:rPr>
-          <w:lang w:val="en-US"/>
-        </w:rPr>
-        <w:t>gbr</w:t>
-      </w:r>
-      <w:proofErr w:type="gramEnd"/>
-      <w:r>
-        <w:rPr>
-          <w:lang w:val="en-US"/>
-        </w:rPr>
-        <w:t>.</w:t>
-      </w:r>
-      <w:proofErr w:type="gramStart"/>
-      <w:r>
-        <w:rPr>
-          <w:lang w:val="en-US"/>
-        </w:rPr>
-        <w:t>caption</w:t>
-      </w:r>
-      <w:proofErr w:type="spellEnd"/>
-      <w:r>
-        <w:rPr>
-          <w:lang w:val="en-US"/>
-        </w:rPr>
-        <w:t xml:space="preserve"> }</w:t>
-      </w:r>
-      <w:proofErr w:type="gramEnd"/>
-      <w:r>
-        <w:rPr>
-          <w:lang w:val="en-US"/>
-        </w:rPr>
-        <w:t xml:space="preserve">} (Style: Caption) {% </w:t>
-      </w:r>
-      <w:proofErr w:type="spellStart"/>
-      <w:r>
-        <w:rPr>
-          <w:lang w:val="en-US"/>
-        </w:rPr>
-        <w:t>endfor</w:t>
-      </w:r>
-      <w:proofErr w:type="spellEnd"/>
-      <w:r>
-        <w:rPr>
-          <w:lang w:val="en-US"/>
-        </w:rPr>
-        <w:t xml:space="preserve"> %} {% endif %}</w:t>
+        <w:t>{% if tugas.ada_gambar %} Lampiran Bukti: {% for gbr in tugas.list_gambar %} {{ gbr.objek_gambar }} Gambar 2.{{ gbr.nomor_tampil }} {{ gbr.caption }} (Style: Caption) {% endfor %} {% endif %}</w:t>
       </w:r>
     </w:p>
     <w:p>
@@ -4241,21 +3474,7 @@
         <w:rPr>
           <w:lang w:val="en-US"/>
         </w:rPr>
-        <w:t xml:space="preserve">{% </w:t>
-      </w:r>
-      <w:proofErr w:type="spellStart"/>
-      <w:r>
-        <w:rPr>
-          <w:lang w:val="en-US"/>
-        </w:rPr>
-        <w:t>endfor</w:t>
-      </w:r>
-      <w:proofErr w:type="spellEnd"/>
-      <w:r>
-        <w:rPr>
-          <w:lang w:val="en-US"/>
-        </w:rPr>
-        <w:t xml:space="preserve"> %} {% endif %}</w:t>
+        <w:t>{% endfor %} {% endif %}</w:t>
       </w:r>
     </w:p>
     <w:p>
@@ -4284,47 +3503,11 @@
           <w:lang w:val="en-US"/>
         </w:rPr>
       </w:pPr>
-      <w:proofErr w:type="gramStart"/>
       <w:r>
         <w:rPr>
           <w:lang w:val="en-US"/>
         </w:rPr>
-        <w:t xml:space="preserve">{{ </w:t>
-      </w:r>
-      <w:proofErr w:type="spellStart"/>
-      <w:r>
-        <w:rPr>
-          <w:lang w:val="en-US"/>
-        </w:rPr>
-        <w:t>isi</w:t>
-      </w:r>
-      <w:proofErr w:type="gramEnd"/>
-      <w:r>
-        <w:rPr>
-          <w:lang w:val="en-US"/>
-        </w:rPr>
-        <w:t>_</w:t>
-      </w:r>
-      <w:proofErr w:type="gramStart"/>
-      <w:r>
-        <w:rPr>
-          <w:lang w:val="en-US"/>
-        </w:rPr>
-        <w:t>kesimpulan</w:t>
-      </w:r>
-      <w:proofErr w:type="spellEnd"/>
-      <w:r>
-        <w:rPr>
-          <w:lang w:val="en-US"/>
-        </w:rPr>
-        <w:t xml:space="preserve"> }</w:t>
-      </w:r>
-      <w:proofErr w:type="gramEnd"/>
-      <w:r>
-        <w:rPr>
-          <w:lang w:val="en-US"/>
-        </w:rPr>
-        <w:t>}</w:t>
+        <w:t>{{ isi_kesimpulan }}</w:t>
       </w:r>
     </w:p>
     <w:sectPr>

</xml_diff>

<commit_message>
memperbaiki format template dan UI untuk pemanggilan kode jinja2
</commit_message>
<xml_diff>
--- a/kuliah/DocumentGenerator_Laporan_Praktikum/src/templates/format-1.docx
+++ b/kuliah/DocumentGenerator_Laporan_Praktikum/src/templates/format-1.docx
@@ -1,6 +1,6 @@
 
 <file path=word/document.xml><?xml version="1.0" encoding="utf-8"?>
-<w:document xmlns:wpc="http://schemas.microsoft.com/office/word/2010/wordprocessingCanvas" xmlns:cx="http://schemas.microsoft.com/office/drawing/2014/chartex" xmlns:cx1="http://schemas.microsoft.com/office/drawing/2015/9/8/chartex" xmlns:cx2="http://schemas.microsoft.com/office/drawing/2015/10/21/chartex" xmlns:cx3="http://schemas.microsoft.com/office/drawing/2016/5/9/chartex" xmlns:cx4="http://schemas.microsoft.com/office/drawing/2016/5/10/chartex" xmlns:cx5="http://schemas.microsoft.com/office/drawing/2016/5/11/chartex" xmlns:cx6="http://schemas.microsoft.com/office/drawing/2016/5/12/chartex" xmlns:cx7="http://schemas.microsoft.com/office/drawing/2016/5/13/chartex" xmlns:cx8="http://schemas.microsoft.com/office/drawing/2016/5/14/chartex" xmlns:mc="http://schemas.openxmlformats.org/markup-compatibility/2006" xmlns:aink="http://schemas.microsoft.com/office/drawing/2016/ink" xmlns:am3d="http://schemas.microsoft.com/office/drawing/2017/model3d" xmlns:o="urn:schemas-microsoft-com:office:office" xmlns:oel="http://schemas.microsoft.com/office/2019/extlst" xmlns:r="http://schemas.openxmlformats.org/officeDocument/2006/relationships" xmlns:m="http://schemas.openxmlformats.org/officeDocument/2006/math" xmlns:v="urn:schemas-microsoft-com:vml" xmlns:wp14="http://schemas.microsoft.com/office/word/2010/wordprocessingDrawing" xmlns:wp="http://schemas.openxmlformats.org/drawingml/2006/wordprocessingDrawing" xmlns:w10="urn:schemas-microsoft-com:office:word" xmlns:w="http://schemas.openxmlformats.org/wordprocessingml/2006/main" xmlns:w14="http://schemas.microsoft.com/office/word/2010/wordml" xmlns:w15="http://schemas.microsoft.com/office/word/2012/wordml" xmlns:w16cex="http://schemas.microsoft.com/office/word/2018/wordml/cex" xmlns:w16cid="http://schemas.microsoft.com/office/word/2016/wordml/cid" xmlns:w16="http://schemas.microsoft.com/office/word/2018/wordml" xmlns:w16du="http://schemas.microsoft.com/office/word/2023/wordml/word16du" xmlns:w16sdtdh="http://schemas.microsoft.com/office/word/2020/wordml/sdtdatahash" xmlns:w16sdtfl="http://schemas.microsoft.com/office/word/2024/wordml/sdtformatlock" xmlns:w16se="http://schemas.microsoft.com/office/word/2015/wordml/symex" xmlns:wpg="http://schemas.microsoft.com/office/word/2010/wordprocessingGroup" xmlns:wpi="http://schemas.microsoft.com/office/word/2010/wordprocessingInk" xmlns:wne="http://schemas.microsoft.com/office/word/2006/wordml" xmlns:wps="http://schemas.microsoft.com/office/word/2010/wordprocessingShape" mc:Ignorable="w14 w15 w16se w16cid w16 w16cex w16sdtdh w16sdtfl w16du wp14">
+<w:document xmlns:wpc="http://schemas.microsoft.com/office/word/2010/wordprocessingCanvas" xmlns:cx="http://schemas.microsoft.com/office/drawing/2014/chartex" xmlns:cx1="http://schemas.microsoft.com/office/drawing/2015/9/8/chartex" xmlns:cx2="http://schemas.microsoft.com/office/drawing/2015/10/21/chartex" xmlns:cx3="http://schemas.microsoft.com/office/drawing/2016/5/9/chartex" xmlns:cx4="http://schemas.microsoft.com/office/drawing/2016/5/10/chartex" xmlns:cx5="http://schemas.microsoft.com/office/drawing/2016/5/11/chartex" xmlns:cx6="http://schemas.microsoft.com/office/drawing/2016/5/12/chartex" xmlns:cx7="http://schemas.microsoft.com/office/drawing/2016/5/13/chartex" xmlns:cx8="http://schemas.microsoft.com/office/drawing/2016/5/14/chartex" xmlns:mc="http://schemas.openxmlformats.org/markup-compatibility/2006" xmlns:aink="http://schemas.microsoft.com/office/drawing/2016/ink" xmlns:am3d="http://schemas.microsoft.com/office/drawing/2017/model3d" xmlns:o="urn:schemas-microsoft-com:office:office" xmlns:r="http://schemas.openxmlformats.org/officeDocument/2006/relationships" xmlns:m="http://schemas.openxmlformats.org/officeDocument/2006/math" xmlns:v="urn:schemas-microsoft-com:vml" xmlns:wp14="http://schemas.microsoft.com/office/word/2010/wordprocessingDrawing" xmlns:wp="http://schemas.openxmlformats.org/drawingml/2006/wordprocessingDrawing" xmlns:w10="urn:schemas-microsoft-com:office:word" xmlns:w="http://schemas.openxmlformats.org/wordprocessingml/2006/main" xmlns:w14="http://schemas.microsoft.com/office/word/2010/wordml" xmlns:w15="http://schemas.microsoft.com/office/word/2012/wordml" xmlns:w16cex="http://schemas.microsoft.com/office/word/2018/wordml/cex" xmlns:w16cid="http://schemas.microsoft.com/office/word/2016/wordml/cid" xmlns:w16="http://schemas.microsoft.com/office/word/2018/wordml" xmlns:w16se="http://schemas.microsoft.com/office/word/2015/wordml/symex" xmlns:wpg="http://schemas.microsoft.com/office/word/2010/wordprocessingGroup" xmlns:wpi="http://schemas.microsoft.com/office/word/2010/wordprocessingInk" xmlns:wne="http://schemas.microsoft.com/office/word/2006/wordml" xmlns:wps="http://schemas.microsoft.com/office/word/2010/wordprocessingShape" mc:Ignorable="w14 w15 w16se w16cid w16 w16cex wp14">
   <w:body>
     <w:p>
       <w:pPr>
@@ -2964,7 +2964,6 @@
       </w:pPr>
       <w:bookmarkStart w:id="0" w:name="_Toc197688582"/>
       <w:r>
-        <w:lastRenderedPageBreak/>
         <w:t>DAFTAR GAMBAR</w:t>
       </w:r>
       <w:bookmarkEnd w:id="0"/>
@@ -3049,7 +3048,6 @@
       </w:pPr>
       <w:bookmarkStart w:id="1" w:name="_Toc197688583"/>
       <w:r>
-        <w:lastRenderedPageBreak/>
         <w:t>HASIL PRAKTIKUM</w:t>
       </w:r>
       <w:bookmarkEnd w:id="1"/>
@@ -3080,7 +3078,10 @@
         </w:numPr>
       </w:pPr>
       <w:r>
-        <w:t>1.{{ loop.index }} {{ item.judul_sub_bab }}</w:t>
+        <w:t>I</w:t>
+      </w:r>
+      <w:r>
+        <w:t>.{{ loop.index }} {{ item.judul_sub_bab }}</w:t>
       </w:r>
     </w:p>
     <w:p>
@@ -3093,10 +3094,13 @@
         <w:ind w:left="510" w:hanging="153"/>
       </w:pPr>
       <w:r>
+        <w:t>I</w:t>
+      </w:r>
+      <w:r>
         <w:rPr>
           <w:lang w:val="id-ID"/>
         </w:rPr>
-        <w:t>1.{{ loop.index }}</w:t>
+        <w:t>.{{ loop.index }}</w:t>
       </w:r>
       <w:r>
         <w:rPr>
@@ -3185,10 +3189,13 @@
         <w:ind w:left="510" w:hanging="153"/>
       </w:pPr>
       <w:r>
+        <w:t>I</w:t>
+      </w:r>
+      <w:r>
         <w:rPr>
           <w:lang w:val="id-ID"/>
         </w:rPr>
-        <w:t>1.{{ loop.index }}</w:t>
+        <w:t>.{{ loop.index }}</w:t>
       </w:r>
       <w:r>
         <w:rPr>
@@ -3201,6 +3208,9 @@
       </w:r>
       <w:r>
         <w:t xml:space="preserve"> </w:t>
+      </w:r>
+      <w:r>
+        <w:t xml:space="preserve">Tampilan </w:t>
       </w:r>
       <w:r>
         <w:t xml:space="preserve">Hasil </w:t>
@@ -3279,10 +3289,13 @@
         <w:ind w:left="357"/>
       </w:pPr>
       <w:r>
+        <w:t>I</w:t>
+      </w:r>
+      <w:r>
         <w:rPr>
           <w:lang w:val="id-ID"/>
         </w:rPr>
-        <w:t>1.{{ loop.index }}</w:t>
+        <w:t>.{{ loop.index }}</w:t>
       </w:r>
       <w:r>
         <w:rPr>
@@ -3339,112 +3352,223 @@
       <w:bookmarkStart w:id="3" w:name="_Toc197688616"/>
       <w:bookmarkStart w:id="4" w:name="_Toc147849649"/>
       <w:r>
-        <w:t>Tugas Praktikum</w:t>
+        <w:t>TUGAS PRAKTIKUM</w:t>
       </w:r>
       <w:bookmarkEnd w:id="3"/>
     </w:p>
     <w:p>
-      <w:pPr>
-        <w:rPr>
-          <w:lang w:val="en-US"/>
-        </w:rPr>
-      </w:pPr>
-      <w:r>
-        <w:rPr>
-          <w:lang w:val="en-US"/>
-        </w:rPr>
-        <w:t>{% if daftar_tugas|length == 0 %} (Bagian ini muncul jika Bab 2 kosong) Tidak ada tugas praktikum pada modul ini.</w:t>
+      <w:r>
+        <w:t>{% if</w:t>
+      </w:r>
+      <w:r>
+        <w:t xml:space="preserve"> daftar_tugas|length == 0</w:t>
+      </w:r>
+      <w:r>
+        <w:t>%}</w:t>
       </w:r>
     </w:p>
     <w:p>
       <w:pPr>
-        <w:rPr>
-          <w:lang w:val="en-US"/>
-        </w:rPr>
-      </w:pPr>
+        <w:pStyle w:val="Text"/>
+      </w:pPr>
+      <w:r>
+        <w:t xml:space="preserve">Berdasarkan praktikum yang telah dilaksanakan, bahwa pada pertemuan </w:t>
+      </w:r>
+      <w:r>
+        <w:t>ke-</w:t>
+      </w:r>
+      <w:r>
+        <w:t>{{ nomor_modul }} ini tidak terdapat tugas praktikum.</w:t>
+      </w:r>
     </w:p>
     <w:p>
       <w:pPr>
         <w:rPr>
+          <w:sz w:val="34"/>
+          <w:szCs w:val="34"/>
           <w:lang w:val="en-US"/>
         </w:rPr>
       </w:pPr>
       <w:r>
         <w:rPr>
+          <w:sz w:val="34"/>
+          <w:szCs w:val="34"/>
           <w:lang w:val="en-US"/>
         </w:rPr>
-        <w:t>{% else %} (Bagian ini muncul jika Bab 2 berisi data) {% for tugas in daftar_tugas %}</w:t>
+        <w:t>{% else %}</w:t>
+      </w:r>
+      <w:r>
+        <w:rPr>
+          <w:sz w:val="34"/>
+          <w:szCs w:val="34"/>
+          <w:lang w:val="en-US"/>
+        </w:rPr>
+        <w:t>{% for item in daftar_</w:t>
+      </w:r>
+      <w:r>
+        <w:rPr>
+          <w:sz w:val="34"/>
+          <w:szCs w:val="34"/>
+          <w:lang w:val="en-US"/>
+        </w:rPr>
+        <w:t>tugas</w:t>
+      </w:r>
+      <w:r>
+        <w:rPr>
+          <w:sz w:val="34"/>
+          <w:szCs w:val="34"/>
+          <w:lang w:val="en-US"/>
+        </w:rPr>
+        <w:t xml:space="preserve"> %}</w:t>
       </w:r>
     </w:p>
     <w:p>
       <w:pPr>
-        <w:rPr>
-          <w:lang w:val="en-US"/>
-        </w:rPr>
-      </w:pPr>
+        <w:pStyle w:val="Heading2"/>
+        <w:numPr>
+          <w:ilvl w:val="0"/>
+          <w:numId w:val="0"/>
+        </w:numPr>
+      </w:pPr>
+      <w:r>
+        <w:t>II</w:t>
+      </w:r>
+      <w:r>
+        <w:t>.{{ loop.index }} {{ item.judul_sub_bab }}</w:t>
+      </w:r>
     </w:p>
     <w:p>
       <w:pPr>
-        <w:rPr>
-          <w:lang w:val="en-US"/>
-        </w:rPr>
-      </w:pPr>
-      <w:r>
-        <w:rPr>
-          <w:lang w:val="en-US"/>
-        </w:rPr>
-        <w:t>2.{{ loop.index }} {{ tugas.judul_sub_bab }} (Style: Heading 2)</w:t>
+        <w:pStyle w:val="Heading3"/>
+        <w:numPr>
+          <w:ilvl w:val="0"/>
+          <w:numId w:val="0"/>
+        </w:numPr>
+        <w:ind w:left="510" w:hanging="153"/>
+      </w:pPr>
+      <w:r>
+        <w:t>II</w:t>
+      </w:r>
+      <w:r>
+        <w:rPr>
+          <w:lang w:val="id-ID"/>
+        </w:rPr>
+        <w:t>.{{ loop.index }}</w:t>
+      </w:r>
+      <w:r>
+        <w:rPr>
+          <w:lang w:val="id-ID"/>
+        </w:rPr>
+        <w:t>.</w:t>
+      </w:r>
+      <w:r>
+        <w:t>A.</w:t>
+      </w:r>
+      <w:r>
+        <w:t xml:space="preserve"> </w:t>
+      </w:r>
+      <w:r>
+        <w:t>{{ item.label_point_a }}</w:t>
+      </w:r>
+      <w:r>
+        <w:t xml:space="preserve"> </w:t>
       </w:r>
     </w:p>
     <w:p>
       <w:pPr>
-        <w:rPr>
-          <w:lang w:val="en-US"/>
-        </w:rPr>
-      </w:pPr>
+        <w:ind w:left="1321" w:hanging="357"/>
+        <w:jc w:val="left"/>
+      </w:pPr>
+      <w:r>
+        <w:t>{% if item.list_kode %}</w:t>
+      </w:r>
+      <w:r>
+        <w:t>{% for k in item.list_kode %}</w:t>
+      </w:r>
+      <w:r>
+        <w:t xml:space="preserve"> </w:t>
+      </w:r>
+      <w:r>
+        <w:t>{{ k.judul }}</w:t>
+      </w:r>
     </w:p>
     <w:p>
       <w:pPr>
-        <w:rPr>
-          <w:lang w:val="en-US"/>
-        </w:rPr>
-      </w:pPr>
-      <w:r>
-        <w:rPr>
-          <w:lang w:val="en-US"/>
-        </w:rPr>
-        <w:t>Soal: {{ tugas.isi_soal }}</w:t>
+        <w:pStyle w:val="Code"/>
+      </w:pPr>
+      <w:r>
+        <w:t>{{ k.isi }}</w:t>
       </w:r>
     </w:p>
     <w:p>
       <w:pPr>
-        <w:rPr>
-          <w:lang w:val="en-US"/>
-        </w:rPr>
-      </w:pPr>
+        <w:ind w:left="1378" w:hanging="357"/>
+      </w:pPr>
+      <w:r>
+        <w:t>{% endfor %}</w:t>
+      </w:r>
+      <w:r>
+        <w:t>{% else %}</w:t>
+      </w:r>
+      <w:r>
+        <w:t>{% for baris in item.isi_point_a %}</w:t>
+      </w:r>
     </w:p>
     <w:p>
       <w:pPr>
-        <w:rPr>
-          <w:lang w:val="en-US"/>
-        </w:rPr>
-      </w:pPr>
-      <w:r>
-        <w:rPr>
-          <w:lang w:val="en-US"/>
-        </w:rPr>
-        <w:t>Jawaban: {{ tugas.isi_jawaban }}</w:t>
+        <w:ind w:left="1378" w:hanging="357"/>
+      </w:pPr>
+      <w:r>
+        <w:t>{{ baris }}</w:t>
+      </w:r>
+      <w:r>
+        <w:t xml:space="preserve"> </w:t>
+      </w:r>
+      <w:r>
+        <w:t>{% endfor %}</w:t>
+      </w:r>
+      <w:r>
+        <w:t xml:space="preserve"> {% endif %}</w:t>
       </w:r>
     </w:p>
     <w:p>
       <w:pPr>
-        <w:rPr>
-          <w:lang w:val="en-US"/>
-        </w:rPr>
-      </w:pPr>
+        <w:pStyle w:val="Heading3"/>
+        <w:numPr>
+          <w:ilvl w:val="0"/>
+          <w:numId w:val="0"/>
+        </w:numPr>
+        <w:spacing w:before="240"/>
+        <w:ind w:left="510" w:hanging="153"/>
+      </w:pPr>
+      <w:r>
+        <w:t>II</w:t>
+      </w:r>
+      <w:r>
+        <w:rPr>
+          <w:lang w:val="id-ID"/>
+        </w:rPr>
+        <w:t>.{{ loop.index }}</w:t>
+      </w:r>
+      <w:r>
+        <w:rPr>
+          <w:lang w:val="id-ID"/>
+        </w:rPr>
+        <w:t>.</w:t>
+      </w:r>
+      <w:r>
+        <w:t xml:space="preserve">B. </w:t>
+      </w:r>
+      <w:r>
+        <w:t xml:space="preserve">Tampilan </w:t>
+      </w:r>
+      <w:r>
+        <w:t xml:space="preserve">Hasil </w:t>
+      </w:r>
     </w:p>
     <w:p>
       <w:pPr>
+        <w:ind w:left="1021"/>
         <w:rPr>
           <w:lang w:val="en-US"/>
         </w:rPr>
@@ -3453,36 +3577,115 @@
         <w:rPr>
           <w:lang w:val="en-US"/>
         </w:rPr>
-        <w:lastRenderedPageBreak/>
-        <w:t>{% if tugas.ada_gambar %} Lampiran Bukti: {% for gbr in tugas.list_gambar %} {{ gbr.objek_gambar }} Gambar 2.{{ gbr.nomor_tampil }} {{ gbr.caption }} (Style: Caption) {% endfor %} {% endif %}</w:t>
+        <w:t>{% for gbr in item.list_gambar %}</w:t>
+      </w:r>
+      <w:r>
+        <w:rPr>
+          <w:lang w:val="en-US"/>
+        </w:rPr>
+        <w:t xml:space="preserve"> </w:t>
+      </w:r>
+      <w:r>
+        <w:rPr>
+          <w:lang w:val="en-US"/>
+        </w:rPr>
+        <w:t>{{ gbr.objek_gambar }}</w:t>
       </w:r>
     </w:p>
     <w:p>
       <w:pPr>
-        <w:rPr>
-          <w:lang w:val="en-US"/>
-        </w:rPr>
-      </w:pPr>
+        <w:pStyle w:val="captions"/>
+        <w:spacing w:after="240"/>
+        <w:ind w:left="1077"/>
+      </w:pPr>
+      <w:r>
+        <w:t xml:space="preserve">Gambar 1.{{ </w:t>
+      </w:r>
+      <w:r>
+        <w:t>gbr.nomor_tampil</w:t>
+      </w:r>
+      <w:r>
+        <w:t>}} {{ gbr.caption }</w:t>
+      </w:r>
+      <w:r>
+        <w:t>}</w:t>
+      </w:r>
     </w:p>
     <w:p>
       <w:pPr>
-        <w:rPr>
-          <w:lang w:val="en-US"/>
-        </w:rPr>
-      </w:pPr>
-      <w:r>
-        <w:rPr>
-          <w:lang w:val="en-US"/>
-        </w:rPr>
-        <w:t>{% endfor %} {% endif %}</w:t>
+        <w:ind w:left="1021"/>
+        <w:rPr>
+          <w:sz w:val="6"/>
+          <w:szCs w:val="6"/>
+        </w:rPr>
+      </w:pPr>
+      <w:r>
+        <w:rPr>
+          <w:sz w:val="6"/>
+          <w:szCs w:val="6"/>
+        </w:rPr>
+        <w:t>{% endfor %}</w:t>
       </w:r>
     </w:p>
     <w:p>
       <w:pPr>
+        <w:pStyle w:val="Heading3"/>
+        <w:numPr>
+          <w:ilvl w:val="0"/>
+          <w:numId w:val="0"/>
+        </w:numPr>
+        <w:ind w:left="357"/>
+      </w:pPr>
+      <w:r>
+        <w:t>II</w:t>
+      </w:r>
+      <w:r>
+        <w:rPr>
+          <w:lang w:val="id-ID"/>
+        </w:rPr>
+        <w:t>.{{ loop.index }}</w:t>
+      </w:r>
+      <w:r>
+        <w:rPr>
+          <w:lang w:val="id-ID"/>
+        </w:rPr>
+        <w:t>.</w:t>
+      </w:r>
+      <w:r>
+        <w:t xml:space="preserve">C. </w:t>
+      </w:r>
+      <w:r>
+        <w:t>Analisa</w:t>
+      </w:r>
+    </w:p>
+    <w:p>
+      <w:pPr>
+        <w:ind w:left="1021"/>
         <w:rPr>
           <w:lang w:val="en-US"/>
         </w:rPr>
       </w:pPr>
+      <w:r>
+        <w:t>{{ item.isi_analisa }}</w:t>
+      </w:r>
+      <w:r>
+        <w:rPr>
+          <w:lang w:val="en-US"/>
+        </w:rPr>
+        <w:t xml:space="preserve"> </w:t>
+      </w:r>
+      <w:r>
+        <w:rPr>
+          <w:lang w:val="en-US"/>
+        </w:rPr>
+        <w:t>{% endfor %}</w:t>
+      </w:r>
+      <w:r>
+        <w:rPr>
+          <w:lang w:val="en-US"/>
+        </w:rPr>
+        <w:t>{% endif %}</w:t>
+      </w:r>
     </w:p>
     <w:p>
       <w:pPr>
@@ -3499,14 +3702,9 @@
     </w:p>
     <w:p>
       <w:pPr>
-        <w:rPr>
-          <w:lang w:val="en-US"/>
-        </w:rPr>
-      </w:pPr>
-      <w:r>
-        <w:rPr>
-          <w:lang w:val="en-US"/>
-        </w:rPr>
+        <w:pStyle w:val="Text"/>
+      </w:pPr>
+      <w:r>
         <w:t>{{ isi_kesimpulan }}</w:t>
       </w:r>
     </w:p>
@@ -3522,7 +3720,7 @@
 </file>
 
 <file path=word/endnotes.xml><?xml version="1.0" encoding="utf-8"?>
-<w:endnotes xmlns:wpc="http://schemas.microsoft.com/office/word/2010/wordprocessingCanvas" xmlns:cx="http://schemas.microsoft.com/office/drawing/2014/chartex" xmlns:cx1="http://schemas.microsoft.com/office/drawing/2015/9/8/chartex" xmlns:cx2="http://schemas.microsoft.com/office/drawing/2015/10/21/chartex" xmlns:cx3="http://schemas.microsoft.com/office/drawing/2016/5/9/chartex" xmlns:cx4="http://schemas.microsoft.com/office/drawing/2016/5/10/chartex" xmlns:cx5="http://schemas.microsoft.com/office/drawing/2016/5/11/chartex" xmlns:cx6="http://schemas.microsoft.com/office/drawing/2016/5/12/chartex" xmlns:cx7="http://schemas.microsoft.com/office/drawing/2016/5/13/chartex" xmlns:cx8="http://schemas.microsoft.com/office/drawing/2016/5/14/chartex" xmlns:mc="http://schemas.openxmlformats.org/markup-compatibility/2006" xmlns:aink="http://schemas.microsoft.com/office/drawing/2016/ink" xmlns:am3d="http://schemas.microsoft.com/office/drawing/2017/model3d" xmlns:o="urn:schemas-microsoft-com:office:office" xmlns:oel="http://schemas.microsoft.com/office/2019/extlst" xmlns:r="http://schemas.openxmlformats.org/officeDocument/2006/relationships" xmlns:m="http://schemas.openxmlformats.org/officeDocument/2006/math" xmlns:v="urn:schemas-microsoft-com:vml" xmlns:wp14="http://schemas.microsoft.com/office/word/2010/wordprocessingDrawing" xmlns:wp="http://schemas.openxmlformats.org/drawingml/2006/wordprocessingDrawing" xmlns:w10="urn:schemas-microsoft-com:office:word" xmlns:w="http://schemas.openxmlformats.org/wordprocessingml/2006/main" xmlns:w14="http://schemas.microsoft.com/office/word/2010/wordml" xmlns:w15="http://schemas.microsoft.com/office/word/2012/wordml" xmlns:w16cex="http://schemas.microsoft.com/office/word/2018/wordml/cex" xmlns:w16cid="http://schemas.microsoft.com/office/word/2016/wordml/cid" xmlns:w16="http://schemas.microsoft.com/office/word/2018/wordml" xmlns:w16du="http://schemas.microsoft.com/office/word/2023/wordml/word16du" xmlns:w16sdtdh="http://schemas.microsoft.com/office/word/2020/wordml/sdtdatahash" xmlns:w16sdtfl="http://schemas.microsoft.com/office/word/2024/wordml/sdtformatlock" xmlns:w16se="http://schemas.microsoft.com/office/word/2015/wordml/symex" xmlns:wpg="http://schemas.microsoft.com/office/word/2010/wordprocessingGroup" xmlns:wpi="http://schemas.microsoft.com/office/word/2010/wordprocessingInk" xmlns:wne="http://schemas.microsoft.com/office/word/2006/wordml" xmlns:wps="http://schemas.microsoft.com/office/word/2010/wordprocessingShape" mc:Ignorable="w14 w15 w16se w16cid w16 w16cex w16sdtdh w16sdtfl w16du wp14">
+<w:endnotes xmlns:wpc="http://schemas.microsoft.com/office/word/2010/wordprocessingCanvas" xmlns:cx="http://schemas.microsoft.com/office/drawing/2014/chartex" xmlns:cx1="http://schemas.microsoft.com/office/drawing/2015/9/8/chartex" xmlns:cx2="http://schemas.microsoft.com/office/drawing/2015/10/21/chartex" xmlns:cx3="http://schemas.microsoft.com/office/drawing/2016/5/9/chartex" xmlns:cx4="http://schemas.microsoft.com/office/drawing/2016/5/10/chartex" xmlns:cx5="http://schemas.microsoft.com/office/drawing/2016/5/11/chartex" xmlns:cx6="http://schemas.microsoft.com/office/drawing/2016/5/12/chartex" xmlns:cx7="http://schemas.microsoft.com/office/drawing/2016/5/13/chartex" xmlns:cx8="http://schemas.microsoft.com/office/drawing/2016/5/14/chartex" xmlns:mc="http://schemas.openxmlformats.org/markup-compatibility/2006" xmlns:aink="http://schemas.microsoft.com/office/drawing/2016/ink" xmlns:am3d="http://schemas.microsoft.com/office/drawing/2017/model3d" xmlns:o="urn:schemas-microsoft-com:office:office" xmlns:r="http://schemas.openxmlformats.org/officeDocument/2006/relationships" xmlns:m="http://schemas.openxmlformats.org/officeDocument/2006/math" xmlns:v="urn:schemas-microsoft-com:vml" xmlns:wp14="http://schemas.microsoft.com/office/word/2010/wordprocessingDrawing" xmlns:wp="http://schemas.openxmlformats.org/drawingml/2006/wordprocessingDrawing" xmlns:w10="urn:schemas-microsoft-com:office:word" xmlns:w="http://schemas.openxmlformats.org/wordprocessingml/2006/main" xmlns:w14="http://schemas.microsoft.com/office/word/2010/wordml" xmlns:w15="http://schemas.microsoft.com/office/word/2012/wordml" xmlns:w16cex="http://schemas.microsoft.com/office/word/2018/wordml/cex" xmlns:w16cid="http://schemas.microsoft.com/office/word/2016/wordml/cid" xmlns:w16="http://schemas.microsoft.com/office/word/2018/wordml" xmlns:w16se="http://schemas.microsoft.com/office/word/2015/wordml/symex" xmlns:wpg="http://schemas.microsoft.com/office/word/2010/wordprocessingGroup" xmlns:wpi="http://schemas.microsoft.com/office/word/2010/wordprocessingInk" xmlns:wne="http://schemas.microsoft.com/office/word/2006/wordml" xmlns:wps="http://schemas.microsoft.com/office/word/2010/wordprocessingShape" mc:Ignorable="w14 w15 w16se w16cid w16 w16cex wp14">
   <w:endnote w:type="separator" w:id="-1">
     <w:p>
       <w:pPr>
@@ -3549,7 +3747,7 @@
 </file>
 
 <file path=word/footer1.xml><?xml version="1.0" encoding="utf-8"?>
-<w:ftr xmlns:wpc="http://schemas.microsoft.com/office/word/2010/wordprocessingCanvas" xmlns:cx="http://schemas.microsoft.com/office/drawing/2014/chartex" xmlns:cx1="http://schemas.microsoft.com/office/drawing/2015/9/8/chartex" xmlns:cx2="http://schemas.microsoft.com/office/drawing/2015/10/21/chartex" xmlns:cx3="http://schemas.microsoft.com/office/drawing/2016/5/9/chartex" xmlns:cx4="http://schemas.microsoft.com/office/drawing/2016/5/10/chartex" xmlns:cx5="http://schemas.microsoft.com/office/drawing/2016/5/11/chartex" xmlns:cx6="http://schemas.microsoft.com/office/drawing/2016/5/12/chartex" xmlns:cx7="http://schemas.microsoft.com/office/drawing/2016/5/13/chartex" xmlns:cx8="http://schemas.microsoft.com/office/drawing/2016/5/14/chartex" xmlns:mc="http://schemas.openxmlformats.org/markup-compatibility/2006" xmlns:aink="http://schemas.microsoft.com/office/drawing/2016/ink" xmlns:am3d="http://schemas.microsoft.com/office/drawing/2017/model3d" xmlns:o="urn:schemas-microsoft-com:office:office" xmlns:oel="http://schemas.microsoft.com/office/2019/extlst" xmlns:r="http://schemas.openxmlformats.org/officeDocument/2006/relationships" xmlns:m="http://schemas.openxmlformats.org/officeDocument/2006/math" xmlns:v="urn:schemas-microsoft-com:vml" xmlns:wp14="http://schemas.microsoft.com/office/word/2010/wordprocessingDrawing" xmlns:wp="http://schemas.openxmlformats.org/drawingml/2006/wordprocessingDrawing" xmlns:w10="urn:schemas-microsoft-com:office:word" xmlns:w="http://schemas.openxmlformats.org/wordprocessingml/2006/main" xmlns:w14="http://schemas.microsoft.com/office/word/2010/wordml" xmlns:w15="http://schemas.microsoft.com/office/word/2012/wordml" xmlns:w16cex="http://schemas.microsoft.com/office/word/2018/wordml/cex" xmlns:w16cid="http://schemas.microsoft.com/office/word/2016/wordml/cid" xmlns:w16="http://schemas.microsoft.com/office/word/2018/wordml" xmlns:w16du="http://schemas.microsoft.com/office/word/2023/wordml/word16du" xmlns:w16sdtdh="http://schemas.microsoft.com/office/word/2020/wordml/sdtdatahash" xmlns:w16sdtfl="http://schemas.microsoft.com/office/word/2024/wordml/sdtformatlock" xmlns:w16se="http://schemas.microsoft.com/office/word/2015/wordml/symex" xmlns:wpg="http://schemas.microsoft.com/office/word/2010/wordprocessingGroup" xmlns:wpi="http://schemas.microsoft.com/office/word/2010/wordprocessingInk" xmlns:wne="http://schemas.microsoft.com/office/word/2006/wordml" xmlns:wps="http://schemas.microsoft.com/office/word/2010/wordprocessingShape" mc:Ignorable="w14 w15 w16se w16cid w16 w16cex w16sdtdh w16sdtfl w16du wp14">
+<w:ftr xmlns:wpc="http://schemas.microsoft.com/office/word/2010/wordprocessingCanvas" xmlns:cx="http://schemas.microsoft.com/office/drawing/2014/chartex" xmlns:cx1="http://schemas.microsoft.com/office/drawing/2015/9/8/chartex" xmlns:cx2="http://schemas.microsoft.com/office/drawing/2015/10/21/chartex" xmlns:cx3="http://schemas.microsoft.com/office/drawing/2016/5/9/chartex" xmlns:cx4="http://schemas.microsoft.com/office/drawing/2016/5/10/chartex" xmlns:cx5="http://schemas.microsoft.com/office/drawing/2016/5/11/chartex" xmlns:cx6="http://schemas.microsoft.com/office/drawing/2016/5/12/chartex" xmlns:cx7="http://schemas.microsoft.com/office/drawing/2016/5/13/chartex" xmlns:cx8="http://schemas.microsoft.com/office/drawing/2016/5/14/chartex" xmlns:mc="http://schemas.openxmlformats.org/markup-compatibility/2006" xmlns:aink="http://schemas.microsoft.com/office/drawing/2016/ink" xmlns:am3d="http://schemas.microsoft.com/office/drawing/2017/model3d" xmlns:o="urn:schemas-microsoft-com:office:office" xmlns:r="http://schemas.openxmlformats.org/officeDocument/2006/relationships" xmlns:m="http://schemas.openxmlformats.org/officeDocument/2006/math" xmlns:v="urn:schemas-microsoft-com:vml" xmlns:wp14="http://schemas.microsoft.com/office/word/2010/wordprocessingDrawing" xmlns:wp="http://schemas.openxmlformats.org/drawingml/2006/wordprocessingDrawing" xmlns:w10="urn:schemas-microsoft-com:office:word" xmlns:w="http://schemas.openxmlformats.org/wordprocessingml/2006/main" xmlns:w14="http://schemas.microsoft.com/office/word/2010/wordml" xmlns:w15="http://schemas.microsoft.com/office/word/2012/wordml" xmlns:w16cex="http://schemas.microsoft.com/office/word/2018/wordml/cex" xmlns:w16cid="http://schemas.microsoft.com/office/word/2016/wordml/cid" xmlns:w16="http://schemas.microsoft.com/office/word/2018/wordml" xmlns:w16se="http://schemas.microsoft.com/office/word/2015/wordml/symex" xmlns:wpg="http://schemas.microsoft.com/office/word/2010/wordprocessingGroup" xmlns:wpi="http://schemas.microsoft.com/office/word/2010/wordprocessingInk" xmlns:wne="http://schemas.microsoft.com/office/word/2006/wordml" xmlns:wps="http://schemas.microsoft.com/office/word/2010/wordprocessingShape" mc:Ignorable="w14 w15 w16se w16cid w16 w16cex wp14">
   <w:sdt>
     <w:sdtPr>
       <w:id w:val="-517623792"/>
@@ -3598,7 +3796,7 @@
 </file>
 
 <file path=word/footer2.xml><?xml version="1.0" encoding="utf-8"?>
-<w:ftr xmlns:wpc="http://schemas.microsoft.com/office/word/2010/wordprocessingCanvas" xmlns:cx="http://schemas.microsoft.com/office/drawing/2014/chartex" xmlns:cx1="http://schemas.microsoft.com/office/drawing/2015/9/8/chartex" xmlns:cx2="http://schemas.microsoft.com/office/drawing/2015/10/21/chartex" xmlns:cx3="http://schemas.microsoft.com/office/drawing/2016/5/9/chartex" xmlns:cx4="http://schemas.microsoft.com/office/drawing/2016/5/10/chartex" xmlns:cx5="http://schemas.microsoft.com/office/drawing/2016/5/11/chartex" xmlns:cx6="http://schemas.microsoft.com/office/drawing/2016/5/12/chartex" xmlns:cx7="http://schemas.microsoft.com/office/drawing/2016/5/13/chartex" xmlns:cx8="http://schemas.microsoft.com/office/drawing/2016/5/14/chartex" xmlns:mc="http://schemas.openxmlformats.org/markup-compatibility/2006" xmlns:aink="http://schemas.microsoft.com/office/drawing/2016/ink" xmlns:am3d="http://schemas.microsoft.com/office/drawing/2017/model3d" xmlns:o="urn:schemas-microsoft-com:office:office" xmlns:oel="http://schemas.microsoft.com/office/2019/extlst" xmlns:r="http://schemas.openxmlformats.org/officeDocument/2006/relationships" xmlns:m="http://schemas.openxmlformats.org/officeDocument/2006/math" xmlns:v="urn:schemas-microsoft-com:vml" xmlns:wp14="http://schemas.microsoft.com/office/word/2010/wordprocessingDrawing" xmlns:wp="http://schemas.openxmlformats.org/drawingml/2006/wordprocessingDrawing" xmlns:w10="urn:schemas-microsoft-com:office:word" xmlns:w="http://schemas.openxmlformats.org/wordprocessingml/2006/main" xmlns:w14="http://schemas.microsoft.com/office/word/2010/wordml" xmlns:w15="http://schemas.microsoft.com/office/word/2012/wordml" xmlns:w16cex="http://schemas.microsoft.com/office/word/2018/wordml/cex" xmlns:w16cid="http://schemas.microsoft.com/office/word/2016/wordml/cid" xmlns:w16="http://schemas.microsoft.com/office/word/2018/wordml" xmlns:w16du="http://schemas.microsoft.com/office/word/2023/wordml/word16du" xmlns:w16sdtdh="http://schemas.microsoft.com/office/word/2020/wordml/sdtdatahash" xmlns:w16sdtfl="http://schemas.microsoft.com/office/word/2024/wordml/sdtformatlock" xmlns:w16se="http://schemas.microsoft.com/office/word/2015/wordml/symex" xmlns:wpg="http://schemas.microsoft.com/office/word/2010/wordprocessingGroup" xmlns:wpi="http://schemas.microsoft.com/office/word/2010/wordprocessingInk" xmlns:wne="http://schemas.microsoft.com/office/word/2006/wordml" xmlns:wps="http://schemas.microsoft.com/office/word/2010/wordprocessingShape" mc:Ignorable="w14 w15 w16se w16cid w16 w16cex w16sdtdh w16sdtfl w16du wp14">
+<w:ftr xmlns:wpc="http://schemas.microsoft.com/office/word/2010/wordprocessingCanvas" xmlns:cx="http://schemas.microsoft.com/office/drawing/2014/chartex" xmlns:cx1="http://schemas.microsoft.com/office/drawing/2015/9/8/chartex" xmlns:cx2="http://schemas.microsoft.com/office/drawing/2015/10/21/chartex" xmlns:cx3="http://schemas.microsoft.com/office/drawing/2016/5/9/chartex" xmlns:cx4="http://schemas.microsoft.com/office/drawing/2016/5/10/chartex" xmlns:cx5="http://schemas.microsoft.com/office/drawing/2016/5/11/chartex" xmlns:cx6="http://schemas.microsoft.com/office/drawing/2016/5/12/chartex" xmlns:cx7="http://schemas.microsoft.com/office/drawing/2016/5/13/chartex" xmlns:cx8="http://schemas.microsoft.com/office/drawing/2016/5/14/chartex" xmlns:mc="http://schemas.openxmlformats.org/markup-compatibility/2006" xmlns:aink="http://schemas.microsoft.com/office/drawing/2016/ink" xmlns:am3d="http://schemas.microsoft.com/office/drawing/2017/model3d" xmlns:o="urn:schemas-microsoft-com:office:office" xmlns:r="http://schemas.openxmlformats.org/officeDocument/2006/relationships" xmlns:m="http://schemas.openxmlformats.org/officeDocument/2006/math" xmlns:v="urn:schemas-microsoft-com:vml" xmlns:wp14="http://schemas.microsoft.com/office/word/2010/wordprocessingDrawing" xmlns:wp="http://schemas.openxmlformats.org/drawingml/2006/wordprocessingDrawing" xmlns:w10="urn:schemas-microsoft-com:office:word" xmlns:w="http://schemas.openxmlformats.org/wordprocessingml/2006/main" xmlns:w14="http://schemas.microsoft.com/office/word/2010/wordml" xmlns:w15="http://schemas.microsoft.com/office/word/2012/wordml" xmlns:w16cex="http://schemas.microsoft.com/office/word/2018/wordml/cex" xmlns:w16cid="http://schemas.microsoft.com/office/word/2016/wordml/cid" xmlns:w16="http://schemas.microsoft.com/office/word/2018/wordml" xmlns:w16se="http://schemas.microsoft.com/office/word/2015/wordml/symex" xmlns:wpg="http://schemas.microsoft.com/office/word/2010/wordprocessingGroup" xmlns:wpi="http://schemas.microsoft.com/office/word/2010/wordprocessingInk" xmlns:wne="http://schemas.microsoft.com/office/word/2006/wordml" xmlns:wps="http://schemas.microsoft.com/office/word/2010/wordprocessingShape" mc:Ignorable="w14 w15 w16se w16cid w16 w16cex wp14">
   <w:sdt>
     <w:sdtPr>
       <w:id w:val="-234937495"/>
@@ -3647,7 +3845,7 @@
 </file>
 
 <file path=word/footnotes.xml><?xml version="1.0" encoding="utf-8"?>
-<w:footnotes xmlns:wpc="http://schemas.microsoft.com/office/word/2010/wordprocessingCanvas" xmlns:cx="http://schemas.microsoft.com/office/drawing/2014/chartex" xmlns:cx1="http://schemas.microsoft.com/office/drawing/2015/9/8/chartex" xmlns:cx2="http://schemas.microsoft.com/office/drawing/2015/10/21/chartex" xmlns:cx3="http://schemas.microsoft.com/office/drawing/2016/5/9/chartex" xmlns:cx4="http://schemas.microsoft.com/office/drawing/2016/5/10/chartex" xmlns:cx5="http://schemas.microsoft.com/office/drawing/2016/5/11/chartex" xmlns:cx6="http://schemas.microsoft.com/office/drawing/2016/5/12/chartex" xmlns:cx7="http://schemas.microsoft.com/office/drawing/2016/5/13/chartex" xmlns:cx8="http://schemas.microsoft.com/office/drawing/2016/5/14/chartex" xmlns:mc="http://schemas.openxmlformats.org/markup-compatibility/2006" xmlns:aink="http://schemas.microsoft.com/office/drawing/2016/ink" xmlns:am3d="http://schemas.microsoft.com/office/drawing/2017/model3d" xmlns:o="urn:schemas-microsoft-com:office:office" xmlns:oel="http://schemas.microsoft.com/office/2019/extlst" xmlns:r="http://schemas.openxmlformats.org/officeDocument/2006/relationships" xmlns:m="http://schemas.openxmlformats.org/officeDocument/2006/math" xmlns:v="urn:schemas-microsoft-com:vml" xmlns:wp14="http://schemas.microsoft.com/office/word/2010/wordprocessingDrawing" xmlns:wp="http://schemas.openxmlformats.org/drawingml/2006/wordprocessingDrawing" xmlns:w10="urn:schemas-microsoft-com:office:word" xmlns:w="http://schemas.openxmlformats.org/wordprocessingml/2006/main" xmlns:w14="http://schemas.microsoft.com/office/word/2010/wordml" xmlns:w15="http://schemas.microsoft.com/office/word/2012/wordml" xmlns:w16cex="http://schemas.microsoft.com/office/word/2018/wordml/cex" xmlns:w16cid="http://schemas.microsoft.com/office/word/2016/wordml/cid" xmlns:w16="http://schemas.microsoft.com/office/word/2018/wordml" xmlns:w16du="http://schemas.microsoft.com/office/word/2023/wordml/word16du" xmlns:w16sdtdh="http://schemas.microsoft.com/office/word/2020/wordml/sdtdatahash" xmlns:w16sdtfl="http://schemas.microsoft.com/office/word/2024/wordml/sdtformatlock" xmlns:w16se="http://schemas.microsoft.com/office/word/2015/wordml/symex" xmlns:wpg="http://schemas.microsoft.com/office/word/2010/wordprocessingGroup" xmlns:wpi="http://schemas.microsoft.com/office/word/2010/wordprocessingInk" xmlns:wne="http://schemas.microsoft.com/office/word/2006/wordml" xmlns:wps="http://schemas.microsoft.com/office/word/2010/wordprocessingShape" mc:Ignorable="w14 w15 w16se w16cid w16 w16cex w16sdtdh w16sdtfl w16du wp14">
+<w:footnotes xmlns:wpc="http://schemas.microsoft.com/office/word/2010/wordprocessingCanvas" xmlns:cx="http://schemas.microsoft.com/office/drawing/2014/chartex" xmlns:cx1="http://schemas.microsoft.com/office/drawing/2015/9/8/chartex" xmlns:cx2="http://schemas.microsoft.com/office/drawing/2015/10/21/chartex" xmlns:cx3="http://schemas.microsoft.com/office/drawing/2016/5/9/chartex" xmlns:cx4="http://schemas.microsoft.com/office/drawing/2016/5/10/chartex" xmlns:cx5="http://schemas.microsoft.com/office/drawing/2016/5/11/chartex" xmlns:cx6="http://schemas.microsoft.com/office/drawing/2016/5/12/chartex" xmlns:cx7="http://schemas.microsoft.com/office/drawing/2016/5/13/chartex" xmlns:cx8="http://schemas.microsoft.com/office/drawing/2016/5/14/chartex" xmlns:mc="http://schemas.openxmlformats.org/markup-compatibility/2006" xmlns:aink="http://schemas.microsoft.com/office/drawing/2016/ink" xmlns:am3d="http://schemas.microsoft.com/office/drawing/2017/model3d" xmlns:o="urn:schemas-microsoft-com:office:office" xmlns:r="http://schemas.openxmlformats.org/officeDocument/2006/relationships" xmlns:m="http://schemas.openxmlformats.org/officeDocument/2006/math" xmlns:v="urn:schemas-microsoft-com:vml" xmlns:wp14="http://schemas.microsoft.com/office/word/2010/wordprocessingDrawing" xmlns:wp="http://schemas.openxmlformats.org/drawingml/2006/wordprocessingDrawing" xmlns:w10="urn:schemas-microsoft-com:office:word" xmlns:w="http://schemas.openxmlformats.org/wordprocessingml/2006/main" xmlns:w14="http://schemas.microsoft.com/office/word/2010/wordml" xmlns:w15="http://schemas.microsoft.com/office/word/2012/wordml" xmlns:w16cex="http://schemas.microsoft.com/office/word/2018/wordml/cex" xmlns:w16cid="http://schemas.microsoft.com/office/word/2016/wordml/cid" xmlns:w16="http://schemas.microsoft.com/office/word/2018/wordml" xmlns:w16se="http://schemas.microsoft.com/office/word/2015/wordml/symex" xmlns:wpg="http://schemas.microsoft.com/office/word/2010/wordprocessingGroup" xmlns:wpi="http://schemas.microsoft.com/office/word/2010/wordprocessingInk" xmlns:wne="http://schemas.microsoft.com/office/word/2006/wordml" xmlns:wps="http://schemas.microsoft.com/office/word/2010/wordprocessingShape" mc:Ignorable="w14 w15 w16se w16cid w16 w16cex wp14">
   <w:footnote w:type="separator" w:id="-1">
     <w:p>
       <w:pPr>
@@ -3674,7 +3872,7 @@
 </file>
 
 <file path=word/numbering.xml><?xml version="1.0" encoding="utf-8"?>
-<w:numbering xmlns:wpc="http://schemas.microsoft.com/office/word/2010/wordprocessingCanvas" xmlns:cx="http://schemas.microsoft.com/office/drawing/2014/chartex" xmlns:cx1="http://schemas.microsoft.com/office/drawing/2015/9/8/chartex" xmlns:cx2="http://schemas.microsoft.com/office/drawing/2015/10/21/chartex" xmlns:cx3="http://schemas.microsoft.com/office/drawing/2016/5/9/chartex" xmlns:cx4="http://schemas.microsoft.com/office/drawing/2016/5/10/chartex" xmlns:cx5="http://schemas.microsoft.com/office/drawing/2016/5/11/chartex" xmlns:cx6="http://schemas.microsoft.com/office/drawing/2016/5/12/chartex" xmlns:cx7="http://schemas.microsoft.com/office/drawing/2016/5/13/chartex" xmlns:cx8="http://schemas.microsoft.com/office/drawing/2016/5/14/chartex" xmlns:mc="http://schemas.openxmlformats.org/markup-compatibility/2006" xmlns:aink="http://schemas.microsoft.com/office/drawing/2016/ink" xmlns:am3d="http://schemas.microsoft.com/office/drawing/2017/model3d" xmlns:o="urn:schemas-microsoft-com:office:office" xmlns:oel="http://schemas.microsoft.com/office/2019/extlst" xmlns:r="http://schemas.openxmlformats.org/officeDocument/2006/relationships" xmlns:m="http://schemas.openxmlformats.org/officeDocument/2006/math" xmlns:v="urn:schemas-microsoft-com:vml" xmlns:wp14="http://schemas.microsoft.com/office/word/2010/wordprocessingDrawing" xmlns:wp="http://schemas.openxmlformats.org/drawingml/2006/wordprocessingDrawing" xmlns:w10="urn:schemas-microsoft-com:office:word" xmlns:w="http://schemas.openxmlformats.org/wordprocessingml/2006/main" xmlns:w14="http://schemas.microsoft.com/office/word/2010/wordml" xmlns:w15="http://schemas.microsoft.com/office/word/2012/wordml" xmlns:w16cex="http://schemas.microsoft.com/office/word/2018/wordml/cex" xmlns:w16cid="http://schemas.microsoft.com/office/word/2016/wordml/cid" xmlns:w16="http://schemas.microsoft.com/office/word/2018/wordml" xmlns:w16du="http://schemas.microsoft.com/office/word/2023/wordml/word16du" xmlns:w16sdtdh="http://schemas.microsoft.com/office/word/2020/wordml/sdtdatahash" xmlns:w16sdtfl="http://schemas.microsoft.com/office/word/2024/wordml/sdtformatlock" xmlns:w16se="http://schemas.microsoft.com/office/word/2015/wordml/symex" xmlns:wpg="http://schemas.microsoft.com/office/word/2010/wordprocessingGroup" xmlns:wpi="http://schemas.microsoft.com/office/word/2010/wordprocessingInk" xmlns:wne="http://schemas.microsoft.com/office/word/2006/wordml" xmlns:wps="http://schemas.microsoft.com/office/word/2010/wordprocessingShape" mc:Ignorable="w14 w15 w16se w16cid w16 w16cex w16sdtdh w16sdtfl w16du wp14">
+<w:numbering xmlns:wpc="http://schemas.microsoft.com/office/word/2010/wordprocessingCanvas" xmlns:cx="http://schemas.microsoft.com/office/drawing/2014/chartex" xmlns:cx1="http://schemas.microsoft.com/office/drawing/2015/9/8/chartex" xmlns:cx2="http://schemas.microsoft.com/office/drawing/2015/10/21/chartex" xmlns:cx3="http://schemas.microsoft.com/office/drawing/2016/5/9/chartex" xmlns:cx4="http://schemas.microsoft.com/office/drawing/2016/5/10/chartex" xmlns:cx5="http://schemas.microsoft.com/office/drawing/2016/5/11/chartex" xmlns:cx6="http://schemas.microsoft.com/office/drawing/2016/5/12/chartex" xmlns:cx7="http://schemas.microsoft.com/office/drawing/2016/5/13/chartex" xmlns:cx8="http://schemas.microsoft.com/office/drawing/2016/5/14/chartex" xmlns:mc="http://schemas.openxmlformats.org/markup-compatibility/2006" xmlns:aink="http://schemas.microsoft.com/office/drawing/2016/ink" xmlns:am3d="http://schemas.microsoft.com/office/drawing/2017/model3d" xmlns:o="urn:schemas-microsoft-com:office:office" xmlns:r="http://schemas.openxmlformats.org/officeDocument/2006/relationships" xmlns:m="http://schemas.openxmlformats.org/officeDocument/2006/math" xmlns:v="urn:schemas-microsoft-com:vml" xmlns:wp14="http://schemas.microsoft.com/office/word/2010/wordprocessingDrawing" xmlns:wp="http://schemas.openxmlformats.org/drawingml/2006/wordprocessingDrawing" xmlns:w10="urn:schemas-microsoft-com:office:word" xmlns:w="http://schemas.openxmlformats.org/wordprocessingml/2006/main" xmlns:w14="http://schemas.microsoft.com/office/word/2010/wordml" xmlns:w15="http://schemas.microsoft.com/office/word/2012/wordml" xmlns:w16cex="http://schemas.microsoft.com/office/word/2018/wordml/cex" xmlns:w16cid="http://schemas.microsoft.com/office/word/2016/wordml/cid" xmlns:w16="http://schemas.microsoft.com/office/word/2018/wordml" xmlns:w16se="http://schemas.microsoft.com/office/word/2015/wordml/symex" xmlns:wpg="http://schemas.microsoft.com/office/word/2010/wordprocessingGroup" xmlns:wpi="http://schemas.microsoft.com/office/word/2010/wordprocessingInk" xmlns:wne="http://schemas.microsoft.com/office/word/2006/wordml" xmlns:wps="http://schemas.microsoft.com/office/word/2010/wordprocessingShape" mc:Ignorable="w14 w15 w16se w16cid w16 w16cex wp14">
   <w:abstractNum w:abstractNumId="0" w15:restartNumberingAfterBreak="0">
     <w:nsid w:val="01344BC1"/>
     <w:multiLevelType w:val="hybridMultilevel"/>
@@ -6674,106 +6872,106 @@
       </w:pPr>
     </w:lvl>
   </w:abstractNum>
-  <w:num w:numId="1" w16cid:durableId="1654677218">
+  <w:num w:numId="1">
     <w:abstractNumId w:val="31"/>
   </w:num>
-  <w:num w:numId="2" w16cid:durableId="175121552">
+  <w:num w:numId="2">
     <w:abstractNumId w:val="25"/>
   </w:num>
-  <w:num w:numId="3" w16cid:durableId="596401328">
+  <w:num w:numId="3">
     <w:abstractNumId w:val="10"/>
   </w:num>
-  <w:num w:numId="4" w16cid:durableId="389117485">
+  <w:num w:numId="4">
     <w:abstractNumId w:val="9"/>
   </w:num>
-  <w:num w:numId="5" w16cid:durableId="1755279736">
+  <w:num w:numId="5">
     <w:abstractNumId w:val="22"/>
   </w:num>
-  <w:num w:numId="6" w16cid:durableId="172231383">
+  <w:num w:numId="6">
     <w:abstractNumId w:val="2"/>
   </w:num>
-  <w:num w:numId="7" w16cid:durableId="2070955809">
+  <w:num w:numId="7">
     <w:abstractNumId w:val="32"/>
   </w:num>
-  <w:num w:numId="8" w16cid:durableId="576212238">
+  <w:num w:numId="8">
     <w:abstractNumId w:val="7"/>
   </w:num>
-  <w:num w:numId="9" w16cid:durableId="582029936">
+  <w:num w:numId="9">
     <w:abstractNumId w:val="0"/>
   </w:num>
-  <w:num w:numId="10" w16cid:durableId="1967926187">
+  <w:num w:numId="10">
     <w:abstractNumId w:val="1"/>
   </w:num>
-  <w:num w:numId="11" w16cid:durableId="1896546671">
+  <w:num w:numId="11">
     <w:abstractNumId w:val="14"/>
   </w:num>
-  <w:num w:numId="12" w16cid:durableId="531456458">
+  <w:num w:numId="12">
     <w:abstractNumId w:val="21"/>
   </w:num>
-  <w:num w:numId="13" w16cid:durableId="4984714">
+  <w:num w:numId="13">
     <w:abstractNumId w:val="17"/>
   </w:num>
-  <w:num w:numId="14" w16cid:durableId="1938446030">
+  <w:num w:numId="14">
     <w:abstractNumId w:val="30"/>
   </w:num>
-  <w:num w:numId="15" w16cid:durableId="1294094243">
+  <w:num w:numId="15">
     <w:abstractNumId w:val="28"/>
   </w:num>
-  <w:num w:numId="16" w16cid:durableId="724648704">
+  <w:num w:numId="16">
     <w:abstractNumId w:val="4"/>
   </w:num>
-  <w:num w:numId="17" w16cid:durableId="852380466">
+  <w:num w:numId="17">
     <w:abstractNumId w:val="3"/>
   </w:num>
-  <w:num w:numId="18" w16cid:durableId="791482080">
+  <w:num w:numId="18">
     <w:abstractNumId w:val="26"/>
   </w:num>
-  <w:num w:numId="19" w16cid:durableId="122626575">
+  <w:num w:numId="19">
     <w:abstractNumId w:val="19"/>
   </w:num>
-  <w:num w:numId="20" w16cid:durableId="1455562247">
+  <w:num w:numId="20">
     <w:abstractNumId w:val="15"/>
   </w:num>
-  <w:num w:numId="21" w16cid:durableId="1288583248">
+  <w:num w:numId="21">
     <w:abstractNumId w:val="5"/>
   </w:num>
-  <w:num w:numId="22" w16cid:durableId="723527819">
+  <w:num w:numId="22">
     <w:abstractNumId w:val="6"/>
   </w:num>
-  <w:num w:numId="23" w16cid:durableId="160238791">
+  <w:num w:numId="23">
     <w:abstractNumId w:val="20"/>
   </w:num>
-  <w:num w:numId="24" w16cid:durableId="1008675173">
+  <w:num w:numId="24">
     <w:abstractNumId w:val="13"/>
   </w:num>
-  <w:num w:numId="25" w16cid:durableId="2130510195">
+  <w:num w:numId="25">
     <w:abstractNumId w:val="18"/>
   </w:num>
-  <w:num w:numId="26" w16cid:durableId="2072540866">
+  <w:num w:numId="26">
     <w:abstractNumId w:val="11"/>
   </w:num>
-  <w:num w:numId="27" w16cid:durableId="934555663">
+  <w:num w:numId="27">
     <w:abstractNumId w:val="27"/>
   </w:num>
-  <w:num w:numId="28" w16cid:durableId="1514300958">
+  <w:num w:numId="28">
     <w:abstractNumId w:val="23"/>
   </w:num>
-  <w:num w:numId="29" w16cid:durableId="1519276575">
+  <w:num w:numId="29">
     <w:abstractNumId w:val="16"/>
   </w:num>
-  <w:num w:numId="30" w16cid:durableId="1262296187">
+  <w:num w:numId="30">
     <w:abstractNumId w:val="24"/>
   </w:num>
-  <w:num w:numId="31" w16cid:durableId="23289935">
+  <w:num w:numId="31">
     <w:abstractNumId w:val="33"/>
   </w:num>
-  <w:num w:numId="32" w16cid:durableId="1483085652">
+  <w:num w:numId="32">
     <w:abstractNumId w:val="12"/>
   </w:num>
-  <w:num w:numId="33" w16cid:durableId="1144812362">
+  <w:num w:numId="33">
     <w:abstractNumId w:val="8"/>
   </w:num>
-  <w:num w:numId="34" w16cid:durableId="1309047552">
+  <w:num w:numId="34">
     <w:abstractNumId w:val="29"/>
   </w:num>
   <w:numIdMacAtCleanup w:val="2"/>
@@ -6781,7 +6979,7 @@
 </file>
 
 <file path=word/styles.xml><?xml version="1.0" encoding="utf-8"?>
-<w:styles xmlns:mc="http://schemas.openxmlformats.org/markup-compatibility/2006" xmlns:r="http://schemas.openxmlformats.org/officeDocument/2006/relationships" xmlns:w="http://schemas.openxmlformats.org/wordprocessingml/2006/main" xmlns:w14="http://schemas.microsoft.com/office/word/2010/wordml" xmlns:w15="http://schemas.microsoft.com/office/word/2012/wordml" xmlns:w16cex="http://schemas.microsoft.com/office/word/2018/wordml/cex" xmlns:w16cid="http://schemas.microsoft.com/office/word/2016/wordml/cid" xmlns:w16="http://schemas.microsoft.com/office/word/2018/wordml" xmlns:w16du="http://schemas.microsoft.com/office/word/2023/wordml/word16du" xmlns:w16sdtdh="http://schemas.microsoft.com/office/word/2020/wordml/sdtdatahash" xmlns:w16sdtfl="http://schemas.microsoft.com/office/word/2024/wordml/sdtformatlock" xmlns:w16se="http://schemas.microsoft.com/office/word/2015/wordml/symex" mc:Ignorable="w14 w15 w16se w16cid w16 w16cex w16sdtdh w16sdtfl w16du">
+<w:styles xmlns:mc="http://schemas.openxmlformats.org/markup-compatibility/2006" xmlns:r="http://schemas.openxmlformats.org/officeDocument/2006/relationships" xmlns:w="http://schemas.openxmlformats.org/wordprocessingml/2006/main" xmlns:w14="http://schemas.microsoft.com/office/word/2010/wordml" xmlns:w15="http://schemas.microsoft.com/office/word/2012/wordml" xmlns:w16cex="http://schemas.microsoft.com/office/word/2018/wordml/cex" xmlns:w16cid="http://schemas.microsoft.com/office/word/2016/wordml/cid" xmlns:w16="http://schemas.microsoft.com/office/word/2018/wordml" xmlns:w16se="http://schemas.microsoft.com/office/word/2015/wordml/symex" mc:Ignorable="w14 w15 w16se w16cid w16 w16cex">
   <w:docDefaults>
     <w:rPrDefault>
       <w:rPr>

</xml_diff>

<commit_message>
perbaikan kalimat akhir paragraf yang di paksa justify menjadi tidak, dgn cara pecahkan blok string-nya
</commit_message>
<xml_diff>
--- a/kuliah/DocumentGenerator_Laporan_Praktikum/src/templates/format-1.docx
+++ b/kuliah/DocumentGenerator_Laporan_Praktikum/src/templates/format-1.docx
@@ -1,6 +1,6 @@
 
 <file path=word/document.xml><?xml version="1.0" encoding="utf-8"?>
-<w:document xmlns:wpc="http://schemas.microsoft.com/office/word/2010/wordprocessingCanvas" xmlns:cx="http://schemas.microsoft.com/office/drawing/2014/chartex" xmlns:cx1="http://schemas.microsoft.com/office/drawing/2015/9/8/chartex" xmlns:cx2="http://schemas.microsoft.com/office/drawing/2015/10/21/chartex" xmlns:cx3="http://schemas.microsoft.com/office/drawing/2016/5/9/chartex" xmlns:cx4="http://schemas.microsoft.com/office/drawing/2016/5/10/chartex" xmlns:cx5="http://schemas.microsoft.com/office/drawing/2016/5/11/chartex" xmlns:cx6="http://schemas.microsoft.com/office/drawing/2016/5/12/chartex" xmlns:cx7="http://schemas.microsoft.com/office/drawing/2016/5/13/chartex" xmlns:cx8="http://schemas.microsoft.com/office/drawing/2016/5/14/chartex" xmlns:mc="http://schemas.openxmlformats.org/markup-compatibility/2006" xmlns:aink="http://schemas.microsoft.com/office/drawing/2016/ink" xmlns:am3d="http://schemas.microsoft.com/office/drawing/2017/model3d" xmlns:o="urn:schemas-microsoft-com:office:office" xmlns:r="http://schemas.openxmlformats.org/officeDocument/2006/relationships" xmlns:m="http://schemas.openxmlformats.org/officeDocument/2006/math" xmlns:v="urn:schemas-microsoft-com:vml" xmlns:wp14="http://schemas.microsoft.com/office/word/2010/wordprocessingDrawing" xmlns:wp="http://schemas.openxmlformats.org/drawingml/2006/wordprocessingDrawing" xmlns:w10="urn:schemas-microsoft-com:office:word" xmlns:w="http://schemas.openxmlformats.org/wordprocessingml/2006/main" xmlns:w14="http://schemas.microsoft.com/office/word/2010/wordml" xmlns:w15="http://schemas.microsoft.com/office/word/2012/wordml" xmlns:w16cex="http://schemas.microsoft.com/office/word/2018/wordml/cex" xmlns:w16cid="http://schemas.microsoft.com/office/word/2016/wordml/cid" xmlns:w16="http://schemas.microsoft.com/office/word/2018/wordml" xmlns:w16se="http://schemas.microsoft.com/office/word/2015/wordml/symex" xmlns:wpg="http://schemas.microsoft.com/office/word/2010/wordprocessingGroup" xmlns:wpi="http://schemas.microsoft.com/office/word/2010/wordprocessingInk" xmlns:wne="http://schemas.microsoft.com/office/word/2006/wordml" xmlns:wps="http://schemas.microsoft.com/office/word/2010/wordprocessingShape" mc:Ignorable="w14 w15 w16se w16cid w16 w16cex wp14">
+<w:document xmlns:wpc="http://schemas.microsoft.com/office/word/2010/wordprocessingCanvas" xmlns:cx="http://schemas.microsoft.com/office/drawing/2014/chartex" xmlns:cx1="http://schemas.microsoft.com/office/drawing/2015/9/8/chartex" xmlns:cx2="http://schemas.microsoft.com/office/drawing/2015/10/21/chartex" xmlns:cx3="http://schemas.microsoft.com/office/drawing/2016/5/9/chartex" xmlns:cx4="http://schemas.microsoft.com/office/drawing/2016/5/10/chartex" xmlns:cx5="http://schemas.microsoft.com/office/drawing/2016/5/11/chartex" xmlns:cx6="http://schemas.microsoft.com/office/drawing/2016/5/12/chartex" xmlns:cx7="http://schemas.microsoft.com/office/drawing/2016/5/13/chartex" xmlns:cx8="http://schemas.microsoft.com/office/drawing/2016/5/14/chartex" xmlns:mc="http://schemas.openxmlformats.org/markup-compatibility/2006" xmlns:aink="http://schemas.microsoft.com/office/drawing/2016/ink" xmlns:am3d="http://schemas.microsoft.com/office/drawing/2017/model3d" xmlns:o="urn:schemas-microsoft-com:office:office" xmlns:oel="http://schemas.microsoft.com/office/2019/extlst" xmlns:r="http://schemas.openxmlformats.org/officeDocument/2006/relationships" xmlns:m="http://schemas.openxmlformats.org/officeDocument/2006/math" xmlns:v="urn:schemas-microsoft-com:vml" xmlns:wp14="http://schemas.microsoft.com/office/word/2010/wordprocessingDrawing" xmlns:wp="http://schemas.openxmlformats.org/drawingml/2006/wordprocessingDrawing" xmlns:w10="urn:schemas-microsoft-com:office:word" xmlns:w="http://schemas.openxmlformats.org/wordprocessingml/2006/main" xmlns:w14="http://schemas.microsoft.com/office/word/2010/wordml" xmlns:w15="http://schemas.microsoft.com/office/word/2012/wordml" xmlns:w16cex="http://schemas.microsoft.com/office/word/2018/wordml/cex" xmlns:w16cid="http://schemas.microsoft.com/office/word/2016/wordml/cid" xmlns:w16="http://schemas.microsoft.com/office/word/2018/wordml" xmlns:w16du="http://schemas.microsoft.com/office/word/2023/wordml/word16du" xmlns:w16sdtdh="http://schemas.microsoft.com/office/word/2020/wordml/sdtdatahash" xmlns:w16sdtfl="http://schemas.microsoft.com/office/word/2024/wordml/sdtformatlock" xmlns:w16se="http://schemas.microsoft.com/office/word/2015/wordml/symex" xmlns:wpg="http://schemas.microsoft.com/office/word/2010/wordprocessingGroup" xmlns:wpi="http://schemas.microsoft.com/office/word/2010/wordprocessingInk" xmlns:wne="http://schemas.microsoft.com/office/word/2006/wordml" xmlns:wps="http://schemas.microsoft.com/office/word/2010/wordprocessingShape" mc:Ignorable="w14 w15 w16se w16cid w16 w16cex w16sdtdh w16sdtfl w16du wp14">
   <w:body>
     <w:p>
       <w:pPr>
@@ -30,6 +30,7 @@
           <w:lang w:val="en-US"/>
         </w:rPr>
       </w:pPr>
+      <w:proofErr w:type="gramStart"/>
       <w:r>
         <w:rPr>
           <w:b/>
@@ -37,43 +38,29 @@
           <w:szCs w:val="28"/>
           <w:lang w:val="en-US"/>
         </w:rPr>
-        <w:t>{{ mata_kuliah }}</w:t>
-      </w:r>
-    </w:p>
-    <w:p>
-      <w:pPr>
-        <w:jc w:val="center"/>
-        <w:rPr>
-          <w:b/>
-        </w:rPr>
-      </w:pPr>
-    </w:p>
-    <w:p>
-      <w:pPr>
-        <w:jc w:val="center"/>
-        <w:rPr>
-          <w:b/>
-        </w:rPr>
-      </w:pPr>
-    </w:p>
-    <w:p>
-      <w:pPr>
-        <w:jc w:val="center"/>
+        <w:t xml:space="preserve">{{ </w:t>
+      </w:r>
+      <w:proofErr w:type="spellStart"/>
+      <w:r>
         <w:rPr>
           <w:b/>
           <w:sz w:val="28"/>
           <w:szCs w:val="28"/>
           <w:lang w:val="en-US"/>
         </w:rPr>
-      </w:pPr>
+        <w:t>mata</w:t>
+      </w:r>
+      <w:proofErr w:type="gramEnd"/>
       <w:r>
         <w:rPr>
           <w:b/>
           <w:sz w:val="28"/>
           <w:szCs w:val="28"/>
-        </w:rPr>
-        <w:t>MODUL</w:t>
-      </w:r>
+          <w:lang w:val="en-US"/>
+        </w:rPr>
+        <w:t>_</w:t>
+      </w:r>
+      <w:proofErr w:type="gramStart"/>
       <w:r>
         <w:rPr>
           <w:b/>
@@ -81,8 +68,9 @@
           <w:szCs w:val="28"/>
           <w:lang w:val="en-US"/>
         </w:rPr>
-        <w:t xml:space="preserve"> </w:t>
-      </w:r>
+        <w:t>kuliah</w:t>
+      </w:r>
+      <w:proofErr w:type="spellEnd"/>
       <w:r>
         <w:rPr>
           <w:b/>
@@ -90,67 +78,90 @@
           <w:szCs w:val="28"/>
           <w:lang w:val="en-US"/>
         </w:rPr>
-        <w:t>{{ nomor_modul }}</w:t>
-      </w:r>
-    </w:p>
-    <w:p>
-      <w:pPr>
-        <w:jc w:val="center"/>
+        <w:t xml:space="preserve"> }</w:t>
+      </w:r>
+      <w:proofErr w:type="gramEnd"/>
+      <w:r>
         <w:rPr>
           <w:b/>
           <w:sz w:val="28"/>
           <w:szCs w:val="28"/>
           <w:lang w:val="en-US"/>
         </w:rPr>
-      </w:pPr>
-      <w:r>
+        <w:t>}</w:t>
+      </w:r>
+    </w:p>
+    <w:p>
+      <w:pPr>
+        <w:jc w:val="center"/>
+        <w:rPr>
+          <w:b/>
+        </w:rPr>
+      </w:pPr>
+    </w:p>
+    <w:p>
+      <w:pPr>
+        <w:jc w:val="center"/>
+        <w:rPr>
+          <w:b/>
+        </w:rPr>
+      </w:pPr>
+    </w:p>
+    <w:p>
+      <w:pPr>
+        <w:jc w:val="center"/>
         <w:rPr>
           <w:b/>
           <w:sz w:val="28"/>
           <w:szCs w:val="28"/>
           <w:lang w:val="en-US"/>
         </w:rPr>
-        <w:t>{{ judul }}</w:t>
-      </w:r>
-    </w:p>
-    <w:p>
-      <w:pPr>
-        <w:jc w:val="center"/>
-        <w:rPr>
-          <w:b/>
-        </w:rPr>
-      </w:pPr>
-    </w:p>
-    <w:p>
-      <w:pPr>
-        <w:jc w:val="center"/>
-        <w:rPr>
-          <w:b/>
-        </w:rPr>
-      </w:pPr>
-    </w:p>
-    <w:p>
-      <w:pPr>
-        <w:jc w:val="center"/>
-        <w:rPr>
-          <w:b/>
-        </w:rPr>
-      </w:pPr>
-    </w:p>
-    <w:p>
-      <w:pPr>
-        <w:jc w:val="center"/>
+      </w:pPr>
+      <w:r>
         <w:rPr>
           <w:b/>
           <w:sz w:val="28"/>
           <w:szCs w:val="28"/>
         </w:rPr>
-      </w:pPr>
+        <w:t>MODUL</w:t>
+      </w:r>
       <w:r>
         <w:rPr>
           <w:b/>
-        </w:rPr>
-        <w:t>DISUSUN OLEH :</w:t>
+          <w:sz w:val="28"/>
+          <w:szCs w:val="28"/>
+          <w:lang w:val="en-US"/>
+        </w:rPr>
+        <w:t xml:space="preserve"> </w:t>
+      </w:r>
+      <w:r>
+        <w:rPr>
+          <w:b/>
+          <w:sz w:val="28"/>
+          <w:szCs w:val="28"/>
+          <w:lang w:val="en-US"/>
+        </w:rPr>
+        <w:t xml:space="preserve">{{ </w:t>
+      </w:r>
+      <w:proofErr w:type="spellStart"/>
+      <w:r>
+        <w:rPr>
+          <w:b/>
+          <w:sz w:val="28"/>
+          <w:szCs w:val="28"/>
+          <w:lang w:val="en-US"/>
+        </w:rPr>
+        <w:t>nomor_modul</w:t>
+      </w:r>
+      <w:proofErr w:type="spellEnd"/>
+      <w:r>
+        <w:rPr>
+          <w:b/>
+          <w:sz w:val="28"/>
+          <w:szCs w:val="28"/>
+          <w:lang w:val="en-US"/>
+        </w:rPr>
+        <w:t xml:space="preserve"> }}</w:t>
       </w:r>
     </w:p>
     <w:p>
@@ -158,28 +169,128 @@
         <w:jc w:val="center"/>
         <w:rPr>
           <w:b/>
-          <w:lang w:val="en-US"/>
-        </w:rPr>
-      </w:pPr>
+          <w:sz w:val="28"/>
+          <w:szCs w:val="28"/>
+          <w:lang w:val="en-US"/>
+        </w:rPr>
+      </w:pPr>
+      <w:proofErr w:type="gramStart"/>
       <w:r>
         <w:rPr>
           <w:b/>
-          <w:lang w:val="en-US"/>
-        </w:rPr>
-        <w:t>{{ nama }}</w:t>
-      </w:r>
+          <w:sz w:val="28"/>
+          <w:szCs w:val="28"/>
+          <w:lang w:val="en-US"/>
+        </w:rPr>
+        <w:t xml:space="preserve">{{ </w:t>
+      </w:r>
+      <w:proofErr w:type="spellStart"/>
       <w:r>
         <w:rPr>
           <w:b/>
+          <w:sz w:val="28"/>
+          <w:szCs w:val="28"/>
+          <w:lang w:val="en-US"/>
+        </w:rPr>
+        <w:t>judul</w:t>
+      </w:r>
+      <w:proofErr w:type="spellEnd"/>
+      <w:proofErr w:type="gramEnd"/>
+      <w:r>
+        <w:rPr>
+          <w:b/>
+          <w:sz w:val="28"/>
+          <w:szCs w:val="28"/>
+          <w:lang w:val="en-US"/>
+        </w:rPr>
+        <w:t xml:space="preserve"> }}</w:t>
+      </w:r>
+    </w:p>
+    <w:p>
+      <w:pPr>
+        <w:jc w:val="center"/>
+        <w:rPr>
+          <w:b/>
+        </w:rPr>
+      </w:pPr>
+    </w:p>
+    <w:p>
+      <w:pPr>
+        <w:jc w:val="center"/>
+        <w:rPr>
+          <w:b/>
+        </w:rPr>
+      </w:pPr>
+    </w:p>
+    <w:p>
+      <w:pPr>
+        <w:jc w:val="center"/>
+        <w:rPr>
+          <w:b/>
+        </w:rPr>
+      </w:pPr>
+    </w:p>
+    <w:p>
+      <w:pPr>
+        <w:jc w:val="center"/>
+        <w:rPr>
+          <w:b/>
+          <w:sz w:val="28"/>
+          <w:szCs w:val="28"/>
+        </w:rPr>
+      </w:pPr>
+      <w:r>
+        <w:rPr>
+          <w:b/>
+        </w:rPr>
+        <w:t>DISUSUN OLEH :</w:t>
+      </w:r>
+    </w:p>
+    <w:p>
+      <w:pPr>
+        <w:jc w:val="center"/>
+        <w:rPr>
+          <w:b/>
+          <w:lang w:val="en-US"/>
+        </w:rPr>
+      </w:pPr>
+      <w:proofErr w:type="gramStart"/>
+      <w:r>
+        <w:rPr>
+          <w:b/>
+          <w:lang w:val="en-US"/>
+        </w:rPr>
+        <w:t>{{ nama</w:t>
+      </w:r>
+      <w:proofErr w:type="gramEnd"/>
+      <w:r>
+        <w:rPr>
+          <w:b/>
+          <w:lang w:val="en-US"/>
+        </w:rPr>
+        <w:t xml:space="preserve"> }}</w:t>
+      </w:r>
+      <w:r>
+        <w:rPr>
+          <w:b/>
         </w:rPr>
         <w:tab/>
       </w:r>
+      <w:proofErr w:type="gramStart"/>
       <w:r>
         <w:rPr>
           <w:b/>
           <w:lang w:val="en-US"/>
         </w:rPr>
-        <w:t>{{ nim }}</w:t>
+        <w:t>{{ nim</w:t>
+      </w:r>
+      <w:proofErr w:type="gramEnd"/>
+      <w:r>
+        <w:rPr>
+          <w:b/>
+          <w:lang w:val="en-US"/>
+        </w:rPr>
+        <w:t xml:space="preserve"> }}</w:t>
       </w:r>
     </w:p>
     <w:p>
@@ -2964,6 +3075,7 @@
       </w:pPr>
       <w:bookmarkStart w:id="0" w:name="_Toc197688582"/>
       <w:r>
+        <w:lastRenderedPageBreak/>
         <w:t>DAFTAR GAMBAR</w:t>
       </w:r>
       <w:bookmarkEnd w:id="0"/>
@@ -3048,6 +3160,7 @@
       </w:pPr>
       <w:bookmarkStart w:id="1" w:name="_Toc197688583"/>
       <w:r>
+        <w:lastRenderedPageBreak/>
         <w:t>HASIL PRAKTIKUM</w:t>
       </w:r>
       <w:bookmarkEnd w:id="1"/>
@@ -3066,7 +3179,25 @@
           <w:szCs w:val="34"/>
           <w:lang w:val="en-US"/>
         </w:rPr>
-        <w:t>{% for item in daftar_sub_bab %}</w:t>
+        <w:t xml:space="preserve">{% for item in </w:t>
+      </w:r>
+      <w:proofErr w:type="spellStart"/>
+      <w:r>
+        <w:rPr>
+          <w:sz w:val="34"/>
+          <w:szCs w:val="34"/>
+          <w:lang w:val="en-US"/>
+        </w:rPr>
+        <w:t>daftar_sub_bab</w:t>
+      </w:r>
+      <w:proofErr w:type="spellEnd"/>
+      <w:r>
+        <w:rPr>
+          <w:sz w:val="34"/>
+          <w:szCs w:val="34"/>
+          <w:lang w:val="en-US"/>
+        </w:rPr>
+        <w:t xml:space="preserve"> %}</w:t>
       </w:r>
     </w:p>
     <w:p>
@@ -3077,11 +3208,56 @@
           <w:numId w:val="0"/>
         </w:numPr>
       </w:pPr>
+      <w:proofErr w:type="gramStart"/>
       <w:r>
         <w:t>I</w:t>
       </w:r>
       <w:r>
-        <w:t>.{{ loop.index }} {{ item.judul_sub_bab }}</w:t>
+        <w:t xml:space="preserve">.{{ </w:t>
+      </w:r>
+      <w:proofErr w:type="spellStart"/>
+      <w:r>
+        <w:t>loop</w:t>
+      </w:r>
+      <w:proofErr w:type="gramEnd"/>
+      <w:r>
+        <w:t>.</w:t>
+      </w:r>
+      <w:proofErr w:type="gramStart"/>
+      <w:r>
+        <w:t>index</w:t>
+      </w:r>
+      <w:proofErr w:type="spellEnd"/>
+      <w:r>
+        <w:t xml:space="preserve"> }</w:t>
+      </w:r>
+      <w:proofErr w:type="gramEnd"/>
+      <w:r>
+        <w:t xml:space="preserve">} </w:t>
+      </w:r>
+      <w:proofErr w:type="gramStart"/>
+      <w:r>
+        <w:t xml:space="preserve">{{ </w:t>
+      </w:r>
+      <w:proofErr w:type="spellStart"/>
+      <w:r>
+        <w:t>item</w:t>
+      </w:r>
+      <w:proofErr w:type="gramEnd"/>
+      <w:r>
+        <w:t>.judul_sub_</w:t>
+      </w:r>
+      <w:proofErr w:type="gramStart"/>
+      <w:r>
+        <w:t>bab</w:t>
+      </w:r>
+      <w:proofErr w:type="spellEnd"/>
+      <w:r>
+        <w:t xml:space="preserve"> }</w:t>
+      </w:r>
+      <w:proofErr w:type="gramEnd"/>
+      <w:r>
+        <w:t>}</w:t>
       </w:r>
     </w:p>
     <w:p>
@@ -3093,6 +3269,7 @@
         </w:numPr>
         <w:ind w:left="510" w:hanging="153"/>
       </w:pPr>
+      <w:proofErr w:type="gramStart"/>
       <w:r>
         <w:t>I</w:t>
       </w:r>
@@ -3100,22 +3277,58 @@
         <w:rPr>
           <w:lang w:val="id-ID"/>
         </w:rPr>
-        <w:t>.{{ loop.index }}</w:t>
-      </w:r>
+        <w:t>.{{ loop</w:t>
+      </w:r>
+      <w:proofErr w:type="gramEnd"/>
       <w:r>
         <w:rPr>
           <w:lang w:val="id-ID"/>
         </w:rPr>
         <w:t>.</w:t>
       </w:r>
+      <w:proofErr w:type="gramStart"/>
+      <w:r>
+        <w:rPr>
+          <w:lang w:val="id-ID"/>
+        </w:rPr>
+        <w:t>index }}</w:t>
+      </w:r>
+      <w:r>
+        <w:rPr>
+          <w:lang w:val="id-ID"/>
+        </w:rPr>
+        <w:t>.</w:t>
+      </w:r>
       <w:r>
         <w:t>A.</w:t>
       </w:r>
+      <w:proofErr w:type="gramEnd"/>
       <w:r>
         <w:t xml:space="preserve"> </w:t>
       </w:r>
-      <w:r>
-        <w:t>{{ item.label_point_a }}</w:t>
+      <w:proofErr w:type="gramStart"/>
+      <w:r>
+        <w:t xml:space="preserve">{{ </w:t>
+      </w:r>
+      <w:proofErr w:type="spellStart"/>
+      <w:r>
+        <w:t>item</w:t>
+      </w:r>
+      <w:proofErr w:type="gramEnd"/>
+      <w:r>
+        <w:t>.label_point_</w:t>
+      </w:r>
+      <w:proofErr w:type="gramStart"/>
+      <w:r>
+        <w:t>a</w:t>
+      </w:r>
+      <w:proofErr w:type="spellEnd"/>
+      <w:r>
+        <w:t xml:space="preserve"> }</w:t>
+      </w:r>
+      <w:proofErr w:type="gramEnd"/>
+      <w:r>
+        <w:t>}</w:t>
       </w:r>
       <w:r>
         <w:t xml:space="preserve"> </w:t>
@@ -3143,8 +3356,18 @@
       <w:pPr>
         <w:pStyle w:val="Code"/>
       </w:pPr>
-      <w:r>
-        <w:t>{{ k.isi }}</w:t>
+      <w:proofErr w:type="gramStart"/>
+      <w:r>
+        <w:t xml:space="preserve">{{ </w:t>
+      </w:r>
+      <w:proofErr w:type="spellStart"/>
+      <w:r>
+        <w:t>k.isi</w:t>
+      </w:r>
+      <w:proofErr w:type="spellEnd"/>
+      <w:proofErr w:type="gramEnd"/>
+      <w:r>
+        <w:t xml:space="preserve"> }}</w:t>
       </w:r>
     </w:p>
     <w:p>
@@ -3188,6 +3411,7 @@
         <w:spacing w:before="240"/>
         <w:ind w:left="510" w:hanging="153"/>
       </w:pPr>
+      <w:proofErr w:type="gramStart"/>
       <w:r>
         <w:t>I</w:t>
       </w:r>
@@ -3195,22 +3419,42 @@
         <w:rPr>
           <w:lang w:val="id-ID"/>
         </w:rPr>
-        <w:t>.{{ loop.index }}</w:t>
-      </w:r>
+        <w:t>.{{ loop</w:t>
+      </w:r>
+      <w:proofErr w:type="gramEnd"/>
       <w:r>
         <w:rPr>
           <w:lang w:val="id-ID"/>
         </w:rPr>
         <w:t>.</w:t>
       </w:r>
+      <w:proofErr w:type="gramStart"/>
+      <w:r>
+        <w:rPr>
+          <w:lang w:val="id-ID"/>
+        </w:rPr>
+        <w:t>index }}</w:t>
+      </w:r>
+      <w:r>
+        <w:rPr>
+          <w:lang w:val="id-ID"/>
+        </w:rPr>
+        <w:t>.</w:t>
+      </w:r>
       <w:r>
         <w:t>B.</w:t>
       </w:r>
+      <w:proofErr w:type="gramEnd"/>
       <w:r>
         <w:t xml:space="preserve"> </w:t>
       </w:r>
-      <w:r>
-        <w:t xml:space="preserve">Tampilan </w:t>
+      <w:proofErr w:type="spellStart"/>
+      <w:r>
+        <w:t>Tampilan</w:t>
+      </w:r>
+      <w:proofErr w:type="spellEnd"/>
+      <w:r>
+        <w:t xml:space="preserve"> </w:t>
       </w:r>
       <w:r>
         <w:t xml:space="preserve">Hasil </w:t>
@@ -3227,7 +3471,43 @@
         <w:rPr>
           <w:lang w:val="en-US"/>
         </w:rPr>
-        <w:t>{% for gbr in item.list_gambar %}</w:t>
+        <w:t xml:space="preserve">{% for </w:t>
+      </w:r>
+      <w:proofErr w:type="spellStart"/>
+      <w:r>
+        <w:rPr>
+          <w:lang w:val="en-US"/>
+        </w:rPr>
+        <w:t>gbr</w:t>
+      </w:r>
+      <w:proofErr w:type="spellEnd"/>
+      <w:r>
+        <w:rPr>
+          <w:lang w:val="en-US"/>
+        </w:rPr>
+        <w:t xml:space="preserve"> in </w:t>
+      </w:r>
+      <w:proofErr w:type="spellStart"/>
+      <w:proofErr w:type="gramStart"/>
+      <w:r>
+        <w:rPr>
+          <w:lang w:val="en-US"/>
+        </w:rPr>
+        <w:t>item.list</w:t>
+      </w:r>
+      <w:proofErr w:type="gramEnd"/>
+      <w:r>
+        <w:rPr>
+          <w:lang w:val="en-US"/>
+        </w:rPr>
+        <w:t>_gambar</w:t>
+      </w:r>
+      <w:proofErr w:type="spellEnd"/>
+      <w:r>
+        <w:rPr>
+          <w:lang w:val="en-US"/>
+        </w:rPr>
+        <w:t xml:space="preserve"> %}</w:t>
       </w:r>
       <w:r>
         <w:rPr>
@@ -3235,11 +3515,47 @@
         </w:rPr>
         <w:t xml:space="preserve"> </w:t>
       </w:r>
-      <w:r>
-        <w:rPr>
-          <w:lang w:val="en-US"/>
-        </w:rPr>
-        <w:t>{{ gbr.objek_gambar }}</w:t>
+      <w:proofErr w:type="gramStart"/>
+      <w:r>
+        <w:rPr>
+          <w:lang w:val="en-US"/>
+        </w:rPr>
+        <w:t xml:space="preserve">{{ </w:t>
+      </w:r>
+      <w:proofErr w:type="spellStart"/>
+      <w:r>
+        <w:rPr>
+          <w:lang w:val="en-US"/>
+        </w:rPr>
+        <w:t>gbr</w:t>
+      </w:r>
+      <w:proofErr w:type="gramEnd"/>
+      <w:r>
+        <w:rPr>
+          <w:lang w:val="en-US"/>
+        </w:rPr>
+        <w:t>.objek_</w:t>
+      </w:r>
+      <w:proofErr w:type="gramStart"/>
+      <w:r>
+        <w:rPr>
+          <w:lang w:val="en-US"/>
+        </w:rPr>
+        <w:t>gambar</w:t>
+      </w:r>
+      <w:proofErr w:type="spellEnd"/>
+      <w:r>
+        <w:rPr>
+          <w:lang w:val="en-US"/>
+        </w:rPr>
+        <w:t xml:space="preserve"> }</w:t>
+      </w:r>
+      <w:proofErr w:type="gramEnd"/>
+      <w:r>
+        <w:rPr>
+          <w:lang w:val="en-US"/>
+        </w:rPr>
+        <w:t>}</w:t>
       </w:r>
     </w:p>
     <w:p>
@@ -3288,6 +3604,7 @@
         </w:numPr>
         <w:ind w:left="357"/>
       </w:pPr>
+      <w:proofErr w:type="gramStart"/>
       <w:r>
         <w:t>I</w:t>
       </w:r>
@@ -3295,17 +3612,32 @@
         <w:rPr>
           <w:lang w:val="id-ID"/>
         </w:rPr>
-        <w:t>.{{ loop.index }}</w:t>
-      </w:r>
+        <w:t>.{{ loop</w:t>
+      </w:r>
+      <w:proofErr w:type="gramEnd"/>
       <w:r>
         <w:rPr>
           <w:lang w:val="id-ID"/>
         </w:rPr>
         <w:t>.</w:t>
       </w:r>
+      <w:proofErr w:type="gramStart"/>
+      <w:r>
+        <w:rPr>
+          <w:lang w:val="id-ID"/>
+        </w:rPr>
+        <w:t>index }}</w:t>
+      </w:r>
+      <w:r>
+        <w:rPr>
+          <w:lang w:val="id-ID"/>
+        </w:rPr>
+        <w:t>.</w:t>
+      </w:r>
       <w:r>
         <w:t>C.</w:t>
       </w:r>
+      <w:proofErr w:type="gramEnd"/>
       <w:r>
         <w:t xml:space="preserve"> </w:t>
       </w:r>
@@ -3333,7 +3665,21 @@
         <w:rPr>
           <w:lang w:val="en-US"/>
         </w:rPr>
-        <w:t>{% endfor %}</w:t>
+        <w:t xml:space="preserve">{% </w:t>
+      </w:r>
+      <w:proofErr w:type="spellStart"/>
+      <w:r>
+        <w:rPr>
+          <w:lang w:val="en-US"/>
+        </w:rPr>
+        <w:t>endfor</w:t>
+      </w:r>
+      <w:proofErr w:type="spellEnd"/>
+      <w:r>
+        <w:rPr>
+          <w:lang w:val="en-US"/>
+        </w:rPr>
+        <w:t xml:space="preserve"> %}</w:t>
       </w:r>
     </w:p>
     <w:p>
@@ -3371,14 +3717,107 @@
       <w:pPr>
         <w:pStyle w:val="Text"/>
       </w:pPr>
-      <w:r>
-        <w:t xml:space="preserve">Berdasarkan praktikum yang telah dilaksanakan, bahwa pada pertemuan </w:t>
-      </w:r>
-      <w:r>
-        <w:t>ke-</w:t>
-      </w:r>
-      <w:r>
-        <w:t>{{ nomor_modul }} ini tidak terdapat tugas praktikum.</w:t>
+      <w:proofErr w:type="spellStart"/>
+      <w:r>
+        <w:t>Berdasarkan</w:t>
+      </w:r>
+      <w:proofErr w:type="spellEnd"/>
+      <w:r>
+        <w:t xml:space="preserve"> </w:t>
+      </w:r>
+      <w:proofErr w:type="spellStart"/>
+      <w:r>
+        <w:t>praktikum</w:t>
+      </w:r>
+      <w:proofErr w:type="spellEnd"/>
+      <w:r>
+        <w:t xml:space="preserve"> yang </w:t>
+      </w:r>
+      <w:proofErr w:type="spellStart"/>
+      <w:r>
+        <w:t>telah</w:t>
+      </w:r>
+      <w:proofErr w:type="spellEnd"/>
+      <w:r>
+        <w:t xml:space="preserve"> </w:t>
+      </w:r>
+      <w:proofErr w:type="spellStart"/>
+      <w:r>
+        <w:t>dilaksanakan</w:t>
+      </w:r>
+      <w:proofErr w:type="spellEnd"/>
+      <w:r>
+        <w:t xml:space="preserve">, </w:t>
+      </w:r>
+      <w:proofErr w:type="spellStart"/>
+      <w:r>
+        <w:t>bahwa</w:t>
+      </w:r>
+      <w:proofErr w:type="spellEnd"/>
+      <w:r>
+        <w:t xml:space="preserve"> pada </w:t>
+      </w:r>
+      <w:proofErr w:type="spellStart"/>
+      <w:r>
+        <w:t>pertemuan</w:t>
+      </w:r>
+      <w:proofErr w:type="spellEnd"/>
+      <w:r>
+        <w:t xml:space="preserve"> </w:t>
+      </w:r>
+      <w:r>
+        <w:t>ke</w:t>
+      </w:r>
+      <w:proofErr w:type="gramStart"/>
+      <w:r>
+        <w:t>-</w:t>
+      </w:r>
+      <w:r>
+        <w:t xml:space="preserve">{{ </w:t>
+      </w:r>
+      <w:proofErr w:type="spellStart"/>
+      <w:r>
+        <w:t>nomor</w:t>
+      </w:r>
+      <w:proofErr w:type="gramEnd"/>
+      <w:r>
+        <w:t>_</w:t>
+      </w:r>
+      <w:proofErr w:type="gramStart"/>
+      <w:r>
+        <w:t>modul</w:t>
+      </w:r>
+      <w:proofErr w:type="spellEnd"/>
+      <w:r>
+        <w:t xml:space="preserve"> }</w:t>
+      </w:r>
+      <w:proofErr w:type="gramEnd"/>
+      <w:r>
+        <w:t xml:space="preserve">} ini </w:t>
+      </w:r>
+      <w:proofErr w:type="spellStart"/>
+      <w:r>
+        <w:t>tidak</w:t>
+      </w:r>
+      <w:proofErr w:type="spellEnd"/>
+      <w:r>
+        <w:t xml:space="preserve"> </w:t>
+      </w:r>
+      <w:proofErr w:type="spellStart"/>
+      <w:r>
+        <w:t>terdapat</w:t>
+      </w:r>
+      <w:proofErr w:type="spellEnd"/>
+      <w:r>
+        <w:t xml:space="preserve"> tugas </w:t>
+      </w:r>
+      <w:proofErr w:type="spellStart"/>
+      <w:r>
+        <w:t>praktikum</w:t>
+      </w:r>
+      <w:proofErr w:type="spellEnd"/>
+      <w:r>
+        <w:t>.</w:t>
       </w:r>
     </w:p>
     <w:p>
@@ -3395,15 +3834,16 @@
           <w:szCs w:val="34"/>
           <w:lang w:val="en-US"/>
         </w:rPr>
-        <w:t>{% else %}</w:t>
-      </w:r>
+        <w:t xml:space="preserve">{% else </w:t>
+      </w:r>
+      <w:proofErr w:type="gramStart"/>
       <w:r>
         <w:rPr>
           <w:sz w:val="34"/>
           <w:szCs w:val="34"/>
           <w:lang w:val="en-US"/>
         </w:rPr>
-        <w:t>{% for item in daftar_</w:t>
+        <w:t>%}</w:t>
       </w:r>
       <w:r>
         <w:rPr>
@@ -3411,8 +3851,35 @@
           <w:szCs w:val="34"/>
           <w:lang w:val="en-US"/>
         </w:rPr>
+        <w:t>{</w:t>
+      </w:r>
+      <w:proofErr w:type="gramEnd"/>
+      <w:r>
+        <w:rPr>
+          <w:sz w:val="34"/>
+          <w:szCs w:val="34"/>
+          <w:lang w:val="en-US"/>
+        </w:rPr>
+        <w:t xml:space="preserve">% for item in </w:t>
+      </w:r>
+      <w:proofErr w:type="spellStart"/>
+      <w:r>
+        <w:rPr>
+          <w:sz w:val="34"/>
+          <w:szCs w:val="34"/>
+          <w:lang w:val="en-US"/>
+        </w:rPr>
+        <w:t>daftar_</w:t>
+      </w:r>
+      <w:r>
+        <w:rPr>
+          <w:sz w:val="34"/>
+          <w:szCs w:val="34"/>
+          <w:lang w:val="en-US"/>
+        </w:rPr>
         <w:t>tugas</w:t>
       </w:r>
+      <w:proofErr w:type="spellEnd"/>
       <w:r>
         <w:rPr>
           <w:sz w:val="34"/>
@@ -3430,11 +3897,56 @@
           <w:numId w:val="0"/>
         </w:numPr>
       </w:pPr>
+      <w:proofErr w:type="gramStart"/>
       <w:r>
         <w:t>II</w:t>
       </w:r>
       <w:r>
-        <w:t>.{{ loop.index }} {{ item.judul_sub_bab }}</w:t>
+        <w:t xml:space="preserve">.{{ </w:t>
+      </w:r>
+      <w:proofErr w:type="spellStart"/>
+      <w:r>
+        <w:t>loop</w:t>
+      </w:r>
+      <w:proofErr w:type="gramEnd"/>
+      <w:r>
+        <w:t>.</w:t>
+      </w:r>
+      <w:proofErr w:type="gramStart"/>
+      <w:r>
+        <w:t>index</w:t>
+      </w:r>
+      <w:proofErr w:type="spellEnd"/>
+      <w:r>
+        <w:t xml:space="preserve"> }</w:t>
+      </w:r>
+      <w:proofErr w:type="gramEnd"/>
+      <w:r>
+        <w:t xml:space="preserve">} </w:t>
+      </w:r>
+      <w:proofErr w:type="gramStart"/>
+      <w:r>
+        <w:t xml:space="preserve">{{ </w:t>
+      </w:r>
+      <w:proofErr w:type="spellStart"/>
+      <w:r>
+        <w:t>item</w:t>
+      </w:r>
+      <w:proofErr w:type="gramEnd"/>
+      <w:r>
+        <w:t>.judul_sub_</w:t>
+      </w:r>
+      <w:proofErr w:type="gramStart"/>
+      <w:r>
+        <w:t>bab</w:t>
+      </w:r>
+      <w:proofErr w:type="spellEnd"/>
+      <w:r>
+        <w:t xml:space="preserve"> }</w:t>
+      </w:r>
+      <w:proofErr w:type="gramEnd"/>
+      <w:r>
+        <w:t>}</w:t>
       </w:r>
     </w:p>
     <w:p>
@@ -3448,13 +3960,71 @@
         <w:rPr>
           <w:lang w:val="en-US"/>
         </w:rPr>
-        <w:t>{% if item.tipe == “3” %}</w:t>
-      </w:r>
-      <w:r>
-        <w:rPr>
-          <w:lang w:val="en-US"/>
-        </w:rPr>
-        <w:t>{% for qa in item.qa_list %}</w:t>
+        <w:t xml:space="preserve">{% if </w:t>
+      </w:r>
+      <w:proofErr w:type="spellStart"/>
+      <w:proofErr w:type="gramStart"/>
+      <w:r>
+        <w:rPr>
+          <w:lang w:val="en-US"/>
+        </w:rPr>
+        <w:t>item.tipe</w:t>
+      </w:r>
+      <w:proofErr w:type="spellEnd"/>
+      <w:proofErr w:type="gramEnd"/>
+      <w:r>
+        <w:rPr>
+          <w:lang w:val="en-US"/>
+        </w:rPr>
+        <w:t xml:space="preserve"> == “3” </w:t>
+      </w:r>
+      <w:proofErr w:type="gramStart"/>
+      <w:r>
+        <w:rPr>
+          <w:lang w:val="en-US"/>
+        </w:rPr>
+        <w:t>%}</w:t>
+      </w:r>
+      <w:r>
+        <w:rPr>
+          <w:lang w:val="en-US"/>
+        </w:rPr>
+        <w:t>{</w:t>
+      </w:r>
+      <w:proofErr w:type="gramEnd"/>
+      <w:r>
+        <w:rPr>
+          <w:lang w:val="en-US"/>
+        </w:rPr>
+        <w:t xml:space="preserve">% for </w:t>
+      </w:r>
+      <w:proofErr w:type="spellStart"/>
+      <w:r>
+        <w:rPr>
+          <w:lang w:val="en-US"/>
+        </w:rPr>
+        <w:t>qa</w:t>
+      </w:r>
+      <w:proofErr w:type="spellEnd"/>
+      <w:r>
+        <w:rPr>
+          <w:lang w:val="en-US"/>
+        </w:rPr>
+        <w:t xml:space="preserve"> in </w:t>
+      </w:r>
+      <w:proofErr w:type="spellStart"/>
+      <w:r>
+        <w:rPr>
+          <w:lang w:val="en-US"/>
+        </w:rPr>
+        <w:t>item.qa_list</w:t>
+      </w:r>
+      <w:proofErr w:type="spellEnd"/>
+      <w:r>
+        <w:rPr>
+          <w:lang w:val="en-US"/>
+        </w:rPr>
+        <w:t xml:space="preserve"> %}</w:t>
       </w:r>
     </w:p>
     <w:tbl>
@@ -3488,19 +4058,39 @@
                 <w:lang w:val="en-US"/>
               </w:rPr>
             </w:pPr>
+            <w:proofErr w:type="gramStart"/>
             <w:r>
               <w:rPr>
                 <w:lang w:val="en-US"/>
               </w:rPr>
               <w:t xml:space="preserve">{{ </w:t>
             </w:r>
+            <w:proofErr w:type="spellStart"/>
             <w:r>
               <w:rPr>
                 <w:sz w:val="2"/>
                 <w:szCs w:val="2"/>
                 <w:lang w:val="en-US"/>
               </w:rPr>
-              <w:t xml:space="preserve">loop.index </w:t>
+              <w:t>loop</w:t>
+            </w:r>
+            <w:proofErr w:type="gramEnd"/>
+            <w:r>
+              <w:rPr>
+                <w:sz w:val="2"/>
+                <w:szCs w:val="2"/>
+                <w:lang w:val="en-US"/>
+              </w:rPr>
+              <w:t>.index</w:t>
+            </w:r>
+            <w:proofErr w:type="spellEnd"/>
+            <w:r>
+              <w:rPr>
+                <w:sz w:val="2"/>
+                <w:szCs w:val="2"/>
+                <w:lang w:val="en-US"/>
+              </w:rPr>
+              <w:t xml:space="preserve"> </w:t>
             </w:r>
             <w:r>
               <w:rPr>
@@ -3520,11 +4110,47 @@
                 <w:lang w:val="en-US"/>
               </w:rPr>
             </w:pPr>
+            <w:proofErr w:type="gramStart"/>
             <w:r>
               <w:rPr>
                 <w:lang w:val="en-US"/>
               </w:rPr>
-              <w:t>{{ qa.q }}</w:t>
+              <w:t xml:space="preserve">{{ </w:t>
+            </w:r>
+            <w:proofErr w:type="spellStart"/>
+            <w:r>
+              <w:rPr>
+                <w:lang w:val="en-US"/>
+              </w:rPr>
+              <w:t>qa</w:t>
+            </w:r>
+            <w:proofErr w:type="gramEnd"/>
+            <w:r>
+              <w:rPr>
+                <w:lang w:val="en-US"/>
+              </w:rPr>
+              <w:t>.</w:t>
+            </w:r>
+            <w:proofErr w:type="gramStart"/>
+            <w:r>
+              <w:rPr>
+                <w:lang w:val="en-US"/>
+              </w:rPr>
+              <w:t>q</w:t>
+            </w:r>
+            <w:proofErr w:type="spellEnd"/>
+            <w:r>
+              <w:rPr>
+                <w:lang w:val="en-US"/>
+              </w:rPr>
+              <w:t xml:space="preserve"> }</w:t>
+            </w:r>
+            <w:proofErr w:type="gramEnd"/>
+            <w:r>
+              <w:rPr>
+                <w:lang w:val="en-US"/>
+              </w:rPr>
+              <w:t>}</w:t>
             </w:r>
           </w:p>
           <w:p>
@@ -3535,21 +4161,44 @@
                 <w:lang w:val="en-US"/>
               </w:rPr>
             </w:pPr>
+            <w:proofErr w:type="spellStart"/>
             <w:r>
               <w:rPr>
                 <w:b/>
                 <w:bCs/>
                 <w:lang w:val="en-US"/>
               </w:rPr>
-              <w:t>Jawaban:</w:t>
+              <w:t>Jawaban</w:t>
+            </w:r>
+            <w:proofErr w:type="spellEnd"/>
+            <w:r>
+              <w:rPr>
+                <w:b/>
+                <w:bCs/>
+                <w:lang w:val="en-US"/>
+              </w:rPr>
+              <w:t>:</w:t>
             </w:r>
           </w:p>
           <w:p>
             <w:pPr>
               <w:pStyle w:val="Text"/>
             </w:pPr>
-            <w:r>
-              <w:t>{{ qa.a }}</w:t>
+            <w:proofErr w:type="gramStart"/>
+            <w:r>
+              <w:t xml:space="preserve">{{ </w:t>
+            </w:r>
+            <w:proofErr w:type="spellStart"/>
+            <w:r>
+              <w:t>qa</w:t>
+            </w:r>
+            <w:proofErr w:type="gramEnd"/>
+            <w:r>
+              <w:t>.a</w:t>
+            </w:r>
+            <w:proofErr w:type="spellEnd"/>
+            <w:r>
+              <w:t xml:space="preserve"> }}</w:t>
             </w:r>
           </w:p>
         </w:tc>
@@ -3566,13 +4215,41 @@
         <w:rPr>
           <w:lang w:val="en-US"/>
         </w:rPr>
-        <w:t>{% endfor %}</w:t>
-      </w:r>
-      <w:r>
-        <w:rPr>
-          <w:lang w:val="en-US"/>
-        </w:rPr>
-        <w:t>{% else %}</w:t>
+        <w:t xml:space="preserve">{% </w:t>
+      </w:r>
+      <w:proofErr w:type="spellStart"/>
+      <w:r>
+        <w:rPr>
+          <w:lang w:val="en-US"/>
+        </w:rPr>
+        <w:t>endfor</w:t>
+      </w:r>
+      <w:proofErr w:type="spellEnd"/>
+      <w:r>
+        <w:rPr>
+          <w:lang w:val="en-US"/>
+        </w:rPr>
+        <w:t xml:space="preserve"> </w:t>
+      </w:r>
+      <w:proofErr w:type="gramStart"/>
+      <w:r>
+        <w:rPr>
+          <w:lang w:val="en-US"/>
+        </w:rPr>
+        <w:t>%}</w:t>
+      </w:r>
+      <w:r>
+        <w:rPr>
+          <w:lang w:val="en-US"/>
+        </w:rPr>
+        <w:t>{</w:t>
+      </w:r>
+      <w:proofErr w:type="gramEnd"/>
+      <w:r>
+        <w:rPr>
+          <w:lang w:val="en-US"/>
+        </w:rPr>
+        <w:t>% else %}</w:t>
       </w:r>
     </w:p>
     <w:p>
@@ -3584,29 +4261,67 @@
         </w:numPr>
         <w:ind w:left="510" w:hanging="153"/>
       </w:pPr>
-      <w:r>
+      <w:proofErr w:type="gramStart"/>
+      <w:r>
+        <w:lastRenderedPageBreak/>
         <w:t>II</w:t>
       </w:r>
       <w:r>
         <w:rPr>
           <w:lang w:val="id-ID"/>
         </w:rPr>
-        <w:t>.{{ loop.index }}</w:t>
-      </w:r>
+        <w:t>.{{ loop</w:t>
+      </w:r>
+      <w:proofErr w:type="gramEnd"/>
       <w:r>
         <w:rPr>
           <w:lang w:val="id-ID"/>
         </w:rPr>
         <w:t>.</w:t>
       </w:r>
+      <w:proofErr w:type="gramStart"/>
+      <w:r>
+        <w:rPr>
+          <w:lang w:val="id-ID"/>
+        </w:rPr>
+        <w:t>index }}</w:t>
+      </w:r>
+      <w:r>
+        <w:rPr>
+          <w:lang w:val="id-ID"/>
+        </w:rPr>
+        <w:t>.</w:t>
+      </w:r>
       <w:r>
         <w:t>A.</w:t>
       </w:r>
+      <w:proofErr w:type="gramEnd"/>
       <w:r>
         <w:t xml:space="preserve"> </w:t>
       </w:r>
-      <w:r>
-        <w:t>{{ item.label_point_a }}</w:t>
+      <w:proofErr w:type="gramStart"/>
+      <w:r>
+        <w:t xml:space="preserve">{{ </w:t>
+      </w:r>
+      <w:proofErr w:type="spellStart"/>
+      <w:r>
+        <w:t>item</w:t>
+      </w:r>
+      <w:proofErr w:type="gramEnd"/>
+      <w:r>
+        <w:t>.label_point_</w:t>
+      </w:r>
+      <w:proofErr w:type="gramStart"/>
+      <w:r>
+        <w:t>a</w:t>
+      </w:r>
+      <w:proofErr w:type="spellEnd"/>
+      <w:r>
+        <w:t xml:space="preserve"> }</w:t>
+      </w:r>
+      <w:proofErr w:type="gramEnd"/>
+      <w:r>
+        <w:t>}</w:t>
       </w:r>
       <w:r>
         <w:t xml:space="preserve"> </w:t>
@@ -3620,11 +4335,19 @@
       <w:r>
         <w:t>{% if item.</w:t>
       </w:r>
-      <w:r>
-        <w:rPr>
-          <w:lang w:val="en-US"/>
-        </w:rPr>
-        <w:t xml:space="preserve">tipe == “1” </w:t>
+      <w:proofErr w:type="spellStart"/>
+      <w:r>
+        <w:rPr>
+          <w:lang w:val="en-US"/>
+        </w:rPr>
+        <w:t>tipe</w:t>
+      </w:r>
+      <w:proofErr w:type="spellEnd"/>
+      <w:r>
+        <w:rPr>
+          <w:lang w:val="en-US"/>
+        </w:rPr>
+        <w:t xml:space="preserve"> == “1” </w:t>
       </w:r>
       <w:r>
         <w:t>%}</w:t>
@@ -3643,8 +4366,18 @@
       <w:pPr>
         <w:pStyle w:val="Code"/>
       </w:pPr>
-      <w:r>
-        <w:t>{{ k.isi }}</w:t>
+      <w:proofErr w:type="gramStart"/>
+      <w:r>
+        <w:t xml:space="preserve">{{ </w:t>
+      </w:r>
+      <w:proofErr w:type="spellStart"/>
+      <w:r>
+        <w:t>k.isi</w:t>
+      </w:r>
+      <w:proofErr w:type="spellEnd"/>
+      <w:proofErr w:type="gramEnd"/>
+      <w:r>
+        <w:t xml:space="preserve"> }}</w:t>
       </w:r>
     </w:p>
     <w:p>
@@ -3672,6 +4405,7 @@
       <w:r>
         <w:t>{% for baris in item.</w:t>
       </w:r>
+      <w:proofErr w:type="spellStart"/>
       <w:r>
         <w:rPr>
           <w:lang w:val="en-US"/>
@@ -3684,6 +4418,7 @@
         </w:rPr>
         <w:t>list</w:t>
       </w:r>
+      <w:proofErr w:type="spellEnd"/>
       <w:r>
         <w:t xml:space="preserve"> %}</w:t>
       </w:r>
@@ -3721,6 +4456,7 @@
         <w:spacing w:before="240"/>
         <w:ind w:left="510" w:hanging="153"/>
       </w:pPr>
+      <w:proofErr w:type="gramStart"/>
       <w:r>
         <w:t>II</w:t>
       </w:r>
@@ -3728,19 +4464,42 @@
         <w:rPr>
           <w:lang w:val="id-ID"/>
         </w:rPr>
-        <w:t>.{{ loop.index }}</w:t>
-      </w:r>
+        <w:t>.{{ loop</w:t>
+      </w:r>
+      <w:proofErr w:type="gramEnd"/>
       <w:r>
         <w:rPr>
           <w:lang w:val="id-ID"/>
         </w:rPr>
         <w:t>.</w:t>
       </w:r>
-      <w:r>
-        <w:t xml:space="preserve">B. </w:t>
-      </w:r>
-      <w:r>
-        <w:t xml:space="preserve">Tampilan </w:t>
+      <w:proofErr w:type="gramStart"/>
+      <w:r>
+        <w:rPr>
+          <w:lang w:val="id-ID"/>
+        </w:rPr>
+        <w:t>index }}</w:t>
+      </w:r>
+      <w:r>
+        <w:rPr>
+          <w:lang w:val="id-ID"/>
+        </w:rPr>
+        <w:t>.</w:t>
+      </w:r>
+      <w:r>
+        <w:t>B.</w:t>
+      </w:r>
+      <w:proofErr w:type="gramEnd"/>
+      <w:r>
+        <w:t xml:space="preserve"> </w:t>
+      </w:r>
+      <w:proofErr w:type="spellStart"/>
+      <w:r>
+        <w:t>Tampilan</w:t>
+      </w:r>
+      <w:proofErr w:type="spellEnd"/>
+      <w:r>
+        <w:t xml:space="preserve"> </w:t>
       </w:r>
       <w:r>
         <w:t xml:space="preserve">Hasil </w:t>
@@ -3757,7 +4516,43 @@
         <w:rPr>
           <w:lang w:val="en-US"/>
         </w:rPr>
-        <w:t>{% for gbr in item.list_gambar %}</w:t>
+        <w:t xml:space="preserve">{% for </w:t>
+      </w:r>
+      <w:proofErr w:type="spellStart"/>
+      <w:r>
+        <w:rPr>
+          <w:lang w:val="en-US"/>
+        </w:rPr>
+        <w:t>gbr</w:t>
+      </w:r>
+      <w:proofErr w:type="spellEnd"/>
+      <w:r>
+        <w:rPr>
+          <w:lang w:val="en-US"/>
+        </w:rPr>
+        <w:t xml:space="preserve"> in </w:t>
+      </w:r>
+      <w:proofErr w:type="spellStart"/>
+      <w:proofErr w:type="gramStart"/>
+      <w:r>
+        <w:rPr>
+          <w:lang w:val="en-US"/>
+        </w:rPr>
+        <w:t>item.list</w:t>
+      </w:r>
+      <w:proofErr w:type="gramEnd"/>
+      <w:r>
+        <w:rPr>
+          <w:lang w:val="en-US"/>
+        </w:rPr>
+        <w:t>_gambar</w:t>
+      </w:r>
+      <w:proofErr w:type="spellEnd"/>
+      <w:r>
+        <w:rPr>
+          <w:lang w:val="en-US"/>
+        </w:rPr>
+        <w:t xml:space="preserve"> %}</w:t>
       </w:r>
       <w:r>
         <w:rPr>
@@ -3765,11 +4560,47 @@
         </w:rPr>
         <w:t xml:space="preserve"> </w:t>
       </w:r>
-      <w:r>
-        <w:rPr>
-          <w:lang w:val="en-US"/>
-        </w:rPr>
-        <w:t>{{ gbr.objek_gambar }}</w:t>
+      <w:proofErr w:type="gramStart"/>
+      <w:r>
+        <w:rPr>
+          <w:lang w:val="en-US"/>
+        </w:rPr>
+        <w:t xml:space="preserve">{{ </w:t>
+      </w:r>
+      <w:proofErr w:type="spellStart"/>
+      <w:r>
+        <w:rPr>
+          <w:lang w:val="en-US"/>
+        </w:rPr>
+        <w:t>gbr</w:t>
+      </w:r>
+      <w:proofErr w:type="gramEnd"/>
+      <w:r>
+        <w:rPr>
+          <w:lang w:val="en-US"/>
+        </w:rPr>
+        <w:t>.objek_</w:t>
+      </w:r>
+      <w:proofErr w:type="gramStart"/>
+      <w:r>
+        <w:rPr>
+          <w:lang w:val="en-US"/>
+        </w:rPr>
+        <w:t>gambar</w:t>
+      </w:r>
+      <w:proofErr w:type="spellEnd"/>
+      <w:r>
+        <w:rPr>
+          <w:lang w:val="en-US"/>
+        </w:rPr>
+        <w:t xml:space="preserve"> }</w:t>
+      </w:r>
+      <w:proofErr w:type="gramEnd"/>
+      <w:r>
+        <w:rPr>
+          <w:lang w:val="en-US"/>
+        </w:rPr>
+        <w:t>}</w:t>
       </w:r>
     </w:p>
     <w:p>
@@ -3825,6 +4656,7 @@
         </w:numPr>
         <w:ind w:left="357"/>
       </w:pPr>
+      <w:proofErr w:type="gramStart"/>
       <w:r>
         <w:t>II</w:t>
       </w:r>
@@ -3832,16 +4664,34 @@
         <w:rPr>
           <w:lang w:val="id-ID"/>
         </w:rPr>
-        <w:t>.{{ loop.index }}</w:t>
-      </w:r>
+        <w:t>.{{ loop</w:t>
+      </w:r>
+      <w:proofErr w:type="gramEnd"/>
       <w:r>
         <w:rPr>
           <w:lang w:val="id-ID"/>
         </w:rPr>
         <w:t>.</w:t>
       </w:r>
-      <w:r>
-        <w:t xml:space="preserve">C. </w:t>
+      <w:proofErr w:type="gramStart"/>
+      <w:r>
+        <w:rPr>
+          <w:lang w:val="id-ID"/>
+        </w:rPr>
+        <w:t>index }}</w:t>
+      </w:r>
+      <w:r>
+        <w:rPr>
+          <w:lang w:val="id-ID"/>
+        </w:rPr>
+        <w:t>.</w:t>
+      </w:r>
+      <w:r>
+        <w:t>C.</w:t>
+      </w:r>
+      <w:proofErr w:type="gramEnd"/>
+      <w:r>
+        <w:t xml:space="preserve"> </w:t>
       </w:r>
       <w:r>
         <w:t>Analisa</w:t>
@@ -3873,7 +4723,21 @@
         <w:rPr>
           <w:lang w:val="en-US"/>
         </w:rPr>
-        <w:t>{% endfor %}</w:t>
+        <w:t xml:space="preserve">{% </w:t>
+      </w:r>
+      <w:proofErr w:type="spellStart"/>
+      <w:r>
+        <w:rPr>
+          <w:lang w:val="en-US"/>
+        </w:rPr>
+        <w:t>endfor</w:t>
+      </w:r>
+      <w:proofErr w:type="spellEnd"/>
+      <w:r>
+        <w:rPr>
+          <w:lang w:val="en-US"/>
+        </w:rPr>
+        <w:t xml:space="preserve"> %}</w:t>
       </w:r>
       <w:r>
         <w:rPr>
@@ -3897,7 +4761,17 @@
     </w:p>
     <w:p>
       <w:r>
-        <w:t>{{ isi_kesimpulan }}</w:t>
+        <w:t>{% for item in list_kesimpulan %}</w:t>
+      </w:r>
+    </w:p>
+    <w:p>
+      <w:r>
+        <w:t>{{ item.teks }}</w:t>
+      </w:r>
+    </w:p>
+    <w:p>
+      <w:r>
+        <w:t>{% endfor %}</w:t>
       </w:r>
     </w:p>
     <w:sectPr>
@@ -3912,7 +4786,7 @@
 </file>
 
 <file path=word/endnotes.xml><?xml version="1.0" encoding="utf-8"?>
-<w:endnotes xmlns:wpc="http://schemas.microsoft.com/office/word/2010/wordprocessingCanvas" xmlns:cx="http://schemas.microsoft.com/office/drawing/2014/chartex" xmlns:cx1="http://schemas.microsoft.com/office/drawing/2015/9/8/chartex" xmlns:cx2="http://schemas.microsoft.com/office/drawing/2015/10/21/chartex" xmlns:cx3="http://schemas.microsoft.com/office/drawing/2016/5/9/chartex" xmlns:cx4="http://schemas.microsoft.com/office/drawing/2016/5/10/chartex" xmlns:cx5="http://schemas.microsoft.com/office/drawing/2016/5/11/chartex" xmlns:cx6="http://schemas.microsoft.com/office/drawing/2016/5/12/chartex" xmlns:cx7="http://schemas.microsoft.com/office/drawing/2016/5/13/chartex" xmlns:cx8="http://schemas.microsoft.com/office/drawing/2016/5/14/chartex" xmlns:mc="http://schemas.openxmlformats.org/markup-compatibility/2006" xmlns:aink="http://schemas.microsoft.com/office/drawing/2016/ink" xmlns:am3d="http://schemas.microsoft.com/office/drawing/2017/model3d" xmlns:o="urn:schemas-microsoft-com:office:office" xmlns:r="http://schemas.openxmlformats.org/officeDocument/2006/relationships" xmlns:m="http://schemas.openxmlformats.org/officeDocument/2006/math" xmlns:v="urn:schemas-microsoft-com:vml" xmlns:wp14="http://schemas.microsoft.com/office/word/2010/wordprocessingDrawing" xmlns:wp="http://schemas.openxmlformats.org/drawingml/2006/wordprocessingDrawing" xmlns:w10="urn:schemas-microsoft-com:office:word" xmlns:w="http://schemas.openxmlformats.org/wordprocessingml/2006/main" xmlns:w14="http://schemas.microsoft.com/office/word/2010/wordml" xmlns:w15="http://schemas.microsoft.com/office/word/2012/wordml" xmlns:w16cex="http://schemas.microsoft.com/office/word/2018/wordml/cex" xmlns:w16cid="http://schemas.microsoft.com/office/word/2016/wordml/cid" xmlns:w16="http://schemas.microsoft.com/office/word/2018/wordml" xmlns:w16se="http://schemas.microsoft.com/office/word/2015/wordml/symex" xmlns:wpg="http://schemas.microsoft.com/office/word/2010/wordprocessingGroup" xmlns:wpi="http://schemas.microsoft.com/office/word/2010/wordprocessingInk" xmlns:wne="http://schemas.microsoft.com/office/word/2006/wordml" xmlns:wps="http://schemas.microsoft.com/office/word/2010/wordprocessingShape" mc:Ignorable="w14 w15 w16se w16cid w16 w16cex wp14">
+<w:endnotes xmlns:wpc="http://schemas.microsoft.com/office/word/2010/wordprocessingCanvas" xmlns:cx="http://schemas.microsoft.com/office/drawing/2014/chartex" xmlns:cx1="http://schemas.microsoft.com/office/drawing/2015/9/8/chartex" xmlns:cx2="http://schemas.microsoft.com/office/drawing/2015/10/21/chartex" xmlns:cx3="http://schemas.microsoft.com/office/drawing/2016/5/9/chartex" xmlns:cx4="http://schemas.microsoft.com/office/drawing/2016/5/10/chartex" xmlns:cx5="http://schemas.microsoft.com/office/drawing/2016/5/11/chartex" xmlns:cx6="http://schemas.microsoft.com/office/drawing/2016/5/12/chartex" xmlns:cx7="http://schemas.microsoft.com/office/drawing/2016/5/13/chartex" xmlns:cx8="http://schemas.microsoft.com/office/drawing/2016/5/14/chartex" xmlns:mc="http://schemas.openxmlformats.org/markup-compatibility/2006" xmlns:aink="http://schemas.microsoft.com/office/drawing/2016/ink" xmlns:am3d="http://schemas.microsoft.com/office/drawing/2017/model3d" xmlns:o="urn:schemas-microsoft-com:office:office" xmlns:oel="http://schemas.microsoft.com/office/2019/extlst" xmlns:r="http://schemas.openxmlformats.org/officeDocument/2006/relationships" xmlns:m="http://schemas.openxmlformats.org/officeDocument/2006/math" xmlns:v="urn:schemas-microsoft-com:vml" xmlns:wp14="http://schemas.microsoft.com/office/word/2010/wordprocessingDrawing" xmlns:wp="http://schemas.openxmlformats.org/drawingml/2006/wordprocessingDrawing" xmlns:w10="urn:schemas-microsoft-com:office:word" xmlns:w="http://schemas.openxmlformats.org/wordprocessingml/2006/main" xmlns:w14="http://schemas.microsoft.com/office/word/2010/wordml" xmlns:w15="http://schemas.microsoft.com/office/word/2012/wordml" xmlns:w16cex="http://schemas.microsoft.com/office/word/2018/wordml/cex" xmlns:w16cid="http://schemas.microsoft.com/office/word/2016/wordml/cid" xmlns:w16="http://schemas.microsoft.com/office/word/2018/wordml" xmlns:w16du="http://schemas.microsoft.com/office/word/2023/wordml/word16du" xmlns:w16sdtdh="http://schemas.microsoft.com/office/word/2020/wordml/sdtdatahash" xmlns:w16sdtfl="http://schemas.microsoft.com/office/word/2024/wordml/sdtformatlock" xmlns:w16se="http://schemas.microsoft.com/office/word/2015/wordml/symex" xmlns:wpg="http://schemas.microsoft.com/office/word/2010/wordprocessingGroup" xmlns:wpi="http://schemas.microsoft.com/office/word/2010/wordprocessingInk" xmlns:wne="http://schemas.microsoft.com/office/word/2006/wordml" xmlns:wps="http://schemas.microsoft.com/office/word/2010/wordprocessingShape" mc:Ignorable="w14 w15 w16se w16cid w16 w16cex w16sdtdh w16sdtfl w16du wp14">
   <w:endnote w:type="separator" w:id="-1">
     <w:p>
       <w:pPr>
@@ -3939,7 +4813,7 @@
 </file>
 
 <file path=word/footer1.xml><?xml version="1.0" encoding="utf-8"?>
-<w:ftr xmlns:wpc="http://schemas.microsoft.com/office/word/2010/wordprocessingCanvas" xmlns:cx="http://schemas.microsoft.com/office/drawing/2014/chartex" xmlns:cx1="http://schemas.microsoft.com/office/drawing/2015/9/8/chartex" xmlns:cx2="http://schemas.microsoft.com/office/drawing/2015/10/21/chartex" xmlns:cx3="http://schemas.microsoft.com/office/drawing/2016/5/9/chartex" xmlns:cx4="http://schemas.microsoft.com/office/drawing/2016/5/10/chartex" xmlns:cx5="http://schemas.microsoft.com/office/drawing/2016/5/11/chartex" xmlns:cx6="http://schemas.microsoft.com/office/drawing/2016/5/12/chartex" xmlns:cx7="http://schemas.microsoft.com/office/drawing/2016/5/13/chartex" xmlns:cx8="http://schemas.microsoft.com/office/drawing/2016/5/14/chartex" xmlns:mc="http://schemas.openxmlformats.org/markup-compatibility/2006" xmlns:aink="http://schemas.microsoft.com/office/drawing/2016/ink" xmlns:am3d="http://schemas.microsoft.com/office/drawing/2017/model3d" xmlns:o="urn:schemas-microsoft-com:office:office" xmlns:r="http://schemas.openxmlformats.org/officeDocument/2006/relationships" xmlns:m="http://schemas.openxmlformats.org/officeDocument/2006/math" xmlns:v="urn:schemas-microsoft-com:vml" xmlns:wp14="http://schemas.microsoft.com/office/word/2010/wordprocessingDrawing" xmlns:wp="http://schemas.openxmlformats.org/drawingml/2006/wordprocessingDrawing" xmlns:w10="urn:schemas-microsoft-com:office:word" xmlns:w="http://schemas.openxmlformats.org/wordprocessingml/2006/main" xmlns:w14="http://schemas.microsoft.com/office/word/2010/wordml" xmlns:w15="http://schemas.microsoft.com/office/word/2012/wordml" xmlns:w16cex="http://schemas.microsoft.com/office/word/2018/wordml/cex" xmlns:w16cid="http://schemas.microsoft.com/office/word/2016/wordml/cid" xmlns:w16="http://schemas.microsoft.com/office/word/2018/wordml" xmlns:w16se="http://schemas.microsoft.com/office/word/2015/wordml/symex" xmlns:wpg="http://schemas.microsoft.com/office/word/2010/wordprocessingGroup" xmlns:wpi="http://schemas.microsoft.com/office/word/2010/wordprocessingInk" xmlns:wne="http://schemas.microsoft.com/office/word/2006/wordml" xmlns:wps="http://schemas.microsoft.com/office/word/2010/wordprocessingShape" mc:Ignorable="w14 w15 w16se w16cid w16 w16cex wp14">
+<w:ftr xmlns:wpc="http://schemas.microsoft.com/office/word/2010/wordprocessingCanvas" xmlns:cx="http://schemas.microsoft.com/office/drawing/2014/chartex" xmlns:cx1="http://schemas.microsoft.com/office/drawing/2015/9/8/chartex" xmlns:cx2="http://schemas.microsoft.com/office/drawing/2015/10/21/chartex" xmlns:cx3="http://schemas.microsoft.com/office/drawing/2016/5/9/chartex" xmlns:cx4="http://schemas.microsoft.com/office/drawing/2016/5/10/chartex" xmlns:cx5="http://schemas.microsoft.com/office/drawing/2016/5/11/chartex" xmlns:cx6="http://schemas.microsoft.com/office/drawing/2016/5/12/chartex" xmlns:cx7="http://schemas.microsoft.com/office/drawing/2016/5/13/chartex" xmlns:cx8="http://schemas.microsoft.com/office/drawing/2016/5/14/chartex" xmlns:mc="http://schemas.openxmlformats.org/markup-compatibility/2006" xmlns:aink="http://schemas.microsoft.com/office/drawing/2016/ink" xmlns:am3d="http://schemas.microsoft.com/office/drawing/2017/model3d" xmlns:o="urn:schemas-microsoft-com:office:office" xmlns:oel="http://schemas.microsoft.com/office/2019/extlst" xmlns:r="http://schemas.openxmlformats.org/officeDocument/2006/relationships" xmlns:m="http://schemas.openxmlformats.org/officeDocument/2006/math" xmlns:v="urn:schemas-microsoft-com:vml" xmlns:wp14="http://schemas.microsoft.com/office/word/2010/wordprocessingDrawing" xmlns:wp="http://schemas.openxmlformats.org/drawingml/2006/wordprocessingDrawing" xmlns:w10="urn:schemas-microsoft-com:office:word" xmlns:w="http://schemas.openxmlformats.org/wordprocessingml/2006/main" xmlns:w14="http://schemas.microsoft.com/office/word/2010/wordml" xmlns:w15="http://schemas.microsoft.com/office/word/2012/wordml" xmlns:w16cex="http://schemas.microsoft.com/office/word/2018/wordml/cex" xmlns:w16cid="http://schemas.microsoft.com/office/word/2016/wordml/cid" xmlns:w16="http://schemas.microsoft.com/office/word/2018/wordml" xmlns:w16du="http://schemas.microsoft.com/office/word/2023/wordml/word16du" xmlns:w16sdtdh="http://schemas.microsoft.com/office/word/2020/wordml/sdtdatahash" xmlns:w16sdtfl="http://schemas.microsoft.com/office/word/2024/wordml/sdtformatlock" xmlns:w16se="http://schemas.microsoft.com/office/word/2015/wordml/symex" xmlns:wpg="http://schemas.microsoft.com/office/word/2010/wordprocessingGroup" xmlns:wpi="http://schemas.microsoft.com/office/word/2010/wordprocessingInk" xmlns:wne="http://schemas.microsoft.com/office/word/2006/wordml" xmlns:wps="http://schemas.microsoft.com/office/word/2010/wordprocessingShape" mc:Ignorable="w14 w15 w16se w16cid w16 w16cex w16sdtdh w16sdtfl w16du wp14">
   <w:sdt>
     <w:sdtPr>
       <w:id w:val="-517623792"/>
@@ -3988,7 +4862,7 @@
 </file>
 
 <file path=word/footer2.xml><?xml version="1.0" encoding="utf-8"?>
-<w:ftr xmlns:wpc="http://schemas.microsoft.com/office/word/2010/wordprocessingCanvas" xmlns:cx="http://schemas.microsoft.com/office/drawing/2014/chartex" xmlns:cx1="http://schemas.microsoft.com/office/drawing/2015/9/8/chartex" xmlns:cx2="http://schemas.microsoft.com/office/drawing/2015/10/21/chartex" xmlns:cx3="http://schemas.microsoft.com/office/drawing/2016/5/9/chartex" xmlns:cx4="http://schemas.microsoft.com/office/drawing/2016/5/10/chartex" xmlns:cx5="http://schemas.microsoft.com/office/drawing/2016/5/11/chartex" xmlns:cx6="http://schemas.microsoft.com/office/drawing/2016/5/12/chartex" xmlns:cx7="http://schemas.microsoft.com/office/drawing/2016/5/13/chartex" xmlns:cx8="http://schemas.microsoft.com/office/drawing/2016/5/14/chartex" xmlns:mc="http://schemas.openxmlformats.org/markup-compatibility/2006" xmlns:aink="http://schemas.microsoft.com/office/drawing/2016/ink" xmlns:am3d="http://schemas.microsoft.com/office/drawing/2017/model3d" xmlns:o="urn:schemas-microsoft-com:office:office" xmlns:r="http://schemas.openxmlformats.org/officeDocument/2006/relationships" xmlns:m="http://schemas.openxmlformats.org/officeDocument/2006/math" xmlns:v="urn:schemas-microsoft-com:vml" xmlns:wp14="http://schemas.microsoft.com/office/word/2010/wordprocessingDrawing" xmlns:wp="http://schemas.openxmlformats.org/drawingml/2006/wordprocessingDrawing" xmlns:w10="urn:schemas-microsoft-com:office:word" xmlns:w="http://schemas.openxmlformats.org/wordprocessingml/2006/main" xmlns:w14="http://schemas.microsoft.com/office/word/2010/wordml" xmlns:w15="http://schemas.microsoft.com/office/word/2012/wordml" xmlns:w16cex="http://schemas.microsoft.com/office/word/2018/wordml/cex" xmlns:w16cid="http://schemas.microsoft.com/office/word/2016/wordml/cid" xmlns:w16="http://schemas.microsoft.com/office/word/2018/wordml" xmlns:w16se="http://schemas.microsoft.com/office/word/2015/wordml/symex" xmlns:wpg="http://schemas.microsoft.com/office/word/2010/wordprocessingGroup" xmlns:wpi="http://schemas.microsoft.com/office/word/2010/wordprocessingInk" xmlns:wne="http://schemas.microsoft.com/office/word/2006/wordml" xmlns:wps="http://schemas.microsoft.com/office/word/2010/wordprocessingShape" mc:Ignorable="w14 w15 w16se w16cid w16 w16cex wp14">
+<w:ftr xmlns:wpc="http://schemas.microsoft.com/office/word/2010/wordprocessingCanvas" xmlns:cx="http://schemas.microsoft.com/office/drawing/2014/chartex" xmlns:cx1="http://schemas.microsoft.com/office/drawing/2015/9/8/chartex" xmlns:cx2="http://schemas.microsoft.com/office/drawing/2015/10/21/chartex" xmlns:cx3="http://schemas.microsoft.com/office/drawing/2016/5/9/chartex" xmlns:cx4="http://schemas.microsoft.com/office/drawing/2016/5/10/chartex" xmlns:cx5="http://schemas.microsoft.com/office/drawing/2016/5/11/chartex" xmlns:cx6="http://schemas.microsoft.com/office/drawing/2016/5/12/chartex" xmlns:cx7="http://schemas.microsoft.com/office/drawing/2016/5/13/chartex" xmlns:cx8="http://schemas.microsoft.com/office/drawing/2016/5/14/chartex" xmlns:mc="http://schemas.openxmlformats.org/markup-compatibility/2006" xmlns:aink="http://schemas.microsoft.com/office/drawing/2016/ink" xmlns:am3d="http://schemas.microsoft.com/office/drawing/2017/model3d" xmlns:o="urn:schemas-microsoft-com:office:office" xmlns:oel="http://schemas.microsoft.com/office/2019/extlst" xmlns:r="http://schemas.openxmlformats.org/officeDocument/2006/relationships" xmlns:m="http://schemas.openxmlformats.org/officeDocument/2006/math" xmlns:v="urn:schemas-microsoft-com:vml" xmlns:wp14="http://schemas.microsoft.com/office/word/2010/wordprocessingDrawing" xmlns:wp="http://schemas.openxmlformats.org/drawingml/2006/wordprocessingDrawing" xmlns:w10="urn:schemas-microsoft-com:office:word" xmlns:w="http://schemas.openxmlformats.org/wordprocessingml/2006/main" xmlns:w14="http://schemas.microsoft.com/office/word/2010/wordml" xmlns:w15="http://schemas.microsoft.com/office/word/2012/wordml" xmlns:w16cex="http://schemas.microsoft.com/office/word/2018/wordml/cex" xmlns:w16cid="http://schemas.microsoft.com/office/word/2016/wordml/cid" xmlns:w16="http://schemas.microsoft.com/office/word/2018/wordml" xmlns:w16du="http://schemas.microsoft.com/office/word/2023/wordml/word16du" xmlns:w16sdtdh="http://schemas.microsoft.com/office/word/2020/wordml/sdtdatahash" xmlns:w16sdtfl="http://schemas.microsoft.com/office/word/2024/wordml/sdtformatlock" xmlns:w16se="http://schemas.microsoft.com/office/word/2015/wordml/symex" xmlns:wpg="http://schemas.microsoft.com/office/word/2010/wordprocessingGroup" xmlns:wpi="http://schemas.microsoft.com/office/word/2010/wordprocessingInk" xmlns:wne="http://schemas.microsoft.com/office/word/2006/wordml" xmlns:wps="http://schemas.microsoft.com/office/word/2010/wordprocessingShape" mc:Ignorable="w14 w15 w16se w16cid w16 w16cex w16sdtdh w16sdtfl w16du wp14">
   <w:sdt>
     <w:sdtPr>
       <w:id w:val="-234937495"/>
@@ -4037,7 +4911,7 @@
 </file>
 
 <file path=word/footnotes.xml><?xml version="1.0" encoding="utf-8"?>
-<w:footnotes xmlns:wpc="http://schemas.microsoft.com/office/word/2010/wordprocessingCanvas" xmlns:cx="http://schemas.microsoft.com/office/drawing/2014/chartex" xmlns:cx1="http://schemas.microsoft.com/office/drawing/2015/9/8/chartex" xmlns:cx2="http://schemas.microsoft.com/office/drawing/2015/10/21/chartex" xmlns:cx3="http://schemas.microsoft.com/office/drawing/2016/5/9/chartex" xmlns:cx4="http://schemas.microsoft.com/office/drawing/2016/5/10/chartex" xmlns:cx5="http://schemas.microsoft.com/office/drawing/2016/5/11/chartex" xmlns:cx6="http://schemas.microsoft.com/office/drawing/2016/5/12/chartex" xmlns:cx7="http://schemas.microsoft.com/office/drawing/2016/5/13/chartex" xmlns:cx8="http://schemas.microsoft.com/office/drawing/2016/5/14/chartex" xmlns:mc="http://schemas.openxmlformats.org/markup-compatibility/2006" xmlns:aink="http://schemas.microsoft.com/office/drawing/2016/ink" xmlns:am3d="http://schemas.microsoft.com/office/drawing/2017/model3d" xmlns:o="urn:schemas-microsoft-com:office:office" xmlns:r="http://schemas.openxmlformats.org/officeDocument/2006/relationships" xmlns:m="http://schemas.openxmlformats.org/officeDocument/2006/math" xmlns:v="urn:schemas-microsoft-com:vml" xmlns:wp14="http://schemas.microsoft.com/office/word/2010/wordprocessingDrawing" xmlns:wp="http://schemas.openxmlformats.org/drawingml/2006/wordprocessingDrawing" xmlns:w10="urn:schemas-microsoft-com:office:word" xmlns:w="http://schemas.openxmlformats.org/wordprocessingml/2006/main" xmlns:w14="http://schemas.microsoft.com/office/word/2010/wordml" xmlns:w15="http://schemas.microsoft.com/office/word/2012/wordml" xmlns:w16cex="http://schemas.microsoft.com/office/word/2018/wordml/cex" xmlns:w16cid="http://schemas.microsoft.com/office/word/2016/wordml/cid" xmlns:w16="http://schemas.microsoft.com/office/word/2018/wordml" xmlns:w16se="http://schemas.microsoft.com/office/word/2015/wordml/symex" xmlns:wpg="http://schemas.microsoft.com/office/word/2010/wordprocessingGroup" xmlns:wpi="http://schemas.microsoft.com/office/word/2010/wordprocessingInk" xmlns:wne="http://schemas.microsoft.com/office/word/2006/wordml" xmlns:wps="http://schemas.microsoft.com/office/word/2010/wordprocessingShape" mc:Ignorable="w14 w15 w16se w16cid w16 w16cex wp14">
+<w:footnotes xmlns:wpc="http://schemas.microsoft.com/office/word/2010/wordprocessingCanvas" xmlns:cx="http://schemas.microsoft.com/office/drawing/2014/chartex" xmlns:cx1="http://schemas.microsoft.com/office/drawing/2015/9/8/chartex" xmlns:cx2="http://schemas.microsoft.com/office/drawing/2015/10/21/chartex" xmlns:cx3="http://schemas.microsoft.com/office/drawing/2016/5/9/chartex" xmlns:cx4="http://schemas.microsoft.com/office/drawing/2016/5/10/chartex" xmlns:cx5="http://schemas.microsoft.com/office/drawing/2016/5/11/chartex" xmlns:cx6="http://schemas.microsoft.com/office/drawing/2016/5/12/chartex" xmlns:cx7="http://schemas.microsoft.com/office/drawing/2016/5/13/chartex" xmlns:cx8="http://schemas.microsoft.com/office/drawing/2016/5/14/chartex" xmlns:mc="http://schemas.openxmlformats.org/markup-compatibility/2006" xmlns:aink="http://schemas.microsoft.com/office/drawing/2016/ink" xmlns:am3d="http://schemas.microsoft.com/office/drawing/2017/model3d" xmlns:o="urn:schemas-microsoft-com:office:office" xmlns:oel="http://schemas.microsoft.com/office/2019/extlst" xmlns:r="http://schemas.openxmlformats.org/officeDocument/2006/relationships" xmlns:m="http://schemas.openxmlformats.org/officeDocument/2006/math" xmlns:v="urn:schemas-microsoft-com:vml" xmlns:wp14="http://schemas.microsoft.com/office/word/2010/wordprocessingDrawing" xmlns:wp="http://schemas.openxmlformats.org/drawingml/2006/wordprocessingDrawing" xmlns:w10="urn:schemas-microsoft-com:office:word" xmlns:w="http://schemas.openxmlformats.org/wordprocessingml/2006/main" xmlns:w14="http://schemas.microsoft.com/office/word/2010/wordml" xmlns:w15="http://schemas.microsoft.com/office/word/2012/wordml" xmlns:w16cex="http://schemas.microsoft.com/office/word/2018/wordml/cex" xmlns:w16cid="http://schemas.microsoft.com/office/word/2016/wordml/cid" xmlns:w16="http://schemas.microsoft.com/office/word/2018/wordml" xmlns:w16du="http://schemas.microsoft.com/office/word/2023/wordml/word16du" xmlns:w16sdtdh="http://schemas.microsoft.com/office/word/2020/wordml/sdtdatahash" xmlns:w16sdtfl="http://schemas.microsoft.com/office/word/2024/wordml/sdtformatlock" xmlns:w16se="http://schemas.microsoft.com/office/word/2015/wordml/symex" xmlns:wpg="http://schemas.microsoft.com/office/word/2010/wordprocessingGroup" xmlns:wpi="http://schemas.microsoft.com/office/word/2010/wordprocessingInk" xmlns:wne="http://schemas.microsoft.com/office/word/2006/wordml" xmlns:wps="http://schemas.microsoft.com/office/word/2010/wordprocessingShape" mc:Ignorable="w14 w15 w16se w16cid w16 w16cex w16sdtdh w16sdtfl w16du wp14">
   <w:footnote w:type="separator" w:id="-1">
     <w:p>
       <w:pPr>
@@ -4064,7 +4938,7 @@
 </file>
 
 <file path=word/numbering.xml><?xml version="1.0" encoding="utf-8"?>
-<w:numbering xmlns:wpc="http://schemas.microsoft.com/office/word/2010/wordprocessingCanvas" xmlns:cx="http://schemas.microsoft.com/office/drawing/2014/chartex" xmlns:cx1="http://schemas.microsoft.com/office/drawing/2015/9/8/chartex" xmlns:cx2="http://schemas.microsoft.com/office/drawing/2015/10/21/chartex" xmlns:cx3="http://schemas.microsoft.com/office/drawing/2016/5/9/chartex" xmlns:cx4="http://schemas.microsoft.com/office/drawing/2016/5/10/chartex" xmlns:cx5="http://schemas.microsoft.com/office/drawing/2016/5/11/chartex" xmlns:cx6="http://schemas.microsoft.com/office/drawing/2016/5/12/chartex" xmlns:cx7="http://schemas.microsoft.com/office/drawing/2016/5/13/chartex" xmlns:cx8="http://schemas.microsoft.com/office/drawing/2016/5/14/chartex" xmlns:mc="http://schemas.openxmlformats.org/markup-compatibility/2006" xmlns:aink="http://schemas.microsoft.com/office/drawing/2016/ink" xmlns:am3d="http://schemas.microsoft.com/office/drawing/2017/model3d" xmlns:o="urn:schemas-microsoft-com:office:office" xmlns:r="http://schemas.openxmlformats.org/officeDocument/2006/relationships" xmlns:m="http://schemas.openxmlformats.org/officeDocument/2006/math" xmlns:v="urn:schemas-microsoft-com:vml" xmlns:wp14="http://schemas.microsoft.com/office/word/2010/wordprocessingDrawing" xmlns:wp="http://schemas.openxmlformats.org/drawingml/2006/wordprocessingDrawing" xmlns:w10="urn:schemas-microsoft-com:office:word" xmlns:w="http://schemas.openxmlformats.org/wordprocessingml/2006/main" xmlns:w14="http://schemas.microsoft.com/office/word/2010/wordml" xmlns:w15="http://schemas.microsoft.com/office/word/2012/wordml" xmlns:w16cex="http://schemas.microsoft.com/office/word/2018/wordml/cex" xmlns:w16cid="http://schemas.microsoft.com/office/word/2016/wordml/cid" xmlns:w16="http://schemas.microsoft.com/office/word/2018/wordml" xmlns:w16se="http://schemas.microsoft.com/office/word/2015/wordml/symex" xmlns:wpg="http://schemas.microsoft.com/office/word/2010/wordprocessingGroup" xmlns:wpi="http://schemas.microsoft.com/office/word/2010/wordprocessingInk" xmlns:wne="http://schemas.microsoft.com/office/word/2006/wordml" xmlns:wps="http://schemas.microsoft.com/office/word/2010/wordprocessingShape" mc:Ignorable="w14 w15 w16se w16cid w16 w16cex wp14">
+<w:numbering xmlns:wpc="http://schemas.microsoft.com/office/word/2010/wordprocessingCanvas" xmlns:cx="http://schemas.microsoft.com/office/drawing/2014/chartex" xmlns:cx1="http://schemas.microsoft.com/office/drawing/2015/9/8/chartex" xmlns:cx2="http://schemas.microsoft.com/office/drawing/2015/10/21/chartex" xmlns:cx3="http://schemas.microsoft.com/office/drawing/2016/5/9/chartex" xmlns:cx4="http://schemas.microsoft.com/office/drawing/2016/5/10/chartex" xmlns:cx5="http://schemas.microsoft.com/office/drawing/2016/5/11/chartex" xmlns:cx6="http://schemas.microsoft.com/office/drawing/2016/5/12/chartex" xmlns:cx7="http://schemas.microsoft.com/office/drawing/2016/5/13/chartex" xmlns:cx8="http://schemas.microsoft.com/office/drawing/2016/5/14/chartex" xmlns:mc="http://schemas.openxmlformats.org/markup-compatibility/2006" xmlns:aink="http://schemas.microsoft.com/office/drawing/2016/ink" xmlns:am3d="http://schemas.microsoft.com/office/drawing/2017/model3d" xmlns:o="urn:schemas-microsoft-com:office:office" xmlns:oel="http://schemas.microsoft.com/office/2019/extlst" xmlns:r="http://schemas.openxmlformats.org/officeDocument/2006/relationships" xmlns:m="http://schemas.openxmlformats.org/officeDocument/2006/math" xmlns:v="urn:schemas-microsoft-com:vml" xmlns:wp14="http://schemas.microsoft.com/office/word/2010/wordprocessingDrawing" xmlns:wp="http://schemas.openxmlformats.org/drawingml/2006/wordprocessingDrawing" xmlns:w10="urn:schemas-microsoft-com:office:word" xmlns:w="http://schemas.openxmlformats.org/wordprocessingml/2006/main" xmlns:w14="http://schemas.microsoft.com/office/word/2010/wordml" xmlns:w15="http://schemas.microsoft.com/office/word/2012/wordml" xmlns:w16cex="http://schemas.microsoft.com/office/word/2018/wordml/cex" xmlns:w16cid="http://schemas.microsoft.com/office/word/2016/wordml/cid" xmlns:w16="http://schemas.microsoft.com/office/word/2018/wordml" xmlns:w16du="http://schemas.microsoft.com/office/word/2023/wordml/word16du" xmlns:w16sdtdh="http://schemas.microsoft.com/office/word/2020/wordml/sdtdatahash" xmlns:w16sdtfl="http://schemas.microsoft.com/office/word/2024/wordml/sdtformatlock" xmlns:w16se="http://schemas.microsoft.com/office/word/2015/wordml/symex" xmlns:wpg="http://schemas.microsoft.com/office/word/2010/wordprocessingGroup" xmlns:wpi="http://schemas.microsoft.com/office/word/2010/wordprocessingInk" xmlns:wne="http://schemas.microsoft.com/office/word/2006/wordml" xmlns:wps="http://schemas.microsoft.com/office/word/2010/wordprocessingShape" mc:Ignorable="w14 w15 w16se w16cid w16 w16cex w16sdtdh w16sdtfl w16du wp14">
   <w:abstractNum w:abstractNumId="0" w15:restartNumberingAfterBreak="0">
     <w:nsid w:val="01344BC1"/>
     <w:multiLevelType w:val="hybridMultilevel"/>
@@ -7064,106 +7938,106 @@
       </w:pPr>
     </w:lvl>
   </w:abstractNum>
-  <w:num w:numId="1">
+  <w:num w:numId="1" w16cid:durableId="1475944865">
     <w:abstractNumId w:val="31"/>
   </w:num>
-  <w:num w:numId="2">
+  <w:num w:numId="2" w16cid:durableId="1862862898">
     <w:abstractNumId w:val="25"/>
   </w:num>
-  <w:num w:numId="3">
+  <w:num w:numId="3" w16cid:durableId="1816800026">
     <w:abstractNumId w:val="10"/>
   </w:num>
-  <w:num w:numId="4">
+  <w:num w:numId="4" w16cid:durableId="388959196">
     <w:abstractNumId w:val="9"/>
   </w:num>
-  <w:num w:numId="5">
+  <w:num w:numId="5" w16cid:durableId="1939218475">
     <w:abstractNumId w:val="22"/>
   </w:num>
-  <w:num w:numId="6">
+  <w:num w:numId="6" w16cid:durableId="149104923">
     <w:abstractNumId w:val="2"/>
   </w:num>
-  <w:num w:numId="7">
+  <w:num w:numId="7" w16cid:durableId="595333027">
     <w:abstractNumId w:val="32"/>
   </w:num>
-  <w:num w:numId="8">
+  <w:num w:numId="8" w16cid:durableId="635306295">
     <w:abstractNumId w:val="7"/>
   </w:num>
-  <w:num w:numId="9">
+  <w:num w:numId="9" w16cid:durableId="578902091">
     <w:abstractNumId w:val="0"/>
   </w:num>
-  <w:num w:numId="10">
+  <w:num w:numId="10" w16cid:durableId="222177415">
     <w:abstractNumId w:val="1"/>
   </w:num>
-  <w:num w:numId="11">
+  <w:num w:numId="11" w16cid:durableId="512109303">
     <w:abstractNumId w:val="14"/>
   </w:num>
-  <w:num w:numId="12">
+  <w:num w:numId="12" w16cid:durableId="934706120">
     <w:abstractNumId w:val="21"/>
   </w:num>
-  <w:num w:numId="13">
+  <w:num w:numId="13" w16cid:durableId="1788548723">
     <w:abstractNumId w:val="17"/>
   </w:num>
-  <w:num w:numId="14">
+  <w:num w:numId="14" w16cid:durableId="17246370">
     <w:abstractNumId w:val="30"/>
   </w:num>
-  <w:num w:numId="15">
+  <w:num w:numId="15" w16cid:durableId="906918303">
     <w:abstractNumId w:val="28"/>
   </w:num>
-  <w:num w:numId="16">
+  <w:num w:numId="16" w16cid:durableId="1761219340">
     <w:abstractNumId w:val="4"/>
   </w:num>
-  <w:num w:numId="17">
+  <w:num w:numId="17" w16cid:durableId="1912959411">
     <w:abstractNumId w:val="3"/>
   </w:num>
-  <w:num w:numId="18">
+  <w:num w:numId="18" w16cid:durableId="140076294">
     <w:abstractNumId w:val="26"/>
   </w:num>
-  <w:num w:numId="19">
+  <w:num w:numId="19" w16cid:durableId="709184447">
     <w:abstractNumId w:val="19"/>
   </w:num>
-  <w:num w:numId="20">
+  <w:num w:numId="20" w16cid:durableId="556009648">
     <w:abstractNumId w:val="15"/>
   </w:num>
-  <w:num w:numId="21">
+  <w:num w:numId="21" w16cid:durableId="191194501">
     <w:abstractNumId w:val="5"/>
   </w:num>
-  <w:num w:numId="22">
+  <w:num w:numId="22" w16cid:durableId="1729761217">
     <w:abstractNumId w:val="6"/>
   </w:num>
-  <w:num w:numId="23">
+  <w:num w:numId="23" w16cid:durableId="304511698">
     <w:abstractNumId w:val="20"/>
   </w:num>
-  <w:num w:numId="24">
+  <w:num w:numId="24" w16cid:durableId="1088624440">
     <w:abstractNumId w:val="13"/>
   </w:num>
-  <w:num w:numId="25">
+  <w:num w:numId="25" w16cid:durableId="364796174">
     <w:abstractNumId w:val="18"/>
   </w:num>
-  <w:num w:numId="26">
+  <w:num w:numId="26" w16cid:durableId="807165008">
     <w:abstractNumId w:val="11"/>
   </w:num>
-  <w:num w:numId="27">
+  <w:num w:numId="27" w16cid:durableId="336155546">
     <w:abstractNumId w:val="27"/>
   </w:num>
-  <w:num w:numId="28">
+  <w:num w:numId="28" w16cid:durableId="666252769">
     <w:abstractNumId w:val="23"/>
   </w:num>
-  <w:num w:numId="29">
+  <w:num w:numId="29" w16cid:durableId="986855401">
     <w:abstractNumId w:val="16"/>
   </w:num>
-  <w:num w:numId="30">
+  <w:num w:numId="30" w16cid:durableId="1623266095">
     <w:abstractNumId w:val="24"/>
   </w:num>
-  <w:num w:numId="31">
+  <w:num w:numId="31" w16cid:durableId="321469419">
     <w:abstractNumId w:val="33"/>
   </w:num>
-  <w:num w:numId="32">
+  <w:num w:numId="32" w16cid:durableId="1577129695">
     <w:abstractNumId w:val="12"/>
   </w:num>
-  <w:num w:numId="33">
+  <w:num w:numId="33" w16cid:durableId="1970813840">
     <w:abstractNumId w:val="8"/>
   </w:num>
-  <w:num w:numId="34">
+  <w:num w:numId="34" w16cid:durableId="1736735104">
     <w:abstractNumId w:val="29"/>
   </w:num>
   <w:numIdMacAtCleanup w:val="2"/>
@@ -7171,7 +8045,7 @@
 </file>
 
 <file path=word/styles.xml><?xml version="1.0" encoding="utf-8"?>
-<w:styles xmlns:mc="http://schemas.openxmlformats.org/markup-compatibility/2006" xmlns:r="http://schemas.openxmlformats.org/officeDocument/2006/relationships" xmlns:w="http://schemas.openxmlformats.org/wordprocessingml/2006/main" xmlns:w14="http://schemas.microsoft.com/office/word/2010/wordml" xmlns:w15="http://schemas.microsoft.com/office/word/2012/wordml" xmlns:w16cex="http://schemas.microsoft.com/office/word/2018/wordml/cex" xmlns:w16cid="http://schemas.microsoft.com/office/word/2016/wordml/cid" xmlns:w16="http://schemas.microsoft.com/office/word/2018/wordml" xmlns:w16se="http://schemas.microsoft.com/office/word/2015/wordml/symex" mc:Ignorable="w14 w15 w16se w16cid w16 w16cex">
+<w:styles xmlns:mc="http://schemas.openxmlformats.org/markup-compatibility/2006" xmlns:r="http://schemas.openxmlformats.org/officeDocument/2006/relationships" xmlns:w="http://schemas.openxmlformats.org/wordprocessingml/2006/main" xmlns:w14="http://schemas.microsoft.com/office/word/2010/wordml" xmlns:w15="http://schemas.microsoft.com/office/word/2012/wordml" xmlns:w16cex="http://schemas.microsoft.com/office/word/2018/wordml/cex" xmlns:w16cid="http://schemas.microsoft.com/office/word/2016/wordml/cid" xmlns:w16="http://schemas.microsoft.com/office/word/2018/wordml" xmlns:w16du="http://schemas.microsoft.com/office/word/2023/wordml/word16du" xmlns:w16sdtdh="http://schemas.microsoft.com/office/word/2020/wordml/sdtdatahash" xmlns:w16sdtfl="http://schemas.microsoft.com/office/word/2024/wordml/sdtformatlock" xmlns:w16se="http://schemas.microsoft.com/office/word/2015/wordml/symex" mc:Ignorable="w14 w15 w16se w16cid w16 w16cex w16sdtdh w16sdtfl w16du">
   <w:docDefaults>
     <w:rPrDefault>
       <w:rPr>

</xml_diff>

<commit_message>
perbaikan pada paragraf analisa bab 1 supaya tidak dipaksa justify berhasil
</commit_message>
<xml_diff>
--- a/kuliah/DocumentGenerator_Laporan_Praktikum/src/templates/format-1.docx
+++ b/kuliah/DocumentGenerator_Laporan_Praktikum/src/templates/format-1.docx
@@ -30,7 +30,6 @@
           <w:lang w:val="en-US"/>
         </w:rPr>
       </w:pPr>
-      <w:proofErr w:type="gramStart"/>
       <w:r>
         <w:rPr>
           <w:b/>
@@ -48,9 +47,9 @@
           <w:szCs w:val="28"/>
           <w:lang w:val="en-US"/>
         </w:rPr>
-        <w:t>mata</w:t>
-      </w:r>
-      <w:proofErr w:type="gramEnd"/>
+        <w:t>mata_kuliah</w:t>
+      </w:r>
+      <w:proofErr w:type="spellEnd"/>
       <w:r>
         <w:rPr>
           <w:b/>
@@ -58,29 +57,43 @@
           <w:szCs w:val="28"/>
           <w:lang w:val="en-US"/>
         </w:rPr>
-        <w:t>_</w:t>
-      </w:r>
-      <w:proofErr w:type="gramStart"/>
-      <w:r>
+        <w:t xml:space="preserve"> }}</w:t>
+      </w:r>
+    </w:p>
+    <w:p>
+      <w:pPr>
+        <w:jc w:val="center"/>
+        <w:rPr>
+          <w:b/>
+        </w:rPr>
+      </w:pPr>
+    </w:p>
+    <w:p>
+      <w:pPr>
+        <w:jc w:val="center"/>
+        <w:rPr>
+          <w:b/>
+        </w:rPr>
+      </w:pPr>
+    </w:p>
+    <w:p>
+      <w:pPr>
+        <w:jc w:val="center"/>
         <w:rPr>
           <w:b/>
           <w:sz w:val="28"/>
           <w:szCs w:val="28"/>
           <w:lang w:val="en-US"/>
         </w:rPr>
-        <w:t>kuliah</w:t>
-      </w:r>
-      <w:proofErr w:type="spellEnd"/>
+      </w:pPr>
       <w:r>
         <w:rPr>
           <w:b/>
           <w:sz w:val="28"/>
           <w:szCs w:val="28"/>
-          <w:lang w:val="en-US"/>
-        </w:rPr>
-        <w:t xml:space="preserve"> }</w:t>
-      </w:r>
-      <w:proofErr w:type="gramEnd"/>
+        </w:rPr>
+        <w:t>MODUL</w:t>
+      </w:r>
       <w:r>
         <w:rPr>
           <w:b/>
@@ -88,43 +101,28 @@
           <w:szCs w:val="28"/>
           <w:lang w:val="en-US"/>
         </w:rPr>
-        <w:t>}</w:t>
-      </w:r>
-    </w:p>
-    <w:p>
-      <w:pPr>
-        <w:jc w:val="center"/>
-        <w:rPr>
-          <w:b/>
-        </w:rPr>
-      </w:pPr>
-    </w:p>
-    <w:p>
-      <w:pPr>
-        <w:jc w:val="center"/>
-        <w:rPr>
-          <w:b/>
-        </w:rPr>
-      </w:pPr>
-    </w:p>
-    <w:p>
-      <w:pPr>
-        <w:jc w:val="center"/>
+        <w:t xml:space="preserve"> </w:t>
+      </w:r>
+      <w:r>
         <w:rPr>
           <w:b/>
           <w:sz w:val="28"/>
           <w:szCs w:val="28"/>
           <w:lang w:val="en-US"/>
         </w:rPr>
-      </w:pPr>
+        <w:t xml:space="preserve">{{ </w:t>
+      </w:r>
+      <w:proofErr w:type="spellStart"/>
       <w:r>
         <w:rPr>
           <w:b/>
           <w:sz w:val="28"/>
           <w:szCs w:val="28"/>
-        </w:rPr>
-        <w:t>MODUL</w:t>
-      </w:r>
+          <w:lang w:val="en-US"/>
+        </w:rPr>
+        <w:t>nomor_modul</w:t>
+      </w:r>
+      <w:proofErr w:type="spellEnd"/>
       <w:r>
         <w:rPr>
           <w:b/>
@@ -132,18 +130,19 @@
           <w:szCs w:val="28"/>
           <w:lang w:val="en-US"/>
         </w:rPr>
-        <w:t xml:space="preserve"> </w:t>
-      </w:r>
-      <w:r>
+        <w:t xml:space="preserve"> }}</w:t>
+      </w:r>
+    </w:p>
+    <w:p>
+      <w:pPr>
+        <w:jc w:val="center"/>
         <w:rPr>
           <w:b/>
           <w:sz w:val="28"/>
           <w:szCs w:val="28"/>
           <w:lang w:val="en-US"/>
         </w:rPr>
-        <w:t xml:space="preserve">{{ </w:t>
-      </w:r>
-      <w:proofErr w:type="spellStart"/>
+      </w:pPr>
       <w:r>
         <w:rPr>
           <w:b/>
@@ -151,9 +150,9 @@
           <w:szCs w:val="28"/>
           <w:lang w:val="en-US"/>
         </w:rPr>
-        <w:t>nomor_modul</w:t>
-      </w:r>
-      <w:proofErr w:type="spellEnd"/>
+        <w:t xml:space="preserve">{{ </w:t>
+      </w:r>
+      <w:proofErr w:type="spellStart"/>
       <w:r>
         <w:rPr>
           <w:b/>
@@ -161,49 +160,57 @@
           <w:szCs w:val="28"/>
           <w:lang w:val="en-US"/>
         </w:rPr>
-        <w:t xml:space="preserve"> }}</w:t>
-      </w:r>
-    </w:p>
-    <w:p>
-      <w:pPr>
-        <w:jc w:val="center"/>
+        <w:t>judul</w:t>
+      </w:r>
+      <w:proofErr w:type="spellEnd"/>
+      <w:r>
         <w:rPr>
           <w:b/>
           <w:sz w:val="28"/>
           <w:szCs w:val="28"/>
           <w:lang w:val="en-US"/>
         </w:rPr>
-      </w:pPr>
-      <w:proofErr w:type="gramStart"/>
-      <w:r>
+        <w:t xml:space="preserve"> }}</w:t>
+      </w:r>
+    </w:p>
+    <w:p>
+      <w:pPr>
+        <w:jc w:val="center"/>
+        <w:rPr>
+          <w:b/>
+        </w:rPr>
+      </w:pPr>
+    </w:p>
+    <w:p>
+      <w:pPr>
+        <w:jc w:val="center"/>
+        <w:rPr>
+          <w:b/>
+        </w:rPr>
+      </w:pPr>
+    </w:p>
+    <w:p>
+      <w:pPr>
+        <w:jc w:val="center"/>
+        <w:rPr>
+          <w:b/>
+        </w:rPr>
+      </w:pPr>
+    </w:p>
+    <w:p>
+      <w:pPr>
+        <w:jc w:val="center"/>
         <w:rPr>
           <w:b/>
           <w:sz w:val="28"/>
           <w:szCs w:val="28"/>
-          <w:lang w:val="en-US"/>
-        </w:rPr>
-        <w:t xml:space="preserve">{{ </w:t>
-      </w:r>
-      <w:proofErr w:type="spellStart"/>
+        </w:rPr>
+      </w:pPr>
       <w:r>
         <w:rPr>
           <w:b/>
-          <w:sz w:val="28"/>
-          <w:szCs w:val="28"/>
-          <w:lang w:val="en-US"/>
-        </w:rPr>
-        <w:t>judul</w:t>
-      </w:r>
-      <w:proofErr w:type="spellEnd"/>
-      <w:proofErr w:type="gramEnd"/>
-      <w:r>
-        <w:rPr>
-          <w:b/>
-          <w:sz w:val="28"/>
-          <w:szCs w:val="28"/>
-          <w:lang w:val="en-US"/>
-        </w:rPr>
-        <w:t xml:space="preserve"> }}</w:t>
+        </w:rPr>
+        <w:t>DISUSUN OLEH :</w:t>
       </w:r>
     </w:p>
     <w:p>
@@ -211,86 +218,28 @@
         <w:jc w:val="center"/>
         <w:rPr>
           <w:b/>
-        </w:rPr>
-      </w:pPr>
-    </w:p>
-    <w:p>
-      <w:pPr>
-        <w:jc w:val="center"/>
+          <w:lang w:val="en-US"/>
+        </w:rPr>
+      </w:pPr>
+      <w:r>
         <w:rPr>
           <w:b/>
-        </w:rPr>
-      </w:pPr>
-    </w:p>
-    <w:p>
-      <w:pPr>
-        <w:jc w:val="center"/>
+          <w:lang w:val="en-US"/>
+        </w:rPr>
+        <w:t>{{ nama }}</w:t>
+      </w:r>
+      <w:r>
         <w:rPr>
           <w:b/>
         </w:rPr>
-      </w:pPr>
-    </w:p>
-    <w:p>
-      <w:pPr>
-        <w:jc w:val="center"/>
+        <w:tab/>
+      </w:r>
+      <w:r>
         <w:rPr>
           <w:b/>
-          <w:sz w:val="28"/>
-          <w:szCs w:val="28"/>
-        </w:rPr>
-      </w:pPr>
-      <w:r>
-        <w:rPr>
-          <w:b/>
-        </w:rPr>
-        <w:t>DISUSUN OLEH :</w:t>
-      </w:r>
-    </w:p>
-    <w:p>
-      <w:pPr>
-        <w:jc w:val="center"/>
-        <w:rPr>
-          <w:b/>
-          <w:lang w:val="en-US"/>
-        </w:rPr>
-      </w:pPr>
-      <w:proofErr w:type="gramStart"/>
-      <w:r>
-        <w:rPr>
-          <w:b/>
-          <w:lang w:val="en-US"/>
-        </w:rPr>
-        <w:t>{{ nama</w:t>
-      </w:r>
-      <w:proofErr w:type="gramEnd"/>
-      <w:r>
-        <w:rPr>
-          <w:b/>
-          <w:lang w:val="en-US"/>
-        </w:rPr>
-        <w:t xml:space="preserve"> }}</w:t>
-      </w:r>
-      <w:r>
-        <w:rPr>
-          <w:b/>
-        </w:rPr>
-        <w:tab/>
-      </w:r>
-      <w:proofErr w:type="gramStart"/>
-      <w:r>
-        <w:rPr>
-          <w:b/>
-          <w:lang w:val="en-US"/>
-        </w:rPr>
-        <w:t>{{ nim</w:t>
-      </w:r>
-      <w:proofErr w:type="gramEnd"/>
-      <w:r>
-        <w:rPr>
-          <w:b/>
-          <w:lang w:val="en-US"/>
-        </w:rPr>
-        <w:t xml:space="preserve"> }}</w:t>
+          <w:lang w:val="en-US"/>
+        </w:rPr>
+        <w:t>{{ nim }}</w:t>
       </w:r>
     </w:p>
     <w:p>
@@ -3208,7 +3157,6 @@
           <w:numId w:val="0"/>
         </w:numPr>
       </w:pPr>
-      <w:proofErr w:type="gramStart"/>
       <w:r>
         <w:t>I</w:t>
       </w:r>
@@ -3217,47 +3165,19 @@
       </w:r>
       <w:proofErr w:type="spellStart"/>
       <w:r>
-        <w:t>loop</w:t>
-      </w:r>
-      <w:proofErr w:type="gramEnd"/>
-      <w:r>
-        <w:t>.</w:t>
-      </w:r>
-      <w:proofErr w:type="gramStart"/>
-      <w:r>
-        <w:t>index</w:t>
+        <w:t>loop.index</w:t>
       </w:r>
       <w:proofErr w:type="spellEnd"/>
       <w:r>
-        <w:t xml:space="preserve"> }</w:t>
-      </w:r>
-      <w:proofErr w:type="gramEnd"/>
-      <w:r>
-        <w:t xml:space="preserve">} </w:t>
-      </w:r>
-      <w:proofErr w:type="gramStart"/>
-      <w:r>
-        <w:t xml:space="preserve">{{ </w:t>
+        <w:t xml:space="preserve"> }} {{ </w:t>
       </w:r>
       <w:proofErr w:type="spellStart"/>
       <w:r>
-        <w:t>item</w:t>
-      </w:r>
-      <w:proofErr w:type="gramEnd"/>
-      <w:r>
-        <w:t>.judul_sub_</w:t>
-      </w:r>
-      <w:proofErr w:type="gramStart"/>
-      <w:r>
-        <w:t>bab</w:t>
+        <w:t>item.judul_sub_bab</w:t>
       </w:r>
       <w:proofErr w:type="spellEnd"/>
       <w:r>
-        <w:t xml:space="preserve"> }</w:t>
-      </w:r>
-      <w:proofErr w:type="gramEnd"/>
-      <w:r>
-        <w:t>}</w:t>
+        <w:t xml:space="preserve"> }}</w:t>
       </w:r>
     </w:p>
     <w:p>
@@ -3269,7 +3189,6 @@
         </w:numPr>
         <w:ind w:left="510" w:hanging="153"/>
       </w:pPr>
-      <w:proofErr w:type="gramStart"/>
       <w:r>
         <w:t>I</w:t>
       </w:r>
@@ -3277,58 +3196,30 @@
         <w:rPr>
           <w:lang w:val="id-ID"/>
         </w:rPr>
-        <w:t>.{{ loop</w:t>
-      </w:r>
-      <w:proofErr w:type="gramEnd"/>
+        <w:t>.{{ loop.index }}</w:t>
+      </w:r>
       <w:r>
         <w:rPr>
           <w:lang w:val="id-ID"/>
         </w:rPr>
         <w:t>.</w:t>
       </w:r>
-      <w:proofErr w:type="gramStart"/>
-      <w:r>
-        <w:rPr>
-          <w:lang w:val="id-ID"/>
-        </w:rPr>
-        <w:t>index }}</w:t>
-      </w:r>
-      <w:r>
-        <w:rPr>
-          <w:lang w:val="id-ID"/>
-        </w:rPr>
-        <w:t>.</w:t>
-      </w:r>
       <w:r>
         <w:t>A.</w:t>
       </w:r>
-      <w:proofErr w:type="gramEnd"/>
       <w:r>
         <w:t xml:space="preserve"> </w:t>
       </w:r>
-      <w:proofErr w:type="gramStart"/>
       <w:r>
         <w:t xml:space="preserve">{{ </w:t>
       </w:r>
       <w:proofErr w:type="spellStart"/>
       <w:r>
-        <w:t>item</w:t>
-      </w:r>
-      <w:proofErr w:type="gramEnd"/>
-      <w:r>
-        <w:t>.label_point_</w:t>
-      </w:r>
-      <w:proofErr w:type="gramStart"/>
-      <w:r>
-        <w:t>a</w:t>
+        <w:t>item.label_point_a</w:t>
       </w:r>
       <w:proofErr w:type="spellEnd"/>
       <w:r>
-        <w:t xml:space="preserve"> }</w:t>
-      </w:r>
-      <w:proofErr w:type="gramEnd"/>
-      <w:r>
-        <w:t>}</w:t>
+        <w:t xml:space="preserve"> }}</w:t>
       </w:r>
       <w:r>
         <w:t xml:space="preserve"> </w:t>
@@ -3356,7 +3247,6 @@
       <w:pPr>
         <w:pStyle w:val="Code"/>
       </w:pPr>
-      <w:proofErr w:type="gramStart"/>
       <w:r>
         <w:t xml:space="preserve">{{ </w:t>
       </w:r>
@@ -3365,7 +3255,6 @@
         <w:t>k.isi</w:t>
       </w:r>
       <w:proofErr w:type="spellEnd"/>
-      <w:proofErr w:type="gramEnd"/>
       <w:r>
         <w:t xml:space="preserve"> }}</w:t>
       </w:r>
@@ -3411,7 +3300,6 @@
         <w:spacing w:before="240"/>
         <w:ind w:left="510" w:hanging="153"/>
       </w:pPr>
-      <w:proofErr w:type="gramStart"/>
       <w:r>
         <w:t>I</w:t>
       </w:r>
@@ -3419,32 +3307,17 @@
         <w:rPr>
           <w:lang w:val="id-ID"/>
         </w:rPr>
-        <w:t>.{{ loop</w:t>
-      </w:r>
-      <w:proofErr w:type="gramEnd"/>
+        <w:t>.{{ loop.index }}</w:t>
+      </w:r>
       <w:r>
         <w:rPr>
           <w:lang w:val="id-ID"/>
         </w:rPr>
         <w:t>.</w:t>
       </w:r>
-      <w:proofErr w:type="gramStart"/>
-      <w:r>
-        <w:rPr>
-          <w:lang w:val="id-ID"/>
-        </w:rPr>
-        <w:t>index }}</w:t>
-      </w:r>
-      <w:r>
-        <w:rPr>
-          <w:lang w:val="id-ID"/>
-        </w:rPr>
-        <w:t>.</w:t>
-      </w:r>
       <w:r>
         <w:t>B.</w:t>
       </w:r>
-      <w:proofErr w:type="gramEnd"/>
       <w:r>
         <w:t xml:space="preserve"> </w:t>
       </w:r>
@@ -3488,19 +3361,11 @@
         <w:t xml:space="preserve"> in </w:t>
       </w:r>
       <w:proofErr w:type="spellStart"/>
-      <w:proofErr w:type="gramStart"/>
-      <w:r>
-        <w:rPr>
-          <w:lang w:val="en-US"/>
-        </w:rPr>
-        <w:t>item.list</w:t>
-      </w:r>
-      <w:proofErr w:type="gramEnd"/>
-      <w:r>
-        <w:rPr>
-          <w:lang w:val="en-US"/>
-        </w:rPr>
-        <w:t>_gambar</w:t>
+      <w:r>
+        <w:rPr>
+          <w:lang w:val="en-US"/>
+        </w:rPr>
+        <w:t>item.list_gambar</w:t>
       </w:r>
       <w:proofErr w:type="spellEnd"/>
       <w:r>
@@ -3515,7 +3380,6 @@
         </w:rPr>
         <w:t xml:space="preserve"> </w:t>
       </w:r>
-      <w:proofErr w:type="gramStart"/>
       <w:r>
         <w:rPr>
           <w:lang w:val="en-US"/>
@@ -3527,35 +3391,14 @@
         <w:rPr>
           <w:lang w:val="en-US"/>
         </w:rPr>
-        <w:t>gbr</w:t>
-      </w:r>
-      <w:proofErr w:type="gramEnd"/>
-      <w:r>
-        <w:rPr>
-          <w:lang w:val="en-US"/>
-        </w:rPr>
-        <w:t>.objek_</w:t>
-      </w:r>
-      <w:proofErr w:type="gramStart"/>
-      <w:r>
-        <w:rPr>
-          <w:lang w:val="en-US"/>
-        </w:rPr>
-        <w:t>gambar</w:t>
+        <w:t>gbr.objek_gambar</w:t>
       </w:r>
       <w:proofErr w:type="spellEnd"/>
       <w:r>
         <w:rPr>
           <w:lang w:val="en-US"/>
         </w:rPr>
-        <w:t xml:space="preserve"> }</w:t>
-      </w:r>
-      <w:proofErr w:type="gramEnd"/>
-      <w:r>
-        <w:rPr>
-          <w:lang w:val="en-US"/>
-        </w:rPr>
-        <w:t>}</w:t>
+        <w:t xml:space="preserve"> }}</w:t>
       </w:r>
     </w:p>
     <w:p>
@@ -3604,7 +3447,6 @@
         </w:numPr>
         <w:ind w:left="357"/>
       </w:pPr>
-      <w:proofErr w:type="gramStart"/>
       <w:r>
         <w:t>I</w:t>
       </w:r>
@@ -3612,32 +3454,17 @@
         <w:rPr>
           <w:lang w:val="id-ID"/>
         </w:rPr>
-        <w:t>.{{ loop</w:t>
-      </w:r>
-      <w:proofErr w:type="gramEnd"/>
+        <w:t>.{{ loop.index }}</w:t>
+      </w:r>
       <w:r>
         <w:rPr>
           <w:lang w:val="id-ID"/>
         </w:rPr>
         <w:t>.</w:t>
       </w:r>
-      <w:proofErr w:type="gramStart"/>
-      <w:r>
-        <w:rPr>
-          <w:lang w:val="id-ID"/>
-        </w:rPr>
-        <w:t>index }}</w:t>
-      </w:r>
-      <w:r>
-        <w:rPr>
-          <w:lang w:val="id-ID"/>
-        </w:rPr>
-        <w:t>.</w:t>
-      </w:r>
       <w:r>
         <w:t>C.</w:t>
       </w:r>
-      <w:proofErr w:type="gramEnd"/>
       <w:r>
         <w:t xml:space="preserve"> </w:t>
       </w:r>
@@ -3653,7 +3480,80 @@
         </w:rPr>
       </w:pPr>
       <w:r>
-        <w:t>{{ item.isi_analisa }}</w:t>
+        <w:rPr>
+          <w:lang w:val="en-US"/>
+        </w:rPr>
+        <w:t xml:space="preserve">{% for p in </w:t>
+      </w:r>
+      <w:proofErr w:type="spellStart"/>
+      <w:r>
+        <w:rPr>
+          <w:lang w:val="en-US"/>
+        </w:rPr>
+        <w:t>item.list_paragraf_analisa</w:t>
+      </w:r>
+      <w:proofErr w:type="spellEnd"/>
+      <w:r>
+        <w:rPr>
+          <w:lang w:val="en-US"/>
+        </w:rPr>
+        <w:t xml:space="preserve"> %}</w:t>
+      </w:r>
+    </w:p>
+    <w:p>
+      <w:pPr>
+        <w:ind w:left="1021"/>
+        <w:rPr>
+          <w:lang w:val="en-US"/>
+        </w:rPr>
+      </w:pPr>
+      <w:r>
+        <w:rPr>
+          <w:lang w:val="en-US"/>
+        </w:rPr>
+        <w:t xml:space="preserve">{{ </w:t>
+      </w:r>
+      <w:proofErr w:type="spellStart"/>
+      <w:r>
+        <w:rPr>
+          <w:lang w:val="en-US"/>
+        </w:rPr>
+        <w:t>p.teks</w:t>
+      </w:r>
+      <w:proofErr w:type="spellEnd"/>
+      <w:r>
+        <w:rPr>
+          <w:lang w:val="en-US"/>
+        </w:rPr>
+        <w:t xml:space="preserve"> }}</w:t>
+      </w:r>
+    </w:p>
+    <w:p>
+      <w:pPr>
+        <w:ind w:left="1021"/>
+        <w:rPr>
+          <w:lang w:val="en-US"/>
+        </w:rPr>
+      </w:pPr>
+      <w:r>
+        <w:rPr>
+          <w:lang w:val="en-US"/>
+        </w:rPr>
+        <w:t xml:space="preserve">{% </w:t>
+      </w:r>
+      <w:proofErr w:type="spellStart"/>
+      <w:r>
+        <w:rPr>
+          <w:lang w:val="en-US"/>
+        </w:rPr>
+        <w:t>endfor</w:t>
+      </w:r>
+      <w:proofErr w:type="spellEnd"/>
+      <w:r>
+        <w:rPr>
+          <w:lang w:val="en-US"/>
+        </w:rPr>
+        <w:t xml:space="preserve"> %}</w:t>
       </w:r>
       <w:r>
         <w:rPr>
@@ -3766,34 +3666,18 @@
         <w:t xml:space="preserve"> </w:t>
       </w:r>
       <w:r>
-        <w:t>ke</w:t>
-      </w:r>
-      <w:proofErr w:type="gramStart"/>
-      <w:r>
-        <w:t>-</w:t>
+        <w:t>ke-</w:t>
       </w:r>
       <w:r>
         <w:t xml:space="preserve">{{ </w:t>
       </w:r>
       <w:proofErr w:type="spellStart"/>
       <w:r>
-        <w:t>nomor</w:t>
-      </w:r>
-      <w:proofErr w:type="gramEnd"/>
-      <w:r>
-        <w:t>_</w:t>
-      </w:r>
-      <w:proofErr w:type="gramStart"/>
-      <w:r>
-        <w:t>modul</w:t>
+        <w:t>nomor_modul</w:t>
       </w:r>
       <w:proofErr w:type="spellEnd"/>
       <w:r>
-        <w:t xml:space="preserve"> }</w:t>
-      </w:r>
-      <w:proofErr w:type="gramEnd"/>
-      <w:r>
-        <w:t xml:space="preserve">} ini </w:t>
+        <w:t xml:space="preserve"> }} ini </w:t>
       </w:r>
       <w:proofErr w:type="spellStart"/>
       <w:r>
@@ -3834,33 +3718,15 @@
           <w:szCs w:val="34"/>
           <w:lang w:val="en-US"/>
         </w:rPr>
-        <w:t xml:space="preserve">{% else </w:t>
-      </w:r>
-      <w:proofErr w:type="gramStart"/>
+        <w:t>{% else %}</w:t>
+      </w:r>
       <w:r>
         <w:rPr>
           <w:sz w:val="34"/>
           <w:szCs w:val="34"/>
           <w:lang w:val="en-US"/>
         </w:rPr>
-        <w:t>%}</w:t>
-      </w:r>
-      <w:r>
-        <w:rPr>
-          <w:sz w:val="34"/>
-          <w:szCs w:val="34"/>
-          <w:lang w:val="en-US"/>
-        </w:rPr>
-        <w:t>{</w:t>
-      </w:r>
-      <w:proofErr w:type="gramEnd"/>
-      <w:r>
-        <w:rPr>
-          <w:sz w:val="34"/>
-          <w:szCs w:val="34"/>
-          <w:lang w:val="en-US"/>
-        </w:rPr>
-        <w:t xml:space="preserve">% for item in </w:t>
+        <w:t xml:space="preserve">{% for item in </w:t>
       </w:r>
       <w:proofErr w:type="spellStart"/>
       <w:r>
@@ -3897,7 +3763,6 @@
           <w:numId w:val="0"/>
         </w:numPr>
       </w:pPr>
-      <w:proofErr w:type="gramStart"/>
       <w:r>
         <w:t>II</w:t>
       </w:r>
@@ -3906,47 +3771,19 @@
       </w:r>
       <w:proofErr w:type="spellStart"/>
       <w:r>
-        <w:t>loop</w:t>
-      </w:r>
-      <w:proofErr w:type="gramEnd"/>
-      <w:r>
-        <w:t>.</w:t>
-      </w:r>
-      <w:proofErr w:type="gramStart"/>
-      <w:r>
-        <w:t>index</w:t>
+        <w:t>loop.index</w:t>
       </w:r>
       <w:proofErr w:type="spellEnd"/>
       <w:r>
-        <w:t xml:space="preserve"> }</w:t>
-      </w:r>
-      <w:proofErr w:type="gramEnd"/>
-      <w:r>
-        <w:t xml:space="preserve">} </w:t>
-      </w:r>
-      <w:proofErr w:type="gramStart"/>
-      <w:r>
-        <w:t xml:space="preserve">{{ </w:t>
+        <w:t xml:space="preserve"> }} {{ </w:t>
       </w:r>
       <w:proofErr w:type="spellStart"/>
       <w:r>
-        <w:t>item</w:t>
-      </w:r>
-      <w:proofErr w:type="gramEnd"/>
-      <w:r>
-        <w:t>.judul_sub_</w:t>
-      </w:r>
-      <w:proofErr w:type="gramStart"/>
-      <w:r>
-        <w:t>bab</w:t>
+        <w:t>item.judul_sub_bab</w:t>
       </w:r>
       <w:proofErr w:type="spellEnd"/>
       <w:r>
-        <w:t xml:space="preserve"> }</w:t>
-      </w:r>
-      <w:proofErr w:type="gramEnd"/>
-      <w:r>
-        <w:t>}</w:t>
+        <w:t xml:space="preserve"> }}</w:t>
       </w:r>
     </w:p>
     <w:p>
@@ -3963,7 +3800,6 @@
         <w:t xml:space="preserve">{% if </w:t>
       </w:r>
       <w:proofErr w:type="spellStart"/>
-      <w:proofErr w:type="gramStart"/>
       <w:r>
         <w:rPr>
           <w:lang w:val="en-US"/>
@@ -3971,32 +3807,17 @@
         <w:t>item.tipe</w:t>
       </w:r>
       <w:proofErr w:type="spellEnd"/>
-      <w:proofErr w:type="gramEnd"/>
-      <w:r>
-        <w:rPr>
-          <w:lang w:val="en-US"/>
-        </w:rPr>
-        <w:t xml:space="preserve"> == “3” </w:t>
-      </w:r>
-      <w:proofErr w:type="gramStart"/>
-      <w:r>
-        <w:rPr>
-          <w:lang w:val="en-US"/>
-        </w:rPr>
-        <w:t>%}</w:t>
-      </w:r>
-      <w:r>
-        <w:rPr>
-          <w:lang w:val="en-US"/>
-        </w:rPr>
-        <w:t>{</w:t>
-      </w:r>
-      <w:proofErr w:type="gramEnd"/>
-      <w:r>
-        <w:rPr>
-          <w:lang w:val="en-US"/>
-        </w:rPr>
-        <w:t xml:space="preserve">% for </w:t>
+      <w:r>
+        <w:rPr>
+          <w:lang w:val="en-US"/>
+        </w:rPr>
+        <w:t xml:space="preserve"> == “3” %}</w:t>
+      </w:r>
+      <w:r>
+        <w:rPr>
+          <w:lang w:val="en-US"/>
+        </w:rPr>
+        <w:t xml:space="preserve">{% for </w:t>
       </w:r>
       <w:proofErr w:type="spellStart"/>
       <w:r>
@@ -4058,7 +3879,6 @@
                 <w:lang w:val="en-US"/>
               </w:rPr>
             </w:pPr>
-            <w:proofErr w:type="gramStart"/>
             <w:r>
               <w:rPr>
                 <w:lang w:val="en-US"/>
@@ -4072,30 +3892,22 @@
                 <w:szCs w:val="2"/>
                 <w:lang w:val="en-US"/>
               </w:rPr>
-              <w:t>loop</w:t>
-            </w:r>
-            <w:proofErr w:type="gramEnd"/>
+              <w:t>loop.index</w:t>
+            </w:r>
+            <w:proofErr w:type="spellEnd"/>
             <w:r>
               <w:rPr>
                 <w:sz w:val="2"/>
                 <w:szCs w:val="2"/>
                 <w:lang w:val="en-US"/>
               </w:rPr>
-              <w:t>.index</w:t>
-            </w:r>
-            <w:proofErr w:type="spellEnd"/>
-            <w:r>
-              <w:rPr>
-                <w:sz w:val="2"/>
-                <w:szCs w:val="2"/>
+              <w:t xml:space="preserve"> </w:t>
+            </w:r>
+            <w:r>
+              <w:rPr>
                 <w:lang w:val="en-US"/>
               </w:rPr>
-              <w:t xml:space="preserve"> </w:t>
-            </w:r>
-            <w:r>
-              <w:rPr>
-                <w:lang w:val="en-US"/>
-              </w:rPr>
+              <w:lastRenderedPageBreak/>
               <w:t>}}</w:t>
             </w:r>
           </w:p>
@@ -4110,11 +3922,11 @@
                 <w:lang w:val="en-US"/>
               </w:rPr>
             </w:pPr>
-            <w:proofErr w:type="gramStart"/>
             <w:r>
               <w:rPr>
                 <w:lang w:val="en-US"/>
               </w:rPr>
+              <w:lastRenderedPageBreak/>
               <w:t xml:space="preserve">{{ </w:t>
             </w:r>
             <w:proofErr w:type="spellStart"/>
@@ -4122,35 +3934,14 @@
               <w:rPr>
                 <w:lang w:val="en-US"/>
               </w:rPr>
-              <w:t>qa</w:t>
-            </w:r>
-            <w:proofErr w:type="gramEnd"/>
+              <w:t>qa.q</w:t>
+            </w:r>
+            <w:proofErr w:type="spellEnd"/>
             <w:r>
               <w:rPr>
                 <w:lang w:val="en-US"/>
               </w:rPr>
-              <w:t>.</w:t>
-            </w:r>
-            <w:proofErr w:type="gramStart"/>
-            <w:r>
-              <w:rPr>
-                <w:lang w:val="en-US"/>
-              </w:rPr>
-              <w:t>q</w:t>
-            </w:r>
-            <w:proofErr w:type="spellEnd"/>
-            <w:r>
-              <w:rPr>
-                <w:lang w:val="en-US"/>
-              </w:rPr>
-              <w:t xml:space="preserve"> }</w:t>
-            </w:r>
-            <w:proofErr w:type="gramEnd"/>
-            <w:r>
-              <w:rPr>
-                <w:lang w:val="en-US"/>
-              </w:rPr>
-              <w:t>}</w:t>
+              <w:t xml:space="preserve"> }}</w:t>
             </w:r>
           </w:p>
           <w:p>
@@ -4184,17 +3975,12 @@
             <w:pPr>
               <w:pStyle w:val="Text"/>
             </w:pPr>
-            <w:proofErr w:type="gramStart"/>
             <w:r>
               <w:t xml:space="preserve">{{ </w:t>
             </w:r>
             <w:proofErr w:type="spellStart"/>
             <w:r>
-              <w:t>qa</w:t>
-            </w:r>
-            <w:proofErr w:type="gramEnd"/>
-            <w:r>
-              <w:t>.a</w:t>
+              <w:t>qa.a</w:t>
             </w:r>
             <w:proofErr w:type="spellEnd"/>
             <w:r>
@@ -4229,27 +4015,13 @@
         <w:rPr>
           <w:lang w:val="en-US"/>
         </w:rPr>
-        <w:t xml:space="preserve"> </w:t>
-      </w:r>
-      <w:proofErr w:type="gramStart"/>
-      <w:r>
-        <w:rPr>
-          <w:lang w:val="en-US"/>
-        </w:rPr>
-        <w:t>%}</w:t>
-      </w:r>
-      <w:r>
-        <w:rPr>
-          <w:lang w:val="en-US"/>
-        </w:rPr>
-        <w:t>{</w:t>
-      </w:r>
-      <w:proofErr w:type="gramEnd"/>
-      <w:r>
-        <w:rPr>
-          <w:lang w:val="en-US"/>
-        </w:rPr>
-        <w:t>% else %}</w:t>
+        <w:t xml:space="preserve"> %}</w:t>
+      </w:r>
+      <w:r>
+        <w:rPr>
+          <w:lang w:val="en-US"/>
+        </w:rPr>
+        <w:t>{% else %}</w:t>
       </w:r>
     </w:p>
     <w:p>
@@ -4261,67 +4033,37 @@
         </w:numPr>
         <w:ind w:left="510" w:hanging="153"/>
       </w:pPr>
-      <w:proofErr w:type="gramStart"/>
-      <w:r>
-        <w:lastRenderedPageBreak/>
+      <w:r>
         <w:t>II</w:t>
       </w:r>
       <w:r>
         <w:rPr>
           <w:lang w:val="id-ID"/>
         </w:rPr>
-        <w:t>.{{ loop</w:t>
-      </w:r>
-      <w:proofErr w:type="gramEnd"/>
+        <w:t>.{{ loop.index }}</w:t>
+      </w:r>
       <w:r>
         <w:rPr>
           <w:lang w:val="id-ID"/>
         </w:rPr>
         <w:t>.</w:t>
       </w:r>
-      <w:proofErr w:type="gramStart"/>
-      <w:r>
-        <w:rPr>
-          <w:lang w:val="id-ID"/>
-        </w:rPr>
-        <w:t>index }}</w:t>
-      </w:r>
-      <w:r>
-        <w:rPr>
-          <w:lang w:val="id-ID"/>
-        </w:rPr>
-        <w:t>.</w:t>
-      </w:r>
       <w:r>
         <w:t>A.</w:t>
       </w:r>
-      <w:proofErr w:type="gramEnd"/>
       <w:r>
         <w:t xml:space="preserve"> </w:t>
       </w:r>
-      <w:proofErr w:type="gramStart"/>
       <w:r>
         <w:t xml:space="preserve">{{ </w:t>
       </w:r>
       <w:proofErr w:type="spellStart"/>
       <w:r>
-        <w:t>item</w:t>
-      </w:r>
-      <w:proofErr w:type="gramEnd"/>
-      <w:r>
-        <w:t>.label_point_</w:t>
-      </w:r>
-      <w:proofErr w:type="gramStart"/>
-      <w:r>
-        <w:t>a</w:t>
+        <w:t>item.label_point_a</w:t>
       </w:r>
       <w:proofErr w:type="spellEnd"/>
       <w:r>
-        <w:t xml:space="preserve"> }</w:t>
-      </w:r>
-      <w:proofErr w:type="gramEnd"/>
-      <w:r>
-        <w:t>}</w:t>
+        <w:t xml:space="preserve"> }}</w:t>
       </w:r>
       <w:r>
         <w:t xml:space="preserve"> </w:t>
@@ -4366,7 +4108,6 @@
       <w:pPr>
         <w:pStyle w:val="Code"/>
       </w:pPr>
-      <w:proofErr w:type="gramStart"/>
       <w:r>
         <w:t xml:space="preserve">{{ </w:t>
       </w:r>
@@ -4375,7 +4116,6 @@
         <w:t>k.isi</w:t>
       </w:r>
       <w:proofErr w:type="spellEnd"/>
-      <w:proofErr w:type="gramEnd"/>
       <w:r>
         <w:t xml:space="preserve"> }}</w:t>
       </w:r>
@@ -4456,7 +4196,6 @@
         <w:spacing w:before="240"/>
         <w:ind w:left="510" w:hanging="153"/>
       </w:pPr>
-      <w:proofErr w:type="gramStart"/>
       <w:r>
         <w:t>II</w:t>
       </w:r>
@@ -4464,34 +4203,16 @@
         <w:rPr>
           <w:lang w:val="id-ID"/>
         </w:rPr>
-        <w:t>.{{ loop</w:t>
-      </w:r>
-      <w:proofErr w:type="gramEnd"/>
+        <w:t>.{{ loop.index }}</w:t>
+      </w:r>
       <w:r>
         <w:rPr>
           <w:lang w:val="id-ID"/>
         </w:rPr>
         <w:t>.</w:t>
       </w:r>
-      <w:proofErr w:type="gramStart"/>
-      <w:r>
-        <w:rPr>
-          <w:lang w:val="id-ID"/>
-        </w:rPr>
-        <w:t>index }}</w:t>
-      </w:r>
-      <w:r>
-        <w:rPr>
-          <w:lang w:val="id-ID"/>
-        </w:rPr>
-        <w:t>.</w:t>
-      </w:r>
-      <w:r>
-        <w:t>B.</w:t>
-      </w:r>
-      <w:proofErr w:type="gramEnd"/>
-      <w:r>
-        <w:t xml:space="preserve"> </w:t>
+      <w:r>
+        <w:t xml:space="preserve">B. </w:t>
       </w:r>
       <w:proofErr w:type="spellStart"/>
       <w:r>
@@ -4533,19 +4254,11 @@
         <w:t xml:space="preserve"> in </w:t>
       </w:r>
       <w:proofErr w:type="spellStart"/>
-      <w:proofErr w:type="gramStart"/>
-      <w:r>
-        <w:rPr>
-          <w:lang w:val="en-US"/>
-        </w:rPr>
-        <w:t>item.list</w:t>
-      </w:r>
-      <w:proofErr w:type="gramEnd"/>
-      <w:r>
-        <w:rPr>
-          <w:lang w:val="en-US"/>
-        </w:rPr>
-        <w:t>_gambar</w:t>
+      <w:r>
+        <w:rPr>
+          <w:lang w:val="en-US"/>
+        </w:rPr>
+        <w:t>item.list_gambar</w:t>
       </w:r>
       <w:proofErr w:type="spellEnd"/>
       <w:r>
@@ -4560,7 +4273,6 @@
         </w:rPr>
         <w:t xml:space="preserve"> </w:t>
       </w:r>
-      <w:proofErr w:type="gramStart"/>
       <w:r>
         <w:rPr>
           <w:lang w:val="en-US"/>
@@ -4572,35 +4284,14 @@
         <w:rPr>
           <w:lang w:val="en-US"/>
         </w:rPr>
-        <w:t>gbr</w:t>
-      </w:r>
-      <w:proofErr w:type="gramEnd"/>
-      <w:r>
-        <w:rPr>
-          <w:lang w:val="en-US"/>
-        </w:rPr>
-        <w:t>.objek_</w:t>
-      </w:r>
-      <w:proofErr w:type="gramStart"/>
-      <w:r>
-        <w:rPr>
-          <w:lang w:val="en-US"/>
-        </w:rPr>
-        <w:t>gambar</w:t>
+        <w:t>gbr.objek_gambar</w:t>
       </w:r>
       <w:proofErr w:type="spellEnd"/>
       <w:r>
         <w:rPr>
           <w:lang w:val="en-US"/>
         </w:rPr>
-        <w:t xml:space="preserve"> }</w:t>
-      </w:r>
-      <w:proofErr w:type="gramEnd"/>
-      <w:r>
-        <w:rPr>
-          <w:lang w:val="en-US"/>
-        </w:rPr>
-        <w:t>}</w:t>
+        <w:t xml:space="preserve"> }}</w:t>
       </w:r>
     </w:p>
     <w:p>
@@ -4656,7 +4347,6 @@
         </w:numPr>
         <w:ind w:left="357"/>
       </w:pPr>
-      <w:proofErr w:type="gramStart"/>
       <w:r>
         <w:t>II</w:t>
       </w:r>
@@ -4664,34 +4354,16 @@
         <w:rPr>
           <w:lang w:val="id-ID"/>
         </w:rPr>
-        <w:t>.{{ loop</w:t>
-      </w:r>
-      <w:proofErr w:type="gramEnd"/>
+        <w:t>.{{ loop.index }}</w:t>
+      </w:r>
       <w:r>
         <w:rPr>
           <w:lang w:val="id-ID"/>
         </w:rPr>
         <w:t>.</w:t>
       </w:r>
-      <w:proofErr w:type="gramStart"/>
-      <w:r>
-        <w:rPr>
-          <w:lang w:val="id-ID"/>
-        </w:rPr>
-        <w:t>index }}</w:t>
-      </w:r>
-      <w:r>
-        <w:rPr>
-          <w:lang w:val="id-ID"/>
-        </w:rPr>
-        <w:t>.</w:t>
-      </w:r>
-      <w:r>
-        <w:t>C.</w:t>
-      </w:r>
-      <w:proofErr w:type="gramEnd"/>
-      <w:r>
-        <w:t xml:space="preserve"> </w:t>
+      <w:r>
+        <w:t xml:space="preserve">C. </w:t>
       </w:r>
       <w:r>
         <w:t>Analisa</w:t>

</xml_diff>

<commit_message>
merapihkan analisa di bab 2 supaya tidak dipaksa justify berhasil
</commit_message>
<xml_diff>
--- a/kuliah/DocumentGenerator_Laporan_Praktikum/src/templates/format-1.docx
+++ b/kuliah/DocumentGenerator_Laporan_Praktikum/src/templates/format-1.docx
@@ -4372,12 +4372,28 @@
     <w:p>
       <w:pPr>
         <w:ind w:left="1021"/>
-        <w:rPr>
-          <w:lang w:val="en-US"/>
-        </w:rPr>
-      </w:pPr>
-      <w:r>
-        <w:t>{{ item.isi_analisa }}</w:t>
+      </w:pPr>
+      <w:r>
+        <w:t>{% for p in item.list_paragraf_analisa_tugas %}</w:t>
+      </w:r>
+    </w:p>
+    <w:p>
+      <w:pPr>
+        <w:ind w:left="1021"/>
+      </w:pPr>
+      <w:r>
+        <w:t>{{ p.teks }}</w:t>
+      </w:r>
+    </w:p>
+    <w:p>
+      <w:pPr>
+        <w:ind w:left="1021"/>
+        <w:rPr>
+          <w:lang w:val="en-US"/>
+        </w:rPr>
+      </w:pPr>
+      <w:r>
+        <w:t>{% endfor %}</w:t>
       </w:r>
       <w:r>
         <w:rPr>

</xml_diff>

<commit_message>
merapihkan layout header bab 2
</commit_message>
<xml_diff>
--- a/kuliah/DocumentGenerator_Laporan_Praktikum/src/templates/format-1.docx
+++ b/kuliah/DocumentGenerator_Laporan_Praktikum/src/templates/format-1.docx
@@ -30,6 +30,7 @@
           <w:lang w:val="en-US"/>
         </w:rPr>
       </w:pPr>
+      <w:proofErr w:type="gramStart"/>
       <w:r>
         <w:rPr>
           <w:b/>
@@ -47,9 +48,9 @@
           <w:szCs w:val="28"/>
           <w:lang w:val="en-US"/>
         </w:rPr>
-        <w:t>mata_kuliah</w:t>
-      </w:r>
-      <w:proofErr w:type="spellEnd"/>
+        <w:t>mata</w:t>
+      </w:r>
+      <w:proofErr w:type="gramEnd"/>
       <w:r>
         <w:rPr>
           <w:b/>
@@ -57,43 +58,29 @@
           <w:szCs w:val="28"/>
           <w:lang w:val="en-US"/>
         </w:rPr>
-        <w:t xml:space="preserve"> }}</w:t>
-      </w:r>
-    </w:p>
-    <w:p>
-      <w:pPr>
-        <w:jc w:val="center"/>
-        <w:rPr>
-          <w:b/>
-        </w:rPr>
-      </w:pPr>
-    </w:p>
-    <w:p>
-      <w:pPr>
-        <w:jc w:val="center"/>
-        <w:rPr>
-          <w:b/>
-        </w:rPr>
-      </w:pPr>
-    </w:p>
-    <w:p>
-      <w:pPr>
-        <w:jc w:val="center"/>
+        <w:t>_</w:t>
+      </w:r>
+      <w:proofErr w:type="gramStart"/>
+      <w:r>
         <w:rPr>
           <w:b/>
           <w:sz w:val="28"/>
           <w:szCs w:val="28"/>
           <w:lang w:val="en-US"/>
         </w:rPr>
-      </w:pPr>
+        <w:t>kuliah</w:t>
+      </w:r>
+      <w:proofErr w:type="spellEnd"/>
       <w:r>
         <w:rPr>
           <w:b/>
           <w:sz w:val="28"/>
           <w:szCs w:val="28"/>
-        </w:rPr>
-        <w:t>MODUL</w:t>
-      </w:r>
+          <w:lang w:val="en-US"/>
+        </w:rPr>
+        <w:t xml:space="preserve"> }</w:t>
+      </w:r>
+      <w:proofErr w:type="gramEnd"/>
       <w:r>
         <w:rPr>
           <w:b/>
@@ -101,28 +88,43 @@
           <w:szCs w:val="28"/>
           <w:lang w:val="en-US"/>
         </w:rPr>
-        <w:t xml:space="preserve"> </w:t>
-      </w:r>
-      <w:r>
+        <w:t>}</w:t>
+      </w:r>
+    </w:p>
+    <w:p>
+      <w:pPr>
+        <w:jc w:val="center"/>
+        <w:rPr>
+          <w:b/>
+        </w:rPr>
+      </w:pPr>
+    </w:p>
+    <w:p>
+      <w:pPr>
+        <w:jc w:val="center"/>
+        <w:rPr>
+          <w:b/>
+        </w:rPr>
+      </w:pPr>
+    </w:p>
+    <w:p>
+      <w:pPr>
+        <w:jc w:val="center"/>
         <w:rPr>
           <w:b/>
           <w:sz w:val="28"/>
           <w:szCs w:val="28"/>
           <w:lang w:val="en-US"/>
         </w:rPr>
-        <w:t xml:space="preserve">{{ </w:t>
-      </w:r>
-      <w:proofErr w:type="spellStart"/>
+      </w:pPr>
       <w:r>
         <w:rPr>
           <w:b/>
           <w:sz w:val="28"/>
           <w:szCs w:val="28"/>
-          <w:lang w:val="en-US"/>
-        </w:rPr>
-        <w:t>nomor_modul</w:t>
-      </w:r>
-      <w:proofErr w:type="spellEnd"/>
+        </w:rPr>
+        <w:t>MODUL</w:t>
+      </w:r>
       <w:r>
         <w:rPr>
           <w:b/>
@@ -130,19 +132,18 @@
           <w:szCs w:val="28"/>
           <w:lang w:val="en-US"/>
         </w:rPr>
-        <w:t xml:space="preserve"> }}</w:t>
-      </w:r>
-    </w:p>
-    <w:p>
-      <w:pPr>
-        <w:jc w:val="center"/>
+        <w:t xml:space="preserve"> </w:t>
+      </w:r>
+      <w:r>
         <w:rPr>
           <w:b/>
           <w:sz w:val="28"/>
           <w:szCs w:val="28"/>
           <w:lang w:val="en-US"/>
         </w:rPr>
-      </w:pPr>
+        <w:t xml:space="preserve">{{ </w:t>
+      </w:r>
+      <w:proofErr w:type="spellStart"/>
       <w:r>
         <w:rPr>
           <w:b/>
@@ -150,9 +151,9 @@
           <w:szCs w:val="28"/>
           <w:lang w:val="en-US"/>
         </w:rPr>
-        <w:t xml:space="preserve">{{ </w:t>
-      </w:r>
-      <w:proofErr w:type="spellStart"/>
+        <w:t>nomor_modul</w:t>
+      </w:r>
+      <w:proofErr w:type="spellEnd"/>
       <w:r>
         <w:rPr>
           <w:b/>
@@ -160,57 +161,49 @@
           <w:szCs w:val="28"/>
           <w:lang w:val="en-US"/>
         </w:rPr>
-        <w:t>judul</w:t>
-      </w:r>
-      <w:proofErr w:type="spellEnd"/>
-      <w:r>
+        <w:t xml:space="preserve"> }}</w:t>
+      </w:r>
+    </w:p>
+    <w:p>
+      <w:pPr>
+        <w:jc w:val="center"/>
         <w:rPr>
           <w:b/>
           <w:sz w:val="28"/>
           <w:szCs w:val="28"/>
           <w:lang w:val="en-US"/>
         </w:rPr>
-        <w:t xml:space="preserve"> }}</w:t>
-      </w:r>
-    </w:p>
-    <w:p>
-      <w:pPr>
-        <w:jc w:val="center"/>
-        <w:rPr>
-          <w:b/>
-        </w:rPr>
-      </w:pPr>
-    </w:p>
-    <w:p>
-      <w:pPr>
-        <w:jc w:val="center"/>
-        <w:rPr>
-          <w:b/>
-        </w:rPr>
-      </w:pPr>
-    </w:p>
-    <w:p>
-      <w:pPr>
-        <w:jc w:val="center"/>
-        <w:rPr>
-          <w:b/>
-        </w:rPr>
-      </w:pPr>
-    </w:p>
-    <w:p>
-      <w:pPr>
-        <w:jc w:val="center"/>
+      </w:pPr>
+      <w:proofErr w:type="gramStart"/>
+      <w:r>
         <w:rPr>
           <w:b/>
           <w:sz w:val="28"/>
           <w:szCs w:val="28"/>
-        </w:rPr>
-      </w:pPr>
+          <w:lang w:val="en-US"/>
+        </w:rPr>
+        <w:t xml:space="preserve">{{ </w:t>
+      </w:r>
+      <w:proofErr w:type="spellStart"/>
       <w:r>
         <w:rPr>
           <w:b/>
-        </w:rPr>
-        <w:t>DISUSUN OLEH :</w:t>
+          <w:sz w:val="28"/>
+          <w:szCs w:val="28"/>
+          <w:lang w:val="en-US"/>
+        </w:rPr>
+        <w:t>judul</w:t>
+      </w:r>
+      <w:proofErr w:type="spellEnd"/>
+      <w:proofErr w:type="gramEnd"/>
+      <w:r>
+        <w:rPr>
+          <w:b/>
+          <w:sz w:val="28"/>
+          <w:szCs w:val="28"/>
+          <w:lang w:val="en-US"/>
+        </w:rPr>
+        <w:t xml:space="preserve"> }}</w:t>
       </w:r>
     </w:p>
     <w:p>
@@ -218,28 +211,86 @@
         <w:jc w:val="center"/>
         <w:rPr>
           <w:b/>
-          <w:lang w:val="en-US"/>
-        </w:rPr>
-      </w:pPr>
-      <w:r>
+        </w:rPr>
+      </w:pPr>
+    </w:p>
+    <w:p>
+      <w:pPr>
+        <w:jc w:val="center"/>
         <w:rPr>
           <w:b/>
-          <w:lang w:val="en-US"/>
-        </w:rPr>
-        <w:t>{{ nama }}</w:t>
-      </w:r>
-      <w:r>
+        </w:rPr>
+      </w:pPr>
+    </w:p>
+    <w:p>
+      <w:pPr>
+        <w:jc w:val="center"/>
         <w:rPr>
           <w:b/>
         </w:rPr>
+      </w:pPr>
+    </w:p>
+    <w:p>
+      <w:pPr>
+        <w:jc w:val="center"/>
+        <w:rPr>
+          <w:b/>
+          <w:sz w:val="28"/>
+          <w:szCs w:val="28"/>
+        </w:rPr>
+      </w:pPr>
+      <w:r>
+        <w:rPr>
+          <w:b/>
+        </w:rPr>
+        <w:t>DISUSUN OLEH :</w:t>
+      </w:r>
+    </w:p>
+    <w:p>
+      <w:pPr>
+        <w:jc w:val="center"/>
+        <w:rPr>
+          <w:b/>
+          <w:lang w:val="en-US"/>
+        </w:rPr>
+      </w:pPr>
+      <w:proofErr w:type="gramStart"/>
+      <w:r>
+        <w:rPr>
+          <w:b/>
+          <w:lang w:val="en-US"/>
+        </w:rPr>
+        <w:t>{{ nama</w:t>
+      </w:r>
+      <w:proofErr w:type="gramEnd"/>
+      <w:r>
+        <w:rPr>
+          <w:b/>
+          <w:lang w:val="en-US"/>
+        </w:rPr>
+        <w:t xml:space="preserve"> }}</w:t>
+      </w:r>
+      <w:r>
+        <w:rPr>
+          <w:b/>
+        </w:rPr>
         <w:tab/>
       </w:r>
+      <w:proofErr w:type="gramStart"/>
       <w:r>
         <w:rPr>
           <w:b/>
           <w:lang w:val="en-US"/>
         </w:rPr>
-        <w:t>{{ nim }}</w:t>
+        <w:t>{{ nim</w:t>
+      </w:r>
+      <w:proofErr w:type="gramEnd"/>
+      <w:r>
+        <w:rPr>
+          <w:b/>
+          <w:lang w:val="en-US"/>
+        </w:rPr>
+        <w:t xml:space="preserve"> }}</w:t>
       </w:r>
     </w:p>
     <w:p>
@@ -3104,7 +3155,7 @@
     <w:p>
       <w:pPr>
         <w:pStyle w:val="Heading1"/>
-        <w:spacing w:before="0" w:after="340"/>
+        <w:spacing w:before="0" w:after="100"/>
         <w:ind w:left="1077" w:hanging="1077"/>
       </w:pPr>
       <w:bookmarkStart w:id="1" w:name="_Toc197688583"/>
@@ -3156,7 +3207,9 @@
           <w:ilvl w:val="0"/>
           <w:numId w:val="0"/>
         </w:numPr>
-      </w:pPr>
+        <w:spacing w:before="240"/>
+      </w:pPr>
+      <w:proofErr w:type="gramStart"/>
       <w:r>
         <w:t>I</w:t>
       </w:r>
@@ -3165,19 +3218,47 @@
       </w:r>
       <w:proofErr w:type="spellStart"/>
       <w:r>
-        <w:t>loop.index</w:t>
+        <w:t>loop</w:t>
+      </w:r>
+      <w:proofErr w:type="gramEnd"/>
+      <w:r>
+        <w:t>.</w:t>
+      </w:r>
+      <w:proofErr w:type="gramStart"/>
+      <w:r>
+        <w:t>index</w:t>
       </w:r>
       <w:proofErr w:type="spellEnd"/>
       <w:r>
-        <w:t xml:space="preserve"> }} {{ </w:t>
+        <w:t xml:space="preserve"> }</w:t>
+      </w:r>
+      <w:proofErr w:type="gramEnd"/>
+      <w:r>
+        <w:t xml:space="preserve">} </w:t>
+      </w:r>
+      <w:proofErr w:type="gramStart"/>
+      <w:r>
+        <w:t xml:space="preserve">{{ </w:t>
       </w:r>
       <w:proofErr w:type="spellStart"/>
       <w:r>
-        <w:t>item.judul_sub_bab</w:t>
+        <w:t>item</w:t>
+      </w:r>
+      <w:proofErr w:type="gramEnd"/>
+      <w:r>
+        <w:t>.judul_sub_</w:t>
+      </w:r>
+      <w:proofErr w:type="gramStart"/>
+      <w:r>
+        <w:t>bab</w:t>
       </w:r>
       <w:proofErr w:type="spellEnd"/>
       <w:r>
-        <w:t xml:space="preserve"> }}</w:t>
+        <w:t xml:space="preserve"> }</w:t>
+      </w:r>
+      <w:proofErr w:type="gramEnd"/>
+      <w:r>
+        <w:t>}</w:t>
       </w:r>
     </w:p>
     <w:p>
@@ -3189,6 +3270,7 @@
         </w:numPr>
         <w:ind w:left="510" w:hanging="153"/>
       </w:pPr>
+      <w:proofErr w:type="gramStart"/>
       <w:r>
         <w:t>I</w:t>
       </w:r>
@@ -3196,30 +3278,58 @@
         <w:rPr>
           <w:lang w:val="id-ID"/>
         </w:rPr>
-        <w:t>.{{ loop.index }}</w:t>
-      </w:r>
+        <w:t>.{{ loop</w:t>
+      </w:r>
+      <w:proofErr w:type="gramEnd"/>
       <w:r>
         <w:rPr>
           <w:lang w:val="id-ID"/>
         </w:rPr>
         <w:t>.</w:t>
       </w:r>
+      <w:proofErr w:type="gramStart"/>
+      <w:r>
+        <w:rPr>
+          <w:lang w:val="id-ID"/>
+        </w:rPr>
+        <w:t>index }}</w:t>
+      </w:r>
+      <w:r>
+        <w:rPr>
+          <w:lang w:val="id-ID"/>
+        </w:rPr>
+        <w:t>.</w:t>
+      </w:r>
       <w:r>
         <w:t>A.</w:t>
       </w:r>
+      <w:proofErr w:type="gramEnd"/>
       <w:r>
         <w:t xml:space="preserve"> </w:t>
       </w:r>
+      <w:proofErr w:type="gramStart"/>
       <w:r>
         <w:t xml:space="preserve">{{ </w:t>
       </w:r>
       <w:proofErr w:type="spellStart"/>
       <w:r>
-        <w:t>item.label_point_a</w:t>
+        <w:t>item</w:t>
+      </w:r>
+      <w:proofErr w:type="gramEnd"/>
+      <w:r>
+        <w:t>.label_point_</w:t>
+      </w:r>
+      <w:proofErr w:type="gramStart"/>
+      <w:r>
+        <w:t>a</w:t>
       </w:r>
       <w:proofErr w:type="spellEnd"/>
       <w:r>
-        <w:t xml:space="preserve"> }}</w:t>
+        <w:t xml:space="preserve"> }</w:t>
+      </w:r>
+      <w:proofErr w:type="gramEnd"/>
+      <w:r>
+        <w:t>}</w:t>
       </w:r>
       <w:r>
         <w:t xml:space="preserve"> </w:t>
@@ -3247,6 +3357,7 @@
       <w:pPr>
         <w:pStyle w:val="Code"/>
       </w:pPr>
+      <w:proofErr w:type="gramStart"/>
       <w:r>
         <w:t xml:space="preserve">{{ </w:t>
       </w:r>
@@ -3255,6 +3366,7 @@
         <w:t>k.isi</w:t>
       </w:r>
       <w:proofErr w:type="spellEnd"/>
+      <w:proofErr w:type="gramEnd"/>
       <w:r>
         <w:t xml:space="preserve"> }}</w:t>
       </w:r>
@@ -3300,6 +3412,7 @@
         <w:spacing w:before="240"/>
         <w:ind w:left="510" w:hanging="153"/>
       </w:pPr>
+      <w:proofErr w:type="gramStart"/>
       <w:r>
         <w:t>I</w:t>
       </w:r>
@@ -3307,17 +3420,32 @@
         <w:rPr>
           <w:lang w:val="id-ID"/>
         </w:rPr>
-        <w:t>.{{ loop.index }}</w:t>
-      </w:r>
+        <w:t>.{{ loop</w:t>
+      </w:r>
+      <w:proofErr w:type="gramEnd"/>
       <w:r>
         <w:rPr>
           <w:lang w:val="id-ID"/>
         </w:rPr>
         <w:t>.</w:t>
       </w:r>
+      <w:proofErr w:type="gramStart"/>
+      <w:r>
+        <w:rPr>
+          <w:lang w:val="id-ID"/>
+        </w:rPr>
+        <w:t>index }}</w:t>
+      </w:r>
+      <w:r>
+        <w:rPr>
+          <w:lang w:val="id-ID"/>
+        </w:rPr>
+        <w:t>.</w:t>
+      </w:r>
       <w:r>
         <w:t>B.</w:t>
       </w:r>
+      <w:proofErr w:type="gramEnd"/>
       <w:r>
         <w:t xml:space="preserve"> </w:t>
       </w:r>
@@ -3361,11 +3489,19 @@
         <w:t xml:space="preserve"> in </w:t>
       </w:r>
       <w:proofErr w:type="spellStart"/>
-      <w:r>
-        <w:rPr>
-          <w:lang w:val="en-US"/>
-        </w:rPr>
-        <w:t>item.list_gambar</w:t>
+      <w:proofErr w:type="gramStart"/>
+      <w:r>
+        <w:rPr>
+          <w:lang w:val="en-US"/>
+        </w:rPr>
+        <w:t>item.list</w:t>
+      </w:r>
+      <w:proofErr w:type="gramEnd"/>
+      <w:r>
+        <w:rPr>
+          <w:lang w:val="en-US"/>
+        </w:rPr>
+        <w:t>_gambar</w:t>
       </w:r>
       <w:proofErr w:type="spellEnd"/>
       <w:r>
@@ -3380,6 +3516,7 @@
         </w:rPr>
         <w:t xml:space="preserve"> </w:t>
       </w:r>
+      <w:proofErr w:type="gramStart"/>
       <w:r>
         <w:rPr>
           <w:lang w:val="en-US"/>
@@ -3391,14 +3528,35 @@
         <w:rPr>
           <w:lang w:val="en-US"/>
         </w:rPr>
-        <w:t>gbr.objek_gambar</w:t>
+        <w:t>gbr</w:t>
+      </w:r>
+      <w:proofErr w:type="gramEnd"/>
+      <w:r>
+        <w:rPr>
+          <w:lang w:val="en-US"/>
+        </w:rPr>
+        <w:t>.objek_</w:t>
+      </w:r>
+      <w:proofErr w:type="gramStart"/>
+      <w:r>
+        <w:rPr>
+          <w:lang w:val="en-US"/>
+        </w:rPr>
+        <w:t>gambar</w:t>
       </w:r>
       <w:proofErr w:type="spellEnd"/>
       <w:r>
         <w:rPr>
           <w:lang w:val="en-US"/>
         </w:rPr>
-        <w:t xml:space="preserve"> }}</w:t>
+        <w:t xml:space="preserve"> }</w:t>
+      </w:r>
+      <w:proofErr w:type="gramEnd"/>
+      <w:r>
+        <w:rPr>
+          <w:lang w:val="en-US"/>
+        </w:rPr>
+        <w:t>}</w:t>
       </w:r>
     </w:p>
     <w:p>
@@ -3447,6 +3605,7 @@
         </w:numPr>
         <w:ind w:left="357"/>
       </w:pPr>
+      <w:proofErr w:type="gramStart"/>
       <w:r>
         <w:t>I</w:t>
       </w:r>
@@ -3454,17 +3613,32 @@
         <w:rPr>
           <w:lang w:val="id-ID"/>
         </w:rPr>
-        <w:t>.{{ loop.index }}</w:t>
-      </w:r>
+        <w:t>.{{ loop</w:t>
+      </w:r>
+      <w:proofErr w:type="gramEnd"/>
       <w:r>
         <w:rPr>
           <w:lang w:val="id-ID"/>
         </w:rPr>
         <w:t>.</w:t>
       </w:r>
+      <w:proofErr w:type="gramStart"/>
+      <w:r>
+        <w:rPr>
+          <w:lang w:val="id-ID"/>
+        </w:rPr>
+        <w:t>index }}</w:t>
+      </w:r>
+      <w:r>
+        <w:rPr>
+          <w:lang w:val="id-ID"/>
+        </w:rPr>
+        <w:t>.</w:t>
+      </w:r>
       <w:r>
         <w:t>C.</w:t>
       </w:r>
+      <w:proofErr w:type="gramEnd"/>
       <w:r>
         <w:t xml:space="preserve"> </w:t>
       </w:r>
@@ -3486,11 +3660,19 @@
         <w:t xml:space="preserve">{% for p in </w:t>
       </w:r>
       <w:proofErr w:type="spellStart"/>
-      <w:r>
-        <w:rPr>
-          <w:lang w:val="en-US"/>
-        </w:rPr>
-        <w:t>item.list_paragraf_analisa</w:t>
+      <w:proofErr w:type="gramStart"/>
+      <w:r>
+        <w:rPr>
+          <w:lang w:val="en-US"/>
+        </w:rPr>
+        <w:t>item.list</w:t>
+      </w:r>
+      <w:proofErr w:type="gramEnd"/>
+      <w:r>
+        <w:rPr>
+          <w:lang w:val="en-US"/>
+        </w:rPr>
+        <w:t>_paragraf_analisa</w:t>
       </w:r>
       <w:proofErr w:type="spellEnd"/>
       <w:r>
@@ -3507,6 +3689,7 @@
           <w:lang w:val="en-US"/>
         </w:rPr>
       </w:pPr>
+      <w:proofErr w:type="gramStart"/>
       <w:r>
         <w:rPr>
           <w:lang w:val="en-US"/>
@@ -3518,14 +3701,35 @@
         <w:rPr>
           <w:lang w:val="en-US"/>
         </w:rPr>
-        <w:t>p.teks</w:t>
+        <w:t>p</w:t>
+      </w:r>
+      <w:proofErr w:type="gramEnd"/>
+      <w:r>
+        <w:rPr>
+          <w:lang w:val="en-US"/>
+        </w:rPr>
+        <w:t>.</w:t>
+      </w:r>
+      <w:proofErr w:type="gramStart"/>
+      <w:r>
+        <w:rPr>
+          <w:lang w:val="en-US"/>
+        </w:rPr>
+        <w:t>teks</w:t>
       </w:r>
       <w:proofErr w:type="spellEnd"/>
       <w:r>
         <w:rPr>
           <w:lang w:val="en-US"/>
         </w:rPr>
-        <w:t xml:space="preserve"> }}</w:t>
+        <w:t xml:space="preserve"> }</w:t>
+      </w:r>
+      <w:proofErr w:type="gramEnd"/>
+      <w:r>
+        <w:rPr>
+          <w:lang w:val="en-US"/>
+        </w:rPr>
+        <w:t>}</w:t>
       </w:r>
     </w:p>
     <w:p>
@@ -3584,15 +3788,8 @@
     </w:p>
     <w:p>
       <w:pPr>
-        <w:rPr>
-          <w:lang w:val="en-US"/>
-        </w:rPr>
-      </w:pPr>
-    </w:p>
-    <w:p>
-      <w:pPr>
         <w:pStyle w:val="Heading1"/>
-        <w:spacing w:before="340" w:after="340"/>
+        <w:spacing w:before="340" w:after="100"/>
         <w:ind w:left="1077" w:hanging="1077"/>
       </w:pPr>
       <w:bookmarkStart w:id="3" w:name="_Toc197688616"/>
@@ -3616,6 +3813,7 @@
     <w:p>
       <w:pPr>
         <w:pStyle w:val="Text"/>
+        <w:spacing w:before="240"/>
       </w:pPr>
       <w:proofErr w:type="spellStart"/>
       <w:r>
@@ -3666,18 +3864,34 @@
         <w:t xml:space="preserve"> </w:t>
       </w:r>
       <w:r>
-        <w:t>ke-</w:t>
+        <w:t>ke</w:t>
+      </w:r>
+      <w:proofErr w:type="gramStart"/>
+      <w:r>
+        <w:t>-</w:t>
       </w:r>
       <w:r>
         <w:t xml:space="preserve">{{ </w:t>
       </w:r>
       <w:proofErr w:type="spellStart"/>
       <w:r>
-        <w:t>nomor_modul</w:t>
+        <w:t>nomor</w:t>
+      </w:r>
+      <w:proofErr w:type="gramEnd"/>
+      <w:r>
+        <w:t>_</w:t>
+      </w:r>
+      <w:proofErr w:type="gramStart"/>
+      <w:r>
+        <w:t>modul</w:t>
       </w:r>
       <w:proofErr w:type="spellEnd"/>
       <w:r>
-        <w:t xml:space="preserve"> }} ini </w:t>
+        <w:t xml:space="preserve"> }</w:t>
+      </w:r>
+      <w:proofErr w:type="gramEnd"/>
+      <w:r>
+        <w:t xml:space="preserve">} ini </w:t>
       </w:r>
       <w:proofErr w:type="spellStart"/>
       <w:r>
@@ -3718,15 +3932,33 @@
           <w:szCs w:val="34"/>
           <w:lang w:val="en-US"/>
         </w:rPr>
-        <w:t>{% else %}</w:t>
-      </w:r>
+        <w:t xml:space="preserve">{% else </w:t>
+      </w:r>
+      <w:proofErr w:type="gramStart"/>
       <w:r>
         <w:rPr>
           <w:sz w:val="34"/>
           <w:szCs w:val="34"/>
           <w:lang w:val="en-US"/>
         </w:rPr>
-        <w:t xml:space="preserve">{% for item in </w:t>
+        <w:t>%}</w:t>
+      </w:r>
+      <w:r>
+        <w:rPr>
+          <w:sz w:val="34"/>
+          <w:szCs w:val="34"/>
+          <w:lang w:val="en-US"/>
+        </w:rPr>
+        <w:t>{</w:t>
+      </w:r>
+      <w:proofErr w:type="gramEnd"/>
+      <w:r>
+        <w:rPr>
+          <w:sz w:val="34"/>
+          <w:szCs w:val="34"/>
+          <w:lang w:val="en-US"/>
+        </w:rPr>
+        <w:t xml:space="preserve">% for item in </w:t>
       </w:r>
       <w:proofErr w:type="spellStart"/>
       <w:r>
@@ -3762,7 +3994,9 @@
           <w:ilvl w:val="0"/>
           <w:numId w:val="0"/>
         </w:numPr>
-      </w:pPr>
+        <w:spacing w:before="240"/>
+      </w:pPr>
+      <w:proofErr w:type="gramStart"/>
       <w:r>
         <w:t>II</w:t>
       </w:r>
@@ -3771,19 +4005,47 @@
       </w:r>
       <w:proofErr w:type="spellStart"/>
       <w:r>
-        <w:t>loop.index</w:t>
+        <w:t>loop</w:t>
+      </w:r>
+      <w:proofErr w:type="gramEnd"/>
+      <w:r>
+        <w:t>.</w:t>
+      </w:r>
+      <w:proofErr w:type="gramStart"/>
+      <w:r>
+        <w:t>index</w:t>
       </w:r>
       <w:proofErr w:type="spellEnd"/>
       <w:r>
-        <w:t xml:space="preserve"> }} {{ </w:t>
+        <w:t xml:space="preserve"> }</w:t>
+      </w:r>
+      <w:proofErr w:type="gramEnd"/>
+      <w:r>
+        <w:t xml:space="preserve">} </w:t>
+      </w:r>
+      <w:proofErr w:type="gramStart"/>
+      <w:r>
+        <w:t xml:space="preserve">{{ </w:t>
       </w:r>
       <w:proofErr w:type="spellStart"/>
       <w:r>
-        <w:t>item.judul_sub_bab</w:t>
+        <w:t>item</w:t>
+      </w:r>
+      <w:proofErr w:type="gramEnd"/>
+      <w:r>
+        <w:t>.judul_sub_</w:t>
+      </w:r>
+      <w:proofErr w:type="gramStart"/>
+      <w:r>
+        <w:t>bab</w:t>
       </w:r>
       <w:proofErr w:type="spellEnd"/>
       <w:r>
-        <w:t xml:space="preserve"> }}</w:t>
+        <w:t xml:space="preserve"> }</w:t>
+      </w:r>
+      <w:proofErr w:type="gramEnd"/>
+      <w:r>
+        <w:t>}</w:t>
       </w:r>
     </w:p>
     <w:p>
@@ -3800,6 +4062,7 @@
         <w:t xml:space="preserve">{% if </w:t>
       </w:r>
       <w:proofErr w:type="spellStart"/>
+      <w:proofErr w:type="gramStart"/>
       <w:r>
         <w:rPr>
           <w:lang w:val="en-US"/>
@@ -3807,17 +4070,32 @@
         <w:t>item.tipe</w:t>
       </w:r>
       <w:proofErr w:type="spellEnd"/>
-      <w:r>
-        <w:rPr>
-          <w:lang w:val="en-US"/>
-        </w:rPr>
-        <w:t xml:space="preserve"> == “3” %}</w:t>
-      </w:r>
-      <w:r>
-        <w:rPr>
-          <w:lang w:val="en-US"/>
-        </w:rPr>
-        <w:t xml:space="preserve">{% for </w:t>
+      <w:proofErr w:type="gramEnd"/>
+      <w:r>
+        <w:rPr>
+          <w:lang w:val="en-US"/>
+        </w:rPr>
+        <w:t xml:space="preserve"> == “3” </w:t>
+      </w:r>
+      <w:proofErr w:type="gramStart"/>
+      <w:r>
+        <w:rPr>
+          <w:lang w:val="en-US"/>
+        </w:rPr>
+        <w:t>%}</w:t>
+      </w:r>
+      <w:r>
+        <w:rPr>
+          <w:lang w:val="en-US"/>
+        </w:rPr>
+        <w:t>{</w:t>
+      </w:r>
+      <w:proofErr w:type="gramEnd"/>
+      <w:r>
+        <w:rPr>
+          <w:lang w:val="en-US"/>
+        </w:rPr>
+        <w:t xml:space="preserve">% for </w:t>
       </w:r>
       <w:proofErr w:type="spellStart"/>
       <w:r>
@@ -3879,6 +4157,7 @@
                 <w:lang w:val="en-US"/>
               </w:rPr>
             </w:pPr>
+            <w:proofErr w:type="gramStart"/>
             <w:r>
               <w:rPr>
                 <w:lang w:val="en-US"/>
@@ -3892,22 +4171,30 @@
                 <w:szCs w:val="2"/>
                 <w:lang w:val="en-US"/>
               </w:rPr>
-              <w:t>loop.index</w:t>
-            </w:r>
-            <w:proofErr w:type="spellEnd"/>
+              <w:t>loop</w:t>
+            </w:r>
+            <w:proofErr w:type="gramEnd"/>
             <w:r>
               <w:rPr>
                 <w:sz w:val="2"/>
                 <w:szCs w:val="2"/>
                 <w:lang w:val="en-US"/>
               </w:rPr>
+              <w:t>.index</w:t>
+            </w:r>
+            <w:proofErr w:type="spellEnd"/>
+            <w:r>
+              <w:rPr>
+                <w:sz w:val="2"/>
+                <w:szCs w:val="2"/>
+                <w:lang w:val="en-US"/>
+              </w:rPr>
               <w:t xml:space="preserve"> </w:t>
             </w:r>
             <w:r>
               <w:rPr>
                 <w:lang w:val="en-US"/>
               </w:rPr>
-              <w:lastRenderedPageBreak/>
               <w:t>}}</w:t>
             </w:r>
           </w:p>
@@ -3922,11 +4209,11 @@
                 <w:lang w:val="en-US"/>
               </w:rPr>
             </w:pPr>
+            <w:proofErr w:type="gramStart"/>
             <w:r>
               <w:rPr>
                 <w:lang w:val="en-US"/>
               </w:rPr>
-              <w:lastRenderedPageBreak/>
               <w:t xml:space="preserve">{{ </w:t>
             </w:r>
             <w:proofErr w:type="spellStart"/>
@@ -3934,14 +4221,35 @@
               <w:rPr>
                 <w:lang w:val="en-US"/>
               </w:rPr>
-              <w:t>qa.q</w:t>
+              <w:t>qa</w:t>
+            </w:r>
+            <w:proofErr w:type="gramEnd"/>
+            <w:r>
+              <w:rPr>
+                <w:lang w:val="en-US"/>
+              </w:rPr>
+              <w:t>.</w:t>
+            </w:r>
+            <w:proofErr w:type="gramStart"/>
+            <w:r>
+              <w:rPr>
+                <w:lang w:val="en-US"/>
+              </w:rPr>
+              <w:t>q</w:t>
             </w:r>
             <w:proofErr w:type="spellEnd"/>
             <w:r>
               <w:rPr>
                 <w:lang w:val="en-US"/>
               </w:rPr>
-              <w:t xml:space="preserve"> }}</w:t>
+              <w:t xml:space="preserve"> }</w:t>
+            </w:r>
+            <w:proofErr w:type="gramEnd"/>
+            <w:r>
+              <w:rPr>
+                <w:lang w:val="en-US"/>
+              </w:rPr>
+              <w:t>}</w:t>
             </w:r>
           </w:p>
           <w:p>
@@ -3975,12 +4283,17 @@
             <w:pPr>
               <w:pStyle w:val="Text"/>
             </w:pPr>
+            <w:proofErr w:type="gramStart"/>
             <w:r>
               <w:t xml:space="preserve">{{ </w:t>
             </w:r>
             <w:proofErr w:type="spellStart"/>
             <w:r>
-              <w:t>qa.a</w:t>
+              <w:t>qa</w:t>
+            </w:r>
+            <w:proofErr w:type="gramEnd"/>
+            <w:r>
+              <w:t>.a</w:t>
             </w:r>
             <w:proofErr w:type="spellEnd"/>
             <w:r>
@@ -4001,6 +4314,7 @@
         <w:rPr>
           <w:lang w:val="en-US"/>
         </w:rPr>
+        <w:lastRenderedPageBreak/>
         <w:t xml:space="preserve">{% </w:t>
       </w:r>
       <w:proofErr w:type="spellStart"/>
@@ -4015,13 +4329,27 @@
         <w:rPr>
           <w:lang w:val="en-US"/>
         </w:rPr>
-        <w:t xml:space="preserve"> %}</w:t>
-      </w:r>
-      <w:r>
-        <w:rPr>
-          <w:lang w:val="en-US"/>
-        </w:rPr>
-        <w:t>{% else %}</w:t>
+        <w:t xml:space="preserve"> </w:t>
+      </w:r>
+      <w:proofErr w:type="gramStart"/>
+      <w:r>
+        <w:rPr>
+          <w:lang w:val="en-US"/>
+        </w:rPr>
+        <w:t>%}</w:t>
+      </w:r>
+      <w:r>
+        <w:rPr>
+          <w:lang w:val="en-US"/>
+        </w:rPr>
+        <w:t>{</w:t>
+      </w:r>
+      <w:proofErr w:type="gramEnd"/>
+      <w:r>
+        <w:rPr>
+          <w:lang w:val="en-US"/>
+        </w:rPr>
+        <w:t>% else %}</w:t>
       </w:r>
     </w:p>
     <w:p>
@@ -4031,8 +4359,9 @@
           <w:ilvl w:val="0"/>
           <w:numId w:val="0"/>
         </w:numPr>
-        <w:ind w:left="510" w:hanging="153"/>
-      </w:pPr>
+        <w:ind w:left="578" w:hanging="153"/>
+      </w:pPr>
+      <w:proofErr w:type="gramStart"/>
       <w:r>
         <w:t>II</w:t>
       </w:r>
@@ -4040,30 +4369,58 @@
         <w:rPr>
           <w:lang w:val="id-ID"/>
         </w:rPr>
-        <w:t>.{{ loop.index }}</w:t>
-      </w:r>
+        <w:t>.{{ loop</w:t>
+      </w:r>
+      <w:proofErr w:type="gramEnd"/>
       <w:r>
         <w:rPr>
           <w:lang w:val="id-ID"/>
         </w:rPr>
         <w:t>.</w:t>
       </w:r>
+      <w:proofErr w:type="gramStart"/>
+      <w:r>
+        <w:rPr>
+          <w:lang w:val="id-ID"/>
+        </w:rPr>
+        <w:t>index }}</w:t>
+      </w:r>
+      <w:r>
+        <w:rPr>
+          <w:lang w:val="id-ID"/>
+        </w:rPr>
+        <w:t>.</w:t>
+      </w:r>
       <w:r>
         <w:t>A.</w:t>
       </w:r>
+      <w:proofErr w:type="gramEnd"/>
       <w:r>
         <w:t xml:space="preserve"> </w:t>
       </w:r>
+      <w:proofErr w:type="gramStart"/>
       <w:r>
         <w:t xml:space="preserve">{{ </w:t>
       </w:r>
       <w:proofErr w:type="spellStart"/>
       <w:r>
-        <w:t>item.label_point_a</w:t>
+        <w:t>item</w:t>
+      </w:r>
+      <w:proofErr w:type="gramEnd"/>
+      <w:r>
+        <w:t>.label_point_</w:t>
+      </w:r>
+      <w:proofErr w:type="gramStart"/>
+      <w:r>
+        <w:t>a</w:t>
       </w:r>
       <w:proofErr w:type="spellEnd"/>
       <w:r>
-        <w:t xml:space="preserve"> }}</w:t>
+        <w:t xml:space="preserve"> }</w:t>
+      </w:r>
+      <w:proofErr w:type="gramEnd"/>
+      <w:r>
+        <w:t>}</w:t>
       </w:r>
       <w:r>
         <w:t xml:space="preserve"> </w:t>
@@ -4107,7 +4464,9 @@
     <w:p>
       <w:pPr>
         <w:pStyle w:val="Code"/>
-      </w:pPr>
+        <w:ind w:left="1276"/>
+      </w:pPr>
+      <w:proofErr w:type="gramStart"/>
       <w:r>
         <w:t xml:space="preserve">{{ </w:t>
       </w:r>
@@ -4116,13 +4475,14 @@
         <w:t>k.isi</w:t>
       </w:r>
       <w:proofErr w:type="spellEnd"/>
+      <w:proofErr w:type="gramEnd"/>
       <w:r>
         <w:t xml:space="preserve"> }}</w:t>
       </w:r>
     </w:p>
     <w:p>
       <w:pPr>
-        <w:ind w:left="1378" w:hanging="357"/>
+        <w:ind w:left="1548" w:hanging="357"/>
         <w:rPr>
           <w:lang w:val="en-US"/>
         </w:rPr>
@@ -4165,7 +4525,7 @@
     </w:p>
     <w:p>
       <w:pPr>
-        <w:ind w:left="1378" w:hanging="357"/>
+        <w:ind w:left="1548" w:hanging="357"/>
         <w:rPr>
           <w:lang w:val="en-US"/>
         </w:rPr>
@@ -4194,8 +4554,9 @@
           <w:numId w:val="0"/>
         </w:numPr>
         <w:spacing w:before="240"/>
-        <w:ind w:left="510" w:hanging="153"/>
-      </w:pPr>
+        <w:ind w:left="578" w:hanging="153"/>
+      </w:pPr>
+      <w:proofErr w:type="gramStart"/>
       <w:r>
         <w:t>II</w:t>
       </w:r>
@@ -4203,16 +4564,34 @@
         <w:rPr>
           <w:lang w:val="id-ID"/>
         </w:rPr>
-        <w:t>.{{ loop.index }}</w:t>
-      </w:r>
+        <w:t>.{{ loop</w:t>
+      </w:r>
+      <w:proofErr w:type="gramEnd"/>
       <w:r>
         <w:rPr>
           <w:lang w:val="id-ID"/>
         </w:rPr>
         <w:t>.</w:t>
       </w:r>
-      <w:r>
-        <w:t xml:space="preserve">B. </w:t>
+      <w:proofErr w:type="gramStart"/>
+      <w:r>
+        <w:rPr>
+          <w:lang w:val="id-ID"/>
+        </w:rPr>
+        <w:t>index }}</w:t>
+      </w:r>
+      <w:r>
+        <w:rPr>
+          <w:lang w:val="id-ID"/>
+        </w:rPr>
+        <w:t>.</w:t>
+      </w:r>
+      <w:r>
+        <w:t>B.</w:t>
+      </w:r>
+      <w:proofErr w:type="gramEnd"/>
+      <w:r>
+        <w:t xml:space="preserve"> </w:t>
       </w:r>
       <w:proofErr w:type="spellStart"/>
       <w:r>
@@ -4228,7 +4607,7 @@
     </w:p>
     <w:p>
       <w:pPr>
-        <w:ind w:left="1021"/>
+        <w:ind w:left="1077"/>
         <w:rPr>
           <w:lang w:val="en-US"/>
         </w:rPr>
@@ -4254,11 +4633,19 @@
         <w:t xml:space="preserve"> in </w:t>
       </w:r>
       <w:proofErr w:type="spellStart"/>
-      <w:r>
-        <w:rPr>
-          <w:lang w:val="en-US"/>
-        </w:rPr>
-        <w:t>item.list_gambar</w:t>
+      <w:proofErr w:type="gramStart"/>
+      <w:r>
+        <w:rPr>
+          <w:lang w:val="en-US"/>
+        </w:rPr>
+        <w:t>item.list</w:t>
+      </w:r>
+      <w:proofErr w:type="gramEnd"/>
+      <w:r>
+        <w:rPr>
+          <w:lang w:val="en-US"/>
+        </w:rPr>
+        <w:t>_gambar</w:t>
       </w:r>
       <w:proofErr w:type="spellEnd"/>
       <w:r>
@@ -4273,6 +4660,7 @@
         </w:rPr>
         <w:t xml:space="preserve"> </w:t>
       </w:r>
+      <w:proofErr w:type="gramStart"/>
       <w:r>
         <w:rPr>
           <w:lang w:val="en-US"/>
@@ -4284,14 +4672,35 @@
         <w:rPr>
           <w:lang w:val="en-US"/>
         </w:rPr>
-        <w:t>gbr.objek_gambar</w:t>
+        <w:t>gbr</w:t>
+      </w:r>
+      <w:proofErr w:type="gramEnd"/>
+      <w:r>
+        <w:rPr>
+          <w:lang w:val="en-US"/>
+        </w:rPr>
+        <w:t>.objek_</w:t>
+      </w:r>
+      <w:proofErr w:type="gramStart"/>
+      <w:r>
+        <w:rPr>
+          <w:lang w:val="en-US"/>
+        </w:rPr>
+        <w:t>gambar</w:t>
       </w:r>
       <w:proofErr w:type="spellEnd"/>
       <w:r>
         <w:rPr>
           <w:lang w:val="en-US"/>
         </w:rPr>
-        <w:t xml:space="preserve"> }}</w:t>
+        <w:t xml:space="preserve"> }</w:t>
+      </w:r>
+      <w:proofErr w:type="gramEnd"/>
+      <w:r>
+        <w:rPr>
+          <w:lang w:val="en-US"/>
+        </w:rPr>
+        <w:t>}</w:t>
       </w:r>
     </w:p>
     <w:p>
@@ -4345,8 +4754,9 @@
           <w:ilvl w:val="0"/>
           <w:numId w:val="0"/>
         </w:numPr>
-        <w:ind w:left="357"/>
-      </w:pPr>
+        <w:ind w:left="425"/>
+      </w:pPr>
+      <w:proofErr w:type="gramStart"/>
       <w:r>
         <w:t>II</w:t>
       </w:r>
@@ -4354,16 +4764,34 @@
         <w:rPr>
           <w:lang w:val="id-ID"/>
         </w:rPr>
-        <w:t>.{{ loop.index }}</w:t>
-      </w:r>
+        <w:t>.{{ loop</w:t>
+      </w:r>
+      <w:proofErr w:type="gramEnd"/>
       <w:r>
         <w:rPr>
           <w:lang w:val="id-ID"/>
         </w:rPr>
         <w:t>.</w:t>
       </w:r>
-      <w:r>
-        <w:t xml:space="preserve">C. </w:t>
+      <w:proofErr w:type="gramStart"/>
+      <w:r>
+        <w:rPr>
+          <w:lang w:val="id-ID"/>
+        </w:rPr>
+        <w:t>index }}</w:t>
+      </w:r>
+      <w:r>
+        <w:rPr>
+          <w:lang w:val="id-ID"/>
+        </w:rPr>
+        <w:t>.</w:t>
+      </w:r>
+      <w:r>
+        <w:t>C.</w:t>
+      </w:r>
+      <w:proofErr w:type="gramEnd"/>
+      <w:r>
+        <w:t xml:space="preserve"> </w:t>
       </w:r>
       <w:r>
         <w:t>Analisa</w:t>
@@ -4371,7 +4799,7 @@
     </w:p>
     <w:p>
       <w:pPr>
-        <w:ind w:left="1021"/>
+        <w:ind w:left="1191"/>
       </w:pPr>
       <w:r>
         <w:t>{% for p in item.list_paragraf_analisa_tugas %}</w:t>
@@ -4379,7 +4807,7 @@
     </w:p>
     <w:p>
       <w:pPr>
-        <w:ind w:left="1021"/>
+        <w:ind w:left="1191"/>
       </w:pPr>
       <w:r>
         <w:t>{{ p.teks }}</w:t>
@@ -4387,7 +4815,7 @@
     </w:p>
     <w:p>
       <w:pPr>
-        <w:ind w:left="1021"/>
+        <w:ind w:left="1191"/>
         <w:rPr>
           <w:lang w:val="en-US"/>
         </w:rPr>

</xml_diff>

<commit_message>
perbaikan layout source code selesai
</commit_message>
<xml_diff>
--- a/kuliah/DocumentGenerator_Laporan_Praktikum/src/templates/format-1.docx
+++ b/kuliah/DocumentGenerator_Laporan_Praktikum/src/templates/format-1.docx
@@ -174,7 +174,6 @@
           <w:lang w:val="en-US"/>
         </w:rPr>
       </w:pPr>
-      <w:proofErr w:type="gramStart"/>
       <w:r>
         <w:rPr>
           <w:b/>
@@ -195,7 +194,6 @@
         <w:t>judul</w:t>
       </w:r>
       <w:proofErr w:type="spellEnd"/>
-      <w:proofErr w:type="gramEnd"/>
       <w:r>
         <w:rPr>
           <w:b/>
@@ -254,43 +252,25 @@
           <w:lang w:val="en-US"/>
         </w:rPr>
       </w:pPr>
-      <w:proofErr w:type="gramStart"/>
       <w:r>
         <w:rPr>
           <w:b/>
           <w:lang w:val="en-US"/>
         </w:rPr>
-        <w:t>{{ nama</w:t>
-      </w:r>
-      <w:proofErr w:type="gramEnd"/>
+        <w:t>{{ nama }}</w:t>
+      </w:r>
       <w:r>
         <w:rPr>
           <w:b/>
-          <w:lang w:val="en-US"/>
-        </w:rPr>
-        <w:t xml:space="preserve"> }}</w:t>
+        </w:rPr>
+        <w:tab/>
       </w:r>
       <w:r>
         <w:rPr>
           <w:b/>
-        </w:rPr>
-        <w:tab/>
-      </w:r>
-      <w:proofErr w:type="gramStart"/>
-      <w:r>
-        <w:rPr>
-          <w:b/>
-          <w:lang w:val="en-US"/>
-        </w:rPr>
-        <w:t>{{ nim</w:t>
-      </w:r>
-      <w:proofErr w:type="gramEnd"/>
-      <w:r>
-        <w:rPr>
-          <w:b/>
-          <w:lang w:val="en-US"/>
-        </w:rPr>
-        <w:t xml:space="preserve"> }}</w:t>
+          <w:lang w:val="en-US"/>
+        </w:rPr>
+        <w:t>{{ nim }}</w:t>
       </w:r>
     </w:p>
     <w:p>
@@ -3209,7 +3189,6 @@
         </w:numPr>
         <w:spacing w:before="240"/>
       </w:pPr>
-      <w:proofErr w:type="gramStart"/>
       <w:r>
         <w:t>I</w:t>
       </w:r>
@@ -3218,47 +3197,19 @@
       </w:r>
       <w:proofErr w:type="spellStart"/>
       <w:r>
-        <w:t>loop</w:t>
-      </w:r>
-      <w:proofErr w:type="gramEnd"/>
-      <w:r>
-        <w:t>.</w:t>
-      </w:r>
-      <w:proofErr w:type="gramStart"/>
-      <w:r>
-        <w:t>index</w:t>
+        <w:t>loop.index</w:t>
       </w:r>
       <w:proofErr w:type="spellEnd"/>
       <w:r>
-        <w:t xml:space="preserve"> }</w:t>
-      </w:r>
-      <w:proofErr w:type="gramEnd"/>
-      <w:r>
-        <w:t xml:space="preserve">} </w:t>
-      </w:r>
-      <w:proofErr w:type="gramStart"/>
-      <w:r>
-        <w:t xml:space="preserve">{{ </w:t>
+        <w:t xml:space="preserve"> }} {{ </w:t>
       </w:r>
       <w:proofErr w:type="spellStart"/>
       <w:r>
-        <w:t>item</w:t>
-      </w:r>
-      <w:proofErr w:type="gramEnd"/>
-      <w:r>
-        <w:t>.judul_sub_</w:t>
-      </w:r>
-      <w:proofErr w:type="gramStart"/>
-      <w:r>
-        <w:t>bab</w:t>
+        <w:t>item.judul_sub_bab</w:t>
       </w:r>
       <w:proofErr w:type="spellEnd"/>
       <w:r>
-        <w:t xml:space="preserve"> }</w:t>
-      </w:r>
-      <w:proofErr w:type="gramEnd"/>
-      <w:r>
-        <w:t>}</w:t>
+        <w:t xml:space="preserve"> }}</w:t>
       </w:r>
     </w:p>
     <w:p>
@@ -3270,7 +3221,6 @@
         </w:numPr>
         <w:ind w:left="510" w:hanging="153"/>
       </w:pPr>
-      <w:proofErr w:type="gramStart"/>
       <w:r>
         <w:t>I</w:t>
       </w:r>
@@ -3278,58 +3228,30 @@
         <w:rPr>
           <w:lang w:val="id-ID"/>
         </w:rPr>
-        <w:t>.{{ loop</w:t>
-      </w:r>
-      <w:proofErr w:type="gramEnd"/>
+        <w:t>.{{ loop.index }}</w:t>
+      </w:r>
       <w:r>
         <w:rPr>
           <w:lang w:val="id-ID"/>
         </w:rPr>
         <w:t>.</w:t>
       </w:r>
-      <w:proofErr w:type="gramStart"/>
-      <w:r>
-        <w:rPr>
-          <w:lang w:val="id-ID"/>
-        </w:rPr>
-        <w:t>index }}</w:t>
-      </w:r>
-      <w:r>
-        <w:rPr>
-          <w:lang w:val="id-ID"/>
-        </w:rPr>
-        <w:t>.</w:t>
-      </w:r>
       <w:r>
         <w:t>A.</w:t>
       </w:r>
-      <w:proofErr w:type="gramEnd"/>
       <w:r>
         <w:t xml:space="preserve"> </w:t>
       </w:r>
-      <w:proofErr w:type="gramStart"/>
       <w:r>
         <w:t xml:space="preserve">{{ </w:t>
       </w:r>
       <w:proofErr w:type="spellStart"/>
       <w:r>
-        <w:t>item</w:t>
-      </w:r>
-      <w:proofErr w:type="gramEnd"/>
-      <w:r>
-        <w:t>.label_point_</w:t>
-      </w:r>
-      <w:proofErr w:type="gramStart"/>
-      <w:r>
-        <w:t>a</w:t>
+        <w:t>item.label_point_a</w:t>
       </w:r>
       <w:proofErr w:type="spellEnd"/>
       <w:r>
-        <w:t xml:space="preserve"> }</w:t>
-      </w:r>
-      <w:proofErr w:type="gramEnd"/>
-      <w:r>
-        <w:t>}</w:t>
+        <w:t xml:space="preserve"> }}</w:t>
       </w:r>
       <w:r>
         <w:t xml:space="preserve"> </w:t>
@@ -3337,7 +3259,7 @@
     </w:p>
     <w:p>
       <w:pPr>
-        <w:ind w:left="1321" w:hanging="357"/>
+        <w:ind w:left="964"/>
         <w:jc w:val="left"/>
       </w:pPr>
       <w:r>
@@ -3357,7 +3279,6 @@
       <w:pPr>
         <w:pStyle w:val="Code"/>
       </w:pPr>
-      <w:proofErr w:type="gramStart"/>
       <w:r>
         <w:t xml:space="preserve">{{ </w:t>
       </w:r>
@@ -3366,18 +3287,22 @@
         <w:t>k.isi</w:t>
       </w:r>
       <w:proofErr w:type="spellEnd"/>
-      <w:proofErr w:type="gramEnd"/>
       <w:r>
         <w:t xml:space="preserve"> }}</w:t>
       </w:r>
     </w:p>
     <w:p>
       <w:pPr>
+        <w:ind w:left="1021"/>
+      </w:pPr>
+      <w:r>
+        <w:t>{% endfor %}</w:t>
+      </w:r>
+    </w:p>
+    <w:p>
+      <w:pPr>
         <w:ind w:left="1378" w:hanging="357"/>
       </w:pPr>
-      <w:r>
-        <w:t>{% endfor %}</w:t>
-      </w:r>
       <w:r>
         <w:t>{% else %}</w:t>
       </w:r>
@@ -3412,7 +3337,6 @@
         <w:spacing w:before="240"/>
         <w:ind w:left="510" w:hanging="153"/>
       </w:pPr>
-      <w:proofErr w:type="gramStart"/>
       <w:r>
         <w:t>I</w:t>
       </w:r>
@@ -3420,32 +3344,17 @@
         <w:rPr>
           <w:lang w:val="id-ID"/>
         </w:rPr>
-        <w:t>.{{ loop</w:t>
-      </w:r>
-      <w:proofErr w:type="gramEnd"/>
+        <w:t>.{{ loop.index }}</w:t>
+      </w:r>
       <w:r>
         <w:rPr>
           <w:lang w:val="id-ID"/>
         </w:rPr>
         <w:t>.</w:t>
       </w:r>
-      <w:proofErr w:type="gramStart"/>
-      <w:r>
-        <w:rPr>
-          <w:lang w:val="id-ID"/>
-        </w:rPr>
-        <w:t>index }}</w:t>
-      </w:r>
-      <w:r>
-        <w:rPr>
-          <w:lang w:val="id-ID"/>
-        </w:rPr>
-        <w:t>.</w:t>
-      </w:r>
       <w:r>
         <w:t>B.</w:t>
       </w:r>
-      <w:proofErr w:type="gramEnd"/>
       <w:r>
         <w:t xml:space="preserve"> </w:t>
       </w:r>
@@ -3489,19 +3398,11 @@
         <w:t xml:space="preserve"> in </w:t>
       </w:r>
       <w:proofErr w:type="spellStart"/>
-      <w:proofErr w:type="gramStart"/>
-      <w:r>
-        <w:rPr>
-          <w:lang w:val="en-US"/>
-        </w:rPr>
-        <w:t>item.list</w:t>
-      </w:r>
-      <w:proofErr w:type="gramEnd"/>
-      <w:r>
-        <w:rPr>
-          <w:lang w:val="en-US"/>
-        </w:rPr>
-        <w:t>_gambar</w:t>
+      <w:r>
+        <w:rPr>
+          <w:lang w:val="en-US"/>
+        </w:rPr>
+        <w:t>item.list_gambar</w:t>
       </w:r>
       <w:proofErr w:type="spellEnd"/>
       <w:r>
@@ -3516,7 +3417,6 @@
         </w:rPr>
         <w:t xml:space="preserve"> </w:t>
       </w:r>
-      <w:proofErr w:type="gramStart"/>
       <w:r>
         <w:rPr>
           <w:lang w:val="en-US"/>
@@ -3528,35 +3428,14 @@
         <w:rPr>
           <w:lang w:val="en-US"/>
         </w:rPr>
-        <w:t>gbr</w:t>
-      </w:r>
-      <w:proofErr w:type="gramEnd"/>
-      <w:r>
-        <w:rPr>
-          <w:lang w:val="en-US"/>
-        </w:rPr>
-        <w:t>.objek_</w:t>
-      </w:r>
-      <w:proofErr w:type="gramStart"/>
-      <w:r>
-        <w:rPr>
-          <w:lang w:val="en-US"/>
-        </w:rPr>
-        <w:t>gambar</w:t>
+        <w:t>gbr.objek_gambar</w:t>
       </w:r>
       <w:proofErr w:type="spellEnd"/>
       <w:r>
         <w:rPr>
           <w:lang w:val="en-US"/>
         </w:rPr>
-        <w:t xml:space="preserve"> }</w:t>
-      </w:r>
-      <w:proofErr w:type="gramEnd"/>
-      <w:r>
-        <w:rPr>
-          <w:lang w:val="en-US"/>
-        </w:rPr>
-        <w:t>}</w:t>
+        <w:t xml:space="preserve"> }}</w:t>
       </w:r>
     </w:p>
     <w:p>
@@ -3605,7 +3484,6 @@
         </w:numPr>
         <w:ind w:left="357"/>
       </w:pPr>
-      <w:proofErr w:type="gramStart"/>
       <w:r>
         <w:t>I</w:t>
       </w:r>
@@ -3613,32 +3491,17 @@
         <w:rPr>
           <w:lang w:val="id-ID"/>
         </w:rPr>
-        <w:t>.{{ loop</w:t>
-      </w:r>
-      <w:proofErr w:type="gramEnd"/>
+        <w:t>.{{ loop.index }}</w:t>
+      </w:r>
       <w:r>
         <w:rPr>
           <w:lang w:val="id-ID"/>
         </w:rPr>
         <w:t>.</w:t>
       </w:r>
-      <w:proofErr w:type="gramStart"/>
-      <w:r>
-        <w:rPr>
-          <w:lang w:val="id-ID"/>
-        </w:rPr>
-        <w:t>index }}</w:t>
-      </w:r>
-      <w:r>
-        <w:rPr>
-          <w:lang w:val="id-ID"/>
-        </w:rPr>
-        <w:t>.</w:t>
-      </w:r>
       <w:r>
         <w:t>C.</w:t>
       </w:r>
-      <w:proofErr w:type="gramEnd"/>
       <w:r>
         <w:t xml:space="preserve"> </w:t>
       </w:r>
@@ -3660,19 +3523,11 @@
         <w:t xml:space="preserve">{% for p in </w:t>
       </w:r>
       <w:proofErr w:type="spellStart"/>
-      <w:proofErr w:type="gramStart"/>
-      <w:r>
-        <w:rPr>
-          <w:lang w:val="en-US"/>
-        </w:rPr>
-        <w:t>item.list</w:t>
-      </w:r>
-      <w:proofErr w:type="gramEnd"/>
-      <w:r>
-        <w:rPr>
-          <w:lang w:val="en-US"/>
-        </w:rPr>
-        <w:t>_paragraf_analisa</w:t>
+      <w:r>
+        <w:rPr>
+          <w:lang w:val="en-US"/>
+        </w:rPr>
+        <w:t>item.list_paragraf_analisa</w:t>
       </w:r>
       <w:proofErr w:type="spellEnd"/>
       <w:r>
@@ -3689,7 +3544,6 @@
           <w:lang w:val="en-US"/>
         </w:rPr>
       </w:pPr>
-      <w:proofErr w:type="gramStart"/>
       <w:r>
         <w:rPr>
           <w:lang w:val="en-US"/>
@@ -3701,35 +3555,14 @@
         <w:rPr>
           <w:lang w:val="en-US"/>
         </w:rPr>
-        <w:t>p</w:t>
-      </w:r>
-      <w:proofErr w:type="gramEnd"/>
-      <w:r>
-        <w:rPr>
-          <w:lang w:val="en-US"/>
-        </w:rPr>
-        <w:t>.</w:t>
-      </w:r>
-      <w:proofErr w:type="gramStart"/>
-      <w:r>
-        <w:rPr>
-          <w:lang w:val="en-US"/>
-        </w:rPr>
-        <w:t>teks</w:t>
+        <w:t>p.teks</w:t>
       </w:r>
       <w:proofErr w:type="spellEnd"/>
       <w:r>
         <w:rPr>
           <w:lang w:val="en-US"/>
         </w:rPr>
-        <w:t xml:space="preserve"> }</w:t>
-      </w:r>
-      <w:proofErr w:type="gramEnd"/>
-      <w:r>
-        <w:rPr>
-          <w:lang w:val="en-US"/>
-        </w:rPr>
-        <w:t>}</w:t>
+        <w:t xml:space="preserve"> }}</w:t>
       </w:r>
     </w:p>
     <w:p>
@@ -3864,34 +3697,18 @@
         <w:t xml:space="preserve"> </w:t>
       </w:r>
       <w:r>
-        <w:t>ke</w:t>
-      </w:r>
-      <w:proofErr w:type="gramStart"/>
-      <w:r>
-        <w:t>-</w:t>
+        <w:t>ke-</w:t>
       </w:r>
       <w:r>
         <w:t xml:space="preserve">{{ </w:t>
       </w:r>
       <w:proofErr w:type="spellStart"/>
       <w:r>
-        <w:t>nomor</w:t>
-      </w:r>
-      <w:proofErr w:type="gramEnd"/>
-      <w:r>
-        <w:t>_</w:t>
-      </w:r>
-      <w:proofErr w:type="gramStart"/>
-      <w:r>
-        <w:t>modul</w:t>
+        <w:t>nomor_modul</w:t>
       </w:r>
       <w:proofErr w:type="spellEnd"/>
       <w:r>
-        <w:t xml:space="preserve"> }</w:t>
-      </w:r>
-      <w:proofErr w:type="gramEnd"/>
-      <w:r>
-        <w:t xml:space="preserve">} ini </w:t>
+        <w:t xml:space="preserve"> }} ini </w:t>
       </w:r>
       <w:proofErr w:type="spellStart"/>
       <w:r>
@@ -3932,33 +3749,15 @@
           <w:szCs w:val="34"/>
           <w:lang w:val="en-US"/>
         </w:rPr>
-        <w:t xml:space="preserve">{% else </w:t>
-      </w:r>
-      <w:proofErr w:type="gramStart"/>
+        <w:t>{% else %}</w:t>
+      </w:r>
       <w:r>
         <w:rPr>
           <w:sz w:val="34"/>
           <w:szCs w:val="34"/>
           <w:lang w:val="en-US"/>
         </w:rPr>
-        <w:t>%}</w:t>
-      </w:r>
-      <w:r>
-        <w:rPr>
-          <w:sz w:val="34"/>
-          <w:szCs w:val="34"/>
-          <w:lang w:val="en-US"/>
-        </w:rPr>
-        <w:t>{</w:t>
-      </w:r>
-      <w:proofErr w:type="gramEnd"/>
-      <w:r>
-        <w:rPr>
-          <w:sz w:val="34"/>
-          <w:szCs w:val="34"/>
-          <w:lang w:val="en-US"/>
-        </w:rPr>
-        <w:t xml:space="preserve">% for item in </w:t>
+        <w:t xml:space="preserve">{% for item in </w:t>
       </w:r>
       <w:proofErr w:type="spellStart"/>
       <w:r>
@@ -3996,7 +3795,6 @@
         </w:numPr>
         <w:spacing w:before="240"/>
       </w:pPr>
-      <w:proofErr w:type="gramStart"/>
       <w:r>
         <w:t>II</w:t>
       </w:r>
@@ -4005,47 +3803,19 @@
       </w:r>
       <w:proofErr w:type="spellStart"/>
       <w:r>
-        <w:t>loop</w:t>
-      </w:r>
-      <w:proofErr w:type="gramEnd"/>
-      <w:r>
-        <w:t>.</w:t>
-      </w:r>
-      <w:proofErr w:type="gramStart"/>
-      <w:r>
-        <w:t>index</w:t>
+        <w:t>loop.index</w:t>
       </w:r>
       <w:proofErr w:type="spellEnd"/>
       <w:r>
-        <w:t xml:space="preserve"> }</w:t>
-      </w:r>
-      <w:proofErr w:type="gramEnd"/>
-      <w:r>
-        <w:t xml:space="preserve">} </w:t>
-      </w:r>
-      <w:proofErr w:type="gramStart"/>
-      <w:r>
-        <w:t xml:space="preserve">{{ </w:t>
+        <w:t xml:space="preserve"> }} {{ </w:t>
       </w:r>
       <w:proofErr w:type="spellStart"/>
       <w:r>
-        <w:t>item</w:t>
-      </w:r>
-      <w:proofErr w:type="gramEnd"/>
-      <w:r>
-        <w:t>.judul_sub_</w:t>
-      </w:r>
-      <w:proofErr w:type="gramStart"/>
-      <w:r>
-        <w:t>bab</w:t>
+        <w:t>item.judul_sub_bab</w:t>
       </w:r>
       <w:proofErr w:type="spellEnd"/>
       <w:r>
-        <w:t xml:space="preserve"> }</w:t>
-      </w:r>
-      <w:proofErr w:type="gramEnd"/>
-      <w:r>
-        <w:t>}</w:t>
+        <w:t xml:space="preserve"> }}</w:t>
       </w:r>
     </w:p>
     <w:p>
@@ -4062,7 +3832,6 @@
         <w:t xml:space="preserve">{% if </w:t>
       </w:r>
       <w:proofErr w:type="spellStart"/>
-      <w:proofErr w:type="gramStart"/>
       <w:r>
         <w:rPr>
           <w:lang w:val="en-US"/>
@@ -4070,32 +3839,17 @@
         <w:t>item.tipe</w:t>
       </w:r>
       <w:proofErr w:type="spellEnd"/>
-      <w:proofErr w:type="gramEnd"/>
-      <w:r>
-        <w:rPr>
-          <w:lang w:val="en-US"/>
-        </w:rPr>
-        <w:t xml:space="preserve"> == “3” </w:t>
-      </w:r>
-      <w:proofErr w:type="gramStart"/>
-      <w:r>
-        <w:rPr>
-          <w:lang w:val="en-US"/>
-        </w:rPr>
-        <w:t>%}</w:t>
-      </w:r>
-      <w:r>
-        <w:rPr>
-          <w:lang w:val="en-US"/>
-        </w:rPr>
-        <w:t>{</w:t>
-      </w:r>
-      <w:proofErr w:type="gramEnd"/>
-      <w:r>
-        <w:rPr>
-          <w:lang w:val="en-US"/>
-        </w:rPr>
-        <w:t xml:space="preserve">% for </w:t>
+      <w:r>
+        <w:rPr>
+          <w:lang w:val="en-US"/>
+        </w:rPr>
+        <w:t xml:space="preserve"> == “3” %}</w:t>
+      </w:r>
+      <w:r>
+        <w:rPr>
+          <w:lang w:val="en-US"/>
+        </w:rPr>
+        <w:t xml:space="preserve">{% for </w:t>
       </w:r>
       <w:proofErr w:type="spellStart"/>
       <w:r>
@@ -4157,7 +3911,6 @@
                 <w:lang w:val="en-US"/>
               </w:rPr>
             </w:pPr>
-            <w:proofErr w:type="gramStart"/>
             <w:r>
               <w:rPr>
                 <w:lang w:val="en-US"/>
@@ -4171,30 +3924,22 @@
                 <w:szCs w:val="2"/>
                 <w:lang w:val="en-US"/>
               </w:rPr>
-              <w:t>loop</w:t>
-            </w:r>
-            <w:proofErr w:type="gramEnd"/>
+              <w:t>loop.index</w:t>
+            </w:r>
+            <w:proofErr w:type="spellEnd"/>
             <w:r>
               <w:rPr>
                 <w:sz w:val="2"/>
                 <w:szCs w:val="2"/>
                 <w:lang w:val="en-US"/>
               </w:rPr>
-              <w:t>.index</w:t>
-            </w:r>
-            <w:proofErr w:type="spellEnd"/>
-            <w:r>
-              <w:rPr>
-                <w:sz w:val="2"/>
-                <w:szCs w:val="2"/>
+              <w:t xml:space="preserve"> </w:t>
+            </w:r>
+            <w:r>
+              <w:rPr>
                 <w:lang w:val="en-US"/>
               </w:rPr>
-              <w:t xml:space="preserve"> </w:t>
-            </w:r>
-            <w:r>
-              <w:rPr>
-                <w:lang w:val="en-US"/>
-              </w:rPr>
+              <w:lastRenderedPageBreak/>
               <w:t>}}</w:t>
             </w:r>
           </w:p>
@@ -4209,11 +3954,11 @@
                 <w:lang w:val="en-US"/>
               </w:rPr>
             </w:pPr>
-            <w:proofErr w:type="gramStart"/>
             <w:r>
               <w:rPr>
                 <w:lang w:val="en-US"/>
               </w:rPr>
+              <w:lastRenderedPageBreak/>
               <w:t xml:space="preserve">{{ </w:t>
             </w:r>
             <w:proofErr w:type="spellStart"/>
@@ -4221,35 +3966,14 @@
               <w:rPr>
                 <w:lang w:val="en-US"/>
               </w:rPr>
-              <w:t>qa</w:t>
-            </w:r>
-            <w:proofErr w:type="gramEnd"/>
+              <w:t>qa.q</w:t>
+            </w:r>
+            <w:proofErr w:type="spellEnd"/>
             <w:r>
               <w:rPr>
                 <w:lang w:val="en-US"/>
               </w:rPr>
-              <w:t>.</w:t>
-            </w:r>
-            <w:proofErr w:type="gramStart"/>
-            <w:r>
-              <w:rPr>
-                <w:lang w:val="en-US"/>
-              </w:rPr>
-              <w:t>q</w:t>
-            </w:r>
-            <w:proofErr w:type="spellEnd"/>
-            <w:r>
-              <w:rPr>
-                <w:lang w:val="en-US"/>
-              </w:rPr>
-              <w:t xml:space="preserve"> }</w:t>
-            </w:r>
-            <w:proofErr w:type="gramEnd"/>
-            <w:r>
-              <w:rPr>
-                <w:lang w:val="en-US"/>
-              </w:rPr>
-              <w:t>}</w:t>
+              <w:t xml:space="preserve"> }}</w:t>
             </w:r>
           </w:p>
           <w:p>
@@ -4283,17 +4007,12 @@
             <w:pPr>
               <w:pStyle w:val="Text"/>
             </w:pPr>
-            <w:proofErr w:type="gramStart"/>
             <w:r>
               <w:t xml:space="preserve">{{ </w:t>
             </w:r>
             <w:proofErr w:type="spellStart"/>
             <w:r>
-              <w:t>qa</w:t>
-            </w:r>
-            <w:proofErr w:type="gramEnd"/>
-            <w:r>
-              <w:t>.a</w:t>
+              <w:t>qa.a</w:t>
             </w:r>
             <w:proofErr w:type="spellEnd"/>
             <w:r>
@@ -4314,7 +4033,6 @@
         <w:rPr>
           <w:lang w:val="en-US"/>
         </w:rPr>
-        <w:lastRenderedPageBreak/>
         <w:t xml:space="preserve">{% </w:t>
       </w:r>
       <w:proofErr w:type="spellStart"/>
@@ -4329,27 +4047,13 @@
         <w:rPr>
           <w:lang w:val="en-US"/>
         </w:rPr>
-        <w:t xml:space="preserve"> </w:t>
-      </w:r>
-      <w:proofErr w:type="gramStart"/>
-      <w:r>
-        <w:rPr>
-          <w:lang w:val="en-US"/>
-        </w:rPr>
-        <w:t>%}</w:t>
-      </w:r>
-      <w:r>
-        <w:rPr>
-          <w:lang w:val="en-US"/>
-        </w:rPr>
-        <w:t>{</w:t>
-      </w:r>
-      <w:proofErr w:type="gramEnd"/>
-      <w:r>
-        <w:rPr>
-          <w:lang w:val="en-US"/>
-        </w:rPr>
-        <w:t>% else %}</w:t>
+        <w:t xml:space="preserve"> %}</w:t>
+      </w:r>
+      <w:r>
+        <w:rPr>
+          <w:lang w:val="en-US"/>
+        </w:rPr>
+        <w:t>{% else %}</w:t>
       </w:r>
     </w:p>
     <w:p>
@@ -4361,7 +4065,6 @@
         </w:numPr>
         <w:ind w:left="578" w:hanging="153"/>
       </w:pPr>
-      <w:proofErr w:type="gramStart"/>
       <w:r>
         <w:t>II</w:t>
       </w:r>
@@ -4369,58 +4072,30 @@
         <w:rPr>
           <w:lang w:val="id-ID"/>
         </w:rPr>
-        <w:t>.{{ loop</w:t>
-      </w:r>
-      <w:proofErr w:type="gramEnd"/>
+        <w:t>.{{ loop.index }}</w:t>
+      </w:r>
       <w:r>
         <w:rPr>
           <w:lang w:val="id-ID"/>
         </w:rPr>
         <w:t>.</w:t>
       </w:r>
-      <w:proofErr w:type="gramStart"/>
-      <w:r>
-        <w:rPr>
-          <w:lang w:val="id-ID"/>
-        </w:rPr>
-        <w:t>index }}</w:t>
-      </w:r>
-      <w:r>
-        <w:rPr>
-          <w:lang w:val="id-ID"/>
-        </w:rPr>
-        <w:t>.</w:t>
-      </w:r>
       <w:r>
         <w:t>A.</w:t>
       </w:r>
-      <w:proofErr w:type="gramEnd"/>
       <w:r>
         <w:t xml:space="preserve"> </w:t>
       </w:r>
-      <w:proofErr w:type="gramStart"/>
       <w:r>
         <w:t xml:space="preserve">{{ </w:t>
       </w:r>
       <w:proofErr w:type="spellStart"/>
       <w:r>
-        <w:t>item</w:t>
-      </w:r>
-      <w:proofErr w:type="gramEnd"/>
-      <w:r>
-        <w:t>.label_point_</w:t>
-      </w:r>
-      <w:proofErr w:type="gramStart"/>
-      <w:r>
-        <w:t>a</w:t>
+        <w:t>item.label_point_a</w:t>
       </w:r>
       <w:proofErr w:type="spellEnd"/>
       <w:r>
-        <w:t xml:space="preserve"> }</w:t>
-      </w:r>
-      <w:proofErr w:type="gramEnd"/>
-      <w:r>
-        <w:t>}</w:t>
+        <w:t xml:space="preserve"> }}</w:t>
       </w:r>
       <w:r>
         <w:t xml:space="preserve"> </w:t>
@@ -4428,7 +4103,7 @@
     </w:p>
     <w:p>
       <w:pPr>
-        <w:ind w:left="1491" w:hanging="357"/>
+        <w:ind w:left="1134"/>
         <w:jc w:val="left"/>
       </w:pPr>
       <w:r>
@@ -4466,7 +4141,6 @@
         <w:pStyle w:val="Code"/>
         <w:ind w:left="1276"/>
       </w:pPr>
-      <w:proofErr w:type="gramStart"/>
       <w:r>
         <w:t xml:space="preserve">{{ </w:t>
       </w:r>
@@ -4475,21 +4149,26 @@
         <w:t>k.isi</w:t>
       </w:r>
       <w:proofErr w:type="spellEnd"/>
-      <w:proofErr w:type="gramEnd"/>
       <w:r>
         <w:t xml:space="preserve"> }}</w:t>
       </w:r>
     </w:p>
     <w:p>
       <w:pPr>
+        <w:ind w:left="1208"/>
+        <w:jc w:val="left"/>
+      </w:pPr>
+      <w:r>
+        <w:t>{% endfor %}</w:t>
+      </w:r>
+    </w:p>
+    <w:p>
+      <w:pPr>
         <w:ind w:left="1548" w:hanging="357"/>
         <w:rPr>
           <w:lang w:val="en-US"/>
         </w:rPr>
       </w:pPr>
-      <w:r>
-        <w:t>{% endfor %}</w:t>
-      </w:r>
       <w:r>
         <w:t xml:space="preserve">{% </w:t>
       </w:r>

</xml_diff>

<commit_message>
perbaikan layout Nur Faid (format-1 docx) selesai, tinggal format-2 docx
</commit_message>
<xml_diff>
--- a/kuliah/DocumentGenerator_Laporan_Praktikum/src/templates/format-1.docx
+++ b/kuliah/DocumentGenerator_Laporan_Praktikum/src/templates/format-1.docx
@@ -30,7 +30,6 @@
           <w:lang w:val="en-US"/>
         </w:rPr>
       </w:pPr>
-      <w:proofErr w:type="gramStart"/>
       <w:r>
         <w:rPr>
           <w:b/>
@@ -48,9 +47,9 @@
           <w:szCs w:val="28"/>
           <w:lang w:val="en-US"/>
         </w:rPr>
-        <w:t>mata</w:t>
-      </w:r>
-      <w:proofErr w:type="gramEnd"/>
+        <w:t>mata_kuliah</w:t>
+      </w:r>
+      <w:proofErr w:type="spellEnd"/>
       <w:r>
         <w:rPr>
           <w:b/>
@@ -58,37 +57,7 @@
           <w:szCs w:val="28"/>
           <w:lang w:val="en-US"/>
         </w:rPr>
-        <w:t>_</w:t>
-      </w:r>
-      <w:proofErr w:type="gramStart"/>
-      <w:r>
-        <w:rPr>
-          <w:b/>
-          <w:sz w:val="28"/>
-          <w:szCs w:val="28"/>
-          <w:lang w:val="en-US"/>
-        </w:rPr>
-        <w:t>kuliah</w:t>
-      </w:r>
-      <w:proofErr w:type="spellEnd"/>
-      <w:r>
-        <w:rPr>
-          <w:b/>
-          <w:sz w:val="28"/>
-          <w:szCs w:val="28"/>
-          <w:lang w:val="en-US"/>
-        </w:rPr>
-        <w:t xml:space="preserve"> }</w:t>
-      </w:r>
-      <w:proofErr w:type="gramEnd"/>
-      <w:r>
-        <w:rPr>
-          <w:b/>
-          <w:sz w:val="28"/>
-          <w:szCs w:val="28"/>
-          <w:lang w:val="en-US"/>
-        </w:rPr>
-        <w:t>}</w:t>
+        <w:t xml:space="preserve"> }}</w:t>
       </w:r>
     </w:p>
     <w:p>
@@ -4235,7 +4204,6 @@
         <w:spacing w:before="240"/>
         <w:ind w:left="578" w:hanging="153"/>
       </w:pPr>
-      <w:proofErr w:type="gramStart"/>
       <w:r>
         <w:t>II</w:t>
       </w:r>
@@ -4243,34 +4211,16 @@
         <w:rPr>
           <w:lang w:val="id-ID"/>
         </w:rPr>
-        <w:t>.{{ loop</w:t>
-      </w:r>
-      <w:proofErr w:type="gramEnd"/>
+        <w:t>.{{ loop.index }}</w:t>
+      </w:r>
       <w:r>
         <w:rPr>
           <w:lang w:val="id-ID"/>
         </w:rPr>
         <w:t>.</w:t>
       </w:r>
-      <w:proofErr w:type="gramStart"/>
-      <w:r>
-        <w:rPr>
-          <w:lang w:val="id-ID"/>
-        </w:rPr>
-        <w:t>index }}</w:t>
-      </w:r>
-      <w:r>
-        <w:rPr>
-          <w:lang w:val="id-ID"/>
-        </w:rPr>
-        <w:t>.</w:t>
-      </w:r>
-      <w:r>
-        <w:t>B.</w:t>
-      </w:r>
-      <w:proofErr w:type="gramEnd"/>
-      <w:r>
-        <w:t xml:space="preserve"> </w:t>
+      <w:r>
+        <w:t xml:space="preserve">B. </w:t>
       </w:r>
       <w:proofErr w:type="spellStart"/>
       <w:r>
@@ -4312,19 +4262,11 @@
         <w:t xml:space="preserve"> in </w:t>
       </w:r>
       <w:proofErr w:type="spellStart"/>
-      <w:proofErr w:type="gramStart"/>
-      <w:r>
-        <w:rPr>
-          <w:lang w:val="en-US"/>
-        </w:rPr>
-        <w:t>item.list</w:t>
-      </w:r>
-      <w:proofErr w:type="gramEnd"/>
-      <w:r>
-        <w:rPr>
-          <w:lang w:val="en-US"/>
-        </w:rPr>
-        <w:t>_gambar</w:t>
+      <w:r>
+        <w:rPr>
+          <w:lang w:val="en-US"/>
+        </w:rPr>
+        <w:t>item.list_gambar</w:t>
       </w:r>
       <w:proofErr w:type="spellEnd"/>
       <w:r>
@@ -4339,7 +4281,6 @@
         </w:rPr>
         <w:t xml:space="preserve"> </w:t>
       </w:r>
-      <w:proofErr w:type="gramStart"/>
       <w:r>
         <w:rPr>
           <w:lang w:val="en-US"/>
@@ -4351,35 +4292,14 @@
         <w:rPr>
           <w:lang w:val="en-US"/>
         </w:rPr>
-        <w:t>gbr</w:t>
-      </w:r>
-      <w:proofErr w:type="gramEnd"/>
-      <w:r>
-        <w:rPr>
-          <w:lang w:val="en-US"/>
-        </w:rPr>
-        <w:t>.objek_</w:t>
-      </w:r>
-      <w:proofErr w:type="gramStart"/>
-      <w:r>
-        <w:rPr>
-          <w:lang w:val="en-US"/>
-        </w:rPr>
-        <w:t>gambar</w:t>
+        <w:t>gbr.objek_gambar</w:t>
       </w:r>
       <w:proofErr w:type="spellEnd"/>
       <w:r>
         <w:rPr>
           <w:lang w:val="en-US"/>
         </w:rPr>
-        <w:t xml:space="preserve"> }</w:t>
-      </w:r>
-      <w:proofErr w:type="gramEnd"/>
-      <w:r>
-        <w:rPr>
-          <w:lang w:val="en-US"/>
-        </w:rPr>
-        <w:t>}</w:t>
+        <w:t xml:space="preserve"> }}</w:t>
       </w:r>
     </w:p>
     <w:p>
@@ -4412,7 +4332,7 @@
     </w:p>
     <w:p>
       <w:pPr>
-        <w:ind w:left="1021"/>
+        <w:ind w:left="1077"/>
         <w:rPr>
           <w:sz w:val="6"/>
           <w:szCs w:val="6"/>
@@ -4435,7 +4355,6 @@
         </w:numPr>
         <w:ind w:left="425"/>
       </w:pPr>
-      <w:proofErr w:type="gramStart"/>
       <w:r>
         <w:t>II</w:t>
       </w:r>
@@ -4443,34 +4362,16 @@
         <w:rPr>
           <w:lang w:val="id-ID"/>
         </w:rPr>
-        <w:t>.{{ loop</w:t>
-      </w:r>
-      <w:proofErr w:type="gramEnd"/>
+        <w:t>.{{ loop.index }}</w:t>
+      </w:r>
       <w:r>
         <w:rPr>
           <w:lang w:val="id-ID"/>
         </w:rPr>
         <w:t>.</w:t>
       </w:r>
-      <w:proofErr w:type="gramStart"/>
-      <w:r>
-        <w:rPr>
-          <w:lang w:val="id-ID"/>
-        </w:rPr>
-        <w:t>index }}</w:t>
-      </w:r>
-      <w:r>
-        <w:rPr>
-          <w:lang w:val="id-ID"/>
-        </w:rPr>
-        <w:t>.</w:t>
-      </w:r>
-      <w:r>
-        <w:t>C.</w:t>
-      </w:r>
-      <w:proofErr w:type="gramEnd"/>
-      <w:r>
-        <w:t xml:space="preserve"> </w:t>
+      <w:r>
+        <w:t xml:space="preserve">C. </w:t>
       </w:r>
       <w:r>
         <w:t>Analisa</w:t>

</xml_diff>

<commit_message>
perbaikan format-1 dengan penambahan penjelasan singkat
</commit_message>
<xml_diff>
--- a/kuliah/DocumentGenerator_Laporan_Praktikum/src/templates/format-1.docx
+++ b/kuliah/DocumentGenerator_Laporan_Praktikum/src/templates/format-1.docx
@@ -700,10 +700,13 @@
             </w:r>
             <w:r>
               <w:rPr>
-                <w:noProof/>
-                <w:webHidden/>
-              </w:rPr>
-              <w:t>4</w:t>
+                <w:b/>
+                <w:bCs/>
+                <w:noProof/>
+                <w:webHidden/>
+                <w:lang w:val="en-US"/>
+              </w:rPr>
+              <w:t>Error! Bookmark not defined.</w:t>
             </w:r>
             <w:r>
               <w:rPr>
@@ -769,10 +772,13 @@
             </w:r>
             <w:r>
               <w:rPr>
-                <w:noProof/>
-                <w:webHidden/>
-              </w:rPr>
-              <w:t>4</w:t>
+                <w:b/>
+                <w:bCs/>
+                <w:noProof/>
+                <w:webHidden/>
+                <w:lang w:val="en-US"/>
+              </w:rPr>
+              <w:t>Error! Bookmark not defined.</w:t>
             </w:r>
             <w:r>
               <w:rPr>
@@ -838,10 +844,13 @@
             </w:r>
             <w:r>
               <w:rPr>
-                <w:noProof/>
-                <w:webHidden/>
-              </w:rPr>
-              <w:t>4</w:t>
+                <w:b/>
+                <w:bCs/>
+                <w:noProof/>
+                <w:webHidden/>
+                <w:lang w:val="en-US"/>
+              </w:rPr>
+              <w:t>Error! Bookmark not defined.</w:t>
             </w:r>
             <w:r>
               <w:rPr>
@@ -907,10 +916,13 @@
             </w:r>
             <w:r>
               <w:rPr>
-                <w:noProof/>
-                <w:webHidden/>
-              </w:rPr>
-              <w:t>4</w:t>
+                <w:b/>
+                <w:bCs/>
+                <w:noProof/>
+                <w:webHidden/>
+                <w:lang w:val="en-US"/>
+              </w:rPr>
+              <w:t>Error! Bookmark not defined.</w:t>
             </w:r>
             <w:r>
               <w:rPr>
@@ -976,10 +988,13 @@
             </w:r>
             <w:r>
               <w:rPr>
-                <w:noProof/>
-                <w:webHidden/>
-              </w:rPr>
-              <w:t>5</w:t>
+                <w:b/>
+                <w:bCs/>
+                <w:noProof/>
+                <w:webHidden/>
+                <w:lang w:val="en-US"/>
+              </w:rPr>
+              <w:t>Error! Bookmark not defined.</w:t>
             </w:r>
             <w:r>
               <w:rPr>
@@ -1045,10 +1060,13 @@
             </w:r>
             <w:r>
               <w:rPr>
-                <w:noProof/>
-                <w:webHidden/>
-              </w:rPr>
-              <w:t>5</w:t>
+                <w:b/>
+                <w:bCs/>
+                <w:noProof/>
+                <w:webHidden/>
+                <w:lang w:val="en-US"/>
+              </w:rPr>
+              <w:t>Error! Bookmark not defined.</w:t>
             </w:r>
             <w:r>
               <w:rPr>
@@ -1114,10 +1132,13 @@
             </w:r>
             <w:r>
               <w:rPr>
-                <w:noProof/>
-                <w:webHidden/>
-              </w:rPr>
-              <w:t>5</w:t>
+                <w:b/>
+                <w:bCs/>
+                <w:noProof/>
+                <w:webHidden/>
+                <w:lang w:val="en-US"/>
+              </w:rPr>
+              <w:t>Error! Bookmark not defined.</w:t>
             </w:r>
             <w:r>
               <w:rPr>
@@ -1183,10 +1204,13 @@
             </w:r>
             <w:r>
               <w:rPr>
-                <w:noProof/>
-                <w:webHidden/>
-              </w:rPr>
-              <w:t>6</w:t>
+                <w:b/>
+                <w:bCs/>
+                <w:noProof/>
+                <w:webHidden/>
+                <w:lang w:val="en-US"/>
+              </w:rPr>
+              <w:t>Error! Bookmark not defined.</w:t>
             </w:r>
             <w:r>
               <w:rPr>
@@ -1252,10 +1276,13 @@
             </w:r>
             <w:r>
               <w:rPr>
-                <w:noProof/>
-                <w:webHidden/>
-              </w:rPr>
-              <w:t>6</w:t>
+                <w:b/>
+                <w:bCs/>
+                <w:noProof/>
+                <w:webHidden/>
+                <w:lang w:val="en-US"/>
+              </w:rPr>
+              <w:t>Error! Bookmark not defined.</w:t>
             </w:r>
             <w:r>
               <w:rPr>
@@ -1321,10 +1348,13 @@
             </w:r>
             <w:r>
               <w:rPr>
-                <w:noProof/>
-                <w:webHidden/>
-              </w:rPr>
-              <w:t>6</w:t>
+                <w:b/>
+                <w:bCs/>
+                <w:noProof/>
+                <w:webHidden/>
+                <w:lang w:val="en-US"/>
+              </w:rPr>
+              <w:t>Error! Bookmark not defined.</w:t>
             </w:r>
             <w:r>
               <w:rPr>
@@ -1390,10 +1420,13 @@
             </w:r>
             <w:r>
               <w:rPr>
-                <w:noProof/>
-                <w:webHidden/>
-              </w:rPr>
-              <w:t>7</w:t>
+                <w:b/>
+                <w:bCs/>
+                <w:noProof/>
+                <w:webHidden/>
+                <w:lang w:val="en-US"/>
+              </w:rPr>
+              <w:t>Error! Bookmark not defined.</w:t>
             </w:r>
             <w:r>
               <w:rPr>
@@ -1459,10 +1492,13 @@
             </w:r>
             <w:r>
               <w:rPr>
-                <w:noProof/>
-                <w:webHidden/>
-              </w:rPr>
-              <w:t>7</w:t>
+                <w:b/>
+                <w:bCs/>
+                <w:noProof/>
+                <w:webHidden/>
+                <w:lang w:val="en-US"/>
+              </w:rPr>
+              <w:t>Error! Bookmark not defined.</w:t>
             </w:r>
             <w:r>
               <w:rPr>
@@ -1528,10 +1564,13 @@
             </w:r>
             <w:r>
               <w:rPr>
-                <w:noProof/>
-                <w:webHidden/>
-              </w:rPr>
-              <w:t>8</w:t>
+                <w:b/>
+                <w:bCs/>
+                <w:noProof/>
+                <w:webHidden/>
+                <w:lang w:val="en-US"/>
+              </w:rPr>
+              <w:t>Error! Bookmark not defined.</w:t>
             </w:r>
             <w:r>
               <w:rPr>
@@ -1597,10 +1636,13 @@
             </w:r>
             <w:r>
               <w:rPr>
-                <w:noProof/>
-                <w:webHidden/>
-              </w:rPr>
-              <w:t>8</w:t>
+                <w:b/>
+                <w:bCs/>
+                <w:noProof/>
+                <w:webHidden/>
+                <w:lang w:val="en-US"/>
+              </w:rPr>
+              <w:t>Error! Bookmark not defined.</w:t>
             </w:r>
             <w:r>
               <w:rPr>
@@ -1666,10 +1708,13 @@
             </w:r>
             <w:r>
               <w:rPr>
-                <w:noProof/>
-                <w:webHidden/>
-              </w:rPr>
-              <w:t>8</w:t>
+                <w:b/>
+                <w:bCs/>
+                <w:noProof/>
+                <w:webHidden/>
+                <w:lang w:val="en-US"/>
+              </w:rPr>
+              <w:t>Error! Bookmark not defined.</w:t>
             </w:r>
             <w:r>
               <w:rPr>
@@ -1735,10 +1780,13 @@
             </w:r>
             <w:r>
               <w:rPr>
-                <w:noProof/>
-                <w:webHidden/>
-              </w:rPr>
-              <w:t>8</w:t>
+                <w:b/>
+                <w:bCs/>
+                <w:noProof/>
+                <w:webHidden/>
+                <w:lang w:val="en-US"/>
+              </w:rPr>
+              <w:t>Error! Bookmark not defined.</w:t>
             </w:r>
             <w:r>
               <w:rPr>
@@ -1804,10 +1852,13 @@
             </w:r>
             <w:r>
               <w:rPr>
-                <w:noProof/>
-                <w:webHidden/>
-              </w:rPr>
-              <w:t>9</w:t>
+                <w:b/>
+                <w:bCs/>
+                <w:noProof/>
+                <w:webHidden/>
+                <w:lang w:val="en-US"/>
+              </w:rPr>
+              <w:t>Error! Bookmark not defined.</w:t>
             </w:r>
             <w:r>
               <w:rPr>
@@ -1873,10 +1924,13 @@
             </w:r>
             <w:r>
               <w:rPr>
-                <w:noProof/>
-                <w:webHidden/>
-              </w:rPr>
-              <w:t>9</w:t>
+                <w:b/>
+                <w:bCs/>
+                <w:noProof/>
+                <w:webHidden/>
+                <w:lang w:val="en-US"/>
+              </w:rPr>
+              <w:t>Error! Bookmark not defined.</w:t>
             </w:r>
             <w:r>
               <w:rPr>
@@ -1942,10 +1996,13 @@
             </w:r>
             <w:r>
               <w:rPr>
-                <w:noProof/>
-                <w:webHidden/>
-              </w:rPr>
-              <w:t>9</w:t>
+                <w:b/>
+                <w:bCs/>
+                <w:noProof/>
+                <w:webHidden/>
+                <w:lang w:val="en-US"/>
+              </w:rPr>
+              <w:t>Error! Bookmark not defined.</w:t>
             </w:r>
             <w:r>
               <w:rPr>
@@ -2011,10 +2068,13 @@
             </w:r>
             <w:r>
               <w:rPr>
-                <w:noProof/>
-                <w:webHidden/>
-              </w:rPr>
-              <w:t>10</w:t>
+                <w:b/>
+                <w:bCs/>
+                <w:noProof/>
+                <w:webHidden/>
+                <w:lang w:val="en-US"/>
+              </w:rPr>
+              <w:t>Error! Bookmark not defined.</w:t>
             </w:r>
             <w:r>
               <w:rPr>
@@ -2080,10 +2140,13 @@
             </w:r>
             <w:r>
               <w:rPr>
-                <w:noProof/>
-                <w:webHidden/>
-              </w:rPr>
-              <w:t>10</w:t>
+                <w:b/>
+                <w:bCs/>
+                <w:noProof/>
+                <w:webHidden/>
+                <w:lang w:val="en-US"/>
+              </w:rPr>
+              <w:t>Error! Bookmark not defined.</w:t>
             </w:r>
             <w:r>
               <w:rPr>
@@ -2149,10 +2212,13 @@
             </w:r>
             <w:r>
               <w:rPr>
-                <w:noProof/>
-                <w:webHidden/>
-              </w:rPr>
-              <w:t>10</w:t>
+                <w:b/>
+                <w:bCs/>
+                <w:noProof/>
+                <w:webHidden/>
+                <w:lang w:val="en-US"/>
+              </w:rPr>
+              <w:t>Error! Bookmark not defined.</w:t>
             </w:r>
             <w:r>
               <w:rPr>
@@ -2218,10 +2284,13 @@
             </w:r>
             <w:r>
               <w:rPr>
-                <w:noProof/>
-                <w:webHidden/>
-              </w:rPr>
-              <w:t>11</w:t>
+                <w:b/>
+                <w:bCs/>
+                <w:noProof/>
+                <w:webHidden/>
+                <w:lang w:val="en-US"/>
+              </w:rPr>
+              <w:t>Error! Bookmark not defined.</w:t>
             </w:r>
             <w:r>
               <w:rPr>
@@ -2287,10 +2356,13 @@
             </w:r>
             <w:r>
               <w:rPr>
-                <w:noProof/>
-                <w:webHidden/>
-              </w:rPr>
-              <w:t>11</w:t>
+                <w:b/>
+                <w:bCs/>
+                <w:noProof/>
+                <w:webHidden/>
+                <w:lang w:val="en-US"/>
+              </w:rPr>
+              <w:t>Error! Bookmark not defined.</w:t>
             </w:r>
             <w:r>
               <w:rPr>
@@ -2356,10 +2428,13 @@
             </w:r>
             <w:r>
               <w:rPr>
-                <w:noProof/>
-                <w:webHidden/>
-              </w:rPr>
-              <w:t>12</w:t>
+                <w:b/>
+                <w:bCs/>
+                <w:noProof/>
+                <w:webHidden/>
+                <w:lang w:val="en-US"/>
+              </w:rPr>
+              <w:t>Error! Bookmark not defined.</w:t>
             </w:r>
             <w:r>
               <w:rPr>
@@ -2425,10 +2500,13 @@
             </w:r>
             <w:r>
               <w:rPr>
-                <w:noProof/>
-                <w:webHidden/>
-              </w:rPr>
-              <w:t>12</w:t>
+                <w:b/>
+                <w:bCs/>
+                <w:noProof/>
+                <w:webHidden/>
+                <w:lang w:val="en-US"/>
+              </w:rPr>
+              <w:t>Error! Bookmark not defined.</w:t>
             </w:r>
             <w:r>
               <w:rPr>
@@ -2494,10 +2572,13 @@
             </w:r>
             <w:r>
               <w:rPr>
-                <w:noProof/>
-                <w:webHidden/>
-              </w:rPr>
-              <w:t>12</w:t>
+                <w:b/>
+                <w:bCs/>
+                <w:noProof/>
+                <w:webHidden/>
+                <w:lang w:val="en-US"/>
+              </w:rPr>
+              <w:t>Error! Bookmark not defined.</w:t>
             </w:r>
             <w:r>
               <w:rPr>
@@ -2563,10 +2644,13 @@
             </w:r>
             <w:r>
               <w:rPr>
-                <w:noProof/>
-                <w:webHidden/>
-              </w:rPr>
-              <w:t>12</w:t>
+                <w:b/>
+                <w:bCs/>
+                <w:noProof/>
+                <w:webHidden/>
+                <w:lang w:val="en-US"/>
+              </w:rPr>
+              <w:t>Error! Bookmark not defined.</w:t>
             </w:r>
             <w:r>
               <w:rPr>
@@ -2632,10 +2716,13 @@
             </w:r>
             <w:r>
               <w:rPr>
-                <w:noProof/>
-                <w:webHidden/>
-              </w:rPr>
-              <w:t>13</w:t>
+                <w:b/>
+                <w:bCs/>
+                <w:noProof/>
+                <w:webHidden/>
+                <w:lang w:val="en-US"/>
+              </w:rPr>
+              <w:t>Error! Bookmark not defined.</w:t>
             </w:r>
             <w:r>
               <w:rPr>
@@ -2701,10 +2788,13 @@
             </w:r>
             <w:r>
               <w:rPr>
-                <w:noProof/>
-                <w:webHidden/>
-              </w:rPr>
-              <w:t>13</w:t>
+                <w:b/>
+                <w:bCs/>
+                <w:noProof/>
+                <w:webHidden/>
+                <w:lang w:val="en-US"/>
+              </w:rPr>
+              <w:t>Error! Bookmark not defined.</w:t>
             </w:r>
             <w:r>
               <w:rPr>
@@ -2770,10 +2860,13 @@
             </w:r>
             <w:r>
               <w:rPr>
-                <w:noProof/>
-                <w:webHidden/>
-              </w:rPr>
-              <w:t>13</w:t>
+                <w:b/>
+                <w:bCs/>
+                <w:noProof/>
+                <w:webHidden/>
+                <w:lang w:val="en-US"/>
+              </w:rPr>
+              <w:t>Error! Bookmark not defined.</w:t>
             </w:r>
             <w:r>
               <w:rPr>
@@ -2839,10 +2932,13 @@
             </w:r>
             <w:r>
               <w:rPr>
-                <w:noProof/>
-                <w:webHidden/>
-              </w:rPr>
-              <w:t>14</w:t>
+                <w:b/>
+                <w:bCs/>
+                <w:noProof/>
+                <w:webHidden/>
+                <w:lang w:val="en-US"/>
+              </w:rPr>
+              <w:t>Error! Bookmark not defined.</w:t>
             </w:r>
             <w:r>
               <w:rPr>
@@ -2911,7 +3007,7 @@
                 <w:noProof/>
                 <w:webHidden/>
               </w:rPr>
-              <w:t>15</w:t>
+              <w:t>4</w:t>
             </w:r>
             <w:r>
               <w:rPr>
@@ -2980,7 +3076,7 @@
                 <w:noProof/>
                 <w:webHidden/>
               </w:rPr>
-              <w:t>16</w:t>
+              <w:t>5</w:t>
             </w:r>
             <w:r>
               <w:rPr>
@@ -3183,6 +3279,91 @@
     </w:p>
     <w:p>
       <w:pPr>
+        <w:ind w:left="357"/>
+        <w:rPr>
+          <w:lang w:val="en-US"/>
+        </w:rPr>
+      </w:pPr>
+      <w:r>
+        <w:rPr>
+          <w:lang w:val="en-US"/>
+        </w:rPr>
+        <w:t xml:space="preserve">{% if </w:t>
+      </w:r>
+      <w:proofErr w:type="spellStart"/>
+      <w:r>
+        <w:rPr>
+          <w:lang w:val="en-US"/>
+        </w:rPr>
+        <w:t>item.penjelasan_singkat</w:t>
+      </w:r>
+      <w:proofErr w:type="spellEnd"/>
+      <w:r>
+        <w:rPr>
+          <w:lang w:val="en-US"/>
+        </w:rPr>
+        <w:t xml:space="preserve"> and </w:t>
+      </w:r>
+      <w:proofErr w:type="spellStart"/>
+      <w:r>
+        <w:rPr>
+          <w:lang w:val="en-US"/>
+        </w:rPr>
+        <w:t>item.penjelasan_singkat</w:t>
+      </w:r>
+      <w:proofErr w:type="spellEnd"/>
+      <w:r>
+        <w:rPr>
+          <w:lang w:val="en-US"/>
+        </w:rPr>
+        <w:t xml:space="preserve"> != "##HAPUS##" %}</w:t>
+      </w:r>
+    </w:p>
+    <w:p>
+      <w:pPr>
+        <w:spacing w:after="240"/>
+        <w:ind w:left="357" w:firstLine="363"/>
+        <w:rPr>
+          <w:lang w:val="en-US"/>
+        </w:rPr>
+      </w:pPr>
+      <w:r>
+        <w:rPr>
+          <w:lang w:val="en-US"/>
+        </w:rPr>
+        <w:t xml:space="preserve">{{ </w:t>
+      </w:r>
+      <w:proofErr w:type="spellStart"/>
+      <w:r>
+        <w:rPr>
+          <w:lang w:val="en-US"/>
+        </w:rPr>
+        <w:t>item.penjelasan_singkat</w:t>
+      </w:r>
+      <w:proofErr w:type="spellEnd"/>
+      <w:r>
+        <w:rPr>
+          <w:lang w:val="en-US"/>
+        </w:rPr>
+        <w:t xml:space="preserve"> }}</w:t>
+      </w:r>
+    </w:p>
+    <w:p>
+      <w:pPr>
+        <w:ind w:left="357"/>
+        <w:rPr>
+          <w:lang w:val="en-US"/>
+        </w:rPr>
+      </w:pPr>
+      <w:r>
+        <w:rPr>
+          <w:lang w:val="en-US"/>
+        </w:rPr>
+        <w:t>{% endif %}</w:t>
+      </w:r>
+    </w:p>
+    <w:p>
+      <w:pPr>
         <w:pStyle w:val="Heading3"/>
         <w:numPr>
           <w:ilvl w:val="0"/>
@@ -3765,6 +3946,7 @@
         <w:spacing w:before="240"/>
       </w:pPr>
       <w:r>
+        <w:lastRenderedPageBreak/>
         <w:t>II</w:t>
       </w:r>
       <w:r>
@@ -3785,6 +3967,91 @@
       <w:proofErr w:type="spellEnd"/>
       <w:r>
         <w:t xml:space="preserve"> }}</w:t>
+      </w:r>
+    </w:p>
+    <w:p>
+      <w:pPr>
+        <w:ind w:left="425"/>
+        <w:rPr>
+          <w:lang w:val="en-US"/>
+        </w:rPr>
+      </w:pPr>
+      <w:r>
+        <w:rPr>
+          <w:lang w:val="en-US"/>
+        </w:rPr>
+        <w:t xml:space="preserve">{% if </w:t>
+      </w:r>
+      <w:proofErr w:type="spellStart"/>
+      <w:r>
+        <w:rPr>
+          <w:lang w:val="en-US"/>
+        </w:rPr>
+        <w:t>item.penjelasan_singkat</w:t>
+      </w:r>
+      <w:proofErr w:type="spellEnd"/>
+      <w:r>
+        <w:rPr>
+          <w:lang w:val="en-US"/>
+        </w:rPr>
+        <w:t xml:space="preserve"> and </w:t>
+      </w:r>
+      <w:proofErr w:type="spellStart"/>
+      <w:r>
+        <w:rPr>
+          <w:lang w:val="en-US"/>
+        </w:rPr>
+        <w:t>item.penjelasan_singkat</w:t>
+      </w:r>
+      <w:proofErr w:type="spellEnd"/>
+      <w:r>
+        <w:rPr>
+          <w:lang w:val="en-US"/>
+        </w:rPr>
+        <w:t xml:space="preserve"> != "##HAPUS##" %}</w:t>
+      </w:r>
+    </w:p>
+    <w:p>
+      <w:pPr>
+        <w:spacing w:after="240"/>
+        <w:ind w:left="425" w:firstLine="295"/>
+        <w:rPr>
+          <w:lang w:val="en-US"/>
+        </w:rPr>
+      </w:pPr>
+      <w:r>
+        <w:rPr>
+          <w:lang w:val="en-US"/>
+        </w:rPr>
+        <w:t xml:space="preserve">{{ </w:t>
+      </w:r>
+      <w:proofErr w:type="spellStart"/>
+      <w:r>
+        <w:rPr>
+          <w:lang w:val="en-US"/>
+        </w:rPr>
+        <w:t>item.penjelasan_singkat</w:t>
+      </w:r>
+      <w:proofErr w:type="spellEnd"/>
+      <w:r>
+        <w:rPr>
+          <w:lang w:val="en-US"/>
+        </w:rPr>
+        <w:t xml:space="preserve"> }}</w:t>
+      </w:r>
+    </w:p>
+    <w:p>
+      <w:pPr>
+        <w:ind w:left="425"/>
+        <w:rPr>
+          <w:lang w:val="en-US"/>
+        </w:rPr>
+      </w:pPr>
+      <w:r>
+        <w:rPr>
+          <w:lang w:val="en-US"/>
+        </w:rPr>
+        <w:t>{% endif %}</w:t>
       </w:r>
     </w:p>
     <w:p>
@@ -3908,7 +4175,6 @@
               <w:rPr>
                 <w:lang w:val="en-US"/>
               </w:rPr>
-              <w:lastRenderedPageBreak/>
               <w:t>}}</w:t>
             </w:r>
           </w:p>
@@ -3927,7 +4193,6 @@
               <w:rPr>
                 <w:lang w:val="en-US"/>
               </w:rPr>
-              <w:lastRenderedPageBreak/>
               <w:t xml:space="preserve">{{ </w:t>
             </w:r>
             <w:proofErr w:type="spellStart"/>

</xml_diff>